<commit_message>
Update final report generator to use final-report-v3.md and add new snapshot document
- Changed the input markdown file from final-report-v2.md to final-report-v3.md in generate-final.js.
- Updated the final report generation process to reflect changes in the new markdown version.
- Added a new snapshot of the final report as final-report.docx in the snapshot directory.
- Updated the existing final-report.docx to reflect the latest changes.
</commit_message>
<xml_diff>
--- a/06-final-report/final/final-report.docx
+++ b/06-final-report/final/final-report.docx
@@ -537,7 +537,7 @@
           <w:sz w:val="22"/>
           <w:szCs w:val="22"/>
         </w:rPr>
-        <w:t xml:space="preserve">최근 ChatGPT, Claude, Gemini 등 대규모 언어 모델(Large Language Model, LLM) API 서비스가 다양한 분야에서 활용되고 있다. 이에 따라 기업이나 연구실에서도 하나의 조직 계정으로 여러 구성원이 LLM API를 사용하거나, 자체 LLM 서버를 구축하여 여러 사용자에게 서비스하는 사례가 늘어나고 있다.</w:t>
+        <w:t xml:space="preserve">최근 ChatGPT, Claude, Gemini 등 대규모 언어 모델(Large Language Model, LLM) API(Application Programming Interface, 프로그램이 다른 프로그램에 요청을 보내고 결과를 받는 통로) 서비스가 다양한 분야에서 활용되고 있다. 이에 따라 기업이나 연구실에서도 하나의 조직 계정으로 여러 구성원이 LLM API를 사용하거나, 자체 LLM 서버를 구축하여 여러 사용자에게 서비스하는 사례가 늘어나고 있다.</w:t>
       </w:r>
     </w:p>
     <w:p>
@@ -1182,7 +1182,7 @@
           <w:sz w:val="22"/>
           <w:szCs w:val="22"/>
         </w:rPr>
-        <w:t xml:space="preserve">JFI는 네트워크 대역폭 배분, CPU 스케줄링 등 다양한 자원 공유 시스템에서 널리 사용된다. 본 프로젝트에서도 이 지표를 활용하여 각 스케줄링 알고리즘의 공정성을 비교하였다. 다만, WFQ처럼 가중치에 따라 자원을 의도적으로 다르게 배분하는 알고리즘에서는 단순 JFI 대신 가중치를 반영한 정규화된 JFI를 사용해야 정확한 공정성 평가가 가능하다 (5.5절 참조).</w:t>
+        <w:t xml:space="preserve">JFI는 네트워크 대역폭 배분, CPU 스케줄링 등 다양한 자원 공유 시스템에서 널리 사용된다. 본 프로젝트에서도 이 지표를 활용하여 각 스케줄링 알고리즘의 공정성을 비교하였다. 다만, WFQ처럼 가중치에 따라 자원을 의도적으로 다르게 배분하는 알고리즘에서는 단순 JFI 대신 가중치를 반영한 JFI를 사용해야 정확한 공정성 평가가 가능하다 (5.5절 참조).</w:t>
       </w:r>
     </w:p>
     <w:p>
@@ -2068,7 +2068,7 @@
           <w:sz w:val="22"/>
           <w:szCs w:val="22"/>
         </w:rPr>
-        <w:t xml:space="preserve">: Express.js [8] 기반의 HTTP 서버로, 요청 접수, 스케줄러 전환, 통계 조회 등의 기능을 제공한다. 사용자의 요청을 받아서 요청 우선순위와 구독 등급 정보를 포함한 요청 객체를 생성하고, 이를 Rate Limiter를 거쳐 스케줄러에 전달하는 역할을 한다. API 계층은 요청의 접수와 전달을 담당하며, 스케줄링 결정에는 관여하지 않는다.</w:t>
+        <w:t xml:space="preserve">: Express.js [8](Node.js용 웹 서버 프레임워크) 기반의 HTTP 서버로, 요청 접수, 스케줄러 전환, 통계 조회 등의 기능을 제공한다. 사용자의 요청을 받아서 요청 우선순위와 구독 등급 정보를 포함한 요청 객체를 생성하고, 이를 Rate Limiter를 거쳐 스케줄러에 전달하는 역할을 한다. API 계층은 요청의 접수와 전달을 담당하며, 스케줄링 결정에는 관여하지 않는다.</w:t>
       </w:r>
     </w:p>
     <w:p>
@@ -2093,7 +2093,7 @@
           <w:sz w:val="22"/>
           <w:szCs w:val="22"/>
         </w:rPr>
-        <w:t xml:space="preserve">: 시스템의 핵심 부분으로, 네 가지 스케줄링 알고리즘이 구현되어 있다. 모든 알고리즘은 같은 인터페이스(enqueue, dequeue)를 따르기 때문에, 서버 시작 시 환경변수 하나로 알고리즘을 선택할 수 있다. 스케줄러 계층에서는 선택된 알고리즘에 따라 어떤 요청을 다음에 처리할지 결정한다. WFQ의 경우, 구독 등급에 따른 가중치를 기반으로 VFT를 계산하여 처리 순서를 결정한다.</w:t>
+        <w:t xml:space="preserve">: 시스템의 핵심 부분으로, 네 가지 스케줄링 알고리즘이 구현되어 있다. 모든 알고리즘은 같은 인터페이스(enqueue: 대기열에 삽입, dequeue: 대기열에서 꺼내기)를 따르기 때문에, 서버 시작 시 환경변수 하나로 알고리즘을 선택할 수 있다. 스케줄러 계층에서는 선택된 알고리즘에 따라 어떤 요청을 다음에 처리할지 결정한다. WFQ의 경우, 구독 등급에 따른 가중치를 기반으로 VFT를 계산하여 처리 순서를 결정한다.</w:t>
       </w:r>
     </w:p>
     <w:p>
@@ -2118,7 +2118,7 @@
           <w:sz w:val="22"/>
           <w:szCs w:val="22"/>
         </w:rPr>
-        <w:t xml:space="preserve">: 메모리 큐(외부 데이터베이스 없이 프로그램 메모리의 배열로 관리하는 대기열)로 요청을 관리하고, JSON 파일로 처리 이력을 기록한다. LLM 호출은 Ollama를 통해 로컬에서 수행한다.</w:t>
+        <w:t xml:space="preserve">: 메모리 큐(외부 데이터베이스 없이 프로그램 메모리의 배열로 관리하는 대기열)로 요청을 관리하고, JSON(텍스트 기반 데이터 형식) 파일로 처리 이력을 기록한다. LLM 호출은 Ollama를 통해 로컬에서 수행한다.</w:t>
       </w:r>
     </w:p>
     <w:p>
@@ -2135,7 +2135,7 @@
           <w:sz w:val="22"/>
           <w:szCs w:val="22"/>
         </w:rPr>
-        <w:t xml:space="preserve">JFI 산출은 실험 종료 후 처리 결과를 사후 분석하는 방식으로 수행하였다. 실험 중에 실시간으로 계산하는 것이 아니라, 모든 요청이 처리된 뒤 각 사용자별 처리량을 집계하여 계산하였다.</w:t>
+        <w:t xml:space="preserve">JFI 산출은 실험이 끝난 뒤 처리 결과를 집계하는 방식으로 수행하였다. 실험 중에 실시간으로 계산하는 것이 아니라, 모든 요청이 처리된 뒤 각 사용자별 처리량을 모아서 계산하였다.</w:t>
       </w:r>
     </w:p>
     <w:p>
@@ -2798,7 +2798,7 @@
           <w:sz w:val="22"/>
           <w:szCs w:val="22"/>
         </w:rPr>
-        <w:t xml:space="preserve">: MLFQ의 핵심 효과는 짧은 요청을 먼저 처리하기 위해 긴 요청을 하위 큐로 내리는 것이다. 그런데 비선점형으로 운영하면 요청이 중단 없이 끝까지 처리되므로, 큐 간 이동이 발생하지 않는다. 실제로 비선점형 MLFQ는 FCFS와 동일한 결과를 보였다 (5.2절 참조). 이것이 MLFQ 알고리즘 자체의 한계인지, LLM 환경의 비선점형 제약 때문인지 확인하기 위해 시뮬레이션 환경에서 선점형 모드를 추가 구현하였다 (5.3절). 선점형 모드에서는 일정 간격(500ms)으로 현재 처리 중인 요청의 실행 시간을 확인하고, 시간 할당량을 초과한 경우 해당 요청을 중단하고 하위 큐로 이동시킨다.</w:t>
+        <w:t xml:space="preserve">: MLFQ의 핵심 효과는 짧은 요청을 먼저 처리하기 위해 긴 요청을 하위 큐로 내리는 것이다. 그런데 비선점형으로 운영하면 요청이 중단 없이 끝까지 처리되므로, 큐 간 이동이 발생하지 않는다. 실제로 비선점형 MLFQ는 FCFS와 동일한 결과를 보였다 (5.2절 참조). 이것이 MLFQ 알고리즘 자체의 한계인지, LLM 환경의 비선점형 제약 때문인지 확인하기 위해 시뮬레이션 환경에서 선점형(Preemptive) 모드를 추가 구현하였다 (5.3절). 선점형 모드에서는 일정 간격(500ms)으로 현재 처리 중인 요청의 실행 시간을 확인하고, 시간 할당량을 초과한 경우 해당 요청을 중단하고 하위 큐로 이동시킨다.</w:t>
       </w:r>
     </w:p>
     <w:p>
@@ -5523,6 +5523,160 @@
           <w:sz w:val="22"/>
           <w:szCs w:val="22"/>
         </w:rPr>
+        <w:t xml:space="preserve">dequeue 동작은 표 5의 Rule 1(높은 큐 우선)을 그대로 코드로 옮긴 것이다. 상위 큐부터 순서대로 확인하여 요청이 있으면 꺼내고, 모든 큐가 비어 있으면 `null`을 반환한다.</w:t>
+      </w:r>
+    </w:p>
+    <w:p>
+      <w:pPr>
+        <w:spacing w:after="0" w:line="240"/>
+        <w:ind w:left="360"/>
+      </w:pPr>
+      <w:r>
+        <w:rPr>
+          <w:rFonts w:ascii="Consolas" w:cs="Consolas" w:eastAsia="Consolas" w:hAnsi="Consolas"/>
+          <w:color w:val="333333"/>
+          <w:sz w:val="18"/>
+          <w:szCs w:val="18"/>
+        </w:rPr>
+        <w:t xml:space="preserve">// MLFQ 스케줄러: 다음 처리할 요청 선택</w:t>
+      </w:r>
+    </w:p>
+    <w:p>
+      <w:pPr>
+        <w:spacing w:after="0" w:line="240"/>
+        <w:ind w:left="360"/>
+      </w:pPr>
+      <w:r>
+        <w:rPr>
+          <w:rFonts w:ascii="Consolas" w:cs="Consolas" w:eastAsia="Consolas" w:hAnsi="Consolas"/>
+          <w:color w:val="333333"/>
+          <w:sz w:val="18"/>
+          <w:szCs w:val="18"/>
+        </w:rPr>
+        <w:t xml:space="preserve">dequeue() {</w:t>
+      </w:r>
+    </w:p>
+    <w:p>
+      <w:pPr>
+        <w:spacing w:after="0" w:line="240"/>
+        <w:ind w:left="360"/>
+      </w:pPr>
+      <w:r>
+        <w:rPr>
+          <w:rFonts w:ascii="Consolas" w:cs="Consolas" w:eastAsia="Consolas" w:hAnsi="Consolas"/>
+          <w:color w:val="333333"/>
+          <w:sz w:val="18"/>
+          <w:szCs w:val="18"/>
+        </w:rPr>
+        <w:t xml:space="preserve">  for (let i = 0; i &lt; 4; i++) {       // Q0부터 Q3까지 순서대로</w:t>
+      </w:r>
+    </w:p>
+    <w:p>
+      <w:pPr>
+        <w:spacing w:after="0" w:line="240"/>
+        <w:ind w:left="360"/>
+      </w:pPr>
+      <w:r>
+        <w:rPr>
+          <w:rFonts w:ascii="Consolas" w:cs="Consolas" w:eastAsia="Consolas" w:hAnsi="Consolas"/>
+          <w:color w:val="333333"/>
+          <w:sz w:val="18"/>
+          <w:szCs w:val="18"/>
+        </w:rPr>
+        <w:t xml:space="preserve">    if (this.queues[i].length &gt; 0) {  // 요청이 있는 가장 높은 큐에서</w:t>
+      </w:r>
+    </w:p>
+    <w:p>
+      <w:pPr>
+        <w:spacing w:after="0" w:line="240"/>
+        <w:ind w:left="360"/>
+      </w:pPr>
+      <w:r>
+        <w:rPr>
+          <w:rFonts w:ascii="Consolas" w:cs="Consolas" w:eastAsia="Consolas" w:hAnsi="Consolas"/>
+          <w:color w:val="333333"/>
+          <w:sz w:val="18"/>
+          <w:szCs w:val="18"/>
+        </w:rPr>
+        <w:t xml:space="preserve">      return this.queues[i].shift();  // FIFO 순서로 꺼낸다</w:t>
+      </w:r>
+    </w:p>
+    <w:p>
+      <w:pPr>
+        <w:spacing w:after="0" w:line="240"/>
+        <w:ind w:left="360"/>
+      </w:pPr>
+      <w:r>
+        <w:rPr>
+          <w:rFonts w:ascii="Consolas" w:cs="Consolas" w:eastAsia="Consolas" w:hAnsi="Consolas"/>
+          <w:color w:val="333333"/>
+          <w:sz w:val="18"/>
+          <w:szCs w:val="18"/>
+        </w:rPr>
+        <w:t xml:space="preserve">    }</w:t>
+      </w:r>
+    </w:p>
+    <w:p>
+      <w:pPr>
+        <w:spacing w:after="0" w:line="240"/>
+        <w:ind w:left="360"/>
+      </w:pPr>
+      <w:r>
+        <w:rPr>
+          <w:rFonts w:ascii="Consolas" w:cs="Consolas" w:eastAsia="Consolas" w:hAnsi="Consolas"/>
+          <w:color w:val="333333"/>
+          <w:sz w:val="18"/>
+          <w:szCs w:val="18"/>
+        </w:rPr>
+        <w:t xml:space="preserve">  }</w:t>
+      </w:r>
+    </w:p>
+    <w:p>
+      <w:pPr>
+        <w:spacing w:after="0" w:line="240"/>
+        <w:ind w:left="360"/>
+      </w:pPr>
+      <w:r>
+        <w:rPr>
+          <w:rFonts w:ascii="Consolas" w:cs="Consolas" w:eastAsia="Consolas" w:hAnsi="Consolas"/>
+          <w:color w:val="333333"/>
+          <w:sz w:val="18"/>
+          <w:szCs w:val="18"/>
+        </w:rPr>
+        <w:t xml:space="preserve">  return null;  // 모든 큐가 비어 있는 경우</w:t>
+      </w:r>
+    </w:p>
+    <w:p>
+      <w:pPr>
+        <w:spacing w:after="0" w:line="240"/>
+        <w:ind w:left="360"/>
+      </w:pPr>
+      <w:r>
+        <w:rPr>
+          <w:rFonts w:ascii="Consolas" w:cs="Consolas" w:eastAsia="Consolas" w:hAnsi="Consolas"/>
+          <w:color w:val="333333"/>
+          <w:sz w:val="18"/>
+          <w:szCs w:val="18"/>
+        </w:rPr>
+        <w:t xml:space="preserve">}</w:t>
+      </w:r>
+    </w:p>
+    <w:p>
+      <w:pPr>
+        <w:spacing w:after="80"/>
+      </w:pPr>
+    </w:p>
+    <w:p>
+      <w:pPr>
+        <w:spacing w:after="120" w:line="360"/>
+      </w:pPr>
+      <w:r>
+        <w:rPr>
+          <w:rFonts w:ascii="맑은 고딕" w:cs="맑은 고딕" w:eastAsia="맑은 고딕" w:hAnsi="맑은 고딕"/>
+          <w:color w:val="000000"/>
+          <w:sz w:val="22"/>
+          <w:szCs w:val="22"/>
+        </w:rPr>
         <w:t xml:space="preserve">선점형 모드에서는 500ms 간격으로 현재 처리 중인 요청의 실행 시간을 확인한다. 시간 할당량을 초과한 요청은 하위 큐로 이동시키고, 상위 큐의 다음 요청을 먼저 처리한다. 큐 강등 시 해당 요청의 사용 시간은 0으로 리셋되어, 새 큐의 할당량을 처음부터 다시 받는다 (큐별 독립 할당량). 즉, Q0에서 1,000ms를 쓰고 Q1으로 내려오면, Q1에서는 3,000ms를 새로 부여받는다.</w:t>
       </w:r>
     </w:p>
@@ -5601,6 +5755,325 @@
         </w:rPr>
         <w:t xml:space="preserve">여기서 처리 비용은 요청 1건당 1로 고정하였다. 이렇게 한 이유는 다음과 같다. LLM 응답의 출력 토큰 수는 생성이 완료되기 전까지 알 수 없으므로, VFT 계산 시점에서 실제 처리 비용을 알 수 없다. 입력 토큰만으로는 실제 자원 소모를 정확히 반영하기 어렵다. 또한 공정성 측정(JFI)도 처리 건수 기준이므로, 스케줄링과 측정의 기준을 요청 건수로 일치시켰다.</w:t>
       </w:r>
+    </w:p>
+    <w:p>
+      <w:pPr>
+        <w:spacing w:after="120" w:line="360"/>
+      </w:pPr>
+      <w:r>
+        <w:rPr>
+          <w:rFonts w:ascii="맑은 고딕" w:cs="맑은 고딕" w:eastAsia="맑은 고딕" w:hAnsi="맑은 고딕"/>
+          <w:color w:val="000000"/>
+          <w:sz w:val="22"/>
+          <w:szCs w:val="22"/>
+        </w:rPr>
+        <w:t xml:space="preserve">WFQ 스케줄러의 핵심 동작은 두 부분으로 나뉜다. 요청이 들어올 때 VFT를 계산하여 저장하고, 다음 요청을 꺼낼 때 VFT가 가장 작은 요청을 선택한다.</w:t>
+      </w:r>
+    </w:p>
+    <w:p>
+      <w:pPr>
+        <w:spacing w:after="0" w:line="240"/>
+        <w:ind w:left="360"/>
+      </w:pPr>
+      <w:r>
+        <w:rPr>
+          <w:rFonts w:ascii="Consolas" w:cs="Consolas" w:eastAsia="Consolas" w:hAnsi="Consolas"/>
+          <w:color w:val="333333"/>
+          <w:sz w:val="18"/>
+          <w:szCs w:val="18"/>
+        </w:rPr>
+        <w:t xml:space="preserve">// WFQ 스케줄러: 요청을 대기열에 추가하며 VFT 계산</w:t>
+      </w:r>
+    </w:p>
+    <w:p>
+      <w:pPr>
+        <w:spacing w:after="0" w:line="240"/>
+        <w:ind w:left="360"/>
+      </w:pPr>
+      <w:r>
+        <w:rPr>
+          <w:rFonts w:ascii="Consolas" w:cs="Consolas" w:eastAsia="Consolas" w:hAnsi="Consolas"/>
+          <w:color w:val="333333"/>
+          <w:sz w:val="18"/>
+          <w:szCs w:val="18"/>
+        </w:rPr>
+        <w:t xml:space="preserve">enqueue(request) {</w:t>
+      </w:r>
+    </w:p>
+    <w:p>
+      <w:pPr>
+        <w:spacing w:after="0" w:line="240"/>
+        <w:ind w:left="360"/>
+      </w:pPr>
+      <w:r>
+        <w:rPr>
+          <w:rFonts w:ascii="Consolas" w:cs="Consolas" w:eastAsia="Consolas" w:hAnsi="Consolas"/>
+          <w:color w:val="333333"/>
+          <w:sz w:val="18"/>
+          <w:szCs w:val="18"/>
+        </w:rPr>
+        <w:t xml:space="preserve">  const tenant = this.tenants.get(request.tenantId);</w:t>
+      </w:r>
+    </w:p>
+    <w:p>
+      <w:pPr>
+        <w:spacing w:after="0" w:line="240"/>
+        <w:ind w:left="360"/>
+      </w:pPr>
+      <w:r>
+        <w:rPr>
+          <w:rFonts w:ascii="Consolas" w:cs="Consolas" w:eastAsia="Consolas" w:hAnsi="Consolas"/>
+          <w:color w:val="333333"/>
+          <w:sz w:val="18"/>
+          <w:szCs w:val="18"/>
+        </w:rPr>
+        <w:t xml:space="preserve">  // 현재 테넌트의 가상 시각과 전체 가상 시각 중 큰 값을 시작점으로</w:t>
+      </w:r>
+    </w:p>
+    <w:p>
+      <w:pPr>
+        <w:spacing w:after="0" w:line="240"/>
+        <w:ind w:left="360"/>
+      </w:pPr>
+      <w:r>
+        <w:rPr>
+          <w:rFonts w:ascii="Consolas" w:cs="Consolas" w:eastAsia="Consolas" w:hAnsi="Consolas"/>
+          <w:color w:val="333333"/>
+          <w:sz w:val="18"/>
+          <w:szCs w:val="18"/>
+        </w:rPr>
+        <w:t xml:space="preserve">  const startTime = Math.max(tenant.virtualTime, this.globalVirtualTime);</w:t>
+      </w:r>
+    </w:p>
+    <w:p>
+      <w:pPr>
+        <w:spacing w:after="0" w:line="240"/>
+        <w:ind w:left="360"/>
+      </w:pPr>
+      <w:r>
+        <w:rPr>
+          <w:rFonts w:ascii="Consolas" w:cs="Consolas" w:eastAsia="Consolas" w:hAnsi="Consolas"/>
+          <w:color w:val="333333"/>
+          <w:sz w:val="18"/>
+          <w:szCs w:val="18"/>
+        </w:rPr>
+        <w:t xml:space="preserve">  // 처리 비용 1을 가중치로 나눔 (가중치가 클수록 증가분이 작음)</w:t>
+      </w:r>
+    </w:p>
+    <w:p>
+      <w:pPr>
+        <w:spacing w:after="0" w:line="240"/>
+        <w:ind w:left="360"/>
+      </w:pPr>
+      <w:r>
+        <w:rPr>
+          <w:rFonts w:ascii="Consolas" w:cs="Consolas" w:eastAsia="Consolas" w:hAnsi="Consolas"/>
+          <w:color w:val="333333"/>
+          <w:sz w:val="18"/>
+          <w:szCs w:val="18"/>
+        </w:rPr>
+        <w:t xml:space="preserve">  request.virtualFinishTime = startTime + (1 / tenant.weight);</w:t>
+      </w:r>
+    </w:p>
+    <w:p>
+      <w:pPr>
+        <w:spacing w:after="0" w:line="240"/>
+        <w:ind w:left="360"/>
+      </w:pPr>
+      <w:r>
+        <w:rPr>
+          <w:rFonts w:ascii="Consolas" w:cs="Consolas" w:eastAsia="Consolas" w:hAnsi="Consolas"/>
+          <w:color w:val="333333"/>
+          <w:sz w:val="18"/>
+          <w:szCs w:val="18"/>
+        </w:rPr>
+        <w:t xml:space="preserve">  this.queue.push(request);</w:t>
+      </w:r>
+    </w:p>
+    <w:p>
+      <w:pPr>
+        <w:spacing w:after="0" w:line="240"/>
+        <w:ind w:left="360"/>
+      </w:pPr>
+      <w:r>
+        <w:rPr>
+          <w:rFonts w:ascii="Consolas" w:cs="Consolas" w:eastAsia="Consolas" w:hAnsi="Consolas"/>
+          <w:color w:val="333333"/>
+          <w:sz w:val="18"/>
+          <w:szCs w:val="18"/>
+        </w:rPr>
+        <w:t xml:space="preserve">}</w:t>
+      </w:r>
+    </w:p>
+    <w:p>
+      <w:pPr>
+        <w:spacing w:after="0" w:line="240"/>
+        <w:ind w:left="360"/>
+      </w:pPr>
+      <w:r>
+        <w:rPr>
+          <w:rFonts w:ascii="Consolas" w:cs="Consolas" w:eastAsia="Consolas" w:hAnsi="Consolas"/>
+          <w:color w:val="333333"/>
+          <w:sz w:val="18"/>
+          <w:szCs w:val="18"/>
+        </w:rPr>
+        <w:t xml:space="preserve"/>
+      </w:r>
+    </w:p>
+    <w:p>
+      <w:pPr>
+        <w:spacing w:after="0" w:line="240"/>
+        <w:ind w:left="360"/>
+      </w:pPr>
+      <w:r>
+        <w:rPr>
+          <w:rFonts w:ascii="Consolas" w:cs="Consolas" w:eastAsia="Consolas" w:hAnsi="Consolas"/>
+          <w:color w:val="333333"/>
+          <w:sz w:val="18"/>
+          <w:szCs w:val="18"/>
+        </w:rPr>
+        <w:t xml:space="preserve">// VFT가 가장 작은 요청을 선택하여 꺼내기</w:t>
+      </w:r>
+    </w:p>
+    <w:p>
+      <w:pPr>
+        <w:spacing w:after="0" w:line="240"/>
+        <w:ind w:left="360"/>
+      </w:pPr>
+      <w:r>
+        <w:rPr>
+          <w:rFonts w:ascii="Consolas" w:cs="Consolas" w:eastAsia="Consolas" w:hAnsi="Consolas"/>
+          <w:color w:val="333333"/>
+          <w:sz w:val="18"/>
+          <w:szCs w:val="18"/>
+        </w:rPr>
+        <w:t xml:space="preserve">dequeue() {</w:t>
+      </w:r>
+    </w:p>
+    <w:p>
+      <w:pPr>
+        <w:spacing w:after="0" w:line="240"/>
+        <w:ind w:left="360"/>
+      </w:pPr>
+      <w:r>
+        <w:rPr>
+          <w:rFonts w:ascii="Consolas" w:cs="Consolas" w:eastAsia="Consolas" w:hAnsi="Consolas"/>
+          <w:color w:val="333333"/>
+          <w:sz w:val="18"/>
+          <w:szCs w:val="18"/>
+        </w:rPr>
+        <w:t xml:space="preserve">  let minIdx = 0;</w:t>
+      </w:r>
+    </w:p>
+    <w:p>
+      <w:pPr>
+        <w:spacing w:after="0" w:line="240"/>
+        <w:ind w:left="360"/>
+      </w:pPr>
+      <w:r>
+        <w:rPr>
+          <w:rFonts w:ascii="Consolas" w:cs="Consolas" w:eastAsia="Consolas" w:hAnsi="Consolas"/>
+          <w:color w:val="333333"/>
+          <w:sz w:val="18"/>
+          <w:szCs w:val="18"/>
+        </w:rPr>
+        <w:t xml:space="preserve">  for (let i = 1; i &lt; this.queue.length; i++) {</w:t>
+      </w:r>
+    </w:p>
+    <w:p>
+      <w:pPr>
+        <w:spacing w:after="0" w:line="240"/>
+        <w:ind w:left="360"/>
+      </w:pPr>
+      <w:r>
+        <w:rPr>
+          <w:rFonts w:ascii="Consolas" w:cs="Consolas" w:eastAsia="Consolas" w:hAnsi="Consolas"/>
+          <w:color w:val="333333"/>
+          <w:sz w:val="18"/>
+          <w:szCs w:val="18"/>
+        </w:rPr>
+        <w:t xml:space="preserve">    if (this.queue[i].virtualFinishTime &lt; this.queue[minIdx].virtualFinishTime) {</w:t>
+      </w:r>
+    </w:p>
+    <w:p>
+      <w:pPr>
+        <w:spacing w:after="0" w:line="240"/>
+        <w:ind w:left="360"/>
+      </w:pPr>
+      <w:r>
+        <w:rPr>
+          <w:rFonts w:ascii="Consolas" w:cs="Consolas" w:eastAsia="Consolas" w:hAnsi="Consolas"/>
+          <w:color w:val="333333"/>
+          <w:sz w:val="18"/>
+          <w:szCs w:val="18"/>
+        </w:rPr>
+        <w:t xml:space="preserve">      minIdx = i;</w:t>
+      </w:r>
+    </w:p>
+    <w:p>
+      <w:pPr>
+        <w:spacing w:after="0" w:line="240"/>
+        <w:ind w:left="360"/>
+      </w:pPr>
+      <w:r>
+        <w:rPr>
+          <w:rFonts w:ascii="Consolas" w:cs="Consolas" w:eastAsia="Consolas" w:hAnsi="Consolas"/>
+          <w:color w:val="333333"/>
+          <w:sz w:val="18"/>
+          <w:szCs w:val="18"/>
+        </w:rPr>
+        <w:t xml:space="preserve">    }</w:t>
+      </w:r>
+    </w:p>
+    <w:p>
+      <w:pPr>
+        <w:spacing w:after="0" w:line="240"/>
+        <w:ind w:left="360"/>
+      </w:pPr>
+      <w:r>
+        <w:rPr>
+          <w:rFonts w:ascii="Consolas" w:cs="Consolas" w:eastAsia="Consolas" w:hAnsi="Consolas"/>
+          <w:color w:val="333333"/>
+          <w:sz w:val="18"/>
+          <w:szCs w:val="18"/>
+        </w:rPr>
+        <w:t xml:space="preserve">  }</w:t>
+      </w:r>
+    </w:p>
+    <w:p>
+      <w:pPr>
+        <w:spacing w:after="0" w:line="240"/>
+        <w:ind w:left="360"/>
+      </w:pPr>
+      <w:r>
+        <w:rPr>
+          <w:rFonts w:ascii="Consolas" w:cs="Consolas" w:eastAsia="Consolas" w:hAnsi="Consolas"/>
+          <w:color w:val="333333"/>
+          <w:sz w:val="18"/>
+          <w:szCs w:val="18"/>
+        </w:rPr>
+        <w:t xml:space="preserve">  return this.queue.splice(minIdx, 1)[0];</w:t>
+      </w:r>
+    </w:p>
+    <w:p>
+      <w:pPr>
+        <w:spacing w:after="0" w:line="240"/>
+        <w:ind w:left="360"/>
+      </w:pPr>
+      <w:r>
+        <w:rPr>
+          <w:rFonts w:ascii="Consolas" w:cs="Consolas" w:eastAsia="Consolas" w:hAnsi="Consolas"/>
+          <w:color w:val="333333"/>
+          <w:sz w:val="18"/>
+          <w:szCs w:val="18"/>
+        </w:rPr>
+        <w:t xml:space="preserve">}</w:t>
+      </w:r>
+    </w:p>
+    <w:p>
+      <w:pPr>
+        <w:spacing w:after="80"/>
+      </w:pPr>
     </w:p>
     <w:p>
       <w:pPr>
@@ -10515,7 +10988,7 @@
           <w:sz w:val="22"/>
           <w:szCs w:val="22"/>
         </w:rPr>
-        <w:t xml:space="preserve">이 결과가 우연이 아닌지 확인하기 위해, 5개 시드의 Short 요청 개선율을 비교하였다. 개선율은 71.8%에서 74.3% 사이에 분포하였으며, 대응표본 t-검정(paired t-test) 결과 t = 45.59 (자유도 4), p &lt; 0.001로 통계적으로 큰 차이가 있음을 확인하였다. 효과 크기 Cohen's d = 25.74로, 이는 매우 큰 효과에 해당한다. 5개 시드 모두에서 일관된 결과가 나왔으므로, MLFQ 선점형이 짧은 요청의 응답시간을 크게 줄이는 효과는 신뢰할 수 있다.</w:t>
+        <w:t xml:space="preserve">이 결과가 우연에 의한 것이 아닌지 확인하기 위해, 5개 시드의 Short 요청 개선율을 비교하였다. 개선율은 71.8%에서 74.3% 사이의 좁은 범위에 분포하여, 어떤 시드에서도 비슷한 수준의 개선이 나타났다. 대응표본 t-검정(paired t-test, 같은 조건에서 반복 측정한 두 값의 평균이 서로 다른지 확인하는 통계 방법)을 수행한 결과, p-값(관측된 차이가 우연에 의한 것일 확률)이 0.001 미만으로 나왔다. 이는 MLFQ 선점형의 개선 효과가 시드 선택과 무관하게 일관되게 나타남을 뜻한다. 따라서 MLFQ 선점형이 짧은 요청의 응답시간을 크게 줄이는 효과는 믿을 수 있다고 판단하였다.</w:t>
       </w:r>
     </w:p>
     <w:p>
@@ -12479,7 +12952,7 @@
           <w:sz w:val="22"/>
           <w:szCs w:val="22"/>
         </w:rPr>
-        <w:t xml:space="preserve">WFQ의 이중 JFI 분석</w:t>
+        <w:t xml:space="preserve">WFQ의 JFI를 두 가지 관점에서 살펴보기</w:t>
       </w:r>
       <w:r>
         <w:rPr>
@@ -12570,7 +13043,7 @@
           <w:sz w:val="22"/>
           <w:szCs w:val="22"/>
         </w:rPr>
-        <w:t xml:space="preserve">결론적으로, WFQ는 가중치에 비례하여 구독 등급 간 차등 서비스를 제공하는 것을 목표로 하며, 실험 결과가 이를 확인하였다.</w:t>
+        <w:t xml:space="preserve">정리하면, WFQ는 가중치에 비례하여 구독 등급 간 차등 서비스를 제공하는 것을 목표로 하며, 실험 결과가 이를 확인하였다.</w:t>
       </w:r>
     </w:p>
     <w:p>
@@ -13870,7 +14343,7 @@
           <w:sz w:val="22"/>
           <w:szCs w:val="22"/>
         </w:rPr>
-        <w:t xml:space="preserve"> 기본 실험에서는 요청당 10~100ms의 처리 시간을 사용하였으나, 실제 LLM 추론은 입력 길이, 출력 토큰 수, 모델 크기에 따라 수백 밀리초에서 수십 초까지 다양하다. 실서버 실험(5.4절)에서도 짧은 프롬프트에 대해 약 116ms의 처리 시간이 관측되었으나, 실제 활용 환경에서는 이보다 훨씬 긴 처리 시간이 예상된다.</w:t>
+        <w:t xml:space="preserve"> 기본 실험에서는 요청당 10~100ms의 처리 시간을 사용하였으나, 실제 LLM 추론은 입력 길이, 출력 토큰 수, 모델 크기에 따라 수백 밀리초에서 수십 초까지 다양하다. 실서버 실험(5.4절)에서도 짧은 프롬프트에 대해 약 116ms의 처리 시간이 측정되었으나, 실제 활용 환경에서는 이보다 훨씬 긴 처리 시간이 예상된다.</w:t>
       </w:r>
     </w:p>
     <w:p>
@@ -14039,28 +14512,6 @@
       </w:r>
     </w:p>
     <w:p>
-      <w:r>
-        <w:br w:type="page"/>
-      </w:r>
-    </w:p>
-    <w:p>
-      <w:pPr>
-        <w:pStyle w:val="Heading1"/>
-        <w:spacing w:after="200" w:before="360"/>
-      </w:pPr>
-      <w:r>
-        <w:rPr>
-          <w:rFonts w:ascii="맑은 고딕" w:cs="맑은 고딕" w:eastAsia="맑은 고딕" w:hAnsi="맑은 고딕"/>
-          <w:b/>
-          <w:bCs/>
-          <w:color w:val="000000"/>
-          <w:sz w:val="28"/>
-          <w:szCs w:val="28"/>
-        </w:rPr>
-        <w:t xml:space="preserve">7. 결론 및 향후 연구</w:t>
-      </w:r>
-    </w:p>
-    <w:p>
       <w:pPr>
         <w:pStyle w:val="Heading2"/>
         <w:spacing w:after="160" w:before="240"/>
@@ -14074,7 +14525,7 @@
           <w:sz w:val="24"/>
           <w:szCs w:val="24"/>
         </w:rPr>
-        <w:t xml:space="preserve">7.1 결론</w:t>
+        <w:t xml:space="preserve">6.3 프로젝트의 의의</w:t>
       </w:r>
     </w:p>
     <w:p>
@@ -14088,13 +14539,22 @@
           <w:sz w:val="22"/>
           <w:szCs w:val="22"/>
         </w:rPr>
-        <w:t xml:space="preserve">본 프로젝트에서는 운영체제의 스케줄링 알고리즘(FCFS, Priority Scheduling, MLFQ, WFQ)을 다중 사용자 LLM API 요청 관리에 적용하고, 시뮬레이션 및 실서버 실험을 통해 성능과 공정성을 비교하였다.</w:t>
+        <w:t xml:space="preserve">본 프로젝트는 두 가지 면에서 의의가 있다.</w:t>
       </w:r>
     </w:p>
     <w:p>
       <w:pPr>
         <w:spacing w:after="120" w:line="360"/>
       </w:pPr>
+      <w:r>
+        <w:rPr>
+          <w:rFonts w:ascii="맑은 고딕" w:cs="맑은 고딕" w:eastAsia="맑은 고딕" w:hAnsi="맑은 고딕"/>
+          <w:color w:val="000000"/>
+          <w:sz w:val="22"/>
+          <w:szCs w:val="22"/>
+        </w:rPr>
+        <w:t xml:space="preserve">첫째, </w:t>
+      </w:r>
       <w:r>
         <w:rPr>
           <w:rFonts w:ascii="맑은 고딕" w:cs="맑은 고딕" w:eastAsia="맑은 고딕" w:hAnsi="맑은 고딕"/>
@@ -14104,22 +14564,31 @@
           <w:sz w:val="22"/>
           <w:szCs w:val="22"/>
         </w:rPr>
-        <w:t xml:space="preserve">RQ1 (스케줄링 적용)</w:t>
-      </w:r>
-      <w:r>
-        <w:rPr>
-          <w:rFonts w:ascii="맑은 고딕" w:cs="맑은 고딕" w:eastAsia="맑은 고딕" w:hAnsi="맑은 고딕"/>
-          <w:color w:val="000000"/>
-          <w:sz w:val="22"/>
-          <w:szCs w:val="22"/>
-        </w:rPr>
-        <w:t xml:space="preserve">: 네 가지 스케줄링 알고리즘을 LLM API 환경에 맞게 구현하였다. 모든 알고리즘은 같은 인터페이스(enqueue/dequeue)를 따르도록 설계하여, 환경변수만으로 알고리즘을 전환할 수 있다. 다만, MLFQ의 선점형 모드는 실제 LLM 환경에서 적용이 어렵다는 한계를 확인하였다.</w:t>
+        <w:t xml:space="preserve">운영체제 이론의 실제 응용을 확인</w:t>
+      </w:r>
+      <w:r>
+        <w:rPr>
+          <w:rFonts w:ascii="맑은 고딕" w:cs="맑은 고딕" w:eastAsia="맑은 고딕" w:hAnsi="맑은 고딕"/>
+          <w:color w:val="000000"/>
+          <w:sz w:val="22"/>
+          <w:szCs w:val="22"/>
+        </w:rPr>
+        <w:t xml:space="preserve">하였다. CPU 스케줄링을 위해 개발된 FCFS, Priority Scheduling, MLFQ 알고리즘과 네트워크 자원 배분을 위한 WFQ 알고리즘을 LLM API 환경에 적용해보고 동작을 확인하였다. 교과서에서 배운 이론을 새로운 문제 영역에 적용해본 경험은, 앞으로 다른 영역의 문제를 해결할 때도 도움이 될 것이다.</w:t>
       </w:r>
     </w:p>
     <w:p>
       <w:pPr>
         <w:spacing w:after="120" w:line="360"/>
       </w:pPr>
+      <w:r>
+        <w:rPr>
+          <w:rFonts w:ascii="맑은 고딕" w:cs="맑은 고딕" w:eastAsia="맑은 고딕" w:hAnsi="맑은 고딕"/>
+          <w:color w:val="000000"/>
+          <w:sz w:val="22"/>
+          <w:szCs w:val="22"/>
+        </w:rPr>
+        <w:t xml:space="preserve">둘째, </w:t>
+      </w:r>
       <w:r>
         <w:rPr>
           <w:rFonts w:ascii="맑은 고딕" w:cs="맑은 고딕" w:eastAsia="맑은 고딕" w:hAnsi="맑은 고딕"/>
@@ -14129,21 +14598,41 @@
           <w:sz w:val="22"/>
           <w:szCs w:val="22"/>
         </w:rPr>
-        <w:t xml:space="preserve">RQ2 (성능 비교)</w:t>
-      </w:r>
-      <w:r>
-        <w:rPr>
-          <w:rFonts w:ascii="맑은 고딕" w:cs="맑은 고딕" w:eastAsia="맑은 고딕" w:hAnsi="맑은 고딕"/>
-          <w:color w:val="000000"/>
-          <w:sz w:val="22"/>
-          <w:szCs w:val="22"/>
-        </w:rPr>
-        <w:t xml:space="preserve">: 비선점형 환경에서 네 알고리즘의 전체 처리량은 유사하였다. 스케줄러는 처리 순서를 결정할 뿐, 처리 속도 자체를 변경하지 않기 때문이다. 선점형 MLFQ에서는 짧은 요청의 응답시간이 약 73% 감소하였으나, 긴 요청의 응답시간은 약 89% 증가하였다. WFQ에서는 구독 등급에 따른 대기시간 차등이 나타나, Enterprise 등급의 평균 대기시간이 Free 등급의 약 1/12 수준이었다.</w:t>
+        <w:t xml:space="preserve">기존 LLM 서빙 도구의 부족한 부분을 구체적으로 확인</w:t>
+      </w:r>
+      <w:r>
+        <w:rPr>
+          <w:rFonts w:ascii="맑은 고딕" w:cs="맑은 고딕" w:eastAsia="맑은 고딕" w:hAnsi="맑은 고딕"/>
+          <w:color w:val="000000"/>
+          <w:sz w:val="22"/>
+          <w:szCs w:val="22"/>
+        </w:rPr>
+        <w:t xml:space="preserve">하였다. vLLM, TGI 같은 기존 도구는 전체 처리량을 높이는 데 집중하고 있으며, 사용자별 공정성이나 요청 우선순위 관리는 제공하지 않는다. 본 프로젝트에서는 이 부분에 운영체제 스케줄링 이론을 적용하면 어떤 효과가 있는지를 네 가지 알고리즘 비교를 통해 확인하였다. 특히 WFQ가 가중치에 비례한 차등 서비스를 잘 구현한다는 점은, 유료 LLM 서비스의 구독 등급 관리에 활용할 수 있는 가능성을 보여준다.</w:t>
       </w:r>
     </w:p>
     <w:p>
       <w:pPr>
         <w:spacing w:after="120" w:line="360"/>
+      </w:pPr>
+      <w:r>
+        <w:rPr>
+          <w:rFonts w:ascii="맑은 고딕" w:cs="맑은 고딕" w:eastAsia="맑은 고딕" w:hAnsi="맑은 고딕"/>
+          <w:color w:val="000000"/>
+          <w:sz w:val="22"/>
+          <w:szCs w:val="22"/>
+        </w:rPr>
+        <w:t xml:space="preserve">다만 본 프로젝트는 최대 500건 규모의 작은 실험으로 확인한 결과이며, 실제 운영 환경의 대규모 요청에서도 같은 결과가 나올지는 추가 확인이 필요하다.</w:t>
+      </w:r>
+    </w:p>
+    <w:p>
+      <w:r>
+        <w:br w:type="page"/>
+      </w:r>
+    </w:p>
+    <w:p>
+      <w:pPr>
+        <w:pStyle w:val="Heading1"/>
+        <w:spacing w:after="200" w:before="360"/>
       </w:pPr>
       <w:r>
         <w:rPr>
@@ -14151,6 +14640,103 @@
           <w:b/>
           <w:bCs/>
           <w:color w:val="000000"/>
+          <w:sz w:val="28"/>
+          <w:szCs w:val="28"/>
+        </w:rPr>
+        <w:t xml:space="preserve">7. 결론 및 향후 연구</w:t>
+      </w:r>
+    </w:p>
+    <w:p>
+      <w:pPr>
+        <w:pStyle w:val="Heading2"/>
+        <w:spacing w:after="160" w:before="240"/>
+      </w:pPr>
+      <w:r>
+        <w:rPr>
+          <w:rFonts w:ascii="맑은 고딕" w:cs="맑은 고딕" w:eastAsia="맑은 고딕" w:hAnsi="맑은 고딕"/>
+          <w:b/>
+          <w:bCs/>
+          <w:color w:val="333333"/>
+          <w:sz w:val="24"/>
+          <w:szCs w:val="24"/>
+        </w:rPr>
+        <w:t xml:space="preserve">7.1 결론</w:t>
+      </w:r>
+    </w:p>
+    <w:p>
+      <w:pPr>
+        <w:spacing w:after="120" w:line="360"/>
+      </w:pPr>
+      <w:r>
+        <w:rPr>
+          <w:rFonts w:ascii="맑은 고딕" w:cs="맑은 고딕" w:eastAsia="맑은 고딕" w:hAnsi="맑은 고딕"/>
+          <w:color w:val="000000"/>
+          <w:sz w:val="22"/>
+          <w:szCs w:val="22"/>
+        </w:rPr>
+        <w:t xml:space="preserve">본 프로젝트에서는 운영체제의 스케줄링 알고리즘(FCFS, Priority Scheduling, MLFQ, WFQ)을 다중 사용자 LLM API 요청 관리에 적용하고, 시뮬레이션 및 실서버 실험을 통해 성능과 공정성을 비교하였다.</w:t>
+      </w:r>
+    </w:p>
+    <w:p>
+      <w:pPr>
+        <w:spacing w:after="120" w:line="360"/>
+      </w:pPr>
+      <w:r>
+        <w:rPr>
+          <w:rFonts w:ascii="맑은 고딕" w:cs="맑은 고딕" w:eastAsia="맑은 고딕" w:hAnsi="맑은 고딕"/>
+          <w:b/>
+          <w:bCs/>
+          <w:color w:val="000000"/>
+          <w:sz w:val="22"/>
+          <w:szCs w:val="22"/>
+        </w:rPr>
+        <w:t xml:space="preserve">RQ1 (스케줄링 적용)</w:t>
+      </w:r>
+      <w:r>
+        <w:rPr>
+          <w:rFonts w:ascii="맑은 고딕" w:cs="맑은 고딕" w:eastAsia="맑은 고딕" w:hAnsi="맑은 고딕"/>
+          <w:color w:val="000000"/>
+          <w:sz w:val="22"/>
+          <w:szCs w:val="22"/>
+        </w:rPr>
+        <w:t xml:space="preserve">: 네 가지 스케줄링 알고리즘을 LLM API 환경에 맞게 구현하였다. 모든 알고리즘은 같은 인터페이스(enqueue/dequeue)를 따르도록 설계하여, 환경변수만으로 알고리즘을 전환할 수 있다. 다만, MLFQ의 선점형 모드는 실제 LLM 환경에서 적용이 어렵다는 한계를 확인하였다.</w:t>
+      </w:r>
+    </w:p>
+    <w:p>
+      <w:pPr>
+        <w:spacing w:after="120" w:line="360"/>
+      </w:pPr>
+      <w:r>
+        <w:rPr>
+          <w:rFonts w:ascii="맑은 고딕" w:cs="맑은 고딕" w:eastAsia="맑은 고딕" w:hAnsi="맑은 고딕"/>
+          <w:b/>
+          <w:bCs/>
+          <w:color w:val="000000"/>
+          <w:sz w:val="22"/>
+          <w:szCs w:val="22"/>
+        </w:rPr>
+        <w:t xml:space="preserve">RQ2 (성능 비교)</w:t>
+      </w:r>
+      <w:r>
+        <w:rPr>
+          <w:rFonts w:ascii="맑은 고딕" w:cs="맑은 고딕" w:eastAsia="맑은 고딕" w:hAnsi="맑은 고딕"/>
+          <w:color w:val="000000"/>
+          <w:sz w:val="22"/>
+          <w:szCs w:val="22"/>
+        </w:rPr>
+        <w:t xml:space="preserve">: 비선점형 환경에서 네 알고리즘의 전체 처리량은 유사하였다. 스케줄러는 처리 순서를 결정할 뿐, 처리 속도 자체를 변경하지 않기 때문이다. 선점형 MLFQ에서는 짧은 요청의 응답시간이 약 73% 감소하였으나, 긴 요청의 응답시간은 약 89% 증가하였다. WFQ에서는 구독 등급에 따른 대기시간 차등이 나타나, Enterprise 등급의 평균 대기시간이 Free 등급의 약 1/12 수준이었다.</w:t>
+      </w:r>
+    </w:p>
+    <w:p>
+      <w:pPr>
+        <w:spacing w:after="120" w:line="360"/>
+      </w:pPr>
+      <w:r>
+        <w:rPr>
+          <w:rFonts w:ascii="맑은 고딕" w:cs="맑은 고딕" w:eastAsia="맑은 고딕" w:hAnsi="맑은 고딕"/>
+          <w:b/>
+          <w:bCs/>
+          <w:color w:val="000000"/>
           <w:sz w:val="22"/>
           <w:szCs w:val="22"/>
         </w:rPr>
@@ -14177,7 +14763,7 @@
           <w:sz w:val="22"/>
           <w:szCs w:val="22"/>
         </w:rPr>
-        <w:t xml:space="preserve">부가적으로, Rate Limiter를 통한 구독 등급별 요청 제한 기능도 구현하여, 스케줄러와 독립적으로 과도한 요청을 사전에 차단할 수 있음을 확인하였다.</w:t>
+        <w:t xml:space="preserve">또한 Rate Limiter를 통한 구독 등급별 요청 제한 기능도 구현하여, 스케줄러와 독립적으로 과도한 요청을 사전에 차단할 수 있음을 확인하였다.</w:t>
       </w:r>
     </w:p>
     <w:p>

</xml_diff>

<commit_message>
Add final report files and package configuration
- Created package.json for figures with dependencies: playwright, pptxgenjs, and sharp.
- Added .gitkeep to the final directory to ensure it is tracked.
- Included final-report.docx in the final directory.
- Added a versioned final-report.docx in the snapshot subdirectory.
- Created snapshot-info.md to document the snapshot details, including creation date, skill, status, version, and next iteration plans.
</commit_message>
<xml_diff>
--- a/06-final-report/final/final-report.docx
+++ b/06-final-report/final/final-report.docx
@@ -854,7 +854,7 @@
           <w:sz w:val="22"/>
           <w:szCs w:val="22"/>
         </w:rPr>
-        <w:t xml:space="preserve">프로세스 스케줄링은 운영체제에서 CPU 자원을 여러 프로세스에 나누어 주기 위한 방법이다. 어떤 순서로 처리할지에 따라 다양한 알고리즘이 연구되어 왔다 [3]. 본 프로젝트에서 사용한 네 가지 알고리즘의 핵심 특성은 그림 8과 같다.</w:t>
+        <w:t xml:space="preserve">프로세스 스케줄링은 운영체제에서 CPU 자원을 여러 프로세스에 나누어 주기 위한 방법이다. 어떤 순서로 처리할지에 따라 다양한 알고리즘이 연구되어 왔다 [3]. 본 프로젝트에서 사용한 네 가지 알고리즘의 핵심 특성은 그림 7과 같다.</w:t>
       </w:r>
     </w:p>
     <w:p>
@@ -922,7 +922,7 @@
           <w:sz w:val="20"/>
           <w:szCs w:val="20"/>
         </w:rPr>
-        <w:t xml:space="preserve">[그림 8] 스케줄링 알고리즘 개념 비교</w:t>
+        <w:t xml:space="preserve">[그림 7] 스케줄링 알고리즘 개념 비교</w:t>
       </w:r>
     </w:p>
     <w:p>
@@ -3085,7 +3085,7 @@
           <w:sz w:val="22"/>
           <w:szCs w:val="22"/>
         </w:rPr>
-        <w:t xml:space="preserve"> 한도를 초과한 요청은 거부(HTTP 429)되고, 허용된 요청만 다음 단계로 진행한다.</w:t>
+        <w:t xml:space="preserve"> 한도를 초과한 요청은 거부(HTTP 429 Too Many Requests)되고, 허용된 요청만 다음 단계로 진행한다.</w:t>
       </w:r>
     </w:p>
     <w:p>
@@ -4577,7 +4577,7 @@
           <w:sz w:val="22"/>
           <w:szCs w:val="22"/>
         </w:rPr>
-        <w:t xml:space="preserve">4개 알고리즘 중 FCFS와 Priority는 구현이 단순하므로, 여기서는 상대적으로 복잡한 MLFQ와 WFQ의 핵심 동작만 설명한다.</w:t>
+        <w:t xml:space="preserve">4개 알고리즘 중 FCFS와 Priority는 구현이 단순하므로, 여기서는 구현이 더 복잡한 MLFQ와 WFQ의 핵심 동작만 설명한다.</w:t>
       </w:r>
     </w:p>
     <w:p>
@@ -6689,7 +6689,7 @@
           <w:sz w:val="22"/>
           <w:szCs w:val="22"/>
         </w:rPr>
-        <w:t xml:space="preserve">실험은 크게 세 가지로 구분된다 (그림 9). 기본 실험과 MLFQ 선점형 실험은 시간 기반 시뮬레이션으로, 실서버 실험은 Ollama를 활용한 실제 LLM 호출로 수행하였다.</w:t>
+        <w:t xml:space="preserve">실험은 크게 세 가지로 구분된다 (그림 8). 기본 실험과 MLFQ 선점형 실험은 시간 기반 시뮬레이션으로, 실서버 실험은 Ollama를 활용한 실제 LLM 호출로 수행하였다.</w:t>
       </w:r>
     </w:p>
     <w:p>
@@ -6757,7 +6757,7 @@
           <w:sz w:val="20"/>
           <w:szCs w:val="20"/>
         </w:rPr>
-        <w:t xml:space="preserve">[그림 9] 실험 환경 구성도</w:t>
+        <w:t xml:space="preserve">[그림 8] 실험 환경 구성도</w:t>
       </w:r>
     </w:p>
     <w:p>
@@ -14147,79 +14147,6 @@
         </w:tc>
       </w:tr>
     </w:tbl>
-    <w:p>
-      <w:pPr>
-        <w:spacing w:after="80"/>
-      </w:pPr>
-    </w:p>
-    <w:p>
-      <w:pPr>
-        <w:spacing w:after="80"/>
-      </w:pPr>
-    </w:p>
-    <w:p>
-      <w:pPr>
-        <w:spacing w:after="100" w:before="100"/>
-        <w:jc w:val="center"/>
-      </w:pPr>
-      <w:r>
-        <w:drawing>
-          <wp:inline distT="0" distB="0" distL="0" distR="0">
-            <wp:extent cx="5400675" cy="3038475"/>
-            <wp:effectExtent t="0" r="0" b="0" l="0"/>
-            <wp:docPr id="1" name="" descr="" title=""/>
-            <wp:cNvGraphicFramePr>
-              <a:graphicFrameLocks xmlns:a="http://schemas.openxmlformats.org/drawingml/2006/main" noChangeAspect="1"/>
-            </wp:cNvGraphicFramePr>
-            <a:graphic xmlns:a="http://schemas.openxmlformats.org/drawingml/2006/main">
-              <a:graphicData uri="http://schemas.openxmlformats.org/drawingml/2006/picture">
-                <pic:pic xmlns:pic="http://schemas.openxmlformats.org/drawingml/2006/picture">
-                  <pic:nvPicPr>
-                    <pic:cNvPr id="0" name="" descr=""/>
-                    <pic:cNvPicPr>
-                      <a:picLocks noChangeAspect="1" noChangeArrowheads="1"/>
-                    </pic:cNvPicPr>
-                  </pic:nvPicPr>
-                  <pic:blipFill>
-                    <a:blip r:embed="rId17" cstate="none"/>
-                    <a:srcRect/>
-                    <a:stretch>
-                      <a:fillRect/>
-                    </a:stretch>
-                  </pic:blipFill>
-                  <pic:spPr bwMode="auto">
-                    <a:xfrm>
-                      <a:off x="0" y="0"/>
-                      <a:ext cx="5400675" cy="3038475"/>
-                    </a:xfrm>
-                    <a:prstGeom prst="rect">
-                      <a:avLst/>
-                    </a:prstGeom>
-                  </pic:spPr>
-                </pic:pic>
-              </a:graphicData>
-            </a:graphic>
-          </wp:inline>
-        </w:drawing>
-      </w:r>
-    </w:p>
-    <w:p>
-      <w:pPr>
-        <w:spacing w:after="120" w:line="360"/>
-        <w:jc w:val="center"/>
-      </w:pPr>
-      <w:r>
-        <w:rPr>
-          <w:rFonts w:ascii="맑은 고딕" w:cs="맑은 고딕" w:eastAsia="맑은 고딕" w:hAnsi="맑은 고딕"/>
-          <w:i/>
-          <w:iCs/>
-          <w:color w:val="666666"/>
-          <w:sz w:val="20"/>
-          <w:szCs w:val="20"/>
-        </w:rPr>
-        <w:t xml:space="preserve">[그림 7] 알고리즘 특성 비교 요약</w:t>
-      </w:r>
-    </w:p>
     <w:p>
       <w:pPr>
         <w:spacing w:after="80"/>

</xml_diff>

<commit_message>
Add snapshots and final report updates for phases A, B, C, and D
- Created snapshots for final report including figures and documentation.
- Updated final report with corrections and clarifications from phases A, B, C, and D.
- Added new figures in PNG and PPTX formats to enhance report visuals.
- Documented changes and restoration procedures in snapshot-info.md for future reference.
</commit_message>
<xml_diff>
--- a/06-final-report/final/final-report.docx
+++ b/06-final-report/final/final-report.docx
@@ -1027,7 +1027,7 @@
           <w:sz w:val="22"/>
           <w:szCs w:val="22"/>
         </w:rPr>
-        <w:t xml:space="preserve">는 네트워크 분야에서 사용되는 공정한 자원 배분 알고리즘이다. WFQ는 GPS(Generalized Processor Sharing)라는 이론적 모델을 실제로 구현한 것이다. GPS는 모든 사용자에게 가중치에 비례하여 자원을 동시에 나누어주는 이상적인 모델이지만, 실제 시스템에서는 요청을 동시에 처리하는 것이 불가능하다. WFQ는 이를 해결하기 위해 가상 완료 시각(Virtual Finish Time, VFT)이라는 값을 계산한다. VFT는 "이 요청이 가상으로 언제잤 처리 완료될지"를 나타내는 계산값으로, 이 값이 작을수록 먼저 처리된다. VFT가 가장 작은 요청부터 처리하는 방식으로 GPS와 비슷한 공정한 배분 결과를 얻는다 [4]. 각 사용자에 가중치를 부여하고, 가중치가 클수록 VFT가 느리게 증가하여 더 자주 선택되고, 결과적으로 더 많은 자원을 받게 된다. 카페에 비유하면, 가중치가 큰 사용자는 큰 컵을 들고 있어 한 번에 더 많은 양을 받는 것과 같고, 가중치가 작은 사용자는 작은 컵을 들고 있어 조금씩 받는 것과 같다. WFQ는 인터넷 라우터의 트래픽 관리에서 널리 사용되며, 서비스 등급별로 대역폭을 차등 배분하는 QoS(Quality of Service) 정책의 기반이 된다 [4]. 구체적인 VFT 계산 방식은 4.3절에서 설명한다.</w:t>
+        <w:t xml:space="preserve">는 네트워크 분야에서 사용되는 공정한 자원 배분 알고리즘이다. WFQ는 GPS(Generalized Processor Sharing)라는 이론적 모델을 실제로 구현한 것이다. GPS는 모든 사용자에게 가중치에 비례하여 자원을 동시에 나누어주는 이상적인 모델이지만, 실제 시스템에서는 요청을 동시에 처리하는 것이 불가능하다. WFQ는 이를 해결하기 위해 가상 완료 시각(Virtual Finish Time, VFT)이라는 값을 계산한다. VFT는 "이 요청이 가상으로 언제 처리 완료될지"를 나타내는 계산값으로, 이 값이 작을수록 먼저 처리된다. VFT가 가장 작은 요청부터 처리하는 방식으로 GPS와 비슷한 공정한 배분 결과를 얻는다 [4]. 각 사용자에 가중치를 부여하고, 가중치가 클수록 VFT가 느리게 증가하여 더 자주 선택되고, 결과적으로 더 많은 자원을 받게 된다. 카페에 비유하면, 가중치가 큰 사용자는 큰 컵을 들고 있어 한 번에 더 많은 양을 받는 것과 같고, 가중치가 작은 사용자는 작은 컵을 들고 있어 조금씩 받는 것과 같다. WFQ는 인터넷 라우터의 트래픽 관리에서 널리 사용되며, 서비스 등급별로 대역폭을 차등 배분하는 QoS(Quality of Service) 정책의 기반이 된다 [4]. 구체적인 VFT 계산 방식은 4.3절에서 설명한다.</w:t>
       </w:r>
     </w:p>
     <w:p>
@@ -1211,6 +1211,20 @@
           <w:szCs w:val="22"/>
         </w:rPr>
         <w:t xml:space="preserve">JFI는 네트워크 대역폭 배분, CPU 스케줄링 등 다양한 자원 공유 시스템에서 널리 사용된다. 본 프로젝트에서도 이 지표를 활용하여 각 스케줄링 알고리즘의 공정성을 비교하였다. 다만, WFQ처럼 가중치에 따라 자원을 의도적으로 다르게 배분하는 알고리즘에서는 단순 JFI 대신 가중치를 반영한 JFI를 사용해야 정확한 공정성 평가가 가능하다 (5.5절 참조).</w:t>
+      </w:r>
+    </w:p>
+    <w:p>
+      <w:pPr>
+        <w:spacing w:after="120" w:line="360"/>
+      </w:pPr>
+      <w:r>
+        <w:rPr>
+          <w:rFonts w:ascii="맑은 고딕" w:cs="맑은 고딕" w:eastAsia="맑은 고딕" w:hAnsi="맑은 고딕"/>
+          <w:color w:val="000000"/>
+          <w:sz w:val="22"/>
+          <w:szCs w:val="22"/>
+        </w:rPr>
+        <w:t xml:space="preserve">지금까지 살펴본 스케줄링 이론과 공정성 측정 방법을 실제 LLM API 요청 관리 시스템에 어떻게 적용할 것인지, 다음 장에서는 시스템 설계 관점으로 기술한다.</w:t>
       </w:r>
     </w:p>
     <w:p>
@@ -2151,23 +2165,6 @@
     </w:p>
     <w:p>
       <w:pPr>
-        <w:spacing w:after="120" w:line="360"/>
-        <w:ind w:left="360"/>
-      </w:pPr>
-      <w:r>
-        <w:rPr>
-          <w:rFonts w:ascii="맑은 고딕" w:cs="맑은 고딕" w:eastAsia="맑은 고딕" w:hAnsi="맑은 고딕"/>
-          <w:i/>
-          <w:iCs/>
-          <w:color w:val="333333"/>
-          <w:sz w:val="22"/>
-          <w:szCs w:val="22"/>
-        </w:rPr>
-        <w:t xml:space="preserve">JFI 산출은 실험이 끝난 뒤 처리 결과를 집계하는 방식으로 수행하였다. 실험 중에 실시간으로 계산하는 것이 아니라, 모든 요청이 처리된 뒤 각 사용자별 처리량을 모아서 계산하였다.</w:t>
-      </w:r>
-    </w:p>
-    <w:p>
-      <w:pPr>
         <w:pStyle w:val="Heading2"/>
         <w:spacing w:after="160" w:before="240"/>
       </w:pPr>
@@ -3207,6 +3204,20 @@
       </w:r>
     </w:p>
     <w:p>
+      <w:pPr>
+        <w:spacing w:after="120" w:line="360"/>
+      </w:pPr>
+      <w:r>
+        <w:rPr>
+          <w:rFonts w:ascii="맑은 고딕" w:cs="맑은 고딕" w:eastAsia="맑은 고딕" w:hAnsi="맑은 고딕"/>
+          <w:color w:val="000000"/>
+          <w:sz w:val="22"/>
+          <w:szCs w:val="22"/>
+        </w:rPr>
+        <w:t xml:space="preserve">다음 장에서는 이러한 설계가 실제 코드로 어떻게 구현되었는지를 기술 스택, 모듈 구조, 핵심 알고리즘 순으로 살펴본다.</w:t>
+      </w:r>
+    </w:p>
+    <w:p>
       <w:r>
         <w:br w:type="page"/>
       </w:r>
@@ -6741,6 +6752,20 @@
       </w:r>
     </w:p>
     <w:p>
+      <w:pPr>
+        <w:spacing w:after="120" w:line="360"/>
+      </w:pPr>
+      <w:r>
+        <w:rPr>
+          <w:rFonts w:ascii="맑은 고딕" w:cs="맑은 고딕" w:eastAsia="맑은 고딕" w:hAnsi="맑은 고딕"/>
+          <w:color w:val="000000"/>
+          <w:sz w:val="22"/>
+          <w:szCs w:val="22"/>
+        </w:rPr>
+        <w:t xml:space="preserve">다음 장에서는 구현된 네 스케줄러의 동작 특성과 공정성을, 시뮬레이션 실험과 실서버 실험을 통해 비교한 결과를 제시한다.</w:t>
+      </w:r>
+    </w:p>
+    <w:p>
       <w:r>
         <w:br w:type="page"/>
       </w:r>
@@ -8961,6 +8986,23 @@
     </w:p>
     <w:p>
       <w:pPr>
+        <w:spacing w:after="120" w:line="360"/>
+        <w:ind w:left="360"/>
+      </w:pPr>
+      <w:r>
+        <w:rPr>
+          <w:rFonts w:ascii="맑은 고딕" w:cs="맑은 고딕" w:eastAsia="맑은 고딕" w:hAnsi="맑은 고딕"/>
+          <w:i/>
+          <w:iCs/>
+          <w:color w:val="333333"/>
+          <w:sz w:val="22"/>
+          <w:szCs w:val="22"/>
+        </w:rPr>
+        <w:t xml:space="preserve">JFI 산출은 실험 중 실시간으로 계산하는 것이 아니라, 모든 요청이 처리된 뒤 각 사용자별 처리량 또는 대기시간을 집계하여 계산하였다. 계산 방식의 세부 차이는 5.5절에서 다룬다.</w:t>
+      </w:r>
+    </w:p>
+    <w:p>
+      <w:pPr>
         <w:pStyle w:val="Heading2"/>
         <w:spacing w:after="160" w:before="240"/>
       </w:pPr>
@@ -9003,7 +9045,7 @@
           <w:sz w:val="22"/>
           <w:szCs w:val="22"/>
         </w:rPr>
-        <w:t xml:space="preserve">표 10. 알고리즘별 성능 비교 (500건)</w:t>
+        <w:t xml:space="preserve">표 10. 알고리즘별 성능 비교 (500건, 지표: 대기시간 기준)</w:t>
       </w:r>
     </w:p>
     <w:tbl>
@@ -9623,6 +9665,20 @@
       <w:pPr>
         <w:spacing w:after="80"/>
       </w:pPr>
+    </w:p>
+    <w:p>
+      <w:pPr>
+        <w:spacing w:after="120" w:line="360"/>
+      </w:pPr>
+      <w:r>
+        <w:rPr>
+          <w:rFonts w:ascii="맑은 고딕" w:cs="맑은 고딕" w:eastAsia="맑은 고딕" w:hAnsi="맑은 고딕"/>
+          <w:color w:val="000000"/>
+          <w:sz w:val="22"/>
+          <w:szCs w:val="22"/>
+        </w:rPr>
+        <w:t xml:space="preserve">여기서 "대기시간(wait time)"은 요청이 대기열에 들어간 시점부터 처리가 시작된 시점까지의 시간이며, 처리 시간 자체는 포함하지 않는다. 5.3절의 선점형 MLFQ 비교에서는 대신 "응답시간(response time, 도착부터 완료까지)"을 사용하는데, 이는 선점형에서 처리가 여러 번 중단·재개되어 "대기시간" 하나로는 성능을 비교하기 어렵기 때문이다.</w:t>
+      </w:r>
     </w:p>
     <w:p>
       <w:pPr>
@@ -9769,7 +9825,7 @@
           <w:sz w:val="22"/>
           <w:szCs w:val="22"/>
         </w:rPr>
-        <w:t xml:space="preserve">: FCFS와 완전히 동일한 결과가 나왔다 (평균 대기시간 약 12,203ms, 처리량 약 18.72 req/s, JFI 1.000). 비선점형에서는 모든 요청이 중단 없이 완료되므로, Q0에서 처리가 끝나 큐 이동이 발생하지 않기 때문이다. 이 결과가 MLFQ 선점형 실험을 추가 수행한 계기이다.</w:t>
+        <w:t xml:space="preserve">: FCFS와 완전히 동일한 결과가 나왔다 (평균 대기시간 약 12,203ms, 처리량 약 18.72 req/s, JFI 1.000). 두 가지 이유 때문이다. 첫째, 본 기본 실험의 처리 시간이 10~100ms로 짧아 모든 요청이 Q0의 시간 할당량(1,000ms) 안에 완료되어 큐 강등이 일어나지 않는다. 둘째, 비선점형 환경에서는 한번 처리가 시작된 요청이 중단되지 않으므로, 대기열에 있는 요청 중에서도 가장 높은 큐(Q0)의 요청부터 꺼내는 동작이 결과적으로 도착 순서와 같아진다. 이 결과는 MLFQ가 비선점형 환경에서 FCFS 이상의 효과를 내지 못한다는 것을 의미하며, MLFQ의 이론적 효과(짧은 요청 우대)를 확인하기 위해 5.3절의 선점형 시뮬레이션 실험을 추가로 수행하였다.</w:t>
       </w:r>
     </w:p>
     <w:p>
@@ -10342,7 +10398,7 @@
           <w:sz w:val="22"/>
           <w:szCs w:val="22"/>
         </w:rPr>
-        <w:t xml:space="preserve">표 12. MLFQ 선점형 vs FCFS 비교 (요청 유형별, 5회 평균)</w:t>
+        <w:t xml:space="preserve">표 12. MLFQ 선점형 vs FCFS 비교 (요청 유형별, 5회 평균, 지표: 응답시간 기준)</w:t>
       </w:r>
     </w:p>
     <w:tbl>
@@ -11089,7 +11145,7 @@
           <w:sz w:val="22"/>
           <w:szCs w:val="22"/>
         </w:rPr>
-        <w:t xml:space="preserve">이 결과가 우연에 의한 것이 아닌지 확인하기 위해, 5개 시드의 Short 요청 개선율을 비교하였다. 개선율은 71.8%에서 74.3% 사이의 좁은 범위에 분포하여, 어떤 시드에서도 비슷한 수준의 개선이 나타났다.</w:t>
+        <w:t xml:space="preserve">이 결과가 우연에 의한 것이 아닌지 확인하기 위해, 5개 시드의 Short 요청 개선율을 비교하였다. 개선율은 71.8%에서 74.3% 사이의 좁은 범위에 분포하여, 어떤 시드에서도 비슷한 수준의 개선이 나타났다 (시드별 세부 수치는 부록 B의 표 18 참조).</w:t>
       </w:r>
     </w:p>
     <w:p>
@@ -12493,6 +12549,71 @@
     </w:p>
     <w:p>
       <w:pPr>
+        <w:spacing w:after="120" w:line="360"/>
+      </w:pPr>
+      <w:r>
+        <w:rPr>
+          <w:rFonts w:ascii="맑은 고딕" w:cs="맑은 고딕" w:eastAsia="맑은 고딕" w:hAnsi="맑은 고딕"/>
+          <w:b/>
+          <w:bCs/>
+          <w:color w:val="000000"/>
+          <w:sz w:val="22"/>
+          <w:szCs w:val="22"/>
+        </w:rPr>
+        <w:t xml:space="preserve">JFI 계산 방식의 이원성 주의</w:t>
+      </w:r>
+      <w:r>
+        <w:rPr>
+          <w:rFonts w:ascii="맑은 고딕" w:cs="맑은 고딕" w:eastAsia="맑은 고딕" w:hAnsi="맑은 고딕"/>
+          <w:color w:val="000000"/>
+          <w:sz w:val="22"/>
+          <w:szCs w:val="22"/>
+        </w:rPr>
+        <w:t xml:space="preserve">: 본 실험에서는 JFI를 두 가지 방식으로 계산하였으며, 알고리즘마다 적용한 방식이 다르다. FCFS, Priority, MLFQ는 등급 간 대기시간 차이를 측정하기 위해 </w:t>
+      </w:r>
+      <w:r>
+        <w:rPr>
+          <w:rFonts w:ascii="맑은 고딕" w:cs="맑은 고딕" w:eastAsia="맑은 고딕" w:hAnsi="맑은 고딕"/>
+          <w:b/>
+          <w:bCs/>
+          <w:color w:val="000000"/>
+          <w:sz w:val="22"/>
+          <w:szCs w:val="22"/>
+        </w:rPr>
+        <w:t xml:space="preserve">대기시간 기반 JFI</w:t>
+      </w:r>
+      <w:r>
+        <w:rPr>
+          <w:rFonts w:ascii="맑은 고딕" w:cs="맑은 고딕" w:eastAsia="맑은 고딕" w:hAnsi="맑은 고딕"/>
+          <w:color w:val="000000"/>
+          <w:sz w:val="22"/>
+          <w:szCs w:val="22"/>
+        </w:rPr>
+        <w:t xml:space="preserve">를 사용하였고(값이 1에 가까울수록 등급 간 대기시간이 균등함), WFQ는 가중치에 비례한 처리량 배분을 측정하기 위해 WFQScheduler 내장의 </w:t>
+      </w:r>
+      <w:r>
+        <w:rPr>
+          <w:rFonts w:ascii="맑은 고딕" w:cs="맑은 고딕" w:eastAsia="맑은 고딕" w:hAnsi="맑은 고딕"/>
+          <w:b/>
+          <w:bCs/>
+          <w:color w:val="000000"/>
+          <w:sz w:val="22"/>
+          <w:szCs w:val="22"/>
+        </w:rPr>
+        <w:t xml:space="preserve">처리량 기반 JFI</w:t>
+      </w:r>
+      <w:r>
+        <w:rPr>
+          <w:rFonts w:ascii="맑은 고딕" w:cs="맑은 고딕" w:eastAsia="맑은 고딕" w:hAnsi="맑은 고딕"/>
+          <w:color w:val="000000"/>
+          <w:sz w:val="22"/>
+          <w:szCs w:val="22"/>
+        </w:rPr>
+        <w:t xml:space="preserve">를 사용하였다(처리량이 가중치에 정확히 비례하면 1에 가까워짐). 따라서 표 15의 0.316과 1.000을 단순 비교하는 것은 적절하지 않으며, WFQ의 0.316은 "공정성 실패"가 아닌 "의도한 차등이 작동 중"을 의미한다.</w:t>
+      </w:r>
+    </w:p>
+    <w:p>
+      <w:pPr>
         <w:spacing w:after="80" w:line="360"/>
       </w:pPr>
       <w:r>
@@ -12520,14 +12641,15 @@
         </w:tblBorders>
       </w:tblPr>
       <w:tblGrid>
-        <w:gridCol w:w="2644"/>
-        <w:gridCol w:w="2644"/>
-        <w:gridCol w:w="2644"/>
+        <w:gridCol w:w="1983"/>
+        <w:gridCol w:w="1983"/>
+        <w:gridCol w:w="1983"/>
+        <w:gridCol w:w="1983"/>
       </w:tblGrid>
       <w:tr>
         <w:tc>
           <w:tcPr>
-            <w:tcW w:type="dxa" w:w="2644"/>
+            <w:tcW w:type="dxa" w:w="1983"/>
             <w:tcBorders>
               <w:top w:val="single" w:color="AAAAAA" w:sz="1"/>
               <w:left w:val="single" w:color="AAAAAA" w:sz="1"/>
@@ -12557,7 +12679,7 @@
         </w:tc>
         <w:tc>
           <w:tcPr>
-            <w:tcW w:type="dxa" w:w="2644"/>
+            <w:tcW w:type="dxa" w:w="1983"/>
             <w:tcBorders>
               <w:top w:val="single" w:color="AAAAAA" w:sz="1"/>
               <w:left w:val="single" w:color="AAAAAA" w:sz="1"/>
@@ -12587,7 +12709,7 @@
         </w:tc>
         <w:tc>
           <w:tcPr>
-            <w:tcW w:type="dxa" w:w="2644"/>
+            <w:tcW w:type="dxa" w:w="1983"/>
             <w:tcBorders>
               <w:top w:val="single" w:color="AAAAAA" w:sz="1"/>
               <w:left w:val="single" w:color="AAAAAA" w:sz="1"/>
@@ -12611,6 +12733,36 @@
                 <w:sz w:val="20"/>
                 <w:szCs w:val="20"/>
               </w:rPr>
+              <w:t xml:space="preserve">계산 방식</w:t>
+            </w:r>
+          </w:p>
+        </w:tc>
+        <w:tc>
+          <w:tcPr>
+            <w:tcW w:type="dxa" w:w="1983"/>
+            <w:tcBorders>
+              <w:top w:val="single" w:color="AAAAAA" w:sz="1"/>
+              <w:left w:val="single" w:color="AAAAAA" w:sz="1"/>
+              <w:bottom w:val="single" w:color="AAAAAA" w:sz="1"/>
+              <w:right w:val="single" w:color="AAAAAA" w:sz="1"/>
+            </w:tcBorders>
+            <w:shd w:fill="D9E2F3" w:val="clear"/>
+            <w:vAlign w:val="center"/>
+          </w:tcPr>
+          <w:p>
+            <w:pPr>
+              <w:spacing w:after="40" w:before="40"/>
+              <w:jc w:val="center"/>
+            </w:pPr>
+            <w:r>
+              <w:rPr>
+                <w:rFonts w:ascii="맑은 고딕" w:cs="맑은 고딕" w:eastAsia="맑은 고딕" w:hAnsi="맑은 고딕"/>
+                <w:b/>
+                <w:bCs/>
+                <w:color w:val="000000"/>
+                <w:sz w:val="20"/>
+                <w:szCs w:val="20"/>
+              </w:rPr>
               <w:t xml:space="preserve">해석</w:t>
             </w:r>
           </w:p>
@@ -12619,7 +12771,7 @@
       <w:tr>
         <w:tc>
           <w:tcPr>
-            <w:tcW w:type="dxa" w:w="2644"/>
+            <w:tcW w:type="dxa" w:w="1983"/>
             <w:tcBorders>
               <w:top w:val="single" w:color="AAAAAA" w:sz="1"/>
               <w:left w:val="single" w:color="AAAAAA" w:sz="1"/>
@@ -12648,7 +12800,7 @@
         </w:tc>
         <w:tc>
           <w:tcPr>
-            <w:tcW w:type="dxa" w:w="2644"/>
+            <w:tcW w:type="dxa" w:w="1983"/>
             <w:tcBorders>
               <w:top w:val="single" w:color="AAAAAA" w:sz="1"/>
               <w:left w:val="single" w:color="AAAAAA" w:sz="1"/>
@@ -12677,7 +12829,36 @@
         </w:tc>
         <w:tc>
           <w:tcPr>
-            <w:tcW w:type="dxa" w:w="2644"/>
+            <w:tcW w:type="dxa" w:w="1983"/>
+            <w:tcBorders>
+              <w:top w:val="single" w:color="AAAAAA" w:sz="1"/>
+              <w:left w:val="single" w:color="AAAAAA" w:sz="1"/>
+              <w:bottom w:val="single" w:color="AAAAAA" w:sz="1"/>
+              <w:right w:val="single" w:color="AAAAAA" w:sz="1"/>
+            </w:tcBorders>
+            <w:vAlign w:val="center"/>
+          </w:tcPr>
+          <w:p>
+            <w:pPr>
+              <w:spacing w:after="40" w:before="40"/>
+              <w:jc w:val="left"/>
+            </w:pPr>
+            <w:r>
+              <w:rPr>
+                <w:rFonts w:ascii="맑은 고딕" w:cs="맑은 고딕" w:eastAsia="맑은 고딕" w:hAnsi="맑은 고딕"/>
+                <w:b w:val="false"/>
+                <w:bCs w:val="false"/>
+                <w:color w:val="000000"/>
+                <w:sz w:val="20"/>
+                <w:szCs w:val="20"/>
+              </w:rPr>
+              <w:t xml:space="preserve">대기시간 기반</w:t>
+            </w:r>
+          </w:p>
+        </w:tc>
+        <w:tc>
+          <w:tcPr>
+            <w:tcW w:type="dxa" w:w="1983"/>
             <w:tcBorders>
               <w:top w:val="single" w:color="AAAAAA" w:sz="1"/>
               <w:left w:val="single" w:color="AAAAAA" w:sz="1"/>
@@ -12708,7 +12889,7 @@
       <w:tr>
         <w:tc>
           <w:tcPr>
-            <w:tcW w:type="dxa" w:w="2644"/>
+            <w:tcW w:type="dxa" w:w="1983"/>
             <w:tcBorders>
               <w:top w:val="single" w:color="AAAAAA" w:sz="1"/>
               <w:left w:val="single" w:color="AAAAAA" w:sz="1"/>
@@ -12737,7 +12918,7 @@
         </w:tc>
         <w:tc>
           <w:tcPr>
-            <w:tcW w:type="dxa" w:w="2644"/>
+            <w:tcW w:type="dxa" w:w="1983"/>
             <w:tcBorders>
               <w:top w:val="single" w:color="AAAAAA" w:sz="1"/>
               <w:left w:val="single" w:color="AAAAAA" w:sz="1"/>
@@ -12766,7 +12947,36 @@
         </w:tc>
         <w:tc>
           <w:tcPr>
-            <w:tcW w:type="dxa" w:w="2644"/>
+            <w:tcW w:type="dxa" w:w="1983"/>
+            <w:tcBorders>
+              <w:top w:val="single" w:color="AAAAAA" w:sz="1"/>
+              <w:left w:val="single" w:color="AAAAAA" w:sz="1"/>
+              <w:bottom w:val="single" w:color="AAAAAA" w:sz="1"/>
+              <w:right w:val="single" w:color="AAAAAA" w:sz="1"/>
+            </w:tcBorders>
+            <w:vAlign w:val="center"/>
+          </w:tcPr>
+          <w:p>
+            <w:pPr>
+              <w:spacing w:after="40" w:before="40"/>
+              <w:jc w:val="left"/>
+            </w:pPr>
+            <w:r>
+              <w:rPr>
+                <w:rFonts w:ascii="맑은 고딕" w:cs="맑은 고딕" w:eastAsia="맑은 고딕" w:hAnsi="맑은 고딕"/>
+                <w:b w:val="false"/>
+                <w:bCs w:val="false"/>
+                <w:color w:val="000000"/>
+                <w:sz w:val="20"/>
+                <w:szCs w:val="20"/>
+              </w:rPr>
+              <w:t xml:space="preserve">대기시간 기반</w:t>
+            </w:r>
+          </w:p>
+        </w:tc>
+        <w:tc>
+          <w:tcPr>
+            <w:tcW w:type="dxa" w:w="1983"/>
             <w:tcBorders>
               <w:top w:val="single" w:color="AAAAAA" w:sz="1"/>
               <w:left w:val="single" w:color="AAAAAA" w:sz="1"/>
@@ -12797,7 +13007,7 @@
       <w:tr>
         <w:tc>
           <w:tcPr>
-            <w:tcW w:type="dxa" w:w="2644"/>
+            <w:tcW w:type="dxa" w:w="1983"/>
             <w:tcBorders>
               <w:top w:val="single" w:color="AAAAAA" w:sz="1"/>
               <w:left w:val="single" w:color="AAAAAA" w:sz="1"/>
@@ -12826,7 +13036,7 @@
         </w:tc>
         <w:tc>
           <w:tcPr>
-            <w:tcW w:type="dxa" w:w="2644"/>
+            <w:tcW w:type="dxa" w:w="1983"/>
             <w:tcBorders>
               <w:top w:val="single" w:color="AAAAAA" w:sz="1"/>
               <w:left w:val="single" w:color="AAAAAA" w:sz="1"/>
@@ -12855,7 +13065,36 @@
         </w:tc>
         <w:tc>
           <w:tcPr>
-            <w:tcW w:type="dxa" w:w="2644"/>
+            <w:tcW w:type="dxa" w:w="1983"/>
+            <w:tcBorders>
+              <w:top w:val="single" w:color="AAAAAA" w:sz="1"/>
+              <w:left w:val="single" w:color="AAAAAA" w:sz="1"/>
+              <w:bottom w:val="single" w:color="AAAAAA" w:sz="1"/>
+              <w:right w:val="single" w:color="AAAAAA" w:sz="1"/>
+            </w:tcBorders>
+            <w:vAlign w:val="center"/>
+          </w:tcPr>
+          <w:p>
+            <w:pPr>
+              <w:spacing w:after="40" w:before="40"/>
+              <w:jc w:val="left"/>
+            </w:pPr>
+            <w:r>
+              <w:rPr>
+                <w:rFonts w:ascii="맑은 고딕" w:cs="맑은 고딕" w:eastAsia="맑은 고딕" w:hAnsi="맑은 고딕"/>
+                <w:b w:val="false"/>
+                <w:bCs w:val="false"/>
+                <w:color w:val="000000"/>
+                <w:sz w:val="20"/>
+                <w:szCs w:val="20"/>
+              </w:rPr>
+              <w:t xml:space="preserve">대기시간 기반</w:t>
+            </w:r>
+          </w:p>
+        </w:tc>
+        <w:tc>
+          <w:tcPr>
+            <w:tcW w:type="dxa" w:w="1983"/>
             <w:tcBorders>
               <w:top w:val="single" w:color="AAAAAA" w:sz="1"/>
               <w:left w:val="single" w:color="AAAAAA" w:sz="1"/>
@@ -12886,7 +13125,7 @@
       <w:tr>
         <w:tc>
           <w:tcPr>
-            <w:tcW w:type="dxa" w:w="2644"/>
+            <w:tcW w:type="dxa" w:w="1983"/>
             <w:tcBorders>
               <w:top w:val="single" w:color="AAAAAA" w:sz="1"/>
               <w:left w:val="single" w:color="AAAAAA" w:sz="1"/>
@@ -12915,7 +13154,7 @@
         </w:tc>
         <w:tc>
           <w:tcPr>
-            <w:tcW w:type="dxa" w:w="2644"/>
+            <w:tcW w:type="dxa" w:w="1983"/>
             <w:tcBorders>
               <w:top w:val="single" w:color="AAAAAA" w:sz="1"/>
               <w:left w:val="single" w:color="AAAAAA" w:sz="1"/>
@@ -12944,7 +13183,36 @@
         </w:tc>
         <w:tc>
           <w:tcPr>
-            <w:tcW w:type="dxa" w:w="2644"/>
+            <w:tcW w:type="dxa" w:w="1983"/>
+            <w:tcBorders>
+              <w:top w:val="single" w:color="AAAAAA" w:sz="1"/>
+              <w:left w:val="single" w:color="AAAAAA" w:sz="1"/>
+              <w:bottom w:val="single" w:color="AAAAAA" w:sz="1"/>
+              <w:right w:val="single" w:color="AAAAAA" w:sz="1"/>
+            </w:tcBorders>
+            <w:vAlign w:val="center"/>
+          </w:tcPr>
+          <w:p>
+            <w:pPr>
+              <w:spacing w:after="40" w:before="40"/>
+              <w:jc w:val="left"/>
+            </w:pPr>
+            <w:r>
+              <w:rPr>
+                <w:rFonts w:ascii="맑은 고딕" w:cs="맑은 고딕" w:eastAsia="맑은 고딕" w:hAnsi="맑은 고딕"/>
+                <w:b w:val="false"/>
+                <w:bCs w:val="false"/>
+                <w:color w:val="000000"/>
+                <w:sz w:val="20"/>
+                <w:szCs w:val="20"/>
+              </w:rPr>
+              <w:t xml:space="preserve">처리량 기반</w:t>
+            </w:r>
+          </w:p>
+        </w:tc>
+        <w:tc>
+          <w:tcPr>
+            <w:tcW w:type="dxa" w:w="1983"/>
             <w:tcBorders>
               <w:top w:val="single" w:color="AAAAAA" w:sz="1"/>
               <w:left w:val="single" w:color="AAAAAA" w:sz="1"/>
@@ -13155,7 +13423,7 @@
           <w:sz w:val="22"/>
           <w:szCs w:val="22"/>
         </w:rPr>
-        <w:t xml:space="preserve">: Enterprise의 평균 대기시간(약 2,046ms)은 Free(약 21,790ms)에 비해 약 10배 빠르며, 이는 가중치 비율(100:1)에 대응하는 결과이다. Premium(약 8,301ms)과 Standard(약 15,247ms)도 가중치 순서에 맞는 대기시간을 보였다. 본 실험에서는 등급당 1명의 사용자를 배치하였으므로, 같은 등급 내 복수 사용자 간 공정성은 검증 범위에 포함되지 않는다. 등급 내 공정성 분석은 향후 연구 과제로 남긴다.</w:t>
+        <w:t xml:space="preserve">: Enterprise의 평균 대기시간(약 1,862ms)은 Free(약 22,029ms)에 비해 약 12배 빠르며, 이는 가중치 비율(100:1)에 대응하는 결과이다. Premium(약 8,384ms)과 Standard(약 15,109ms)도 가중치 순서에 맞는 대기시간을 보였다. 본 실험에서는 등급당 1명의 사용자를 배치하였으므로, 같은 등급 내 복수 사용자 간 공정성은 검증 범위에 포함되지 않는다. 등급 내 공정성 분석은 향후 연구 과제로 남긴다.</w:t>
       </w:r>
     </w:p>
     <w:p>
@@ -14279,6 +14547,20 @@
       </w:pPr>
     </w:p>
     <w:p>
+      <w:pPr>
+        <w:spacing w:after="120" w:line="360"/>
+      </w:pPr>
+      <w:r>
+        <w:rPr>
+          <w:rFonts w:ascii="맑은 고딕" w:cs="맑은 고딕" w:eastAsia="맑은 고딕" w:hAnsi="맑은 고딕"/>
+          <w:color w:val="000000"/>
+          <w:sz w:val="22"/>
+          <w:szCs w:val="22"/>
+        </w:rPr>
+        <w:t xml:space="preserve">이어지는 논의 장에서는 이 결과가 실제 LLM 서빙 환경에서 갖는 의미와, 시뮬레이션 기반 실험이 가진 한계를 정리한다.</w:t>
+      </w:r>
+    </w:p>
+    <w:p>
       <w:r>
         <w:br w:type="page"/>
       </w:r>
@@ -14777,7 +15059,7 @@
           <w:sz w:val="22"/>
           <w:szCs w:val="22"/>
         </w:rPr>
-        <w:t xml:space="preserve">: 비선점형 환경에서 네 알고리즘의 전체 처리량은 유사하였다. 스케줄러는 처리 순서를 결정할 뿐, 처리 속도 자체를 변경하지 않기 때문이다. 선점형 MLFQ에서는 짧은 요청의 응답시간이 약 73% 감소하였으나, 긴 요청의 응답시간은 약 89% 증가하였다. WFQ에서는 구독 등급에 따른 대기시간 차등이 나타나, Enterprise 등급의 평균 대기시간이 Free 등급의 약 1/12 수준이었다.</w:t>
+        <w:t xml:space="preserve">: 비선점형 환경에서 네 알고리즘의 전체 처리량은 유사하였다. 스케줄러는 처리 순서를 결정할 뿐, 처리 속도 자체를 변경하지 않기 때문이다. 선점형 MLFQ에서는 짧은 요청의 응답시간이 약 73% 감소하였으나, 긴 요청의 응답시간은 약 89% 증가하였다. 이 개선 효과는 5개 시드에서 71.8~74.3% 범위로 일관되게 재현되었고(p &lt; 0.001, Cohen's d = 20.39), 특정 시드의 우연에 의한 결과가 아님을 확인하였다. WFQ에서는 구독 등급에 따른 대기시간 차등이 나타나, Enterprise 등급의 평균 대기시간이 Free 등급의 약 1/12 수준이었다.</w:t>
       </w:r>
     </w:p>
     <w:p>
@@ -14802,7 +15084,7 @@
           <w:sz w:val="22"/>
           <w:szCs w:val="22"/>
         </w:rPr>
-        <w:t xml:space="preserve">: FCFS, Priority, MLFQ(비선점형)의 JFI는 모두 1.000으로 사용자 간 균등 배분이 이루어졌다. WFQ의 시스템 수준 JFI는 0.316이었으나, 이는 가중치에 따른 의도적 차등 배분의 결과이다. Enterprise의 대기시간이 Free보다 약 10배 짧아, 가중치 비율(100:1)에 대응하는 차등 서비스가 확인되었다.</w:t>
+        <w:t xml:space="preserve">: FCFS, Priority, MLFQ(비선점형)의 JFI는 모두 1.000으로 사용자 간 균등 배분이 이루어졌다. WFQ의 시스템 수준 JFI는 0.316이었으나, 이는 가중치에 따른 의도적 차등 배분의 결과이다. Enterprise의 대기시간이 Free보다 약 12배 짧아, 가중치 비율(100:1) 수준의 극단적 차이는 아니지만 가중치 순서에 대응하는 차등 서비스가 확인되었다.</w:t>
       </w:r>
     </w:p>
     <w:p>
@@ -14949,7 +15231,7 @@
           <w:sz w:val="22"/>
           <w:szCs w:val="22"/>
         </w:rPr>
-        <w:t xml:space="preserve">이다. 본 실험에서는 최대 500건의 요청으로 실험하였다. 수천 건 이상의 요청, 더 많은 사용자 수, 더 긴 처리 시간 등 더 큰 규모의 환경에서 각 알고리즘이 잘 동작하는지 확인할 수 있을 것이다.</w:t>
+        <w:t xml:space="preserve">이다. 본 실험에서는 최대 500건의 요청으로 실험하였다. 수천 건 이상의 요청, 더 많은 사용자 수, 더 긴 처리 시간 등 더 큰 규모의 환경에서 각 알고리즘이 어떤 특성을 보이는지 확인할 수 있을 것이다.</w:t>
       </w:r>
     </w:p>
     <w:p>
@@ -15991,7 +16273,7 @@
           <w:sz w:val="22"/>
           <w:szCs w:val="22"/>
         </w:rPr>
-        <w:t xml:space="preserve">표 18. MLFQ 선점형 실험 시드별 결과</w:t>
+        <w:t xml:space="preserve">표 18. MLFQ 선점형 실험 시드별 결과 (지표: Short 요청 응답시간)</w:t>
       </w:r>
     </w:p>
     <w:tbl>
@@ -16860,6 +17142,31 @@
           <w:szCs w:val="22"/>
         </w:rPr>
         <w:t xml:space="preserve">통계 검증 결과: t = 45.59, p &lt; 0.001, Cohen's d = 20.39, 95% CI [71.89%, 74.51%]</w:t>
+      </w:r>
+    </w:p>
+    <w:p>
+      <w:pPr>
+        <w:spacing w:after="120" w:line="360"/>
+      </w:pPr>
+      <w:r>
+        <w:rPr>
+          <w:rFonts w:ascii="맑은 고딕" w:cs="맑은 고딕" w:eastAsia="맑은 고딕" w:hAnsi="맑은 고딕"/>
+          <w:b/>
+          <w:bCs/>
+          <w:color w:val="000000"/>
+          <w:sz w:val="22"/>
+          <w:szCs w:val="22"/>
+        </w:rPr>
+        <w:t xml:space="preserve">선점형 시뮬레이션의 한계</w:t>
+      </w:r>
+      <w:r>
+        <w:rPr>
+          <w:rFonts w:ascii="맑은 고딕" w:cs="맑은 고딕" w:eastAsia="맑은 고딕" w:hAnsi="맑은 고딕"/>
+          <w:color w:val="000000"/>
+          <w:sz w:val="22"/>
+          <w:szCs w:val="22"/>
+        </w:rPr>
+        <w:t xml:space="preserve">: 부록 B의 결과는 LLM 추론을 임의 시점에 중단·재개할 수 있다고 가정한 시뮬레이션 수치이다. 실제 Ollama 등 LLM 서빙 도구는 추론 중단 기능을 제공하지 않으므로, 이 표의 개선율은 "선점이 가능할 경우 기대할 수 있는 이론적 상한"으로 해석해야 한다. 실서버에서는 비선점형 MLFQ만 적용 가능하며, 이 경우 5.2절에서 확인한 바와 같이 FCFS와 동일한 결과가 나타난다.</w:t>
       </w:r>
     </w:p>
     <w:sectPr>

</xml_diff>

<commit_message>
Update final report generation and add new figures
- Changed the markdown file name from 'final-report-v6.md' to 'final-report-v7.md' in the report generation script.
- Updated the final report document to reflect the latest changes.
- Added multiple new figures and their corresponding PowerPoint files to the snapshots directory, enhancing the visual representation of the report.
- Included a new final report document in the snapshots directory for version control.
</commit_message>
<xml_diff>
--- a/06-final-report/final/final-report.docx
+++ b/06-final-report/final/final-report.docx
@@ -8011,7 +8011,7 @@
                 <w:sz w:val="20"/>
                 <w:szCs w:val="20"/>
               </w:rPr>
-              <w:t xml:space="preserve">순차 도착</w:t>
+              <w:t xml:space="preserve">버스트 (20건 동시 도착)</w:t>
             </w:r>
           </w:p>
         </w:tc>
@@ -8967,7 +8967,7 @@
           <w:sz w:val="22"/>
           <w:szCs w:val="22"/>
         </w:rPr>
-        <w:t xml:space="preserve">: 기본 실험에서는 요청이 1~10ms 간격으로 순차 도착한다. 즉, 한 번에 하나씩 도착하며 동시 도착은 없다. MLFQ 선점형 실험에서는 20건의 요청이 동시에 도착하고, 2초 후 다시 20건이 도착하는 버스트(Burst) 패턴을 사용하였다. 대기열에 여러 요청이 쌓인 상태에서 스케줄링이 이루어지도록 하기 위함이다. 모든 실험에서 요청은 한 번에 1건씩 순차 처리되며, 동시 처리는 하지 않는다.</w:t>
+        <w:t xml:space="preserve">: 기본 실험에서는 요청이 1~10ms 간격으로 순차 도착한다. 즉, 한 번에 하나씩 도착하며 동시 도착은 없다. MLFQ 선점형 실험에서는 20건의 요청이 동시에 도착하고, 2초 후 다시 20건이 도착하는 버스트(Burst) 패턴을 사용하였다. 실서버 실험 역시 20건의 요청을 동시에 투입하는 버스트 패턴을 사용하였다. 대기열에 여러 요청이 쌓인 상태에서 스케줄러가 처리 순서를 결정하도록 하기 위함이다. 모든 실험에서 요청은 한 번에 1건씩 순차 처리되며, 동시 처리는 하지 않는다.</w:t>
       </w:r>
     </w:p>
     <w:p>
@@ -11170,7 +11170,7 @@
           <w:sz w:val="22"/>
           <w:szCs w:val="22"/>
         </w:rPr>
-        <w:t xml:space="preserve">: 대응표본 t-검정(paired t-test, 같은 조건에서 반복 측정한 두 값의 평균이 서로 다른지 확인하는 통계 방법)을 수행한 결과, p-값(관측된 차이가 우연에 의한 것일 확률)이 0.001 미만으로 나왔다. 95% 신뢰구간(Confidence Interval, 실험을 반복했을 때 참값이 포함될 것으로 기대되는 범위)은 [71.89%, 74.51%]로, 개선율이 약 72~75% 범위에서 안정적으로 나타남을 확인하였다. 효과 크기를 나타내는 Cohen's d(두 집단의 차이가 얼마나 의미 있는 크기인지를 보여주는 지표로, 일반적으로 0.8 이상이면 큰 효과로 판단)는 20.39로, 이는 MLFQ 선점형의 개선이 시드 간 편차에 비해 매우 크고 일관적임을 의미한다. 이처럼 높은 효과 크기는 Short 요청의 응답시간 차이(약 46만ms)가 시드 간 변동(표준편차 약 2.3만ms)에 비해 압도적으로 크기 때문이다. 따라서 MLFQ 선점형이 짧은 요청의 응답시간을 크게 줄이는 효과는 통계적으로 유의미하다고 판단하였다.</w:t>
+        <w:t xml:space="preserve">: 대응표본 t-검정(paired t-test, 같은 조건에서 반복 측정한 두 값의 평균이 서로 다른지 확인하는 통계 방법)을 수행한 결과, p-값(관측된 차이가 우연에 의한 것일 확률)이 0.001 미만으로 나왔다. 95% 신뢰구간(Confidence Interval, 실험을 반복했을 때 참값이 포함될 것으로 기대되는 범위)은 [71.89%, 74.51%]로, 개선율이 약 72~75% 범위에서 안정적으로 나타남을 확인하였다. 효과 크기를 나타내는 Cohen's d(두 집단의 차이가 얼마나 의미 있는 크기인지를 보여주는 지표로, 일반적으로 0.8 이상이면 큰 효과로 판단)는 20.39로, 이는 MLFQ 선점형의 개선이 시드 간 편차에 비해 매우 크고 일관적임을 의미한다. 이처럼 높은 효과 크기는 Short 요청의 응답시간 차이(약 46만ms)가 시드 간 변동(표준편차 약 2.3만ms)에 비해 압도적으로 크기 때문이다. 따라서 MLFQ 선점형이 짧은 요청의 응답시간을 크게 줄이는 효과는 통계적으로 유의미하다고 판단하였다. 위 통계 수치는 `experiments-simple/compute-stats.js` 스크립트를 실행하여 재현할 수 있으며, 계산 세부는 부록 B에서 다룬다.</w:t>
       </w:r>
     </w:p>
     <w:p>
@@ -11201,7 +11201,7 @@
           <w:sz w:val="22"/>
           <w:szCs w:val="22"/>
         </w:rPr>
-        <w:t xml:space="preserve">시뮬레이션에서 확인한 스케줄링 순서 차이가 실제 LLM 환경에서도 나타나는지 확인하기 위해, Ollama를 활용한 실서버 실험을 수행하였다. 사용 모델은 llama3.2이며, 출력을 최대 20토큰으로 제한하여 짧은 응답을 생성하도록 하였다. 총 20건의 요청(등급별 5건)을 보내고, FCFS, Priority, WFQ 세 알고리즘을 비교하였다. 비선점형 MLFQ는 5.2절에서 확인한 대로 FCFS와 동일한 결과가 예상되므로 비교 대상에서 제외하였다.</w:t>
+        <w:t xml:space="preserve">시뮬레이션에서 확인한 스케줄링 순서 차이가 실제 LLM 환경에서도 나타나는지 확인하기 위해, Ollama를 활용한 실서버 실험을 수행하였다. 사용 모델은 llama3.2이며, 출력을 최대 20토큰으로 제한하여 짧은 응답을 생성하도록 하였다. 총 20건의 요청(등급별 5건)을 동시에 큐에 투입한 뒤, 스케줄러가 결정한 순서대로 Ollama에 전달하여 응답을 받았다. FCFS, Priority, WFQ 세 알고리즘을 비교하였으며, 비선점형 MLFQ는 5.2절에서 확인한 대로 FCFS와 동일한 결과가 예상되므로 비교 대상에서 제외하였다.</w:t>
       </w:r>
     </w:p>
     <w:p>
@@ -13380,16 +13380,16 @@
           <w:sz w:val="22"/>
           <w:szCs w:val="22"/>
         </w:rPr>
-        <w:t xml:space="preserve">시스템 수준 JFI (= 0.316)</w:t>
-      </w:r>
-      <w:r>
-        <w:rPr>
-          <w:rFonts w:ascii="맑은 고딕" w:cs="맑은 고딕" w:eastAsia="맑은 고딕" w:hAnsi="맑은 고딕"/>
-          <w:color w:val="000000"/>
-          <w:sz w:val="22"/>
-          <w:szCs w:val="22"/>
-        </w:rPr>
-        <w:t xml:space="preserve">: 전체 사용자의 대기시간 분포를 단순 비교한 값이다. Enterprise와 Free의 대기시간 차이가 크므로 낮은 값이 나온다. 이 값은 WFQ가 "의도한 대로 차등 서비스를 제공하고 있다"는 것을 보여준다.</w:t>
+        <w:t xml:space="preserve">처리량 기반 JFI (= 0.316)</w:t>
+      </w:r>
+      <w:r>
+        <w:rPr>
+          <w:rFonts w:ascii="맑은 고딕" w:cs="맑은 고딕" w:eastAsia="맑은 고딕" w:hAnsi="맑은 고딕"/>
+          <w:color w:val="000000"/>
+          <w:sz w:val="22"/>
+          <w:szCs w:val="22"/>
+        </w:rPr>
+        <w:t xml:space="preserve">: WFQScheduler 내부에서 각 사용자의 "처리된 요청 수 ÷ 가중치" 값을 구한 뒤 JFI 공식에 대입한 결과이다. 본 실험은 라운드 로빈 방식으로 사용자당 125건씩 동일한 요청 수를 배정하였으므로, 가중치가 작은 Free(1)일수록 이 비율이 커지고 가중치가 큰 Enterprise(100)일수록 비율이 작아진다. 따라서 JFI가 1에서 멀어지는데, 이는 "WFQ가 가중치 비례가 아닌 요청 수 비례로 처리했다면 나타났을 불균형"을 의미한다. 반대로 말하면, 0.316이라는 값 자체가 WFQ가 라운드 로빈 배정을 그대로 따르지 않고 가중치를 반영해 처리했다는 증거이다.</w:t>
       </w:r>
     </w:p>
     <w:p>
@@ -13414,16 +13414,16 @@
           <w:sz w:val="22"/>
           <w:szCs w:val="22"/>
         </w:rPr>
-        <w:t xml:space="preserve">등급 간 차등의 적절성</w:t>
-      </w:r>
-      <w:r>
-        <w:rPr>
-          <w:rFonts w:ascii="맑은 고딕" w:cs="맑은 고딕" w:eastAsia="맑은 고딕" w:hAnsi="맑은 고딕"/>
-          <w:color w:val="000000"/>
-          <w:sz w:val="22"/>
-          <w:szCs w:val="22"/>
-        </w:rPr>
-        <w:t xml:space="preserve">: Enterprise의 평균 대기시간(약 1,862ms)은 Free(약 22,029ms)에 비해 약 12배 빠르며, 이는 가중치 비율(100:1)에 대응하는 결과이다. Premium(약 8,384ms)과 Standard(약 15,109ms)도 가중치 순서에 맞는 대기시간을 보였다. 본 실험에서는 등급당 1명의 사용자를 배치하였으므로, 같은 등급 내 복수 사용자 간 공정성은 검증 범위에 포함되지 않는다. 등급 내 공정성 분석은 향후 연구 과제로 남긴다.</w:t>
+        <w:t xml:space="preserve">등급 간 대기시간 차등의 적절성</w:t>
+      </w:r>
+      <w:r>
+        <w:rPr>
+          <w:rFonts w:ascii="맑은 고딕" w:cs="맑은 고딕" w:eastAsia="맑은 고딕" w:hAnsi="맑은 고딕"/>
+          <w:color w:val="000000"/>
+          <w:sz w:val="22"/>
+          <w:szCs w:val="22"/>
+        </w:rPr>
+        <w:t xml:space="preserve">: 실제 대기시간을 보면 Enterprise의 평균 대기시간(약 1,862ms)은 Free(약 22,029ms)에 비해 약 12배 짧으며, 이는 가중치 비율(100:1)에 대응하는 결과이다. Premium(약 8,384ms)과 Standard(약 15,109ms)도 가중치 순서에 맞는 대기시간을 보였다. 본 실험에서는 등급당 1명의 사용자를 배치하였으므로, 같은 등급 내 복수 사용자 간 공정성은 검증 범위에 포함되지 않는다. 등급 내 공정성 분석은 향후 연구 과제로 남긴다.</w:t>
       </w:r>
     </w:p>
     <w:p>
@@ -15715,7 +15715,7 @@
                 <w:sz w:val="20"/>
                 <w:szCs w:val="20"/>
               </w:rPr>
-              <w:t xml:space="preserve">schedulers/fcfsScheduler.js</w:t>
+              <w:t xml:space="preserve">api/routes.js</w:t>
             </w:r>
           </w:p>
         </w:tc>
@@ -15744,7 +15744,7 @@
                 <w:sz w:val="20"/>
                 <w:szCs w:val="20"/>
               </w:rPr>
-              <w:t xml:space="preserve">FCFS 스케줄러</w:t>
+              <w:t xml:space="preserve">API 라우팅</w:t>
             </w:r>
           </w:p>
         </w:tc>
@@ -15773,7 +15773,7 @@
                 <w:sz w:val="20"/>
                 <w:szCs w:val="20"/>
               </w:rPr>
-              <w:t xml:space="preserve">도착 순서 기반 FIFO 처리</w:t>
+              <w:t xml:space="preserve">요청 등록/조회 엔드포인트 정의</w:t>
             </w:r>
           </w:p>
         </w:tc>
@@ -15804,7 +15804,7 @@
                 <w:sz w:val="20"/>
                 <w:szCs w:val="20"/>
               </w:rPr>
-              <w:t xml:space="preserve">schedulers/priorityScheduler.js</w:t>
+              <w:t xml:space="preserve">schedulers/FCFSScheduler.js</w:t>
             </w:r>
           </w:p>
         </w:tc>
@@ -15833,7 +15833,7 @@
                 <w:sz w:val="20"/>
                 <w:szCs w:val="20"/>
               </w:rPr>
-              <w:t xml:space="preserve">Priority 스케줄러</w:t>
+              <w:t xml:space="preserve">FCFS 스케줄러</w:t>
             </w:r>
           </w:p>
         </w:tc>
@@ -15862,7 +15862,7 @@
                 <w:sz w:val="20"/>
                 <w:szCs w:val="20"/>
               </w:rPr>
-              <w:t xml:space="preserve">우선순위 기반 처리, 에이징 구현</w:t>
+              <w:t xml:space="preserve">도착 순서 기반 FIFO 처리</w:t>
             </w:r>
           </w:p>
         </w:tc>
@@ -15893,7 +15893,7 @@
                 <w:sz w:val="20"/>
                 <w:szCs w:val="20"/>
               </w:rPr>
-              <w:t xml:space="preserve">schedulers/mlfqScheduler.js</w:t>
+              <w:t xml:space="preserve">schedulers/PriorityScheduler.js</w:t>
             </w:r>
           </w:p>
         </w:tc>
@@ -15922,7 +15922,7 @@
                 <w:sz w:val="20"/>
                 <w:szCs w:val="20"/>
               </w:rPr>
-              <w:t xml:space="preserve">MLFQ 스케줄러</w:t>
+              <w:t xml:space="preserve">Priority 스케줄러</w:t>
             </w:r>
           </w:p>
         </w:tc>
@@ -15951,7 +15951,7 @@
                 <w:sz w:val="20"/>
                 <w:szCs w:val="20"/>
               </w:rPr>
-              <w:t xml:space="preserve">4단계 큐, 시간 할당량 기반 큐 강등</w:t>
+              <w:t xml:space="preserve">우선순위 기반 처리, 에이징 구현</w:t>
             </w:r>
           </w:p>
         </w:tc>
@@ -15982,7 +15982,7 @@
                 <w:sz w:val="20"/>
                 <w:szCs w:val="20"/>
               </w:rPr>
-              <w:t xml:space="preserve">schedulers/wfqScheduler.js</w:t>
+              <w:t xml:space="preserve">schedulers/MLFQScheduler.js</w:t>
             </w:r>
           </w:p>
         </w:tc>
@@ -16011,7 +16011,7 @@
                 <w:sz w:val="20"/>
                 <w:szCs w:val="20"/>
               </w:rPr>
-              <w:t xml:space="preserve">WFQ 스케줄러</w:t>
+              <w:t xml:space="preserve">MLFQ 스케줄러</w:t>
             </w:r>
           </w:p>
         </w:tc>
@@ -16040,7 +16040,7 @@
                 <w:sz w:val="20"/>
                 <w:szCs w:val="20"/>
               </w:rPr>
-              <w:t xml:space="preserve">VFT 계산, 가중치 기반 공정 배분</w:t>
+              <w:t xml:space="preserve">4단계 큐, 시간 할당량 기반 큐 강등</w:t>
             </w:r>
           </w:p>
         </w:tc>
@@ -16071,7 +16071,7 @@
                 <w:sz w:val="20"/>
                 <w:szCs w:val="20"/>
               </w:rPr>
-              <w:t xml:space="preserve">schedulers/baseScheduler.js</w:t>
+              <w:t xml:space="preserve">schedulers/WFQScheduler.js</w:t>
             </w:r>
           </w:p>
         </w:tc>
@@ -16100,7 +16100,7 @@
                 <w:sz w:val="20"/>
                 <w:szCs w:val="20"/>
               </w:rPr>
-              <w:t xml:space="preserve">기본 인터페이스</w:t>
+              <w:t xml:space="preserve">WFQ 스케줄러</w:t>
             </w:r>
           </w:p>
         </w:tc>
@@ -16129,7 +16129,7 @@
                 <w:sz w:val="20"/>
                 <w:szCs w:val="20"/>
               </w:rPr>
-              <w:t xml:space="preserve">enqueue/dequeue 공통 인터페이스</w:t>
+              <w:t xml:space="preserve">VFT 계산, 가중치 기반 공정 배분</w:t>
             </w:r>
           </w:p>
         </w:tc>
@@ -16160,7 +16160,7 @@
                 <w:sz w:val="20"/>
                 <w:szCs w:val="20"/>
               </w:rPr>
-              <w:t xml:space="preserve">rate-limiter/rateLimiter.js</w:t>
+              <w:t xml:space="preserve">schedulers/BaseScheduler.js</w:t>
             </w:r>
           </w:p>
         </w:tc>
@@ -16189,6 +16189,95 @@
                 <w:sz w:val="20"/>
                 <w:szCs w:val="20"/>
               </w:rPr>
+              <w:t xml:space="preserve">기본 인터페이스</w:t>
+            </w:r>
+          </w:p>
+        </w:tc>
+        <w:tc>
+          <w:tcPr>
+            <w:tcW w:type="dxa" w:w="2644"/>
+            <w:tcBorders>
+              <w:top w:val="single" w:color="AAAAAA" w:sz="1"/>
+              <w:left w:val="single" w:color="AAAAAA" w:sz="1"/>
+              <w:bottom w:val="single" w:color="AAAAAA" w:sz="1"/>
+              <w:right w:val="single" w:color="AAAAAA" w:sz="1"/>
+            </w:tcBorders>
+            <w:vAlign w:val="center"/>
+          </w:tcPr>
+          <w:p>
+            <w:pPr>
+              <w:spacing w:after="40" w:before="40"/>
+              <w:jc w:val="left"/>
+            </w:pPr>
+            <w:r>
+              <w:rPr>
+                <w:rFonts w:ascii="맑은 고딕" w:cs="맑은 고딕" w:eastAsia="맑은 고딕" w:hAnsi="맑은 고딕"/>
+                <w:b w:val="false"/>
+                <w:bCs w:val="false"/>
+                <w:color w:val="000000"/>
+                <w:sz w:val="20"/>
+                <w:szCs w:val="20"/>
+              </w:rPr>
+              <w:t xml:space="preserve">enqueue/dequeue 공통 인터페이스</w:t>
+            </w:r>
+          </w:p>
+        </w:tc>
+      </w:tr>
+      <w:tr>
+        <w:tc>
+          <w:tcPr>
+            <w:tcW w:type="dxa" w:w="2644"/>
+            <w:tcBorders>
+              <w:top w:val="single" w:color="AAAAAA" w:sz="1"/>
+              <w:left w:val="single" w:color="AAAAAA" w:sz="1"/>
+              <w:bottom w:val="single" w:color="AAAAAA" w:sz="1"/>
+              <w:right w:val="single" w:color="AAAAAA" w:sz="1"/>
+            </w:tcBorders>
+            <w:vAlign w:val="center"/>
+          </w:tcPr>
+          <w:p>
+            <w:pPr>
+              <w:spacing w:after="40" w:before="40"/>
+              <w:jc w:val="left"/>
+            </w:pPr>
+            <w:r>
+              <w:rPr>
+                <w:rFonts w:ascii="맑은 고딕" w:cs="맑은 고딕" w:eastAsia="맑은 고딕" w:hAnsi="맑은 고딕"/>
+                <w:b w:val="false"/>
+                <w:bCs w:val="false"/>
+                <w:color w:val="000000"/>
+                <w:sz w:val="20"/>
+                <w:szCs w:val="20"/>
+              </w:rPr>
+              <w:t xml:space="preserve">utils/rateLimiter.js</w:t>
+            </w:r>
+          </w:p>
+        </w:tc>
+        <w:tc>
+          <w:tcPr>
+            <w:tcW w:type="dxa" w:w="2644"/>
+            <w:tcBorders>
+              <w:top w:val="single" w:color="AAAAAA" w:sz="1"/>
+              <w:left w:val="single" w:color="AAAAAA" w:sz="1"/>
+              <w:bottom w:val="single" w:color="AAAAAA" w:sz="1"/>
+              <w:right w:val="single" w:color="AAAAAA" w:sz="1"/>
+            </w:tcBorders>
+            <w:vAlign w:val="center"/>
+          </w:tcPr>
+          <w:p>
+            <w:pPr>
+              <w:spacing w:after="40" w:before="40"/>
+              <w:jc w:val="left"/>
+            </w:pPr>
+            <w:r>
+              <w:rPr>
+                <w:rFonts w:ascii="맑은 고딕" w:cs="맑은 고딕" w:eastAsia="맑은 고딕" w:hAnsi="맑은 고딕"/>
+                <w:b w:val="false"/>
+                <w:bCs w:val="false"/>
+                <w:color w:val="000000"/>
+                <w:sz w:val="20"/>
+                <w:szCs w:val="20"/>
+              </w:rPr>
               <w:t xml:space="preserve">요청 제한</w:t>
             </w:r>
           </w:p>
@@ -16219,6 +16308,95 @@
                 <w:szCs w:val="20"/>
               </w:rPr>
               <w:t xml:space="preserve">토큰 버킷 방식 구독 등급별 제한</w:t>
+            </w:r>
+          </w:p>
+        </w:tc>
+      </w:tr>
+      <w:tr>
+        <w:tc>
+          <w:tcPr>
+            <w:tcW w:type="dxa" w:w="2644"/>
+            <w:tcBorders>
+              <w:top w:val="single" w:color="AAAAAA" w:sz="1"/>
+              <w:left w:val="single" w:color="AAAAAA" w:sz="1"/>
+              <w:bottom w:val="single" w:color="AAAAAA" w:sz="1"/>
+              <w:right w:val="single" w:color="AAAAAA" w:sz="1"/>
+            </w:tcBorders>
+            <w:vAlign w:val="center"/>
+          </w:tcPr>
+          <w:p>
+            <w:pPr>
+              <w:spacing w:after="40" w:before="40"/>
+              <w:jc w:val="left"/>
+            </w:pPr>
+            <w:r>
+              <w:rPr>
+                <w:rFonts w:ascii="맑은 고딕" w:cs="맑은 고딕" w:eastAsia="맑은 고딕" w:hAnsi="맑은 고딕"/>
+                <w:b w:val="false"/>
+                <w:bCs w:val="false"/>
+                <w:color w:val="000000"/>
+                <w:sz w:val="20"/>
+                <w:szCs w:val="20"/>
+              </w:rPr>
+              <w:t xml:space="preserve">llm/OllamaClient.js</w:t>
+            </w:r>
+          </w:p>
+        </w:tc>
+        <w:tc>
+          <w:tcPr>
+            <w:tcW w:type="dxa" w:w="2644"/>
+            <w:tcBorders>
+              <w:top w:val="single" w:color="AAAAAA" w:sz="1"/>
+              <w:left w:val="single" w:color="AAAAAA" w:sz="1"/>
+              <w:bottom w:val="single" w:color="AAAAAA" w:sz="1"/>
+              <w:right w:val="single" w:color="AAAAAA" w:sz="1"/>
+            </w:tcBorders>
+            <w:vAlign w:val="center"/>
+          </w:tcPr>
+          <w:p>
+            <w:pPr>
+              <w:spacing w:after="40" w:before="40"/>
+              <w:jc w:val="left"/>
+            </w:pPr>
+            <w:r>
+              <w:rPr>
+                <w:rFonts w:ascii="맑은 고딕" w:cs="맑은 고딕" w:eastAsia="맑은 고딕" w:hAnsi="맑은 고딕"/>
+                <w:b w:val="false"/>
+                <w:bCs w:val="false"/>
+                <w:color w:val="000000"/>
+                <w:sz w:val="20"/>
+                <w:szCs w:val="20"/>
+              </w:rPr>
+              <w:t xml:space="preserve">LLM 호출</w:t>
+            </w:r>
+          </w:p>
+        </w:tc>
+        <w:tc>
+          <w:tcPr>
+            <w:tcW w:type="dxa" w:w="2644"/>
+            <w:tcBorders>
+              <w:top w:val="single" w:color="AAAAAA" w:sz="1"/>
+              <w:left w:val="single" w:color="AAAAAA" w:sz="1"/>
+              <w:bottom w:val="single" w:color="AAAAAA" w:sz="1"/>
+              <w:right w:val="single" w:color="AAAAAA" w:sz="1"/>
+            </w:tcBorders>
+            <w:vAlign w:val="center"/>
+          </w:tcPr>
+          <w:p>
+            <w:pPr>
+              <w:spacing w:after="40" w:before="40"/>
+              <w:jc w:val="left"/>
+            </w:pPr>
+            <w:r>
+              <w:rPr>
+                <w:rFonts w:ascii="맑은 고딕" w:cs="맑은 고딕" w:eastAsia="맑은 고딕" w:hAnsi="맑은 고딕"/>
+                <w:b w:val="false"/>
+                <w:bCs w:val="false"/>
+                <w:color w:val="000000"/>
+                <w:sz w:val="20"/>
+                <w:szCs w:val="20"/>
+              </w:rPr>
+              <w:t xml:space="preserve">Ollama API와 통신하는 클라이언트</w:t>
             </w:r>
           </w:p>
         </w:tc>
@@ -16240,8 +16418,584 @@
           <w:sz w:val="22"/>
           <w:szCs w:val="22"/>
         </w:rPr>
-        <w:t xml:space="preserve">전체 소스 코드는 `02-implementation/src-simple/` 디렉토리에 위치하며, 외부 라이브러리 의존성은 Express.js 1개이다.</w:t>
-      </w:r>
+        <w:t xml:space="preserve">전체 소스 코드는 `02-implementation/src-simple/` 디렉토리에 위치하며, 외부 라이브러리 의존성은 Express.js 1개이다. 실험 스크립트는 `02-implementation/experiments-simple/` 디렉토리에 위치하며, 용도는 아래와 같다.</w:t>
+      </w:r>
+    </w:p>
+    <w:p>
+      <w:pPr>
+        <w:spacing w:after="80" w:line="360"/>
+      </w:pPr>
+      <w:r>
+        <w:rPr>
+          <w:rFonts w:ascii="맑은 고딕" w:cs="맑은 고딕" w:eastAsia="맑은 고딕" w:hAnsi="맑은 고딕"/>
+          <w:b/>
+          <w:bCs/>
+          <w:color w:val="000000"/>
+          <w:sz w:val="22"/>
+          <w:szCs w:val="22"/>
+        </w:rPr>
+        <w:t xml:space="preserve">표 17-1. 실험 스크립트 목록</w:t>
+      </w:r>
+    </w:p>
+    <w:tbl>
+      <w:tblPr>
+        <w:tblW w:type="auto" w:w="100"/>
+        <w:tblBorders>
+          <w:top w:val="single" w:color="auto" w:sz="4"/>
+          <w:left w:val="single" w:color="auto" w:sz="4"/>
+          <w:bottom w:val="single" w:color="auto" w:sz="4"/>
+          <w:right w:val="single" w:color="auto" w:sz="4"/>
+          <w:insideH w:val="single" w:color="auto" w:sz="4"/>
+          <w:insideV w:val="single" w:color="auto" w:sz="4"/>
+        </w:tblBorders>
+      </w:tblPr>
+      <w:tblGrid>
+        <w:gridCol w:w="2644"/>
+        <w:gridCol w:w="2644"/>
+        <w:gridCol w:w="2644"/>
+      </w:tblGrid>
+      <w:tr>
+        <w:tc>
+          <w:tcPr>
+            <w:tcW w:type="dxa" w:w="2644"/>
+            <w:tcBorders>
+              <w:top w:val="single" w:color="AAAAAA" w:sz="1"/>
+              <w:left w:val="single" w:color="AAAAAA" w:sz="1"/>
+              <w:bottom w:val="single" w:color="AAAAAA" w:sz="1"/>
+              <w:right w:val="single" w:color="AAAAAA" w:sz="1"/>
+            </w:tcBorders>
+            <w:shd w:fill="D9E2F3" w:val="clear"/>
+            <w:vAlign w:val="center"/>
+          </w:tcPr>
+          <w:p>
+            <w:pPr>
+              <w:spacing w:after="40" w:before="40"/>
+              <w:jc w:val="center"/>
+            </w:pPr>
+            <w:r>
+              <w:rPr>
+                <w:rFonts w:ascii="맑은 고딕" w:cs="맑은 고딕" w:eastAsia="맑은 고딕" w:hAnsi="맑은 고딕"/>
+                <w:b/>
+                <w:bCs/>
+                <w:color w:val="000000"/>
+                <w:sz w:val="20"/>
+                <w:szCs w:val="20"/>
+              </w:rPr>
+              <w:t xml:space="preserve">파일</w:t>
+            </w:r>
+          </w:p>
+        </w:tc>
+        <w:tc>
+          <w:tcPr>
+            <w:tcW w:type="dxa" w:w="2644"/>
+            <w:tcBorders>
+              <w:top w:val="single" w:color="AAAAAA" w:sz="1"/>
+              <w:left w:val="single" w:color="AAAAAA" w:sz="1"/>
+              <w:bottom w:val="single" w:color="AAAAAA" w:sz="1"/>
+              <w:right w:val="single" w:color="AAAAAA" w:sz="1"/>
+            </w:tcBorders>
+            <w:shd w:fill="D9E2F3" w:val="clear"/>
+            <w:vAlign w:val="center"/>
+          </w:tcPr>
+          <w:p>
+            <w:pPr>
+              <w:spacing w:after="40" w:before="40"/>
+              <w:jc w:val="center"/>
+            </w:pPr>
+            <w:r>
+              <w:rPr>
+                <w:rFonts w:ascii="맑은 고딕" w:cs="맑은 고딕" w:eastAsia="맑은 고딕" w:hAnsi="맑은 고딕"/>
+                <w:b/>
+                <w:bCs/>
+                <w:color w:val="000000"/>
+                <w:sz w:val="20"/>
+                <w:szCs w:val="20"/>
+              </w:rPr>
+              <w:t xml:space="preserve">용도</w:t>
+            </w:r>
+          </w:p>
+        </w:tc>
+        <w:tc>
+          <w:tcPr>
+            <w:tcW w:type="dxa" w:w="2644"/>
+            <w:tcBorders>
+              <w:top w:val="single" w:color="AAAAAA" w:sz="1"/>
+              <w:left w:val="single" w:color="AAAAAA" w:sz="1"/>
+              <w:bottom w:val="single" w:color="AAAAAA" w:sz="1"/>
+              <w:right w:val="single" w:color="AAAAAA" w:sz="1"/>
+            </w:tcBorders>
+            <w:shd w:fill="D9E2F3" w:val="clear"/>
+            <w:vAlign w:val="center"/>
+          </w:tcPr>
+          <w:p>
+            <w:pPr>
+              <w:spacing w:after="40" w:before="40"/>
+              <w:jc w:val="center"/>
+            </w:pPr>
+            <w:r>
+              <w:rPr>
+                <w:rFonts w:ascii="맑은 고딕" w:cs="맑은 고딕" w:eastAsia="맑은 고딕" w:hAnsi="맑은 고딕"/>
+                <w:b/>
+                <w:bCs/>
+                <w:color w:val="000000"/>
+                <w:sz w:val="20"/>
+                <w:szCs w:val="20"/>
+              </w:rPr>
+              <w:t xml:space="preserve">본 보고서 반영 여부</w:t>
+            </w:r>
+          </w:p>
+        </w:tc>
+      </w:tr>
+      <w:tr>
+        <w:tc>
+          <w:tcPr>
+            <w:tcW w:type="dxa" w:w="2644"/>
+            <w:tcBorders>
+              <w:top w:val="single" w:color="AAAAAA" w:sz="1"/>
+              <w:left w:val="single" w:color="AAAAAA" w:sz="1"/>
+              <w:bottom w:val="single" w:color="AAAAAA" w:sz="1"/>
+              <w:right w:val="single" w:color="AAAAAA" w:sz="1"/>
+            </w:tcBorders>
+            <w:vAlign w:val="center"/>
+          </w:tcPr>
+          <w:p>
+            <w:pPr>
+              <w:spacing w:after="40" w:before="40"/>
+              <w:jc w:val="left"/>
+            </w:pPr>
+            <w:r>
+              <w:rPr>
+                <w:rFonts w:ascii="맑은 고딕" w:cs="맑은 고딕" w:eastAsia="맑은 고딕" w:hAnsi="맑은 고딕"/>
+                <w:b w:val="false"/>
+                <w:bCs w:val="false"/>
+                <w:color w:val="000000"/>
+                <w:sz w:val="20"/>
+                <w:szCs w:val="20"/>
+              </w:rPr>
+              <w:t xml:space="preserve">run-experiments.js</w:t>
+            </w:r>
+          </w:p>
+        </w:tc>
+        <w:tc>
+          <w:tcPr>
+            <w:tcW w:type="dxa" w:w="2644"/>
+            <w:tcBorders>
+              <w:top w:val="single" w:color="AAAAAA" w:sz="1"/>
+              <w:left w:val="single" w:color="AAAAAA" w:sz="1"/>
+              <w:bottom w:val="single" w:color="AAAAAA" w:sz="1"/>
+              <w:right w:val="single" w:color="AAAAAA" w:sz="1"/>
+            </w:tcBorders>
+            <w:vAlign w:val="center"/>
+          </w:tcPr>
+          <w:p>
+            <w:pPr>
+              <w:spacing w:after="40" w:before="40"/>
+              <w:jc w:val="left"/>
+            </w:pPr>
+            <w:r>
+              <w:rPr>
+                <w:rFonts w:ascii="맑은 고딕" w:cs="맑은 고딕" w:eastAsia="맑은 고딕" w:hAnsi="맑은 고딕"/>
+                <w:b w:val="false"/>
+                <w:bCs w:val="false"/>
+                <w:color w:val="000000"/>
+                <w:sz w:val="20"/>
+                <w:szCs w:val="20"/>
+              </w:rPr>
+              <w:t xml:space="preserve">초기 탐색용 (100건, 단일 시드)</w:t>
+            </w:r>
+          </w:p>
+        </w:tc>
+        <w:tc>
+          <w:tcPr>
+            <w:tcW w:type="dxa" w:w="2644"/>
+            <w:tcBorders>
+              <w:top w:val="single" w:color="AAAAAA" w:sz="1"/>
+              <w:left w:val="single" w:color="AAAAAA" w:sz="1"/>
+              <w:bottom w:val="single" w:color="AAAAAA" w:sz="1"/>
+              <w:right w:val="single" w:color="AAAAAA" w:sz="1"/>
+            </w:tcBorders>
+            <w:vAlign w:val="center"/>
+          </w:tcPr>
+          <w:p>
+            <w:pPr>
+              <w:spacing w:after="40" w:before="40"/>
+              <w:jc w:val="left"/>
+            </w:pPr>
+            <w:r>
+              <w:rPr>
+                <w:rFonts w:ascii="맑은 고딕" w:cs="맑은 고딕" w:eastAsia="맑은 고딕" w:hAnsi="맑은 고딕"/>
+                <w:b w:val="false"/>
+                <w:bCs w:val="false"/>
+                <w:color w:val="000000"/>
+                <w:sz w:val="20"/>
+                <w:szCs w:val="20"/>
+              </w:rPr>
+              <w:t xml:space="preserve">미반영</w:t>
+            </w:r>
+          </w:p>
+        </w:tc>
+      </w:tr>
+      <w:tr>
+        <w:tc>
+          <w:tcPr>
+            <w:tcW w:type="dxa" w:w="2644"/>
+            <w:tcBorders>
+              <w:top w:val="single" w:color="AAAAAA" w:sz="1"/>
+              <w:left w:val="single" w:color="AAAAAA" w:sz="1"/>
+              <w:bottom w:val="single" w:color="AAAAAA" w:sz="1"/>
+              <w:right w:val="single" w:color="AAAAAA" w:sz="1"/>
+            </w:tcBorders>
+            <w:vAlign w:val="center"/>
+          </w:tcPr>
+          <w:p>
+            <w:pPr>
+              <w:spacing w:after="40" w:before="40"/>
+              <w:jc w:val="left"/>
+            </w:pPr>
+            <w:r>
+              <w:rPr>
+                <w:rFonts w:ascii="맑은 고딕" w:cs="맑은 고딕" w:eastAsia="맑은 고딕" w:hAnsi="맑은 고딕"/>
+                <w:b w:val="false"/>
+                <w:bCs w:val="false"/>
+                <w:color w:val="000000"/>
+                <w:sz w:val="20"/>
+                <w:szCs w:val="20"/>
+              </w:rPr>
+              <w:t xml:space="preserve">run-extended.js</w:t>
+            </w:r>
+          </w:p>
+        </w:tc>
+        <w:tc>
+          <w:tcPr>
+            <w:tcW w:type="dxa" w:w="2644"/>
+            <w:tcBorders>
+              <w:top w:val="single" w:color="AAAAAA" w:sz="1"/>
+              <w:left w:val="single" w:color="AAAAAA" w:sz="1"/>
+              <w:bottom w:val="single" w:color="AAAAAA" w:sz="1"/>
+              <w:right w:val="single" w:color="AAAAAA" w:sz="1"/>
+            </w:tcBorders>
+            <w:vAlign w:val="center"/>
+          </w:tcPr>
+          <w:p>
+            <w:pPr>
+              <w:spacing w:after="40" w:before="40"/>
+              <w:jc w:val="left"/>
+            </w:pPr>
+            <w:r>
+              <w:rPr>
+                <w:rFonts w:ascii="맑은 고딕" w:cs="맑은 고딕" w:eastAsia="맑은 고딕" w:hAnsi="맑은 고딕"/>
+                <w:b w:val="false"/>
+                <w:bCs w:val="false"/>
+                <w:color w:val="000000"/>
+                <w:sz w:val="20"/>
+                <w:szCs w:val="20"/>
+              </w:rPr>
+              <w:t xml:space="preserve">기본 실험 (500건, 4 스케줄러 비교, 5.2·5.5절)</w:t>
+            </w:r>
+          </w:p>
+        </w:tc>
+        <w:tc>
+          <w:tcPr>
+            <w:tcW w:type="dxa" w:w="2644"/>
+            <w:tcBorders>
+              <w:top w:val="single" w:color="AAAAAA" w:sz="1"/>
+              <w:left w:val="single" w:color="AAAAAA" w:sz="1"/>
+              <w:bottom w:val="single" w:color="AAAAAA" w:sz="1"/>
+              <w:right w:val="single" w:color="AAAAAA" w:sz="1"/>
+            </w:tcBorders>
+            <w:vAlign w:val="center"/>
+          </w:tcPr>
+          <w:p>
+            <w:pPr>
+              <w:spacing w:after="40" w:before="40"/>
+              <w:jc w:val="left"/>
+            </w:pPr>
+            <w:r>
+              <w:rPr>
+                <w:rFonts w:ascii="맑은 고딕" w:cs="맑은 고딕" w:eastAsia="맑은 고딕" w:hAnsi="맑은 고딕"/>
+                <w:b w:val="false"/>
+                <w:bCs w:val="false"/>
+                <w:color w:val="000000"/>
+                <w:sz w:val="20"/>
+                <w:szCs w:val="20"/>
+              </w:rPr>
+              <w:t xml:space="preserve">반영</w:t>
+            </w:r>
+          </w:p>
+        </w:tc>
+      </w:tr>
+      <w:tr>
+        <w:tc>
+          <w:tcPr>
+            <w:tcW w:type="dxa" w:w="2644"/>
+            <w:tcBorders>
+              <w:top w:val="single" w:color="AAAAAA" w:sz="1"/>
+              <w:left w:val="single" w:color="AAAAAA" w:sz="1"/>
+              <w:bottom w:val="single" w:color="AAAAAA" w:sz="1"/>
+              <w:right w:val="single" w:color="AAAAAA" w:sz="1"/>
+            </w:tcBorders>
+            <w:vAlign w:val="center"/>
+          </w:tcPr>
+          <w:p>
+            <w:pPr>
+              <w:spacing w:after="40" w:before="40"/>
+              <w:jc w:val="left"/>
+            </w:pPr>
+            <w:r>
+              <w:rPr>
+                <w:rFonts w:ascii="맑은 고딕" w:cs="맑은 고딕" w:eastAsia="맑은 고딕" w:hAnsi="맑은 고딕"/>
+                <w:b w:val="false"/>
+                <w:bCs w:val="false"/>
+                <w:color w:val="000000"/>
+                <w:sz w:val="20"/>
+                <w:szCs w:val="20"/>
+              </w:rPr>
+              <w:t xml:space="preserve">run-multi-seed.js</w:t>
+            </w:r>
+          </w:p>
+        </w:tc>
+        <w:tc>
+          <w:tcPr>
+            <w:tcW w:type="dxa" w:w="2644"/>
+            <w:tcBorders>
+              <w:top w:val="single" w:color="AAAAAA" w:sz="1"/>
+              <w:left w:val="single" w:color="AAAAAA" w:sz="1"/>
+              <w:bottom w:val="single" w:color="AAAAAA" w:sz="1"/>
+              <w:right w:val="single" w:color="AAAAAA" w:sz="1"/>
+            </w:tcBorders>
+            <w:vAlign w:val="center"/>
+          </w:tcPr>
+          <w:p>
+            <w:pPr>
+              <w:spacing w:after="40" w:before="40"/>
+              <w:jc w:val="left"/>
+            </w:pPr>
+            <w:r>
+              <w:rPr>
+                <w:rFonts w:ascii="맑은 고딕" w:cs="맑은 고딕" w:eastAsia="맑은 고딕" w:hAnsi="맑은 고딕"/>
+                <w:b w:val="false"/>
+                <w:bCs w:val="false"/>
+                <w:color w:val="000000"/>
+                <w:sz w:val="20"/>
+                <w:szCs w:val="20"/>
+              </w:rPr>
+              <w:t xml:space="preserve">MLFQ 선점형 실험 (500건 × 5 시드, 5.3절)</w:t>
+            </w:r>
+          </w:p>
+        </w:tc>
+        <w:tc>
+          <w:tcPr>
+            <w:tcW w:type="dxa" w:w="2644"/>
+            <w:tcBorders>
+              <w:top w:val="single" w:color="AAAAAA" w:sz="1"/>
+              <w:left w:val="single" w:color="AAAAAA" w:sz="1"/>
+              <w:bottom w:val="single" w:color="AAAAAA" w:sz="1"/>
+              <w:right w:val="single" w:color="AAAAAA" w:sz="1"/>
+            </w:tcBorders>
+            <w:vAlign w:val="center"/>
+          </w:tcPr>
+          <w:p>
+            <w:pPr>
+              <w:spacing w:after="40" w:before="40"/>
+              <w:jc w:val="left"/>
+            </w:pPr>
+            <w:r>
+              <w:rPr>
+                <w:rFonts w:ascii="맑은 고딕" w:cs="맑은 고딕" w:eastAsia="맑은 고딕" w:hAnsi="맑은 고딕"/>
+                <w:b w:val="false"/>
+                <w:bCs w:val="false"/>
+                <w:color w:val="000000"/>
+                <w:sz w:val="20"/>
+                <w:szCs w:val="20"/>
+              </w:rPr>
+              <w:t xml:space="preserve">반영</w:t>
+            </w:r>
+          </w:p>
+        </w:tc>
+      </w:tr>
+      <w:tr>
+        <w:tc>
+          <w:tcPr>
+            <w:tcW w:type="dxa" w:w="2644"/>
+            <w:tcBorders>
+              <w:top w:val="single" w:color="AAAAAA" w:sz="1"/>
+              <w:left w:val="single" w:color="AAAAAA" w:sz="1"/>
+              <w:bottom w:val="single" w:color="AAAAAA" w:sz="1"/>
+              <w:right w:val="single" w:color="AAAAAA" w:sz="1"/>
+            </w:tcBorders>
+            <w:vAlign w:val="center"/>
+          </w:tcPr>
+          <w:p>
+            <w:pPr>
+              <w:spacing w:after="40" w:before="40"/>
+              <w:jc w:val="left"/>
+            </w:pPr>
+            <w:r>
+              <w:rPr>
+                <w:rFonts w:ascii="맑은 고딕" w:cs="맑은 고딕" w:eastAsia="맑은 고딕" w:hAnsi="맑은 고딕"/>
+                <w:b w:val="false"/>
+                <w:bCs w:val="false"/>
+                <w:color w:val="000000"/>
+                <w:sz w:val="20"/>
+                <w:szCs w:val="20"/>
+              </w:rPr>
+              <w:t xml:space="preserve">run-ollama-experiment.js</w:t>
+            </w:r>
+          </w:p>
+        </w:tc>
+        <w:tc>
+          <w:tcPr>
+            <w:tcW w:type="dxa" w:w="2644"/>
+            <w:tcBorders>
+              <w:top w:val="single" w:color="AAAAAA" w:sz="1"/>
+              <w:left w:val="single" w:color="AAAAAA" w:sz="1"/>
+              <w:bottom w:val="single" w:color="AAAAAA" w:sz="1"/>
+              <w:right w:val="single" w:color="AAAAAA" w:sz="1"/>
+            </w:tcBorders>
+            <w:vAlign w:val="center"/>
+          </w:tcPr>
+          <w:p>
+            <w:pPr>
+              <w:spacing w:after="40" w:before="40"/>
+              <w:jc w:val="left"/>
+            </w:pPr>
+            <w:r>
+              <w:rPr>
+                <w:rFonts w:ascii="맑은 고딕" w:cs="맑은 고딕" w:eastAsia="맑은 고딕" w:hAnsi="맑은 고딕"/>
+                <w:b w:val="false"/>
+                <w:bCs w:val="false"/>
+                <w:color w:val="000000"/>
+                <w:sz w:val="20"/>
+                <w:szCs w:val="20"/>
+              </w:rPr>
+              <w:t xml:space="preserve">실서버 실험 (20건, Ollama llama3.2, 5.4절)</w:t>
+            </w:r>
+          </w:p>
+        </w:tc>
+        <w:tc>
+          <w:tcPr>
+            <w:tcW w:type="dxa" w:w="2644"/>
+            <w:tcBorders>
+              <w:top w:val="single" w:color="AAAAAA" w:sz="1"/>
+              <w:left w:val="single" w:color="AAAAAA" w:sz="1"/>
+              <w:bottom w:val="single" w:color="AAAAAA" w:sz="1"/>
+              <w:right w:val="single" w:color="AAAAAA" w:sz="1"/>
+            </w:tcBorders>
+            <w:vAlign w:val="center"/>
+          </w:tcPr>
+          <w:p>
+            <w:pPr>
+              <w:spacing w:after="40" w:before="40"/>
+              <w:jc w:val="left"/>
+            </w:pPr>
+            <w:r>
+              <w:rPr>
+                <w:rFonts w:ascii="맑은 고딕" w:cs="맑은 고딕" w:eastAsia="맑은 고딕" w:hAnsi="맑은 고딕"/>
+                <w:b w:val="false"/>
+                <w:bCs w:val="false"/>
+                <w:color w:val="000000"/>
+                <w:sz w:val="20"/>
+                <w:szCs w:val="20"/>
+              </w:rPr>
+              <w:t xml:space="preserve">반영</w:t>
+            </w:r>
+          </w:p>
+        </w:tc>
+      </w:tr>
+      <w:tr>
+        <w:tc>
+          <w:tcPr>
+            <w:tcW w:type="dxa" w:w="2644"/>
+            <w:tcBorders>
+              <w:top w:val="single" w:color="AAAAAA" w:sz="1"/>
+              <w:left w:val="single" w:color="AAAAAA" w:sz="1"/>
+              <w:bottom w:val="single" w:color="AAAAAA" w:sz="1"/>
+              <w:right w:val="single" w:color="AAAAAA" w:sz="1"/>
+            </w:tcBorders>
+            <w:vAlign w:val="center"/>
+          </w:tcPr>
+          <w:p>
+            <w:pPr>
+              <w:spacing w:after="40" w:before="40"/>
+              <w:jc w:val="left"/>
+            </w:pPr>
+            <w:r>
+              <w:rPr>
+                <w:rFonts w:ascii="맑은 고딕" w:cs="맑은 고딕" w:eastAsia="맑은 고딕" w:hAnsi="맑은 고딕"/>
+                <w:b w:val="false"/>
+                <w:bCs w:val="false"/>
+                <w:color w:val="000000"/>
+                <w:sz w:val="20"/>
+                <w:szCs w:val="20"/>
+              </w:rPr>
+              <w:t xml:space="preserve">compute-stats.js</w:t>
+            </w:r>
+          </w:p>
+        </w:tc>
+        <w:tc>
+          <w:tcPr>
+            <w:tcW w:type="dxa" w:w="2644"/>
+            <w:tcBorders>
+              <w:top w:val="single" w:color="AAAAAA" w:sz="1"/>
+              <w:left w:val="single" w:color="AAAAAA" w:sz="1"/>
+              <w:bottom w:val="single" w:color="AAAAAA" w:sz="1"/>
+              <w:right w:val="single" w:color="AAAAAA" w:sz="1"/>
+            </w:tcBorders>
+            <w:vAlign w:val="center"/>
+          </w:tcPr>
+          <w:p>
+            <w:pPr>
+              <w:spacing w:after="40" w:before="40"/>
+              <w:jc w:val="left"/>
+            </w:pPr>
+            <w:r>
+              <w:rPr>
+                <w:rFonts w:ascii="맑은 고딕" w:cs="맑은 고딕" w:eastAsia="맑은 고딕" w:hAnsi="맑은 고딕"/>
+                <w:b w:val="false"/>
+                <w:bCs w:val="false"/>
+                <w:color w:val="000000"/>
+                <w:sz w:val="20"/>
+                <w:szCs w:val="20"/>
+              </w:rPr>
+              <w:t xml:space="preserve">5개 시드 결과의 t-검정·Cohen's d·신뢰구간 계산</w:t>
+            </w:r>
+          </w:p>
+        </w:tc>
+        <w:tc>
+          <w:tcPr>
+            <w:tcW w:type="dxa" w:w="2644"/>
+            <w:tcBorders>
+              <w:top w:val="single" w:color="AAAAAA" w:sz="1"/>
+              <w:left w:val="single" w:color="AAAAAA" w:sz="1"/>
+              <w:bottom w:val="single" w:color="AAAAAA" w:sz="1"/>
+              <w:right w:val="single" w:color="AAAAAA" w:sz="1"/>
+            </w:tcBorders>
+            <w:vAlign w:val="center"/>
+          </w:tcPr>
+          <w:p>
+            <w:pPr>
+              <w:spacing w:after="40" w:before="40"/>
+              <w:jc w:val="left"/>
+            </w:pPr>
+            <w:r>
+              <w:rPr>
+                <w:rFonts w:ascii="맑은 고딕" w:cs="맑은 고딕" w:eastAsia="맑은 고딕" w:hAnsi="맑은 고딕"/>
+                <w:b w:val="false"/>
+                <w:bCs w:val="false"/>
+                <w:color w:val="000000"/>
+                <w:sz w:val="20"/>
+                <w:szCs w:val="20"/>
+              </w:rPr>
+              <w:t xml:space="preserve">부록 B 수치 산출</w:t>
+            </w:r>
+          </w:p>
+        </w:tc>
+      </w:tr>
+    </w:tbl>
+    <w:p>
+      <w:pPr>
+        <w:spacing w:after="80"/>
+      </w:pPr>
     </w:p>
     <w:p>
       <w:pPr>
@@ -17142,6 +17896,56 @@
           <w:szCs w:val="22"/>
         </w:rPr>
         <w:t xml:space="preserve">통계 검증 결과: t = 45.59, p &lt; 0.001, Cohen's d = 20.39, 95% CI [71.89%, 74.51%]</w:t>
+      </w:r>
+    </w:p>
+    <w:p>
+      <w:pPr>
+        <w:spacing w:after="120" w:line="360"/>
+      </w:pPr>
+      <w:r>
+        <w:rPr>
+          <w:rFonts w:ascii="맑은 고딕" w:cs="맑은 고딕" w:eastAsia="맑은 고딕" w:hAnsi="맑은 고딕"/>
+          <w:b/>
+          <w:bCs/>
+          <w:color w:val="000000"/>
+          <w:sz w:val="22"/>
+          <w:szCs w:val="22"/>
+        </w:rPr>
+        <w:t xml:space="preserve">통계 계산 방법 및 재현</w:t>
+      </w:r>
+      <w:r>
+        <w:rPr>
+          <w:rFonts w:ascii="맑은 고딕" w:cs="맑은 고딕" w:eastAsia="맑은 고딕" w:hAnsi="맑은 고딕"/>
+          <w:color w:val="000000"/>
+          <w:sz w:val="22"/>
+          <w:szCs w:val="22"/>
+        </w:rPr>
+        <w:t xml:space="preserve">: 5개 시드의 FCFS Short 응답시간과 MLFQ Short 응답시간을 짝지어 대응표본 t-검정을 수행하였다. 구체적으로는 각 시드의 응답시간 차이(FCFS − MLFQ, 평균 약 464,785ms, 표준편차 약 22,798ms)에 대해 표준오차(약 10,196ms)를 계산하고, t = (차이 평균)/(표준오차) = 45.59를 얻었다. Cohen's d는 대응표본용 공식 (차이 평균/차이 표준편차)에 따라 20.39로 산출하였다. 95% 신뢰구간은 개선율 5개 값([71.76%, 74.30%, 73.94%, 72.48%, 73.53%])에 대해 자유도 4의 t 임계값(t₀.₀₂₅ = 2.776)을 적용하여 계산하였다. 이 수치들은 `02-implementation/experiments-simple/compute-stats.js`를 실행하여 그대로 재현할 수 있다.</w:t>
+      </w:r>
+    </w:p>
+    <w:p>
+      <w:pPr>
+        <w:spacing w:after="120" w:line="360"/>
+      </w:pPr>
+      <w:r>
+        <w:rPr>
+          <w:rFonts w:ascii="맑은 고딕" w:cs="맑은 고딕" w:eastAsia="맑은 고딕" w:hAnsi="맑은 고딕"/>
+          <w:b/>
+          <w:bCs/>
+          <w:color w:val="000000"/>
+          <w:sz w:val="22"/>
+          <w:szCs w:val="22"/>
+        </w:rPr>
+        <w:t xml:space="preserve">부스팅 구현의 세부 차이</w:t>
+      </w:r>
+      <w:r>
+        <w:rPr>
+          <w:rFonts w:ascii="맑은 고딕" w:cs="맑은 고딕" w:eastAsia="맑은 고딕" w:hAnsi="맑은 고딕"/>
+          <w:color w:val="000000"/>
+          <w:sz w:val="22"/>
+          <w:szCs w:val="22"/>
+        </w:rPr>
+        <w:t xml:space="preserve">: MLFQ 부스팅(Rule 5)의 트리거 조건이 실험 스크립트별로 다르다. 기본 실험(run-extended.js)은 "30건 처리마다 1회 부스팅"을 사용하고, MLFQ 선점형 실험(run-multi-seed.js)은 "가상 시뮬레이션 시간 5,000ms마다 1회 부스팅"을 사용한다. 기본 실험은 모든 요청의 처리 시간이 10~100ms로 짧아 Q0(1,000ms) 안에서 완료되므로 부스팅이 실제로 작동하는 시점이 거의 없고, 두 구현 방식의 차이가 결과에 영향을 주지 않는다. 반면 선점형 실험은 Long 요청이 하위 큐로 내려가므로 시간 기반 부스팅이 의미를 갖는다.</w:t>
       </w:r>
     </w:p>
     <w:p>

</xml_diff>

<commit_message>
Update final report generator to use final-report-v9.md and regenerate DOCX
</commit_message>
<xml_diff>
--- a/06-final-report/final/final-report.docx
+++ b/06-final-report/final/final-report.docx
@@ -6749,6 +6749,20 @@
           <w:szCs w:val="22"/>
         </w:rPr>
         <w:t xml:space="preserve">: 서버 시작 시 환경변수(`SCHEDULER_TYPE`)로 스케줄링 알고리즘을 선택할 수 있다</w:t>
+      </w:r>
+    </w:p>
+    <w:p>
+      <w:pPr>
+        <w:spacing w:after="120" w:line="360"/>
+      </w:pPr>
+      <w:r>
+        <w:rPr>
+          <w:rFonts w:ascii="맑은 고딕" w:cs="맑은 고딕" w:eastAsia="맑은 고딕" w:hAnsi="맑은 고딕"/>
+          <w:color w:val="000000"/>
+          <w:sz w:val="22"/>
+          <w:szCs w:val="22"/>
+        </w:rPr>
+        <w:t xml:space="preserve">또한, 최종 발표를 위한 실시간 데모 환경을 준비하였다. 터미널에서 `SCHEDULER_TYPE=FCFS node server.js`로 서버를 시작한 뒤, REST API를 통해 여러 등급의 요청을 보내면 스케줄러별로 처리 순서가 달라지는 것을 확인할 수 있다. 데모에서는 FCFS 서버와 WFQ 서버를 순차적으로 실행하여, 동일한 요청이 알고리즘에 따라 다른 순서로 처리되는 과정을 비교한다. 이를 통해 스케줄링 알고리즘의 차이가 실제 사용자 경험에 어떤 영향을 미치는지 직관적으로 보여줄 수 있다.</w:t>
       </w:r>
     </w:p>
     <w:p>

</xml_diff>

<commit_message>
Add snapshot files and package configuration for final report
- Created package.json for figures with dependencies: playwright, pptxgenjs, and sharp.
- Added final-report.docx as a new binary file.
- Introduced snapshot-info.md files for both the final report and the snapshot, detailing creation dates, status, and file contents.
</commit_message>
<xml_diff>
--- a/06-final-report/final/final-report.docx
+++ b/06-final-report/final/final-report.docx
@@ -1002,7 +1002,7 @@
           <w:sz w:val="22"/>
           <w:szCs w:val="22"/>
         </w:rPr>
-        <w:t xml:space="preserve">는 여러 개의 대기열을 두고, 작업의 실행 특성에 따라 우선순위를 자동으로 조정하는 알고리즘이다. 새로 도착한 요청은 가장 높은 우선순위 큐에 배치된다. 해당 큐에서 주어진 시간 할당량(Time Quantum) 안에 처리가 끝나지 않으면 한 단계 낮은 큐로 내려간다. 이를 통해 짧은 요청은 높은 우선순위에서 빠르게 처리되고, 긴 요청은 낮은 큐에서 처리되는 효과를 얻는다. 사전 정보 없이도 요청의 실행 시간을 보면서 자동으로 우선순위를 조정한다는 것이 MLFQ의 핵심이다. 실제로 BSD 계열 운영체제에서도 MLFQ 기반의 스케줄링을 사용한 바 있으며, 다양한 운영체제 교과서에서 핵심 스케줄링 알고리즘으로 다루고 있다 [3]. 다만, 하위 큐의 요청이 오래 처리되지 못하는 것을 방지하기 위해 일정 주기로 모든 요청을 최상위 큐로 올려주는 부스팅(Boosting) 기법이 함께 사용된다 [3]. 부스팅의 주기가 너무 짧으면 MLFQ가 실질적으로 RR(Round Robin)처럼 동작하고, 너무 길면 기아 방지 효과가 약해지므로 적절한 주기 설정이 중요하다.</w:t>
+        <w:t xml:space="preserve">는 여러 개의 대기열을 두고, 작업의 실행 특성에 따라 우선순위를 자동으로 조정하는 알고리즘이다. 새로 도착한 요청은 가장 높은 우선순위 큐에 배치된다. 해당 큐에서 주어진 시간 할당량(Time Quantum) 안에 처리가 끝나지 않으면 한 단계 낮은 큐로 내려간다. 이를 통해 짧은 요청은 높은 우선순위에서 빠르게 처리되고, 긴 요청은 낮은 큐에서 처리되는 효과를 얻는다. 사전 정보 없이도 요청의 실행 시간을 보면서 자동으로 우선순위를 조정한다는 것이 MLFQ의 핵심이다. 실제로 BSD 계열 운영체제에서도 MLFQ 기반의 스케줄링을 사용한 바 있으며, 다양한 운영체제 교과서에서 핵심 스케줄링 알고리즘으로 다루고 있다 [3]. 다만, 하위 큐의 요청이 오래 처리되지 못하는 것을 방지하기 위해 일정 주기로 모든 요청을 최상위 큐로 올려주는 부스팅(Boosting) 기법이 함께 사용된다 [3]. 부스팅의 주기가 너무 짧으면 MLFQ가 실질적으로 RR(Round Robin, 대기열의 요청을 차례대로 돌아가며 조금씩 처리하는 방식)처럼 동작하고, 너무 길면 기아 방지 효과가 약해지므로 적절한 주기 설정이 중요하다.</w:t>
       </w:r>
     </w:p>
     <w:p>
@@ -1027,7 +1027,7 @@
           <w:sz w:val="22"/>
           <w:szCs w:val="22"/>
         </w:rPr>
-        <w:t xml:space="preserve">는 네트워크 분야에서 사용되는 공정한 자원 배분 알고리즘이다. WFQ는 GPS(Generalized Processor Sharing)라는 이론적 모델을 실제로 구현한 것이다. GPS는 모든 사용자에게 가중치에 비례하여 자원을 동시에 나누어주는 이상적인 모델이지만, 실제 시스템에서는 요청을 동시에 처리하는 것이 불가능하다. WFQ는 이를 해결하기 위해 가상 완료 시각(Virtual Finish Time, VFT)이라는 값을 계산한다. VFT는 "이 요청이 가상으로 언제 처리 완료될지"를 나타내는 계산값으로, 이 값이 작을수록 먼저 처리된다. VFT가 가장 작은 요청부터 처리하는 방식으로 GPS와 비슷한 공정한 배분 결과를 얻는다 [4]. 각 사용자에 가중치를 부여하고, 가중치가 클수록 VFT가 느리게 증가하여 더 자주 선택되고, 결과적으로 더 많은 자원을 받게 된다. WFQ는 인터넷 라우터의 트래픽 관리에서 널리 사용되며, 서비스 등급별로 대역폭을 차등 배분하는 QoS(Quality of Service) 정책의 기반이 된다 [4]. 구체적인 VFT 계산 방식은 4.3절에서 설명한다.</w:t>
+        <w:t xml:space="preserve">는 네트워크 분야에서 사용되는 공정한 자원 배분 알고리즘이다. WFQ는 GPS(Generalized Processor Sharing)라는 이론적 모델을 실제로 구현한 것이다. GPS는 모든 사용자에게 가중치에 비례하여 자원을 동시에 나누어주는 이상적인 모델이지만, 실제 시스템에서는 요청을 동시에 처리하는 것이 불가능하다. WFQ는 이를 해결하기 위해 가상 완료 시각(Virtual Finish Time, VFT)이라는 값을 계산한다. VFT는 "이 요청이 가상으로 언제 처리 완료될지"를 나타내는 계산값으로, 이 값이 작을수록 먼저 처리된다. VFT가 가장 작은 요청부터 처리하는 방식으로 GPS와 비슷한 공정한 배분 결과를 얻는다 [4]. 각 사용자에 가중치를 부여하고, 가중치가 클수록 VFT가 느리게 증가하여 더 자주 선택되고, 결과적으로 더 많은 자원을 받게 된다. WFQ는 인터넷 라우터의 트래픽 관리에서 널리 사용되며, 서비스 등급별로 대역폭을 차등 배분하는 QoS(Quality of Service, 서비스 품질을 등급에 따라 다르게 보장하는 정책)의 기반이 된다 [4]. 구체적인 VFT 계산 방식은 4.3절에서 설명한다.</w:t>
       </w:r>
     </w:p>
     <w:p>

</xml_diff>

<commit_message>
Add snapshot files for final report versioning
- Created new package.json for figures with dependencies: playwright, pptxgenjs, sharp.
- Added final-report.docx as a new binary file for the final report.
- Introduced snapshot-info.md for the previous snapshot (v10) detailing creation date, skill, status, and reason for finalization.
- Added snapshot-info.md for the latest snapshot (v11) with details on creation date, skill, status, files included, and reasons for minor polish before v12 generation.
</commit_message>
<xml_diff>
--- a/06-final-report/final/final-report.docx
+++ b/06-final-report/final/final-report.docx
@@ -3977,7 +3977,7 @@
           <w:sz w:val="22"/>
           <w:szCs w:val="22"/>
         </w:rPr>
-        <w:t xml:space="preserve">소스 코드는 api, schedulers, queue, storage, llm의 5개 모듈로 구성되어 있다 (그림 4).</w:t>
+        <w:t xml:space="preserve">소스 코드는 api, schedulers, queue, storage, llm 등 핵심 모듈과 rate-limiter, server.js 보조 요소로 구성되어 있다 (그림 4, 표 4).</w:t>
       </w:r>
     </w:p>
     <w:p>
@@ -12574,7 +12574,7 @@
           <w:sz w:val="22"/>
           <w:szCs w:val="22"/>
         </w:rPr>
-        <w:t xml:space="preserve">JFI 계산 방식의 이원성 주의</w:t>
+        <w:t xml:space="preserve">JFI 계산 방식 차이 주의</w:t>
       </w:r>
       <w:r>
         <w:rPr>

</xml_diff>

<commit_message>
Update final report generator to use final-report-v13.md and regenerate output DOCX
</commit_message>
<xml_diff>
--- a/06-final-report/final/final-report.docx
+++ b/06-final-report/final/final-report.docx
@@ -537,7 +537,7 @@
           <w:sz w:val="22"/>
           <w:szCs w:val="22"/>
         </w:rPr>
-        <w:t xml:space="preserve">최근 ChatGPT, Claude, Gemini 등 대규모 언어 모델(Large Language Model, LLM) API(Application Programming Interface, 프로그램이 다른 프로그램에 요청을 보내고 결과를 받는 통로) 서비스가 다양한 분야에서 활용되고 있다. 이에 따라 기업이나 연구실에서도 하나의 조직 계정으로 여러 구성원이 LLM API를 사용하거나, 자체 LLM 서버를 구축하여 여러 사용자에게 서비스하는 사례가 늘어나고 있다.</w:t>
+        <w:t xml:space="preserve">최근 ChatGPT, Claude, Gemini 등 대규모 언어 모델(Large Language Model, LLM) 서비스가 다양한 분야에서 활용되고 있다. 이러한 서비스는 주로 API(Application Programming Interface, 프로그램이 다른 프로그램에 요청을 보내고 결과를 받는 통로) 형태로 제공된다. 이에 따라 기업이나 연구실에서도 하나의 조직 계정으로 여러 구성원이 LLM API를 사용하거나, 자체 LLM 서버를 구축하여 여러 사용자에게 서비스하는 사례가 늘어나고 있다.</w:t>
       </w:r>
     </w:p>
     <w:p>
@@ -759,7 +759,7 @@
           <w:sz w:val="22"/>
           <w:szCs w:val="22"/>
         </w:rPr>
-        <w:t xml:space="preserve">둘째, 실험은 시간 기반 시뮬레이션(처리 시간을 미리 지정하여 알고리즘 자체의 특성을 비교하는 방식)과 실서버 환경(Ollama(로컬에서 LLM을 실행할 수 있는 오픈소스 도구)를 활용한 실제 LLM 호출) 두 가지로 수행하였다.</w:t>
+        <w:t xml:space="preserve">둘째, 실험은 두 가지 방식으로 수행하였다. 하나는 시간 기반 시뮬레이션으로, 처리 시간을 미리 지정하여 알고리즘 자체의 특성을 비교하는 방식이다. 다른 하나는 실서버 환경에서 Ollama(로컬에서 LLM을 실행할 수 있는 오픈소스 도구)를 활용한 실제 LLM 호출이다.</w:t>
       </w:r>
     </w:p>
     <w:p>
@@ -1100,7 +1100,7 @@
           <w:sz w:val="22"/>
           <w:szCs w:val="22"/>
         </w:rPr>
-        <w:t xml:space="preserve">그러나 이들 도구 모두 다중 사용자 환경에서의 요청 우선순위 관리나 사용자 간 공정성 보장 기능은 공식 문서에서 확인하지 못하였다. 기존 LLM 서빙 도구들은 전체 처리량을 높이는 데 집중하고 있으며, "어떤 사용자의 요청을 먼저 처리할 것인가"나 "사용자별로 자원을 공정하게 나누는 것인가"에 대한 관리 기능은 제공하지 않고 있다. 본 프로젝트는 이 부분에 스케줄링 이론을 적용해보려고 한다.</w:t>
+        <w:t xml:space="preserve">그러나 이들 도구 모두 다중 사용자 환경에서의 요청 우선순위 관리나 사용자 간 공정성 보장 기능은 공식 문서에서 확인하지 못하였다. 기존 LLM 서빙 도구들은 전체 처리량을 높이는 데 집중하고 있으며, "어떤 사용자의 요청을 먼저 처리할 것인가"나 "사용자별로 자원을 공정하게 나누는 것인가"에 대한 관리 기능은 제공하지 않고 있다. 본 프로젝트는 이 부분에 스케줄링 이론을 적용하였다.</w:t>
       </w:r>
     </w:p>
     <w:p>
@@ -1224,7 +1224,7 @@
           <w:sz w:val="22"/>
           <w:szCs w:val="22"/>
         </w:rPr>
-        <w:t xml:space="preserve">지금까지 살펴본 스케줄링 이론과 공정성 측정 방법을 실제 LLM API 요청 관리 시스템에 어떻게 적용할 것인지, 다음 장에서는 시스템 설계 관점으로 기술한다.</w:t>
+        <w:t xml:space="preserve">지금까지 살펴본 스케줄링 이론과 공정성 측정 방법을 실제 LLM API 요청 관리 시스템에 어떻게 적용할 것인지, 다음 장에서는 시스템 설계 관점에서 설명한다.</w:t>
       </w:r>
     </w:p>
     <w:p>
@@ -2110,7 +2110,7 @@
           <w:sz w:val="22"/>
           <w:szCs w:val="22"/>
         </w:rPr>
-        <w:t xml:space="preserve">: Express.js [8](Node.js용 웹 서버 프레임워크) 기반의 HTTP 서버로, 요청 접수, 스케줄러 전환, 통계 조회 등의 기능을 제공한다. 사용자의 요청을 받아서 요청 우선순위와 구독 등급 정보를 포함한 요청 객체를 생성하고, 이를 Rate Limiter를 거쳐 스케줄러에 전달하는 역할을 한다. API 계층은 요청의 접수와 전달을 담당하며, 스케줄링 결정에는 관여하지 않는다.</w:t>
+        <w:t xml:space="preserve">: Express.js(Node.js용 웹 서버 프레임워크) [8] 기반의 HTTP 서버로, 요청 접수, 스케줄러 전환, 통계 조회 등의 기능을 제공한다. 사용자의 요청을 받아서 요청 우선순위와 구독 등급 정보를 포함한 요청 객체를 생성하고, 이를 Rate Limiter를 거쳐 스케줄러에 전달하는 역할을 한다. API 계층은 요청의 접수와 전달을 담당하며, 스케줄링 결정에는 관여하지 않는다.</w:t>
       </w:r>
     </w:p>
     <w:p>
@@ -6628,7 +6628,7 @@
           <w:sz w:val="22"/>
           <w:szCs w:val="22"/>
         </w:rPr>
-        <w:t xml:space="preserve">현재까지 핵심 기능을 구현하고 테스트를 완료하였다.</w:t>
+        <w:t xml:space="preserve">핵심 기능을 구현하고 테스트를 완료하였다.</w:t>
       </w:r>
     </w:p>
     <w:p>
@@ -11184,7 +11184,35 @@
           <w:sz w:val="22"/>
           <w:szCs w:val="22"/>
         </w:rPr>
-        <w:t xml:space="preserve">: 대응표본 t-검정(paired t-test, 같은 조건에서 반복 측정한 두 값의 평균이 서로 다른지 확인하는 통계 방법)을 수행한 결과, p-값(관측된 차이가 우연에 의한 것일 확률)이 0.001 미만으로 나왔다. 95% 신뢰구간(Confidence Interval, 실험을 반복했을 때 참값이 포함될 것으로 기대되는 범위)은 [71.89%, 74.51%]로, 개선율이 약 72~75% 범위에서 안정적으로 나타남을 확인하였다. 효과 크기를 나타내는 Cohen's d(두 집단의 차이가 얼마나 의미 있는 크기인지를 보여주는 지표로, 일반적으로 0.2는 작은 효과, 0.5는 중간 효과, 0.8 이상이면 큰 효과로 판단)는 20.39로, 이는 통상적인 "큰 효과" 기준(0.8)을 훨씬 넘어선 수치이다. 이처럼 값이 매우 크게 나온 이유는, Short 요청의 응답시간 차이(약 46만ms)가 시드 간 변동(표준편차 약 2.3만ms)에 비해 20배 이상이기 때문이다. 즉, 시드를 바꿔가며 실험해도 MLFQ 선점형의 개선 폭은 거의 흔들리지 않는 일관된 결과가 나왔다는 의미이다. 다만 본 실험은 5개 시드의 제한된 반복이므로, 실제 운영 환경에서는 트래픽 패턴에 따라 효과 크기가 달라질 수 있다. 따라서 MLFQ 선점형이 짧은 요청의 응답시간을 크게 줄이는 효과는 통계적으로 유의미하다고 판단하였다. 위 통계 수치는 `experiments-simple/compute-stats.js` 스크립트를 실행하여 재현할 수 있으며, 계산 세부는 부록 B에서 다룬다.</w:t>
+        <w:t xml:space="preserve">: 대응표본 t-검정(paired t-test, 같은 조건에서 반복 측정한 두 값의 평균이 서로 다른지 확인하는 통계 방법)을 수행한 결과, p-값(관측된 차이가 우연에 의한 것일 확률)이 0.001 미만으로 나왔다. 95% 신뢰구간(Confidence Interval, 실험을 반복했을 때 참값이 포함될 것으로 기대되는 범위)은 [71.89%, 74.51%]로, 개선율이 약 72~75% 범위에서 안정적으로 나타남을 확인하였다.</w:t>
+      </w:r>
+    </w:p>
+    <w:p>
+      <w:pPr>
+        <w:spacing w:after="120" w:line="360"/>
+      </w:pPr>
+      <w:r>
+        <w:rPr>
+          <w:rFonts w:ascii="맑은 고딕" w:cs="맑은 고딕" w:eastAsia="맑은 고딕" w:hAnsi="맑은 고딕"/>
+          <w:color w:val="000000"/>
+          <w:sz w:val="22"/>
+          <w:szCs w:val="22"/>
+        </w:rPr>
+        <w:t xml:space="preserve">효과 크기를 나타내는 Cohen's d(두 집단의 차이가 얼마나 의미 있는 크기인지를 보여주는 지표로, 일반적으로 0.2는 작은 효과, 0.5는 중간 효과, 0.8 이상이면 큰 효과로 판단)는 20.39로, 이는 통상적인 "큰 효과" 기준(0.8)을 훨씬 넘어선 수치이다. 이처럼 값이 매우 크게 나온 이유는, Short 요청의 응답시간 차이(약 46만ms)가 시드 간 변동(표준편차 약 2.3만ms)에 비해 20배 이상이기 때문이다. 즉, 시드를 바꿔가며 실험해도 MLFQ 선점형의 개선 폭은 거의 흔들리지 않는 일관된 결과가 나왔다는 의미이다.</w:t>
+      </w:r>
+    </w:p>
+    <w:p>
+      <w:pPr>
+        <w:spacing w:after="120" w:line="360"/>
+      </w:pPr>
+      <w:r>
+        <w:rPr>
+          <w:rFonts w:ascii="맑은 고딕" w:cs="맑은 고딕" w:eastAsia="맑은 고딕" w:hAnsi="맑은 고딕"/>
+          <w:color w:val="000000"/>
+          <w:sz w:val="22"/>
+          <w:szCs w:val="22"/>
+        </w:rPr>
+        <w:t xml:space="preserve">다만 본 실험은 5개 시드의 제한된 반복이므로, 실제 운영 환경에서는 트래픽 패턴에 따라 효과 크기가 달라질 수 있다. 따라서 MLFQ 선점형이 짧은 요청의 응답시간을 크게 줄이는 효과는 통계적으로 유의미하다고 판단하였다. 위 통계 수치는 `02-implementation/experiments-simple/compute-stats.js` 스크립트를 실행하여 재현할 수 있으며, 계산 세부는 부록 B에서 다룬다.</w:t>
       </w:r>
     </w:p>
     <w:p>

</xml_diff>

<commit_message>
Add package.json for figures and include dependencies; add final report document
</commit_message>
<xml_diff>
--- a/06-final-report/final/final-report.docx
+++ b/06-final-report/final/final-report.docx
@@ -809,7 +809,7 @@
       <w:r>
         <w:drawing>
           <wp:inline distT="0" distB="0" distL="0" distR="0">
-            <wp:extent cx="5400675" cy="3038475"/>
+            <wp:extent cx="5400675" cy="1590675"/>
             <wp:effectExtent t="0" r="0" b="0" l="0"/>
             <wp:docPr id="1" name="" descr="" title=""/>
             <wp:cNvGraphicFramePr>
@@ -834,7 +834,7 @@
                   <pic:spPr bwMode="auto">
                     <a:xfrm>
                       <a:off x="0" y="0"/>
-                      <a:ext cx="5400675" cy="3038475"/>
+                      <a:ext cx="5400675" cy="1590675"/>
                     </a:xfrm>
                     <a:prstGeom prst="rect">
                       <a:avLst/>
@@ -1942,7 +1942,7 @@
       <w:r>
         <w:drawing>
           <wp:inline distT="0" distB="0" distL="0" distR="0">
-            <wp:extent cx="5400675" cy="3038475"/>
+            <wp:extent cx="5400675" cy="2019300"/>
             <wp:effectExtent t="0" r="0" b="0" l="0"/>
             <wp:docPr id="1" name="" descr="" title=""/>
             <wp:cNvGraphicFramePr>
@@ -1967,7 +1967,7 @@
                   <pic:spPr bwMode="auto">
                     <a:xfrm>
                       <a:off x="0" y="0"/>
-                      <a:ext cx="5400675" cy="3038475"/>
+                      <a:ext cx="5400675" cy="2019300"/>
                     </a:xfrm>
                     <a:prstGeom prst="rect">
                       <a:avLst/>
@@ -2924,7 +2924,7 @@
       <w:r>
         <w:drawing>
           <wp:inline distT="0" distB="0" distL="0" distR="0">
-            <wp:extent cx="5400675" cy="3038475"/>
+            <wp:extent cx="5400675" cy="1247775"/>
             <wp:effectExtent t="0" r="0" b="0" l="0"/>
             <wp:docPr id="1" name="" descr="" title=""/>
             <wp:cNvGraphicFramePr>
@@ -2949,7 +2949,7 @@
                   <pic:spPr bwMode="auto">
                     <a:xfrm>
                       <a:off x="0" y="0"/>
-                      <a:ext cx="5400675" cy="3038475"/>
+                      <a:ext cx="5400675" cy="1247775"/>
                     </a:xfrm>
                     <a:prstGeom prst="rect">
                       <a:avLst/>
@@ -3932,7 +3932,7 @@
       <w:r>
         <w:drawing>
           <wp:inline distT="0" distB="0" distL="0" distR="0">
-            <wp:extent cx="5400675" cy="3038475"/>
+            <wp:extent cx="5400675" cy="1485900"/>
             <wp:effectExtent t="0" r="0" b="0" l="0"/>
             <wp:docPr id="1" name="" descr="" title=""/>
             <wp:cNvGraphicFramePr>
@@ -3957,7 +3957,7 @@
                   <pic:spPr bwMode="auto">
                     <a:xfrm>
                       <a:off x="0" y="0"/>
-                      <a:ext cx="5400675" cy="3038475"/>
+                      <a:ext cx="5400675" cy="1485900"/>
                     </a:xfrm>
                     <a:prstGeom prst="rect">
                       <a:avLst/>
@@ -6784,7 +6784,7 @@
       <w:r>
         <w:drawing>
           <wp:inline distT="0" distB="0" distL="0" distR="0">
-            <wp:extent cx="5400675" cy="3038475"/>
+            <wp:extent cx="5400675" cy="1657350"/>
             <wp:effectExtent t="0" r="0" b="0" l="0"/>
             <wp:docPr id="1" name="" descr="" title=""/>
             <wp:cNvGraphicFramePr>
@@ -6809,7 +6809,7 @@
                   <pic:spPr bwMode="auto">
                     <a:xfrm>
                       <a:off x="0" y="0"/>
-                      <a:ext cx="5400675" cy="3038475"/>
+                      <a:ext cx="5400675" cy="1657350"/>
                     </a:xfrm>
                     <a:prstGeom prst="rect">
                       <a:avLst/>
@@ -9646,7 +9646,7 @@
       <w:r>
         <w:drawing>
           <wp:inline distT="0" distB="0" distL="0" distR="0">
-            <wp:extent cx="5400675" cy="3038475"/>
+            <wp:extent cx="5400675" cy="2533650"/>
             <wp:effectExtent t="0" r="0" b="0" l="0"/>
             <wp:docPr id="1" name="" descr="" title=""/>
             <wp:cNvGraphicFramePr>
@@ -9671,7 +9671,7 @@
                   <pic:spPr bwMode="auto">
                     <a:xfrm>
                       <a:off x="0" y="0"/>
-                      <a:ext cx="5400675" cy="3038475"/>
+                      <a:ext cx="5400675" cy="2533650"/>
                     </a:xfrm>
                     <a:prstGeom prst="rect">
                       <a:avLst/>
@@ -10985,7 +10985,7 @@
       <w:r>
         <w:drawing>
           <wp:inline distT="0" distB="0" distL="0" distR="0">
-            <wp:extent cx="5400675" cy="3038475"/>
+            <wp:extent cx="5400675" cy="2409825"/>
             <wp:effectExtent t="0" r="0" b="0" l="0"/>
             <wp:docPr id="1" name="" descr="" title=""/>
             <wp:cNvGraphicFramePr>
@@ -11010,7 +11010,7 @@
                   <pic:spPr bwMode="auto">
                     <a:xfrm>
                       <a:off x="0" y="0"/>
-                      <a:ext cx="5400675" cy="3038475"/>
+                      <a:ext cx="5400675" cy="2409825"/>
                     </a:xfrm>
                     <a:prstGeom prst="rect">
                       <a:avLst/>
@@ -12348,7 +12348,7 @@
       <w:r>
         <w:drawing>
           <wp:inline distT="0" distB="0" distL="0" distR="0">
-            <wp:extent cx="5400675" cy="3038475"/>
+            <wp:extent cx="5400675" cy="2257425"/>
             <wp:effectExtent t="0" r="0" b="0" l="0"/>
             <wp:docPr id="1" name="" descr="" title=""/>
             <wp:cNvGraphicFramePr>
@@ -12373,7 +12373,7 @@
                   <pic:spPr bwMode="auto">
                     <a:xfrm>
                       <a:off x="0" y="0"/>
-                      <a:ext cx="5400675" cy="3038475"/>
+                      <a:ext cx="5400675" cy="2257425"/>
                     </a:xfrm>
                     <a:prstGeom prst="rect">
                       <a:avLst/>
@@ -13240,7 +13240,7 @@
       <w:r>
         <w:drawing>
           <wp:inline distT="0" distB="0" distL="0" distR="0">
-            <wp:extent cx="5400675" cy="3038475"/>
+            <wp:extent cx="5400675" cy="2400300"/>
             <wp:effectExtent t="0" r="0" b="0" l="0"/>
             <wp:docPr id="1" name="" descr="" title=""/>
             <wp:cNvGraphicFramePr>
@@ -13265,7 +13265,7 @@
                   <pic:spPr bwMode="auto">
                     <a:xfrm>
                       <a:off x="0" y="0"/>
-                      <a:ext cx="5400675" cy="3038475"/>
+                      <a:ext cx="5400675" cy="2400300"/>
                     </a:xfrm>
                     <a:prstGeom prst="rect">
                       <a:avLst/>
@@ -18015,6 +18015,7 @@
 <w:ftr xmlns:wpc="http://schemas.microsoft.com/office/word/2010/wordprocessingCanvas" xmlns:mc="http://schemas.openxmlformats.org/markup-compatibility/2006" xmlns:o="urn:schemas-microsoft-com:office:office" xmlns:r="http://schemas.openxmlformats.org/officeDocument/2006/relationships" xmlns:m="http://schemas.openxmlformats.org/officeDocument/2006/math" xmlns:v="urn:schemas-microsoft-com:vml" xmlns:wp14="http://schemas.microsoft.com/office/word/2010/wordprocessingDrawing" xmlns:wp="http://schemas.openxmlformats.org/drawingml/2006/wordprocessingDrawing" xmlns:w10="urn:schemas-microsoft-com:office:word" xmlns:w="http://schemas.openxmlformats.org/wordprocessingml/2006/main" xmlns:w14="http://schemas.microsoft.com/office/word/2010/wordml" xmlns:w15="http://schemas.microsoft.com/office/word/2012/wordml" xmlns:wpg="http://schemas.microsoft.com/office/word/2010/wordprocessingGroup" xmlns:wpi="http://schemas.microsoft.com/office/word/2010/wordprocessingInk" xmlns:wne="http://schemas.microsoft.com/office/word/2006/wordml" xmlns:wps="http://schemas.microsoft.com/office/word/2010/wordprocessingShape">
   <w:p>
     <w:pPr>
+      <w:ind w:firstLine="180"/>
       <w:jc w:val="center"/>
     </w:pPr>
     <w:r>
@@ -18092,6 +18093,7 @@
 <w:hdr xmlns:wpc="http://schemas.microsoft.com/office/word/2010/wordprocessingCanvas" xmlns:mc="http://schemas.openxmlformats.org/markup-compatibility/2006" xmlns:o="urn:schemas-microsoft-com:office:office" xmlns:r="http://schemas.openxmlformats.org/officeDocument/2006/relationships" xmlns:m="http://schemas.openxmlformats.org/officeDocument/2006/math" xmlns:v="urn:schemas-microsoft-com:vml" xmlns:wp14="http://schemas.microsoft.com/office/word/2010/wordprocessingDrawing" xmlns:wp="http://schemas.openxmlformats.org/drawingml/2006/wordprocessingDrawing" xmlns:w10="urn:schemas-microsoft-com:office:word" xmlns:w="http://schemas.openxmlformats.org/wordprocessingml/2006/main" xmlns:w14="http://schemas.microsoft.com/office/word/2010/wordml" xmlns:w15="http://schemas.microsoft.com/office/word/2012/wordml" xmlns:wpg="http://schemas.microsoft.com/office/word/2010/wordprocessingGroup" xmlns:wpi="http://schemas.microsoft.com/office/word/2010/wordprocessingInk" xmlns:wne="http://schemas.microsoft.com/office/word/2006/wordml" xmlns:wps="http://schemas.microsoft.com/office/word/2010/wordprocessingShape" xmlns:cx="http://schemas.microsoft.com/office/drawing/2014/chartex" xmlns:cx1="http://schemas.microsoft.com/office/drawing/2015/9/8/chartex" xmlns:cx2="http://schemas.microsoft.com/office/drawing/2015/10/21/chartex" xmlns:cx3="http://schemas.microsoft.com/office/drawing/2016/5/9/chartex" xmlns:cx4="http://schemas.microsoft.com/office/drawing/2016/5/10/chartex" xmlns:cx5="http://schemas.microsoft.com/office/drawing/2016/5/11/chartex" xmlns:cx6="http://schemas.microsoft.com/office/drawing/2016/5/12/chartex" xmlns:cx7="http://schemas.microsoft.com/office/drawing/2016/5/13/chartex" xmlns:cx8="http://schemas.microsoft.com/office/drawing/2016/5/14/chartex" xmlns:w16cid="http://schemas.microsoft.com/office/word/2016/wordml/cid" xmlns:w16se="http://schemas.microsoft.com/office/word/2015/wordml/symex">
   <w:p>
     <w:pPr>
+      <w:ind w:firstLine="160"/>
       <w:jc w:val="right"/>
     </w:pPr>
     <w:r>

</xml_diff>

<commit_message>
Update final report generation to use version 14 and include updated DOCX file
</commit_message>
<xml_diff>
--- a/06-final-report/final/final-report.docx
+++ b/06-final-report/final/final-report.docx
@@ -476,7 +476,7 @@
           <w:sz w:val="22"/>
           <w:szCs w:val="22"/>
         </w:rPr>
-        <w:t xml:space="preserve">최근 ChatGPT, Claude, Gemini 등 대규모 언어 모델(Large Language Model, LLM) 서비스가 다양한 분야에서 활용되고 있다. 이러한 서비스는 주로 API(Application Programming Interface, 프로그램이 다른 프로그램에 요청을 보내고 결과를 받는 통로) 형태로 제공된다. 이에 따라 기업이나 연구실에서도 하나의 조직 계정으로 여러 구성원이 LLM API를 사용하거나, 자체 LLM 서버를 구축하여 여러 사용자에게 서비스하는 사례가 늘어나고 있다.</w:t>
+        <w:t xml:space="preserve">최근 ChatGPT, Claude, Gemini 등 대규모 언어 모델(Large Language Model, LLM) 서비스가 다양한 분야에서 활용되고 있다. 이러한 서비스는 주로 API(Application Programming Interface, 프로그램이 다른 프로그램에 요청을 보내고 결과를 받는 통로) 형태로 제공된다. 기업이나 연구실에서도 하나의 조직 계정으로 여러 구성원이 LLM API를 공유하거나, 자체 LLM 서버를 구축하여 여러 사용자에게 서비스하는 사례가 늘어나고 있다.</w:t>
       </w:r>
     </w:p>
     <w:p>
@@ -1039,7 +1039,7 @@
           <w:sz w:val="22"/>
           <w:szCs w:val="22"/>
         </w:rPr>
-        <w:t xml:space="preserve">그러나 이들 도구 모두 다중 사용자 환경에서의 요청 우선순위 관리나 사용자 간 공정성 보장 기능은 공식 문서에서 확인하지 못하였다. 기존 LLM 서빙 도구들은 전체 처리량을 높이는 데 집중하고 있으며, "어떤 사용자의 요청을 먼저 처리할 것인가"나 "사용자별로 자원을 공정하게 나누는 것인가"에 대한 관리 기능은 제공하지 않고 있다. 본 프로젝트는 이 부분에 스케줄링 이론을 적용하였다.</w:t>
+        <w:t xml:space="preserve">그러나 이들 도구 모두 다중 사용자 환경에서의 요청 우선순위 관리나 사용자 간 공정성 보장 기능은 공식 문서에서 다루지 않는다. 기존 LLM 서빙 도구들은 전체 처리량을 높이는 데 집중하고 있으며, "어떤 사용자의 요청을 먼저 처리할 것인가"나 "사용자별로 자원을 공정하게 나눌 것인가"에 대한 관리 기능은 제공하지 않는다. 본 프로젝트는 이 부분에 스케줄링 이론을 적용하였다.</w:t>
       </w:r>
     </w:p>
     <w:p>
@@ -1070,7 +1070,7 @@
           <w:sz w:val="22"/>
           <w:szCs w:val="22"/>
         </w:rPr>
-        <w:t xml:space="preserve">여러 사용자가 자원을 공유하는 시스템에서, 자원이 얼마나 고르게 나뉘었는지를 측정하는 것은 중요한 문제이다. 공정성을 측정하는 지표로는 대표적으로 Jain's Fairness Index(JFI)가 있다 [7]. JFI는 자원 배분의 균등성을 0에서 1 사이의 점수 하나로 나타내는 지표이다. 이 지표는 사용자 수에 관계없이 적용할 수 있고, 0과 1 사이의 직관적인 값을 제공하므로 해석이 쉽다는 장점이 있다.</w:t>
+        <w:t xml:space="preserve">여러 사용자가 자원을 공유하는 시스템에서, 자원이 얼마나 고르게 나뉘었는지를 측정하는 것은 중요한 문제이다. 앞서 1.2절에서 언급한 Jain's Fairness Index(JFI)는 이러한 측정을 위해 널리 쓰이는 대표적 지표이다 [7]. JFI는 사용자 수에 관계없이 적용할 수 있고, 0과 1 사이의 직관적인 값을 제공하므로 해석이 쉽다는 장점이 있다.</w:t>
       </w:r>
     </w:p>
     <w:p>
@@ -1132,7 +1132,7 @@
           <w:sz w:val="22"/>
           <w:szCs w:val="22"/>
         </w:rPr>
-        <w:t xml:space="preserve">공정성을 측정하는 다른 접근법으로는 최대-최소 공정성(Max-Min Fairness)이 있다. 이는 가장 적게 받는 사용자의 배분량을 최대화하는 방식이다. JFI는 이에 비해 계산이 간단하고, 실험 결과를 단일 수치로 비교할 수 있어 본 프로젝트에서는 JFI를 선택하였다.</w:t>
+        <w:t xml:space="preserve">공정성을 측정하는 다른 접근법으로는 최대-최소 공정성(Max-Min Fairness)이 있다. 이는 가장 적게 받는 사용자의 배분량을 최대화하는 것을 우선시하는 방식으로, 각 사용자의 배분을 반복적으로 조정하여 산출한다. JFI는 이에 비해 계산이 간단하고, 실험 결과를 단일 수치로 비교할 수 있어 본 프로젝트에서는 JFI를 선택하였다.</w:t>
       </w:r>
     </w:p>
     <w:p>
@@ -3871,7 +3871,7 @@
           <w:sz w:val="22"/>
           <w:szCs w:val="22"/>
         </w:rPr>
-        <w:t xml:space="preserve">스케줄링 로직 자체에 집중하기 위해, 별도 빌드나 타입 설정이 필요 없는 JavaScript를 사용하였다. 외부 라이브러리를 최소한으로 사용하고, 스케줄링 알고리즘을 직접 구현하여 학습 효과를 높이는 것을 목표로 하였다.</w:t>
+        <w:t xml:space="preserve">외부 라이브러리를 최소한으로 사용하고, 스케줄링 알고리즘을 직접 구현하여 학습 효과를 높이는 것을 목표로 하였다.</w:t>
       </w:r>
     </w:p>
     <w:p>
@@ -6701,7 +6701,7 @@
           <w:sz w:val="22"/>
           <w:szCs w:val="22"/>
         </w:rPr>
-        <w:t xml:space="preserve">또한, 최종 발표를 위한 실시간 데모 환경을 준비하였다. 터미널에서 `SCHEDULER_TYPE=FCFS node server.js`로 서버를 시작한 뒤, REST API를 통해 여러 등급의 요청을 보내면 스케줄러별로 처리 순서가 달라지는 것을 확인할 수 있다. 데모에서는 FCFS 서버와 WFQ 서버를 순차적으로 실행하여, 동일한 요청이 알고리즘에 따라 다른 순서로 처리되는 과정을 비교한다. 이를 통해 스케줄링 알고리즘의 차이가 실제 사용자 경험에 어떤 영향을 미치는지 직관적으로 보여줄 수 있다.</w:t>
+        <w:t xml:space="preserve">또한, 환경변수로 선택된 스케줄러가 동일한 요청을 알고리즘별로 다른 순서로 처리함을 확인할 수 있도록 실시간 데모 환경을 구성하여, 스케줄링 알고리즘의 차이가 실제 사용자 경험에 미치는 영향을 시각적으로 확인할 수 있도록 하였다.</w:t>
       </w:r>
     </w:p>
     <w:p>
@@ -11123,7 +11123,7 @@
           <w:sz w:val="22"/>
           <w:szCs w:val="22"/>
         </w:rPr>
-        <w:t xml:space="preserve">: 대응표본 t-검정(paired t-test, 같은 조건에서 반복 측정한 두 값의 평균이 서로 다른지 확인하는 통계 방법)을 수행한 결과, p-값(관측된 차이가 우연에 의한 것일 확률)이 0.001 미만으로 나왔다. 95% 신뢰구간(Confidence Interval, 실험을 반복했을 때 참값이 포함될 것으로 기대되는 범위)은 [71.89%, 74.51%]로, 개선율이 약 72~75% 범위에서 안정적으로 나타남을 확인하였다.</w:t>
+        <w:t xml:space="preserve">: 대응표본 t-검정(paired t-test, 같은 조건에서 반복 측정한 두 평균의 차이를 확인하는 방법)을 수행한 결과, p-값이 0.001 미만으로 나왔다. 이는 관측된 차이가 우연에 의한 것일 확률이 매우 낮다는 의미이다. 95% 신뢰구간은 [71.89%, 74.51%]로, 개선율이 약 72~75% 범위에서 안정적으로 나타남을 확인하였다.</w:t>
       </w:r>
     </w:p>
     <w:p>
@@ -11137,7 +11137,7 @@
           <w:sz w:val="22"/>
           <w:szCs w:val="22"/>
         </w:rPr>
-        <w:t xml:space="preserve">효과 크기를 나타내는 Cohen's d(두 집단의 차이가 얼마나 의미 있는 크기인지를 보여주는 지표로, 일반적으로 0.2는 작은 효과, 0.5는 중간 효과, 0.8 이상이면 큰 효과로 판단)는 20.39로, 이는 통상적인 "큰 효과" 기준(0.8)을 훨씬 넘어선 수치이다. 이처럼 값이 매우 크게 나온 이유는, Short 요청의 응답시간 차이(약 46만ms)가 시드 간 변동(표준편차 약 2.3만ms)에 비해 20배 이상이기 때문이다. 즉, 시드를 바꿔가며 실험해도 MLFQ 선점형의 개선 폭은 거의 흔들리지 않는 일관된 결과가 나왔다는 의미이다.</w:t>
+        <w:t xml:space="preserve">효과 크기를 나타내는 Cohen's d(두 집단 차이의 크기를 보여주는 지표)는 20.39로, 통상적인 "큰 효과" 기준(0.8)을 훨씬 넘어선 수치이다. Short 요청의 응답시간 차이가 시드 간 변동에 비해 20배 이상 크다는 의미로, 시드를 바꿔도 MLFQ 선점형의 개선 폭은 거의 흔들리지 않는 일관된 결과를 보였다.</w:t>
       </w:r>
     </w:p>
     <w:p>
@@ -17905,7 +17905,7 @@
           <w:sz w:val="22"/>
           <w:szCs w:val="22"/>
         </w:rPr>
-        <w:t xml:space="preserve">: 5개 시드의 FCFS Short 응답시간과 MLFQ Short 응답시간을 짝지어 대응표본 t-검정을 수행하였다. 구체적으로는 각 시드의 응답시간 차이(FCFS − MLFQ, 평균 약 464,785ms, 표준편차 약 22,798ms)에 대해 표준오차(약 10,196ms)를 계산하고, t = (차이 평균)/(표준오차) = 45.59를 얻었다. Cohen's d는 대응표본용 공식 (차이 평균/차이 표준편차)에 따라 20.39로 산출하였다. 95% 신뢰구간은 개선율 5개 값([71.76%, 74.30%, 73.94%, 72.48%, 73.53%])에 대해 자유도 4의 t 임계값(t₀.₀₂₅ = 2.776)을 적용하여 계산하였다. 이 수치들은 `02-implementation/experiments-simple/compute-stats.js`를 실행하여 그대로 재현할 수 있다.</w:t>
+        <w:t xml:space="preserve">: 5개 시드의 FCFS Short 응답시간과 MLFQ Short 응답시간을 짝지어 대응표본 t-검정을 수행하였다. 각 시드의 응답시간 차이로부터 t = 45.59, Cohen's d = 20.39를 계산하였으며, 95% 신뢰구간은 개선율 5개 값에 자유도 4의 t 임계값을 적용하여 산출하였다. 위 수치는 `02-implementation/experiments-simple/compute-stats.js`를 실행하여 재현할 수 있다.</w:t>
       </w:r>
     </w:p>
     <w:p>

</xml_diff>

<commit_message>
Update final report to version 16 and adjust generation script to reflect changes. - Added new final report draft (final-report-v16.md) with comprehensive content on multi-user LLM API request management using scheduling algorithms. - Modified generate-final.js to reference the new report version. - Updated final report document (final-report.docx) to include the latest changes.
</commit_message>
<xml_diff>
--- a/06-final-report/final/final-report.docx
+++ b/06-final-report/final/final-report.docx
@@ -988,7 +988,7 @@
           <w:sz w:val="22"/>
           <w:szCs w:val="22"/>
         </w:rPr>
-        <w:t xml:space="preserve">는 네트워크의 공정 자원 배분 알고리즘으로, 이상적 모델 GPS(Generalized Processor Sharing)를 근사하기 위해 각 요청의 가상 완료 시각(Virtual Finish Time, VFT)이 작은 것부터 처리한다 [4]. 가중치가 클수록 VFT가 느리게 증가해 더 자주 선택되며, 인터넷 라우터의 QoS(Quality of Service) 기반으로 쓰인다 [4]. 구체적 VFT 계산은 4.3절에서 설명한다.</w:t>
+        <w:t xml:space="preserve">는 네트워크의 공정 자원 배분 알고리즘으로, 이상적 모델 GPS(Generalized Processor Sharing)를 비슷하게 구현하기 위해 각 요청의 가상 완료 시각(Virtual Finish Time, VFT)이 작은 것부터 처리한다 [4]. 가중치가 클수록 VFT가 느리게 증가해 더 자주 선택되며, 인터넷 라우터의 QoS(Quality of Service) 기반으로 쓰인다 [4]. 구체적 VFT 계산은 4.3절에서 설명한다.</w:t>
       </w:r>
     </w:p>
     <w:p>
@@ -2574,7 +2574,7 @@
           <w:sz w:val="22"/>
           <w:szCs w:val="22"/>
         </w:rPr>
-        <w:t xml:space="preserve">실서버는 Ollama 등 대부분의 LLM 서빙 도구가 추론 중단을 지원하지 않으므로 비선점형(Non-preemptive)으로 동작한다. MLFQ의 이론적 효과 확인을 위해 선점형(500ms 간격 할당량 확인)은 시뮬레이션에만 추가 구현하였다 (5.3절). Priority는 URGENT &gt; HIGH &gt; NORMAL &gt; LOW 순에 5초 주기 에이징을 적용하고, MLFQ는 4단계 큐(Q0~Q3)와 5초 주기 부스팅을 [3], WFQ는 구독 등급 가중치(Enterprise 100, Premium 50, Standard 10, Free 1)를 VFT 계산에 반영한다.</w:t>
+        <w:t xml:space="preserve">실서버는 Ollama 등 대부분의 LLM 서빙 도구가 추론 중단을 지원하지 않으므로 비선점형(Non-preemptive)으로 동작한다. MLFQ의 이론적 효과 확인을 위해 선점형(500ms 간격 할당량 확인)은 시뮬레이션에만 추가 구현하였다 (5.3절). Priority는 URGENT &gt; HIGH &gt; NORMAL &gt; LOW 순에 5초 주기 에이징을 적용하고, MLFQ는 4단계 큐(Q0~Q3)와 5초 주기 부스팅을 적용하며 [3], WFQ는 구독 등급 가중치(Enterprise 100, Premium 50, Standard 10, Free 1)를 VFT 계산에 반영한다.</w:t>
       </w:r>
     </w:p>
     <w:p>
@@ -8532,7 +8532,7 @@
           <w:sz w:val="22"/>
           <w:szCs w:val="22"/>
         </w:rPr>
-        <w:t xml:space="preserve">: 5개 시드에서 Short 개선율이 71.8~74.3%의 좁은 범위에 분포하였다 (시드별 세부는 부록 B 표 18). 대응표본 t-검정 결과 p &lt; 0.001, 95% 신뢰구간 [71.89%, 74.51%]로 우연의 결과가 아님을 확인하였다. 효과 크기 Cohen's d = 20.39는 통상 "큰 효과" 기준(0.8)을 크게 상회한다. 5개 시드의 제한된 반복이므로 실제 트래픽 패턴에 따라 효과는 달라질 수 있다. 통계 수치는 `compute-stats.js`로 재현 가능하며 계산 세부는 부록 B에서 다룬다.</w:t>
+        <w:t xml:space="preserve">: 5개 시드에서 Short 개선율이 71.8~74.3%의 좁은 범위에 분포하였다 (시드별 세부는 부록 B 표 18). 대응표본 t-검정 결과 p &lt; 0.001, 95% 신뢰구간 [71.89%, 74.51%]로 우연의 결과가 아님을 확인하였다. 효과 크기 Cohen's d = 20.39는 통상 "큰 효과" 기준(0.8)보다 훨씬 크다. 5개 시드의 제한된 반복이므로 실제 트래픽 패턴에 따라 효과는 달라질 수 있다. 통계 수치는 `compute-stats.js`로 재현 가능하며 계산 세부는 부록 B에서 다룬다.</w:t>
       </w:r>
     </w:p>
     <w:p>
@@ -14515,7 +14515,7 @@
           <w:sz w:val="22"/>
           <w:szCs w:val="22"/>
         </w:rPr>
-        <w:t xml:space="preserve">: 이 표의 개선율은 LLM 추론을 임의 시점에 중단·재개할 수 있다는 가정 하의 이론적 상한이며, 실서버에서는 비선점형 MLFQ만 적용 가능하다 (6.1절).</w:t>
+        <w:t xml:space="preserve">: 이 표의 개선율은 LLM 추론을 임의 시점에 중단·재개할 수 있다고 가정했을 때의 이론적 상한이며, 실서버에서는 비선점형 MLFQ만 적용 가능하다 (6.1절).</w:t>
       </w:r>
     </w:p>
     <w:sectPr>

</xml_diff>

<commit_message>
Add final report snapshots and package configuration
- Created package.json for figures with dependencies: playwright, pptxgenjs, and sharp.
- Added final-report.docx for snapshot taken on 2026-04-16 07:51:02.
- Included additional final-report.docx for snapshot taken on 2026-04-15 17:56:15.
- Documented snapshot information in snapshot-info.md, detailing sources preserved and purpose for v17 preparation.
</commit_message>
<xml_diff>
--- a/06-final-report/final/final-report.docx
+++ b/06-final-report/final/final-report.docx
@@ -1019,7 +1019,7 @@
           <w:sz w:val="22"/>
           <w:szCs w:val="22"/>
         </w:rPr>
-        <w:t xml:space="preserve">LLM 서빙은 학습된 모델을 실행해 사용자 요청에 응답을 주는 것을 뜻한다. LLM은 이전 토큰을 참고해 다음 토큰을 하나씩 생성하며, 매 토큰마다 GPU 자원이 소비된다. 대표 오픈소스 도구인 vLLM [5]과 Hugging Face TGI [6]는 여러 요청을 동시 처리하는 연속 배치(Continuous Batching)를 지원하며, 특히 vLLM은 PagedAttention으로 높은 처리 성능을 낸다 [5]. 본 프로젝트 실서버 실험에 사용한 Ollama [10]는 로컬에서 REST API로 LLM을 호출하는 도구로, 한 번에 한 요청씩 순차 처리하고 추론 중단이 불가능하다.</w:t>
+        <w:t xml:space="preserve">LLM 서빙은 학습된 모델을 실행해 사용자 요청에 응답을 주는 것을 뜻한다. LLM은 이전 토큰을 참고해 다음 토큰을 하나씩 생성하며, 매 토큰마다 GPU 자원이 소비된다. 대표 오픈소스 도구인 vLLM [5]과 Hugging Face TGI [6]는 여러 요청을 동시 처리하는 연속 배치(Continuous Batching)를 지원해 높은 처리 성능을 내는 것으로 알려져 있다. 본 프로젝트 실서버 실험에 사용한 Ollama [10]는 로컬에서 REST API로 LLM을 호출하는 도구로, 한 번에 한 요청씩 순차 처리하고 추론 중단이 불가능하다.</w:t>
       </w:r>
     </w:p>
     <w:p>
@@ -2905,33 +2905,27 @@
     </w:p>
     <w:p>
       <w:pPr>
-        <w:pStyle w:val="Heading3"/>
-        <w:spacing w:after="120" w:before="200"/>
+        <w:spacing w:after="120" w:line="360"/>
       </w:pPr>
       <w:r>
         <w:rPr>
           <w:rFonts w:ascii="맑은 고딕" w:cs="맑은 고딕" w:eastAsia="맑은 고딕" w:hAnsi="맑은 고딕"/>
           <w:b/>
           <w:bCs/>
-          <w:color w:val="333333"/>
-          <w:sz w:val="22"/>
-          <w:szCs w:val="22"/>
-        </w:rPr>
-        <w:t xml:space="preserve">MLFQ 구현</w:t>
-      </w:r>
-    </w:p>
-    <w:p>
-      <w:pPr>
-        <w:spacing w:after="120" w:line="360"/>
-      </w:pPr>
-      <w:r>
-        <w:rPr>
-          <w:rFonts w:ascii="맑은 고딕" w:cs="맑은 고딕" w:eastAsia="맑은 고딕" w:hAnsi="맑은 고딕"/>
-          <w:color w:val="000000"/>
-          <w:sz w:val="22"/>
-          <w:szCs w:val="22"/>
-        </w:rPr>
-        <w:t xml:space="preserve">OSTEP [3]의 5가지 규칙에 따라 구현하였다 (표 5).</w:t>
+          <w:color w:val="000000"/>
+          <w:sz w:val="22"/>
+          <w:szCs w:val="22"/>
+        </w:rPr>
+        <w:t xml:space="preserve">MLFQ 구현.</w:t>
+      </w:r>
+      <w:r>
+        <w:rPr>
+          <w:rFonts w:ascii="맑은 고딕" w:cs="맑은 고딕" w:eastAsia="맑은 고딕" w:hAnsi="맑은 고딕"/>
+          <w:color w:val="000000"/>
+          <w:sz w:val="22"/>
+          <w:szCs w:val="22"/>
+        </w:rPr>
+        <w:t xml:space="preserve"> OSTEP [3]의 5가지 규칙에 따라 구현하였다 (표 5).</w:t>
       </w:r>
     </w:p>
     <w:p>
@@ -3820,33 +3814,27 @@
     </w:p>
     <w:p>
       <w:pPr>
-        <w:pStyle w:val="Heading3"/>
-        <w:spacing w:after="120" w:before="200"/>
+        <w:spacing w:after="120" w:line="360"/>
       </w:pPr>
       <w:r>
         <w:rPr>
           <w:rFonts w:ascii="맑은 고딕" w:cs="맑은 고딕" w:eastAsia="맑은 고딕" w:hAnsi="맑은 고딕"/>
           <w:b/>
           <w:bCs/>
-          <w:color w:val="333333"/>
-          <w:sz w:val="22"/>
-          <w:szCs w:val="22"/>
-        </w:rPr>
-        <w:t xml:space="preserve">WFQ 구현</w:t>
-      </w:r>
-    </w:p>
-    <w:p>
-      <w:pPr>
-        <w:spacing w:after="120" w:line="360"/>
-      </w:pPr>
-      <w:r>
-        <w:rPr>
-          <w:rFonts w:ascii="맑은 고딕" w:cs="맑은 고딕" w:eastAsia="맑은 고딕" w:hAnsi="맑은 고딕"/>
-          <w:color w:val="000000"/>
-          <w:sz w:val="22"/>
-          <w:szCs w:val="22"/>
-        </w:rPr>
-        <w:t xml:space="preserve">WFQ는 각 요청의 가상 완료 시각(VFT)을 계산해 가장 작은 값부터 처리한다.</w:t>
+          <w:color w:val="000000"/>
+          <w:sz w:val="22"/>
+          <w:szCs w:val="22"/>
+        </w:rPr>
+        <w:t xml:space="preserve">WFQ 구현.</w:t>
+      </w:r>
+      <w:r>
+        <w:rPr>
+          <w:rFonts w:ascii="맑은 고딕" w:cs="맑은 고딕" w:eastAsia="맑은 고딕" w:hAnsi="맑은 고딕"/>
+          <w:color w:val="000000"/>
+          <w:sz w:val="22"/>
+          <w:szCs w:val="22"/>
+        </w:rPr>
+        <w:t xml:space="preserve"> WFQ는 각 요청의 가상 완료 시각(VFT)을 계산해 가장 작은 값부터 처리한다.</w:t>
       </w:r>
     </w:p>
     <w:p>
@@ -4152,7 +4140,7 @@
           <w:sz w:val="22"/>
           <w:szCs w:val="22"/>
         </w:rPr>
-        <w:t xml:space="preserve">Rate Limiter는 스케줄링 비교 대상이 아닌 요청 진입 관리 전처리 단계이다. 토큰 버킷(Token Bucket) 방식으로 구현되어 구독 등급별 분당 허용 수(표 7)를 제한하고, 토큰이 없으면 HTTP 429로 거부한다. 스케줄러와 독립적으로 동작한다.</w:t>
+        <w:t xml:space="preserve">Rate Limiter는 스케줄링 비교 대상이 아닌 요청 진입 관리 전처리 단계이다. 토큰 버킷(Token Bucket, 일정 시간마다 요청 권한인 토큰이 새로 발급되고 요청이 들어올 때마다 토큰 하나씩 소모하는 방식) 방식으로 구현되어 구독 등급별 분당 허용 수(표 7)를 제한하고, 토큰이 없으면 HTTP 429로 거부한다. 스케줄러와 독립적으로 동작한다.</w:t>
       </w:r>
     </w:p>
     <w:p>
@@ -6417,7 +6405,7 @@
           <w:sz w:val="22"/>
           <w:szCs w:val="22"/>
         </w:rPr>
-        <w:t xml:space="preserve">Short는 최상위 큐에서 완료되고 Medium·Long은 시간 할당량 초과로 하위 큐로 강등되도록 설계하였다. 버스트 도착(20건 동시)은 대기열에 요청이 쌓인 상태에서 스케줄러가 순서를 결정하도록 유도하기 위함이다. 모든 실험에서 요청은 1건씩 순차 처리된다. JFI 계산 방식의 차이는 5.5절에서 다루며, 대규모 환경은 7.2절 향후 연구 과제로 남긴다.</w:t>
+        <w:t xml:space="preserve">Short는 최상위 큐에서 완료되고 Medium·Long은 시간 할당량 초과로 하위 큐로 강등되도록 설계하였다. 버스트 도착(20건 동시)은 대기열에 요청이 쌓인 상태에서 스케줄러가 순서를 결정하도록 유도하기 위함이다. 모든 실험에서 요청은 1건씩 순차 처리된다. 세 실험의 요청을 합산하면 총 2,520건 규모(기본 500 + 선점형 2,500 + 실서버 20)가 된다. JFI 계산 방식의 차이는 5.5절에서 다루며, 대규모 환경은 7.2절 향후 연구 과제로 남긴다.</w:t>
       </w:r>
     </w:p>
     <w:p>
@@ -8532,7 +8520,7 @@
           <w:sz w:val="22"/>
           <w:szCs w:val="22"/>
         </w:rPr>
-        <w:t xml:space="preserve">: 5개 시드에서 Short 개선율이 71.8~74.3%의 좁은 범위에 분포하였다 (시드별 세부는 부록 B 표 18). 대응표본 t-검정 결과 p &lt; 0.001, 95% 신뢰구간 [71.89%, 74.51%]로 우연의 결과가 아님을 확인하였다. 효과 크기 Cohen's d = 20.39는 통상 "큰 효과" 기준(0.8)보다 훨씬 크다. 5개 시드의 제한된 반복이므로 실제 트래픽 패턴에 따라 효과는 달라질 수 있다. 통계 수치는 `compute-stats.js`로 재현 가능하며 계산 세부는 부록 B에서 다룬다.</w:t>
+        <w:t xml:space="preserve">: 5개 시드에서 Short 개선율이 71.8~74.3%의 좁은 범위에 분포하였다 (시드별 세부는 부록 B 표 18). 대응표본 t-검정 결과 p &lt; 0.001, 95% 신뢰구간 [71.89%, 74.51%]로 우연의 결과가 아님을 확인하였다. 효과 크기 Cohen's d도 통상 "큰 효과" 기준(0.8)을 크게 상회하였는데, 이는 5개 시드 간 분산이 매우 작아 수치상 크게 계산된 결과이므로 "개선이 일관되게 재현된다"는 의미로 해석하는 것이 타당하다. 5개 시드의 제한된 반복이므로 실제 트래픽 패턴에 따라 효과는 달라질 수 있다. 통계 수치는 `compute-stats.js`로 재현 가능하며 계산 세부는 부록 B에서 다룬다.</w:t>
       </w:r>
     </w:p>
     <w:p>
@@ -12110,7 +12098,7 @@
           <w:sz w:val="22"/>
           <w:szCs w:val="22"/>
         </w:rPr>
-        <w:t xml:space="preserve">본 프로젝트는 두 가지 면에서 의의가 있다. 첫째, CPU 스케줄링(FCFS, Priority, MLFQ)과 네트워크 자원 배분(WFQ) 알고리즘을 LLM API 환경에 적용해 운영체제 이론의 실제 응용을 확인하였다. 둘째, vLLM·TGI 등 기존 LLM 서빙 도구가 전체 처리량 최적화에 집중하여 사용자별 공정성이나 우선순위 관리를 제공하지 않는다는 점을 확인하고, 이 부분에 스케줄링 이론을 적용한 효과를 비교하였다. 특히 WFQ의 가중치 비례 차등 서비스는 유료 LLM 서비스의 구독 등급 관리에 활용할 가능성을 보여준다. 다만 최대 500건 규모의 실험이므로, 대규모 운영 환경에서도 같은 결과가 나올지는 추가 확인이 필요하다.</w:t>
+        <w:t xml:space="preserve">본 프로젝트는 두 가지 면에서 의의가 있다. 첫째, CPU 스케줄링(FCFS, Priority, MLFQ)과 네트워크 자원 배분(WFQ) 알고리즘을 LLM API 환경에 적용해 운영체제 이론의 실제 응용을 확인하였다. 둘째, vLLM·TGI 등 기존 LLM 서빙 도구가 전체 처리량 최적화에 집중하여 사용자별 공정성이나 우선순위 관리를 제공하지 않는다는 점을 확인하고, 이 부분에 스케줄링 이론을 적용한 효과를 비교하였다. 특히 WFQ의 가중치 비례 차등 서비스는 유료 LLM 서비스의 구독 등급 관리에 활용할 가능성을 보여준다. 다만 단일 실험 기준 최대 500건, 세 실험을 합산한 총 2,520건 규모이므로, 대규모 운영 환경에서도 같은 결과가 나올지는 추가 확인이 필요하다.</w:t>
       </w:r>
     </w:p>
     <w:p>
@@ -12213,7 +12201,7 @@
           <w:sz w:val="22"/>
           <w:szCs w:val="22"/>
         </w:rPr>
-        <w:t xml:space="preserve">: 비선점형 환경에서 네 알고리즘의 전체 처리량은 유사하였다. 스케줄러는 순서만 결정할 뿐 처리 속도 자체를 바꾸지 못하기 때문이다. 선점형 MLFQ에서는 짧은 요청 응답시간이 약 73% 감소, 긴 요청은 약 89% 증가하였다. 개선 효과는 5개 시드에서 71.8~74.3% 범위로 일관되게 재현되었다 (p &lt; 0.001, Cohen's d = 20.39). WFQ에서는 Enterprise의 평균 대기시간이 Free의 약 1/12 수준으로 나타났다.</w:t>
+        <w:t xml:space="preserve">: 비선점형 환경에서 네 알고리즘의 전체 처리량은 유사하였다. 스케줄러는 순서만 결정할 뿐 처리 속도 자체를 바꾸지 못하기 때문이다. 선점형 MLFQ에서는 짧은 요청 응답시간이 약 73% 감소, 긴 요청은 약 89% 증가하였다. 개선 효과는 5개 시드에서 71.8~74.3% 범위로 일관되게 재현되었다 (p &lt; 0.001, 효과 크기 큼, 상세는 부록 B). WFQ에서는 Enterprise의 평균 대기시간이 Free의 약 1/12 수준으로 나타났다.</w:t>
       </w:r>
     </w:p>
     <w:p>

</xml_diff>

<commit_message>
Update final report to version 18 and adjust generator script
- Added new final report draft (final-report-v18.md) with comprehensive content on multi-user LLM API request management using scheduling algorithms.
- Updated the DOCX generator script to read from the new final report version (final-report-v18.md).
- Generated new final report document (final-report.docx) based on the latest draft.
- Created a snapshot of the previous report version (final-report-v17-pre.docx) for reference.
</commit_message>
<xml_diff>
--- a/06-final-report/final/final-report.docx
+++ b/06-final-report/final/final-report.docx
@@ -1019,7 +1019,7 @@
           <w:sz w:val="22"/>
           <w:szCs w:val="22"/>
         </w:rPr>
-        <w:t xml:space="preserve">LLM 서빙은 학습된 모델을 실행해 사용자 요청에 응답을 주는 것을 뜻한다. LLM은 이전 토큰을 참고해 다음 토큰을 하나씩 생성하며, 매 토큰마다 GPU 자원이 소비된다. 대표 오픈소스 도구인 vLLM [5]과 Hugging Face TGI [6]는 여러 요청을 동시 처리하는 연속 배치(Continuous Batching)를 지원해 높은 처리 성능을 내는 것으로 알려져 있다. 본 프로젝트 실서버 실험에 사용한 Ollama [10]는 로컬에서 REST API로 LLM을 호출하는 도구로, 한 번에 한 요청씩 순차 처리하고 추론 중단이 불가능하다.</w:t>
+        <w:t xml:space="preserve">LLM 서빙은 학습된 모델을 실행해 사용자 요청에 응답을 주는 것을 뜻한다. LLM은 이전 토큰을 참고해 다음 토큰을 하나씩 생성하며, 매 토큰마다 GPU 자원이 소비된다. GPU 메모리 용량이 동시 처리 가능한 요청 수의 상한을 결정하므로, 다중 사용자 환경에서는 한정된 GPU 자원을 여러 요청이 경쟁하게 된다. 대표 오픈소스 도구인 vLLM [5]과 Hugging Face TGI [6]는 여러 요청을 동시 처리하는 연속 배치(Continuous Batching)를 지원해 높은 처리 성능을 내는 것으로 알려져 있다. 연속 배치는 매 토큰 생성 단계마다 새 요청을 배치에 합류시키는 방식으로, 전체 처리량은 늘리지만 각 요청을 어떤 순서로 끼워 넣을지는 별도 결정이 필요하다. 본 프로젝트 실서버 실험에 사용한 Ollama [10]는 로컬에서 REST API로 LLM을 호출하는 도구로, 한 번에 한 요청씩 순차 처리하고 추론 중단이 불가능하다.</w:t>
       </w:r>
     </w:p>
     <w:p>
@@ -1033,7 +1033,7 @@
           <w:sz w:val="22"/>
           <w:szCs w:val="22"/>
         </w:rPr>
-        <w:t xml:space="preserve">이들 도구는 모두 다중 사용자 환경에서의 우선순위 관리나 공정성 보장 기능을 제공하지 않고, 전체 처리량을 높이는 데 집중한다. "어떤 사용자를 먼저 처리할 것인가"는 별도 구현이 필요하며, 본 프로젝트는 이 부분에 스케줄링 이론을 적용하였다.</w:t>
+        <w:t xml:space="preserve">이들 도구는 모두 다중 사용자 환경에서의 우선순위 관리나 공정성 보장 기능을 제공하지 않고, 전체 처리량을 높이는 데 집중한다. OpenAI [1]와 Anthropic [2]의 상용 API도 조직 단위의 분당 한도만 제공할 뿐 조직 내부에서 사용자별 차등이나 우선순위 처리는 지원하지 않는다. 즉 "어떤 사용자를 먼저 처리할 것인가"는 서비스 운영자가 별도로 구현해야 하는 부분이며, 본 프로젝트는 이 부분에 스케줄링 이론을 적용하였다.</w:t>
       </w:r>
     </w:p>
     <w:p>
@@ -1095,7 +1095,7 @@
           <w:sz w:val="22"/>
           <w:szCs w:val="22"/>
         </w:rPr>
-        <w:t xml:space="preserve">xi는 사용자 i의 자원량, n은 사용자 수이다. 모두 동일 배분이면 1, 한 명이 독점하면 1/n에 가까워진다(예: 4명 중 한 명 독점 시 0.25). 계산이 간단하고 단일 수치로 비교 가능하여 본 프로젝트에서 사용하였다. 다만 WFQ처럼 가중치 기반으로 의도적 차등을 두는 경우에는 가중치 반영 JFI가 필요하다 (5.5절 참조).</w:t>
+        <w:t xml:space="preserve">xi는 사용자 i의 자원량, n은 사용자 수이다. 모두 동일 배분이면 1, 한 명이 독점하면 1/n에 가까워진다(예: 4명 중 한 명 독점 시 0.25). 스케줄링 맥락에서는 xi로 사용자별 대기시간(값이 작을수록 좋음)이나 처리 건수(값이 클수록 좋음) 등을 대입하여 공정성을 측정하며, 본 프로젝트에서도 실험 목적에 따라 두 기준을 구분해 사용하였다 (5.5절). 공정성 지표에는 JFI 외에 최대-최소 공정성(Max-Min Fairness, 가장 불리한 사용자의 몫을 극대화하는 기준)이나 비례 공정성(Proportional Fairness, 사용자별 효용의 로그합을 극대화) 등이 있으나 [4], 본 프로젝트에서는 계산이 간단하고 단일 수치로 비교가 용이한 JFI를 선택하였다. 다만 WFQ처럼 가중치 기반으로 의도적 차등을 두는 경우에는 가중치 반영 JFI가 필요하다 (5.5절 참조).</w:t>
       </w:r>
     </w:p>
     <w:p>
@@ -2925,7 +2925,7 @@
           <w:sz w:val="22"/>
           <w:szCs w:val="22"/>
         </w:rPr>
-        <w:t xml:space="preserve"> OSTEP [3]의 5가지 규칙에 따라 구현하였다 (표 5).</w:t>
+        <w:t xml:space="preserve"> OSTEP [3]의 5가지 규칙에 따라 구현하였다 (표 3).</w:t>
       </w:r>
     </w:p>
     <w:p>
@@ -2941,7 +2941,7 @@
           <w:sz w:val="22"/>
           <w:szCs w:val="22"/>
         </w:rPr>
-        <w:t xml:space="preserve">표 5. MLFQ 규칙 및 큐별 시간 할당량</w:t>
+        <w:t xml:space="preserve">표 3. MLFQ 규칙 및 큐별 시간 할당량</w:t>
       </w:r>
     </w:p>
     <w:tbl>
@@ -4140,7 +4140,7 @@
           <w:sz w:val="22"/>
           <w:szCs w:val="22"/>
         </w:rPr>
-        <w:t xml:space="preserve">Rate Limiter는 스케줄링 비교 대상이 아닌 요청 진입 관리 전처리 단계이다. 토큰 버킷(Token Bucket, 일정 시간마다 요청 권한인 토큰이 새로 발급되고 요청이 들어올 때마다 토큰 하나씩 소모하는 방식) 방식으로 구현되어 구독 등급별 분당 허용 수(표 7)를 제한하고, 토큰이 없으면 HTTP 429로 거부한다. 스케줄러와 독립적으로 동작한다.</w:t>
+        <w:t xml:space="preserve">Rate Limiter는 스케줄링 비교 대상이 아닌 요청 진입 관리 전처리 단계이다. 토큰 버킷(Token Bucket, 일정 시간마다 요청 권한인 토큰이 새로 발급되고 요청이 들어올 때마다 토큰 하나씩 소모하는 방식) 방식으로 구현되어 구독 등급별 분당 허용 수(표 4)를 제한하고, 토큰이 없으면 HTTP 429로 거부한다. 스케줄러와 독립적으로 동작한다.</w:t>
       </w:r>
     </w:p>
     <w:p>
@@ -4156,7 +4156,7 @@
           <w:sz w:val="22"/>
           <w:szCs w:val="22"/>
         </w:rPr>
-        <w:t xml:space="preserve">표 7. 구독 등급별 요청 한도</w:t>
+        <w:t xml:space="preserve">표 4. 구독 등급별 요청 한도</w:t>
       </w:r>
     </w:p>
     <w:tbl>
@@ -4653,7 +4653,7 @@
           <w:sz w:val="22"/>
           <w:szCs w:val="22"/>
         </w:rPr>
-        <w:t xml:space="preserve">표 8. 실험 유형별 설정 비교</w:t>
+        <w:t xml:space="preserve">표 5. 실험 유형별 설정 비교</w:t>
       </w:r>
     </w:p>
     <w:tbl>
@@ -5875,7 +5875,7 @@
           <w:sz w:val="22"/>
           <w:szCs w:val="22"/>
         </w:rPr>
-        <w:t xml:space="preserve">선점형 실험의 "혼합"은 세 가지 처리 시간 범위의 요청을 섞은 것이다 (표 9).</w:t>
+        <w:t xml:space="preserve">선점형 실험의 "혼합"은 세 가지 처리 시간 범위의 요청을 섞은 것이다 (표 6).</w:t>
       </w:r>
     </w:p>
     <w:p>
@@ -5891,7 +5891,7 @@
           <w:sz w:val="22"/>
           <w:szCs w:val="22"/>
         </w:rPr>
-        <w:t xml:space="preserve">표 9. 요청 유형별 구성</w:t>
+        <w:t xml:space="preserve">표 6. 요청 유형별 구성</w:t>
       </w:r>
     </w:p>
     <w:tbl>
@@ -6436,7 +6436,7 @@
           <w:sz w:val="22"/>
           <w:szCs w:val="22"/>
         </w:rPr>
-        <w:t xml:space="preserve">네 가지 알고리즘을 같은 500건 요청에 대해 실행한 결과는 표 10과 같다.</w:t>
+        <w:t xml:space="preserve">네 가지 알고리즘을 같은 500건 요청에 대해 실행한 결과는 표 7과 같다.</w:t>
       </w:r>
     </w:p>
     <w:p>
@@ -6452,7 +6452,7 @@
           <w:sz w:val="22"/>
           <w:szCs w:val="22"/>
         </w:rPr>
-        <w:t xml:space="preserve">표 10. 알고리즘별 성능 비교 (500건, 지표: 대기시간 기준)</w:t>
+        <w:t xml:space="preserve">표 7. 알고리즘별 성능 비교 (500건, 지표: 대기시간 기준)</w:t>
       </w:r>
     </w:p>
     <w:tbl>
@@ -7242,7 +7242,7 @@
           <w:sz w:val="22"/>
           <w:szCs w:val="22"/>
         </w:rPr>
-        <w:t xml:space="preserve">는 전체 평균은 가장 낮았으나 구독 등급별 차이가 컸다 (표 11). JFI = 0.316은 5.5절에서 분석한다.</w:t>
+        <w:t xml:space="preserve">는 전체 평균은 가장 낮았으나 구독 등급별 차이가 컸다 (표 8). JFI = 0.316은 5.5절에서 분석한다.</w:t>
       </w:r>
     </w:p>
     <w:p>
@@ -7258,7 +7258,7 @@
           <w:sz w:val="22"/>
           <w:szCs w:val="22"/>
         </w:rPr>
-        <w:t xml:space="preserve">표 11. WFQ 구독 등급별 평균 대기시간</w:t>
+        <w:t xml:space="preserve">표 8. WFQ 구독 등급별 평균 대기시간</w:t>
       </w:r>
     </w:p>
     <w:tbl>
@@ -7790,7 +7790,7 @@
           <w:sz w:val="22"/>
           <w:szCs w:val="22"/>
         </w:rPr>
-        <w:t xml:space="preserve">표 12. MLFQ 선점형 vs FCFS 비교 (요청 유형별, 5회 평균, 지표: 응답시간 기준)</w:t>
+        <w:t xml:space="preserve">표 9. MLFQ 선점형 vs FCFS 비교 (요청 유형별, 5회 평균, 지표: 응답시간 기준)</w:t>
       </w:r>
     </w:p>
     <w:tbl>
@@ -8520,7 +8520,7 @@
           <w:sz w:val="22"/>
           <w:szCs w:val="22"/>
         </w:rPr>
-        <w:t xml:space="preserve">: 5개 시드에서 Short 개선율이 71.8~74.3%의 좁은 범위에 분포하였다 (시드별 세부는 부록 B 표 18). 대응표본 t-검정 결과 p &lt; 0.001, 95% 신뢰구간 [71.89%, 74.51%]로 우연의 결과가 아님을 확인하였다. 효과 크기 Cohen's d도 통상 "큰 효과" 기준(0.8)을 크게 상회하였는데, 이는 5개 시드 간 분산이 매우 작아 수치상 크게 계산된 결과이므로 "개선이 일관되게 재현된다"는 의미로 해석하는 것이 타당하다. 5개 시드의 제한된 반복이므로 실제 트래픽 패턴에 따라 효과는 달라질 수 있다. 통계 수치는 `compute-stats.js`로 재현 가능하며 계산 세부는 부록 B에서 다룬다.</w:t>
+        <w:t xml:space="preserve">: 5개 시드에서 Short 개선율이 71.8~74.3%의 좁은 범위에 분포하였다 (시드별 세부는 부록 B 표 B.1). 대응표본 t-검정 결과 p &lt; 0.001, 95% 신뢰구간 [71.89%, 74.51%]로 우연의 결과가 아님을 확인하였다. 효과 크기 Cohen's d도 통상 "큰 효과" 기준(0.8)을 크게 상회하였는데, 이는 5개 시드 간 분산이 매우 작아 수치상 크게 계산된 결과이므로 "개선이 일관되게 재현된다"는 의미로 해석하는 것이 타당하다. 5개 시드의 제한된 반복이므로 실제 트래픽 패턴에 따라 효과는 달라질 수 있다. 통계 수치는 `compute-stats.js`로 재현 가능하며 계산 세부는 부록 B에서 다룬다.</w:t>
       </w:r>
     </w:p>
     <w:p>
@@ -8567,7 +8567,7 @@
           <w:sz w:val="22"/>
           <w:szCs w:val="22"/>
         </w:rPr>
-        <w:t xml:space="preserve">표 13. 실서버 실험 결과</w:t>
+        <w:t xml:space="preserve">표 10. 실서버 실험 결과</w:t>
       </w:r>
     </w:p>
     <w:tbl>
@@ -9083,7 +9083,7 @@
           <w:sz w:val="22"/>
           <w:szCs w:val="22"/>
         </w:rPr>
-        <w:t xml:space="preserve">표 14. 실서버 구독 등급별 평균 대기시간</w:t>
+        <w:t xml:space="preserve">표 11. 실서버 구독 등급별 평균 대기시간</w:t>
       </w:r>
     </w:p>
     <w:tbl>
@@ -9930,7 +9930,7 @@
           <w:sz w:val="22"/>
           <w:szCs w:val="22"/>
         </w:rPr>
-        <w:t xml:space="preserve">(가중치에 정확히 비례하면 1에 가까워짐)를 사용하였다. 따라서 표 15의 0.316과 1.000을 단순 비교하는 것은 부적절하며, WFQ의 0.316은 "공정성 실패"가 아닌 "의도된 차등이 작동 중"을 의미한다.</w:t>
+        <w:t xml:space="preserve">(가중치에 정확히 비례하면 1에 가까워짐)를 사용하였다. 따라서 표 12의 0.316과 1.000을 단순 비교하는 것은 부적절하며, WFQ의 0.316은 "공정성 실패"가 아닌 "의도된 차등이 작동 중"을 의미한다.</w:t>
       </w:r>
     </w:p>
     <w:p>
@@ -9946,7 +9946,7 @@
           <w:sz w:val="22"/>
           <w:szCs w:val="22"/>
         </w:rPr>
-        <w:t xml:space="preserve">표 15. 알고리즘별 JFI 비교 (기본 실험, 500건)</w:t>
+        <w:t xml:space="preserve">표 12. 알고리즘별 JFI 비교 (기본 실험, 500건)</w:t>
       </w:r>
     </w:p>
     <w:tbl>
@@ -10738,7 +10738,7 @@
           <w:sz w:val="22"/>
           <w:szCs w:val="22"/>
         </w:rPr>
-        <w:t xml:space="preserve">표 16. 알고리즘 특성 비교 종합</w:t>
+        <w:t xml:space="preserve">표 13. 알고리즘 특성 비교 종합</w:t>
       </w:r>
     </w:p>
     <w:tbl>
@@ -12563,7 +12563,7 @@
     </w:p>
     <w:p>
       <w:pPr>
-        <w:spacing w:after="80" w:line="360"/>
+        <w:spacing w:after="120" w:line="360"/>
       </w:pPr>
       <w:r>
         <w:rPr>
@@ -12574,7 +12574,7 @@
           <w:sz w:val="22"/>
           <w:szCs w:val="22"/>
         </w:rPr>
-        <w:t xml:space="preserve">표 17. 핵심 소스 코드 파일</w:t>
+        <w:t xml:space="preserve">표 A.1. 핵심 소스 코드 파일</w:t>
       </w:r>
     </w:p>
     <w:tbl>
@@ -13217,7 +13217,7 @@
     </w:p>
     <w:p>
       <w:pPr>
-        <w:spacing w:after="80" w:line="360"/>
+        <w:spacing w:after="120" w:line="360"/>
       </w:pPr>
       <w:r>
         <w:rPr>
@@ -13228,7 +13228,7 @@
           <w:sz w:val="22"/>
           <w:szCs w:val="22"/>
         </w:rPr>
-        <w:t xml:space="preserve">표 17-1. 실험 스크립트 목록</w:t>
+        <w:t xml:space="preserve">표 A.2. 실험 스크립트 목록</w:t>
       </w:r>
     </w:p>
     <w:tbl>
@@ -13574,7 +13574,7 @@
     </w:p>
     <w:p>
       <w:pPr>
-        <w:spacing w:after="80" w:line="360"/>
+        <w:spacing w:after="120" w:line="360"/>
       </w:pPr>
       <w:r>
         <w:rPr>
@@ -13585,7 +13585,7 @@
           <w:sz w:val="22"/>
           <w:szCs w:val="22"/>
         </w:rPr>
-        <w:t xml:space="preserve">표 18. MLFQ 선점형 실험 시드별 결과 (지표: Short 요청 응답시간)</w:t>
+        <w:t xml:space="preserve">표 B.1. MLFQ 선점형 실험 시드별 결과 (지표: Short 요청 응답시간)</w:t>
       </w:r>
     </w:p>
     <w:tbl>

</xml_diff>

<commit_message>
Update final report generation and figures
- Changed the markdown file name from 'final-report-v18.md' to 'final-report-v19.md' in the report generation script.
- Updated multiple figures in the report, including changes to the content and structure of the figures related to MLFQ algorithm.
- Adjusted figure dimensions and colors for better clarity and consistency.
- Generated a new final report document reflecting these updates.
</commit_message>
<xml_diff>
--- a/06-final-report/final/final-report.docx
+++ b/06-final-report/final/final-report.docx
@@ -831,7 +831,7 @@
       <w:r>
         <w:drawing>
           <wp:inline distT="0" distB="0" distL="0" distR="0">
-            <wp:extent cx="5400675" cy="1590675"/>
+            <wp:extent cx="5400675" cy="1600200"/>
             <wp:effectExtent t="0" r="0" b="0" l="0"/>
             <wp:docPr id="1" name="" descr="" title=""/>
             <wp:cNvGraphicFramePr>
@@ -856,7 +856,7 @@
                   <pic:spPr bwMode="auto">
                     <a:xfrm>
                       <a:off x="0" y="0"/>
-                      <a:ext cx="5400675" cy="1590675"/>
+                      <a:ext cx="5400675" cy="1600200"/>
                     </a:xfrm>
                     <a:prstGeom prst="rect">
                       <a:avLst/>
@@ -8520,7 +8520,7 @@
           <w:sz w:val="22"/>
           <w:szCs w:val="22"/>
         </w:rPr>
-        <w:t xml:space="preserve">: 5개 시드에서 Short 개선율이 71.8~74.3%의 좁은 범위에 분포하였다 (시드별 세부는 부록 B 표 B.1). 대응표본 t-검정 결과 p &lt; 0.001, 95% 신뢰구간 [71.89%, 74.51%]로 우연의 결과가 아님을 확인하였다. 효과 크기 Cohen's d도 통상 "큰 효과" 기준(0.8)을 크게 상회하였는데, 이는 5개 시드 간 분산이 매우 작아 수치상 크게 계산된 결과이므로 "개선이 일관되게 재현된다"는 의미로 해석하는 것이 타당하다. 5개 시드의 제한된 반복이므로 실제 트래픽 패턴에 따라 효과는 달라질 수 있다. 통계 수치는 `compute-stats.js`로 재현 가능하며 계산 세부는 부록 B에서 다룬다.</w:t>
+        <w:t xml:space="preserve">: 5개 시드에서 Short 개선율이 71.8~74.3%의 좁은 범위에 분포하였다 (시드별 세부는 부록 B 표 B.1). 대응표본 t-검정의 p-value(같은 결과가 우연히 나올 확률로, 작을수록 의미 있는 차이이다)가 0.001 미만이고, 95% 신뢰구간(참값이 포함될 가능성이 95%인 범위)이 [71.89%, 74.51%]로 우연의 결과가 아님을 확인하였다. 효과 크기 Cohen's d(두 집단의 차이가 실질적으로 얼마나 큰지 나타내는 지표)도 통상 "큰 효과" 기준(0.8)을 크게 상회하였는데, 이는 5개 시드 간 분산이 매우 작아 수치상 크게 계산된 결과이므로 "개선이 일관되게 재현된다"는 의미로 해석하는 것이 타당하다. 5개 시드의 제한된 반복이므로 실제 트래픽 패턴에 따라 효과는 달라질 수 있다. 통계 수치는 `compute-stats.js`로 재현 가능하며 계산 세부는 부록 B에서 다룬다.</w:t>
       </w:r>
     </w:p>
     <w:p>
@@ -12444,7 +12444,7 @@
           <w:sz w:val="22"/>
           <w:szCs w:val="22"/>
         </w:rPr>
-        <w:t xml:space="preserve">[5] vLLM Project, "vLLM: Easy, Fast, and Cheap LLM Serving." [온라인] Available: https://docs.vllm.ai/ (접속: 2026-03-14)</w:t>
+        <w:t xml:space="preserve">[5] vLLM Project, "vLLM: Easy, Fast, and Cheap LLM Serving," GitHub. [온라인] Available: https://github.com/vllm-project/vllm (접속: 2026-03-14)</w:t>
       </w:r>
     </w:p>
     <w:p>

</xml_diff>

<commit_message>
Update final report to version 20 and adjust generator script
- Added new final report draft (final-report-v20.md) with comprehensive content on multi-user LLM API request management using scheduling algorithms.
- Updated the DOCX generator script to read from the new final report draft (final-report-v20.md) instead of the previous version.
- Generated new final report DOCX file (final-report.docx) based on the updated draft.
- Created a snapshot of the previous final report version (final-report-v19.docx) for reference.
</commit_message>
<xml_diff>
--- a/06-final-report/final/final-report.docx
+++ b/06-final-report/final/final-report.docx
@@ -6405,7 +6405,7 @@
           <w:sz w:val="22"/>
           <w:szCs w:val="22"/>
         </w:rPr>
-        <w:t xml:space="preserve">Short는 최상위 큐에서 완료되고 Medium·Long은 시간 할당량 초과로 하위 큐로 강등되도록 설계하였다. 버스트 도착(20건 동시)은 대기열에 요청이 쌓인 상태에서 스케줄러가 순서를 결정하도록 유도하기 위함이다. 모든 실험에서 요청은 1건씩 순차 처리된다. 세 실험의 요청을 합산하면 총 2,520건 규모(기본 500 + 선점형 2,500 + 실서버 20)가 된다. JFI 계산 방식의 차이는 5.5절에서 다루며, 대규모 환경은 7.2절 향후 연구 과제로 남긴다.</w:t>
+        <w:t xml:space="preserve">Short는 최상위 큐에서 완료되고 Medium·Long은 시간 할당량 초과로 하위 큐로 강등되도록 설계하였다. 버스트 도착(20건 동시)은 대기열에 요청이 쌓인 상태에서 스케줄러가 순서를 결정하도록 유도하기 위함이다. 모든 실험에서 요청은 1건씩 순차 처리된다. 세 실험의 요청을 합산하면 총 3,020건 규모(기본 500 + 선점형 2,500 + 실서버 20)가 된다. JFI 계산 방식의 차이는 5.5절에서 다루며, 대규모 환경은 7.2절 향후 연구 과제로 남긴다.</w:t>
       </w:r>
     </w:p>
     <w:p>
@@ -8511,16 +8511,16 @@
           <w:sz w:val="22"/>
           <w:szCs w:val="22"/>
         </w:rPr>
-        <w:t xml:space="preserve">통계적 유의성</w:t>
-      </w:r>
-      <w:r>
-        <w:rPr>
-          <w:rFonts w:ascii="맑은 고딕" w:cs="맑은 고딕" w:eastAsia="맑은 고딕" w:hAnsi="맑은 고딕"/>
-          <w:color w:val="000000"/>
-          <w:sz w:val="22"/>
-          <w:szCs w:val="22"/>
-        </w:rPr>
-        <w:t xml:space="preserve">: 5개 시드에서 Short 개선율이 71.8~74.3%의 좁은 범위에 분포하였다 (시드별 세부는 부록 B 표 B.1). 대응표본 t-검정(같은 조건에서 두 방법의 결과를 짝지어 비교하는 통계 검정)의 p-value(같은 결과가 우연히 나올 확률로, 작을수록 의미 있는 차이이다)가 0.001 미만이고, 95% 신뢰구간(참값이 포함될 가능성이 95%인 범위)이 [71.89%, 74.51%]로 우연의 결과가 아님을 확인하였다. 효과 크기 Cohen's d(두 집단의 차이가 실질적으로 얼마나 큰지 나타내는 지표)도 통상 "큰 효과" 기준(0.8)을 크게 상회하였는데, 이는 5개 시드 간 분산이 매우 작아 수치상 크게 계산된 결과이므로 "개선이 일관되게 재현된다"는 의미로 해석하는 것이 타당하다. 5개 시드의 제한된 반복이므로 실제 트래픽 패턴에 따라 효과는 달라질 수 있다. 통계 수치는 `compute-stats.js`로 재현 가능하며 계산 세부는 부록 B에서 다룬다.</w:t>
+        <w:t xml:space="preserve">재현성 확인</w:t>
+      </w:r>
+      <w:r>
+        <w:rPr>
+          <w:rFonts w:ascii="맑은 고딕" w:cs="맑은 고딕" w:eastAsia="맑은 고딕" w:hAnsi="맑은 고딕"/>
+          <w:color w:val="000000"/>
+          <w:sz w:val="22"/>
+          <w:szCs w:val="22"/>
+        </w:rPr>
+        <w:t xml:space="preserve">: 5개 시드에서 Short 개선율이 71.8~74.3%의 좁은 범위에 모였다 (시드별 세부는 부록 B 표 B.1). 같은 실험을 시드를 바꾸어 다섯 번 반복해도 비슷한 개선율이 나왔다는 것은, 이 효과가 특정 시드에 우연히 기댄 결과가 아님을 뜻한다. 다만 5개 시드의 제한된 반복이므로 실제 트래픽 패턴에서는 효과가 달라질 수 있다.</w:t>
       </w:r>
     </w:p>
     <w:p>
@@ -12098,7 +12098,7 @@
           <w:sz w:val="22"/>
           <w:szCs w:val="22"/>
         </w:rPr>
-        <w:t xml:space="preserve">본 프로젝트는 두 가지 면에서 의의가 있다. 첫째, CPU 스케줄링(FCFS, Priority, MLFQ)과 네트워크 자원 배분(WFQ) 알고리즘을 LLM API 환경에 적용해 운영체제 이론의 실제 응용을 확인하였다. 둘째, vLLM·TGI 등 기존 LLM 서빙 도구가 전체 처리량 최적화에 집중하여 사용자별 공정성이나 우선순위 관리를 제공하지 않는다는 점을 확인하고, 이 부분에 스케줄링 이론을 적용한 효과를 비교하였다. 특히 WFQ의 가중치 비례 차등 서비스는 유료 LLM 서비스의 구독 등급 관리에 활용할 가능성을 보여준다. 다만 단일 실험 기준 최대 500건, 세 실험을 합산한 총 2,520건 규모이므로, 대규모 운영 환경에서도 같은 결과가 나올지는 추가 확인이 필요하다.</w:t>
+        <w:t xml:space="preserve">본 프로젝트는 두 가지 면에서 의의가 있다. 첫째, CPU 스케줄링(FCFS, Priority, MLFQ)과 네트워크 자원 배분(WFQ) 알고리즘을 LLM API 환경에 적용해 운영체제 이론의 실제 응용을 확인하였다. 둘째, vLLM·TGI 등 기존 LLM 서빙 도구가 전체 처리량 최적화에 집중하여 사용자별 공정성이나 우선순위 관리를 제공하지 않는다는 점을 확인하고, 이 부분에 스케줄링 이론을 적용한 효과를 비교하였다. 특히 WFQ의 가중치 비례 차등 서비스는 유료 LLM 서비스의 구독 등급 관리에 활용할 가능성을 보여준다. 다만 단일 실험 기준 최대 500건, 세 실험을 합산한 총 3,020건 규모이므로, 대규모 운영 환경에서도 같은 결과가 나올지는 추가 확인이 필요하다.</w:t>
       </w:r>
     </w:p>
     <w:p>
@@ -12201,7 +12201,7 @@
           <w:sz w:val="22"/>
           <w:szCs w:val="22"/>
         </w:rPr>
-        <w:t xml:space="preserve">: 비선점형 환경에서 네 알고리즘의 전체 처리량은 유사하였다. 스케줄러는 순서만 결정할 뿐 처리 속도 자체를 바꾸지 못하기 때문이다. 선점형 MLFQ에서는 짧은 요청 응답시간이 약 73% 감소, 긴 요청은 약 89% 증가하였다. 개선 효과는 5개 시드에서 71.8~74.3% 범위로 일관되게 재현되었다 (p &lt; 0.001, 효과 크기 큼, 상세는 부록 B). WFQ에서는 Enterprise의 평균 대기시간이 Free의 약 1/12 수준으로 나타났다.</w:t>
+        <w:t xml:space="preserve">: 비선점형 환경에서 네 알고리즘의 전체 처리량은 유사하였다. 스케줄러는 순서만 결정할 뿐 처리 속도 자체를 바꾸지 못하기 때문이다. 선점형 MLFQ에서는 짧은 요청 응답시간이 약 73% 감소, 긴 요청은 약 89% 증가하였다. 개선 효과는 5개 시드에서 71.8~74.3% 범위로 일관되게 재현되었다 (시드별 세부는 부록 B). WFQ에서는 Enterprise의 평균 대기시간이 Free의 약 1/12 수준으로 나타났다.</w:t>
       </w:r>
     </w:p>
     <w:p>
@@ -13574,7 +13574,7 @@
                 <w:sz w:val="20"/>
                 <w:szCs w:val="20"/>
               </w:rPr>
-              <w:t xml:space="preserve">t-검정·Cohen's d·CI 계산 (부록 B)</w:t>
+              <w:t xml:space="preserve">시드별 개선율 재현성 검증 (부록 B)</w:t>
             </w:r>
           </w:p>
         </w:tc>
@@ -14483,7 +14483,7 @@
           <w:sz w:val="22"/>
           <w:szCs w:val="22"/>
         </w:rPr>
-        <w:t xml:space="preserve">통계 검증: t = 45.59, p &lt; 0.001, Cohen's d = 20.39, 95% CI [71.89%, 74.51%]. 대응표본 t-검정과 자유도 4의 t 임계값 기반 CI는 `compute-stats.js`로 재현 가능하다.</w:t>
+        <w:t xml:space="preserve">다섯 개 시드 모두 70% 이상의 개선을 보였으며, 시드에 따른 개선율 편차는 약 2.5%p 범위에 머물렀다. 같은 시드 값으로 `compute-stats.js`를 실행하면 동일한 결과를 얻을 수 있다.</w:t>
       </w:r>
     </w:p>
     <w:p>

</xml_diff>

<commit_message>
Add new figures package and multiple final report documents
- Created a new package.json for the figures directory with dependencies including playwright, pptxgenjs, and sharp.
- Added several new final report documents in different snapshots:
- final-report.docx (snapshot 20260415_141047)
- final-report.docx (snapshot 20260415_175615)
- final-report-v17-pre.docx (snapshot 20260416_101147)
- final-report-v19.docx (snapshot 20260416_144229)
- final-report-v21.docx (snapshot 20260416_184732)
</commit_message>
<xml_diff>
--- a/06-final-report/final/final-report.docx
+++ b/06-final-report/final/final-report.docx
@@ -748,7 +748,7 @@
           <w:sz w:val="22"/>
           <w:szCs w:val="22"/>
         </w:rPr>
-        <w:t xml:space="preserve">: 스케줄링 비교 대상이 아닌 전처리 단계로 구현하였다.</w:t>
+        <w:t xml:space="preserve">: 요청 진입 한도를 관리하는 전처리 장치로, 스케줄링 비교 대상이 아닌 별도 단계로 구현하였다.</w:t>
       </w:r>
     </w:p>
     <w:p>
@@ -988,7 +988,7 @@
           <w:sz w:val="22"/>
           <w:szCs w:val="22"/>
         </w:rPr>
-        <w:t xml:space="preserve">는 네트워크의 공정 자원 배분 알고리즘으로, 자원을 완벽히 공평하게 나누는 이상적 모델인 GPS(Generalized Processor Sharing)를 비슷하게 구현하기 위해 각 요청의 가상 완료 시각(Virtual Finish Time, VFT)이 작은 것부터 처리한다 [4]. 가중치가 클수록 VFT가 느리게 증가해 더 자주 선택되며, 인터넷 라우터의 QoS(Quality of Service, 서비스 품질 차등 제공) 기반으로 쓰인다 [4]. 구체적 VFT 계산은 4.3절에서 설명한다.</w:t>
+        <w:t xml:space="preserve">는 네트워크에서 자원을 공평하게 나누는 알고리즘이다. 자원을 완벽히 공평하게 나누는 이상적 모델인 GPS(Generalized Processor Sharing)를 비슷하게 구현하기 위해, 각 요청의 가상 완료 시각(Virtual Finish Time, VFT)이 작은 것부터 처리한다 [4]. 가중치가 클수록 VFT가 느리게 증가해 더 자주 선택되며, 인터넷 라우터의 QoS(Quality of Service, 서비스 품질 차등 제공)를 구현하는 데 쓰인다 [4]. 구체적 VFT 계산은 4.3절에서 설명한다.</w:t>
       </w:r>
     </w:p>
     <w:p>
@@ -1095,7 +1095,7 @@
           <w:sz w:val="22"/>
           <w:szCs w:val="22"/>
         </w:rPr>
-        <w:t xml:space="preserve">xi는 사용자 i의 자원량, n은 사용자 수이다. 모두 동일 배분이면 1, 한 명이 독점하면 1/n에 가까워진다(예: 4명 중 한 명 독점 시 0.25). 스케줄링 맥락에서는 xi로 사용자별 대기시간(값이 작을수록 좋음)이나 처리 건수(값이 클수록 좋음) 등을 대입하여 공정성을 측정하며, 본 프로젝트에서도 실험 목적에 따라 두 기준을 구분해 사용하였다 (5.5절). 공정성 지표에는 JFI 외에 최대-최소 공정성(Max-Min Fairness, 가장 불리한 사용자의 몫을 극대화하는 기준)이나 비례 공정성(Proportional Fairness, 각 사용자의 만족도를 종합적으로 높이는 기준) 등이 있으나 [4], 본 프로젝트에서는 계산이 간단하고 단일 수치로 비교가 용이한 JFI를 선택하였다. 다만 WFQ처럼 가중치 기반으로 의도적 차등을 두는 경우에는 가중치 반영 JFI가 필요하다 (5.5절 참조).</w:t>
+        <w:t xml:space="preserve">xi는 사용자 i의 자원량, n은 사용자 수이다. 모두 동일 배분이면 1, 한 명이 독점하면 1/n에 가까워진다(예: 4명 중 한 명 독점 시 0.25). 스케줄링 맥락에서는 xi로 사용자별 대기시간(값이 작을수록 좋음)이나 처리 건수(값이 클수록 좋음) 등을 대입하여 공정성을 측정하며, 본 프로젝트에서도 실험 목적에 따라 두 기준을 구분해 사용하였다 (5.5절). 공정성 지표에는 JFI 외에 최대-최소 공정성(Max-Min Fairness, 가장 불리한 사용자의 몫을 극대화하는 기준)이나 비례 공정성(Proportional Fairness, 각 사용자의 만족도를 종합적으로 높이는 기준) 등이 있다 [4]. 본 프로젝트에서는 계산이 간단하고 단일 수치로 비교가 용이한 JFI를 선택하였다. 다만 WFQ처럼 가중치 기반으로 의도적 차등을 두는 경우에는 가중치 반영 JFI가 필요하다 (5.5절 참조).</w:t>
       </w:r>
     </w:p>
     <w:p>
@@ -1938,7 +1938,7 @@
           <w:sz w:val="22"/>
           <w:szCs w:val="22"/>
         </w:rPr>
-        <w:t xml:space="preserve">은 메모리 큐로 요청을 관리하고 JSON 파일로 처리 이력을 기록하며, LLM 호출은 Ollama로 로컬에서 수행한다.</w:t>
+        <w:t xml:space="preserve">은 메모리 큐로 요청을 관리하고 JSON 파일로 처리 이력을 기록하며, LLM 호출은 로컬의 Ollama로 수행한다.</w:t>
       </w:r>
     </w:p>
     <w:p>
@@ -2574,7 +2574,97 @@
           <w:sz w:val="22"/>
           <w:szCs w:val="22"/>
         </w:rPr>
-        <w:t xml:space="preserve">실서버는 Ollama 등 대부분의 LLM 서빙 도구가 추론 중단을 지원하지 않으므로 비선점형(Non-preemptive)으로 동작한다. MLFQ의 이론적 효과 확인을 위해 선점형(500ms 간격 할당량 확인)은 시뮬레이션에만 추가 구현하였다 (5.3절). Priority는 URGENT &gt; HIGH &gt; NORMAL &gt; LOW 순에 5초 주기 에이징을 적용하고, MLFQ는 4단계 큐(Q0~Q3)와 5초 주기 부스팅을 적용하며 [3], WFQ는 구독 등급 가중치(Enterprise 100, Premium 50, Standard 10, Free 1)를 VFT 계산에 반영한다.</w:t>
+        <w:t xml:space="preserve">실서버는 Ollama 등 대부분의 LLM 서빙 도구가 추론 중단을 지원하지 않으므로 비선점형(Non-preemptive, 실행 중인 요청을 끝까지 처리하고 중단하지 않는 방식)으로 동작한다. MLFQ의 이론적 효과 확인을 위해 선점형(Preemptive, 할당량 소진 시 실행 중인 요청을 중단하고 다른 요청으로 교체하는 방식, 500ms 간격 할당량 확인)은 시뮬레이션에만 추가 구현하였다 (5.3절). 각 알고리즘의 세부 설정은 다음과 같다.</w:t>
+      </w:r>
+    </w:p>
+    <w:p>
+      <w:pPr>
+        <w:pStyle w:val="ListParagraph"/>
+        <w:numPr>
+          <w:ilvl w:val="0"/>
+          <w:numId w:val="3"/>
+        </w:numPr>
+        <w:spacing w:after="80" w:line="340"/>
+      </w:pPr>
+      <w:r>
+        <w:rPr>
+          <w:rFonts w:ascii="맑은 고딕" w:cs="맑은 고딕" w:eastAsia="맑은 고딕" w:hAnsi="맑은 고딕"/>
+          <w:b/>
+          <w:bCs/>
+          <w:color w:val="000000"/>
+          <w:sz w:val="22"/>
+          <w:szCs w:val="22"/>
+        </w:rPr>
+        <w:t xml:space="preserve">Priority</w:t>
+      </w:r>
+      <w:r>
+        <w:rPr>
+          <w:rFonts w:ascii="맑은 고딕" w:cs="맑은 고딕" w:eastAsia="맑은 고딕" w:hAnsi="맑은 고딕"/>
+          <w:color w:val="000000"/>
+          <w:sz w:val="22"/>
+          <w:szCs w:val="22"/>
+        </w:rPr>
+        <w:t xml:space="preserve">: URGENT &gt; HIGH &gt; NORMAL &gt; LOW 순, 5초 주기 에이징 적용</w:t>
+      </w:r>
+    </w:p>
+    <w:p>
+      <w:pPr>
+        <w:pStyle w:val="ListParagraph"/>
+        <w:numPr>
+          <w:ilvl w:val="0"/>
+          <w:numId w:val="3"/>
+        </w:numPr>
+        <w:spacing w:after="80" w:line="340"/>
+      </w:pPr>
+      <w:r>
+        <w:rPr>
+          <w:rFonts w:ascii="맑은 고딕" w:cs="맑은 고딕" w:eastAsia="맑은 고딕" w:hAnsi="맑은 고딕"/>
+          <w:b/>
+          <w:bCs/>
+          <w:color w:val="000000"/>
+          <w:sz w:val="22"/>
+          <w:szCs w:val="22"/>
+        </w:rPr>
+        <w:t xml:space="preserve">MLFQ</w:t>
+      </w:r>
+      <w:r>
+        <w:rPr>
+          <w:rFonts w:ascii="맑은 고딕" w:cs="맑은 고딕" w:eastAsia="맑은 고딕" w:hAnsi="맑은 고딕"/>
+          <w:color w:val="000000"/>
+          <w:sz w:val="22"/>
+          <w:szCs w:val="22"/>
+        </w:rPr>
+        <w:t xml:space="preserve">: 4단계 큐(Q0~Q3), 5초 주기 부스팅 적용 [3]</w:t>
+      </w:r>
+    </w:p>
+    <w:p>
+      <w:pPr>
+        <w:pStyle w:val="ListParagraph"/>
+        <w:numPr>
+          <w:ilvl w:val="0"/>
+          <w:numId w:val="3"/>
+        </w:numPr>
+        <w:spacing w:after="80" w:line="340"/>
+      </w:pPr>
+      <w:r>
+        <w:rPr>
+          <w:rFonts w:ascii="맑은 고딕" w:cs="맑은 고딕" w:eastAsia="맑은 고딕" w:hAnsi="맑은 고딕"/>
+          <w:b/>
+          <w:bCs/>
+          <w:color w:val="000000"/>
+          <w:sz w:val="22"/>
+          <w:szCs w:val="22"/>
+        </w:rPr>
+        <w:t xml:space="preserve">WFQ</w:t>
+      </w:r>
+      <w:r>
+        <w:rPr>
+          <w:rFonts w:ascii="맑은 고딕" w:cs="맑은 고딕" w:eastAsia="맑은 고딕" w:hAnsi="맑은 고딕"/>
+          <w:color w:val="000000"/>
+          <w:sz w:val="22"/>
+          <w:szCs w:val="22"/>
+        </w:rPr>
+        <w:t xml:space="preserve">: 구독 등급 가중치(Enterprise 100, Premium 50, Standard 10, Free 1)를 VFT 계산에 반영</w:t>
       </w:r>
     </w:p>
     <w:p>
@@ -2625,7 +2715,7 @@
           <w:sz w:val="22"/>
           <w:szCs w:val="22"/>
         </w:rPr>
-        <w:t xml:space="preserve">(초과 시 HTTP 429(요청 과다 거부 응답)), 4) 스케줄러 대기열에 등록(`enqueue`), 5) 스케줄러가 알고리즘에 따라 `dequeue`, 6) Ollama에 전달해 응답 수신, 7) 클라이언트 반환 및 JSON 이력 기록. 대기열이 남으면 5번부터 반복한다.</w:t>
+        <w:t xml:space="preserve">(초과 시 HTTP 429로 거부, 4.4절 참조), 4) 스케줄러 대기열에 등록(`enqueue`), 5) 스케줄러가 알고리즘에 따라 `dequeue`, 6) Ollama에 전달해 응답 수신, 7) 클라이언트 반환 및 JSON 이력 기록. 대기열이 남으면 5번부터 반복한다.</w:t>
       </w:r>
     </w:p>
     <w:p>
@@ -2782,7 +2872,7 @@
           <w:sz w:val="22"/>
           <w:szCs w:val="22"/>
         </w:rPr>
-        <w:t xml:space="preserve">소스 코드는 api(REST 라우터), schedulers(4개 알고리즘), queue(메모리 대기열), storage(JSON 기록), llm(Ollama 호출) 핵심 모듈과 rate-limiter, server.js(Express 진입점) 보조 요소로 구성된다 (그림 4).</w:t>
+        <w:t xml:space="preserve">소스 코드는 핵심 모듈과 보조 요소로 구성된다 (그림 4). 핵심 모듈은 api(REST 라우터), schedulers(4개 알고리즘), queue(메모리 대기열), storage(JSON 기록), llm(Ollama 호출)이다. 보조 요소로는 rate-limiter와 server.js(Express 진입점)가 있다.</w:t>
       </w:r>
     </w:p>
     <w:p>
@@ -4140,7 +4230,7 @@
           <w:sz w:val="22"/>
           <w:szCs w:val="22"/>
         </w:rPr>
-        <w:t xml:space="preserve">Rate Limiter는 스케줄링 비교 대상이 아닌 요청 진입 관리 전처리 단계이다. 토큰 버킷(Token Bucket, 일정 시간마다 요청 권한인 토큰이 새로 발급되고 요청이 들어올 때마다 토큰 하나씩 소모하는 방식) 방식으로 구현되어 구독 등급별 분당 허용 수(표 4)를 제한하고, 토큰이 없으면 HTTP 429(Too Many Requests, 요청 한도 초과를 알리는 표준 응답 코드) [12]로 거부한다. 스케줄러와 독립적으로 동작한다.</w:t>
+        <w:t xml:space="preserve">Rate Limiter는 스케줄링 비교 대상이 아닌 요청 진입 관리 전처리 단계이며, 스케줄러와 독립적으로 동작한다. 토큰 버킷(Token Bucket, 일정 시간마다 요청 권한인 토큰이 새로 발급되고 요청이 들어올 때마다 토큰 하나씩 소모하는 방식) 방식으로 구현하였다. 구독 등급별 분당 허용 수(표 4)를 제한하고, 토큰이 없으면 HTTP 429(Too Many Requests, 요청 한도 초과를 알리는 표준 응답 코드) [12]로 거부한다.</w:t>
       </w:r>
     </w:p>
     <w:p>
@@ -9890,7 +9980,26 @@
           <w:sz w:val="22"/>
           <w:szCs w:val="22"/>
         </w:rPr>
-        <w:t xml:space="preserve">: FCFS, Priority, MLFQ는 등급 간 대기시간 차이를 측정하기 위해 </w:t>
+        <w:t xml:space="preserve">: 두 가지 기준을 실험 목적에 맞게 구분해 사용하였다.</w:t>
+      </w:r>
+    </w:p>
+    <w:p>
+      <w:pPr>
+        <w:pStyle w:val="ListParagraph"/>
+        <w:numPr>
+          <w:ilvl w:val="0"/>
+          <w:numId w:val="3"/>
+        </w:numPr>
+        <w:spacing w:after="80" w:line="340"/>
+      </w:pPr>
+      <w:r>
+        <w:rPr>
+          <w:rFonts w:ascii="맑은 고딕" w:cs="맑은 고딕" w:eastAsia="맑은 고딕" w:hAnsi="맑은 고딕"/>
+          <w:color w:val="000000"/>
+          <w:sz w:val="22"/>
+          <w:szCs w:val="22"/>
+        </w:rPr>
+        <w:t xml:space="preserve">FCFS, Priority, MLFQ: 등급 간 대기시간 차이 측정 → </w:t>
       </w:r>
       <w:r>
         <w:rPr>
@@ -9910,7 +10019,26 @@
           <w:sz w:val="22"/>
           <w:szCs w:val="22"/>
         </w:rPr>
-        <w:t xml:space="preserve">(값이 1에 가까울수록 균등)를 사용하였고, WFQ는 가중치 비례 처리량 배분을 측정하기 위해 WFQScheduler 내장의 </w:t>
+        <w:t xml:space="preserve"> (값이 1에 가까울수록 균등)</w:t>
+      </w:r>
+    </w:p>
+    <w:p>
+      <w:pPr>
+        <w:pStyle w:val="ListParagraph"/>
+        <w:numPr>
+          <w:ilvl w:val="0"/>
+          <w:numId w:val="3"/>
+        </w:numPr>
+        <w:spacing w:after="80" w:line="340"/>
+      </w:pPr>
+      <w:r>
+        <w:rPr>
+          <w:rFonts w:ascii="맑은 고딕" w:cs="맑은 고딕" w:eastAsia="맑은 고딕" w:hAnsi="맑은 고딕"/>
+          <w:color w:val="000000"/>
+          <w:sz w:val="22"/>
+          <w:szCs w:val="22"/>
+        </w:rPr>
+        <w:t xml:space="preserve">WFQ: 가중치 비례 처리량 배분 측정 → WFQScheduler 내장의 </w:t>
       </w:r>
       <w:r>
         <w:rPr>
@@ -9930,7 +10058,21 @@
           <w:sz w:val="22"/>
           <w:szCs w:val="22"/>
         </w:rPr>
-        <w:t xml:space="preserve">(가중치에 정확히 비례하면 1에 가까워짐)를 사용하였다. 따라서 표 12의 0.316과 1.000을 단순 비교하는 것은 부적절하며, WFQ의 0.316은 "공정성 실패"가 아닌 "의도된 차등이 작동 중"을 의미한다.</w:t>
+        <w:t xml:space="preserve"> (가중치에 정확히 비례하면 1에 가까워짐)</w:t>
+      </w:r>
+    </w:p>
+    <w:p>
+      <w:pPr>
+        <w:spacing w:after="120" w:line="360"/>
+      </w:pPr>
+      <w:r>
+        <w:rPr>
+          <w:rFonts w:ascii="맑은 고딕" w:cs="맑은 고딕" w:eastAsia="맑은 고딕" w:hAnsi="맑은 고딕"/>
+          <w:color w:val="000000"/>
+          <w:sz w:val="22"/>
+          <w:szCs w:val="22"/>
+        </w:rPr>
+        <w:t xml:space="preserve">따라서 표 12의 0.316과 1.000을 단순 비교하는 것은 부적절하며, WFQ의 0.316은 "공정성 실패"가 아닌 "의도된 차등이 작동 중"을 의미한다.</w:t>
       </w:r>
     </w:p>
     <w:p>

</xml_diff>

<commit_message>
Add new figures and final report documents
- Created a new package.json file for the figures directory, including dependencies for Playwright, PPTXGenJS, and Sharp.
- Added multiple final report documents in various snapshots, including versions v17, v19, and v21.
</commit_message>
<xml_diff>
--- a/06-final-report/final/final-report.docx
+++ b/06-final-report/final/final-report.docx
@@ -490,7 +490,7 @@
           <w:sz w:val="22"/>
           <w:szCs w:val="22"/>
         </w:rPr>
-        <w:t xml:space="preserve">다중 사용자 환경에서는 요청을 어떻게 관리할지가 문제가 된다. OpenAI는 조직(Organization) 단위로 분당 요청 수·토큰 수 한도를 두고 [1], Anthropic은 사용 등급별 호출 한도를 적용한다 [2]. 이 한도가 조직 단위로 적용되므로, 구성원들이 한정된 호출 한도를 어떻게 나누어 쓸지는 별도로 관리해야 한다. 자체 LLM 서버도 동시 처리 수가 제한되어 같은 문제가 발생한다. 별도 관리 기능이 없으면 요청은 도착 순서대로 처리되거나 단순한 호출 횟수 제한만 적용된다. 이 경우 긴급한 요청이 뒤로 밀리고, 사용자별 차등 배분도 어렵다.</w:t>
+        <w:t xml:space="preserve">다중 사용자 환경에서는 요청을 어떻게 관리할지가 문제이다. OpenAI는 조직(Organization) 단위로 분당 요청 수·토큰 수 한도를 두고 [1], Anthropic은 사용 등급별 호출 한도를 적용한다 [2]. 이 한도가 조직 단위로 적용되므로, 구성원들이 한정된 호출 한도를 어떻게 나누어 쓸지는 별도로 관리해야 한다. 자체 LLM 서버도 동시 처리 수가 제한되어 같은 문제가 발생한다. 별도 관리 기능이 없으면 도착 순서대로 처리하거나 단순한 호출 횟수 제한만 거는 수준에 그친다. 이 경우 긴급한 요청이 뒤로 밀리고, 사용자별 차등 배분도 어렵다.</w:t>
       </w:r>
     </w:p>
     <w:p>
@@ -2574,7 +2574,7 @@
           <w:sz w:val="22"/>
           <w:szCs w:val="22"/>
         </w:rPr>
-        <w:t xml:space="preserve">실서버는 Ollama 등 대부분의 LLM 서빙 도구가 추론 중단을 지원하지 않으므로 비선점형(Non-preemptive, 실행 중인 요청을 끝까지 처리하고 중단하지 않는 방식)으로 동작한다. MLFQ의 이론적 효과 확인을 위해 선점형(Preemptive, 할당량 소진 시 실행 중인 요청을 중단하고 다른 요청으로 교체하는 방식, 500ms 간격 할당량 확인)은 시뮬레이션에만 추가 구현하였다 (5.3절). 각 알고리즘의 세부 설정은 다음과 같다.</w:t>
+        <w:t xml:space="preserve">실서버 환경에서는 Ollama 등 대부분의 LLM 서빙 도구가 추론 중단을 지원하지 않으므로, 본 시스템도 비선점형(Non-preemptive, 실행 중인 요청을 끝까지 처리하고 중단하지 않는 방식)으로 동작하도록 구현하였다. MLFQ의 이론적 효과 확인을 위해 선점형(Preemptive, 할당량 소진 시 실행 중인 요청을 중단하고 다른 요청으로 교체하는 방식, 500ms 간격 할당량 확인)은 시뮬레이션에만 추가 구현하였다 (5.3절). 각 알고리즘의 세부 설정은 다음과 같다.</w:t>
       </w:r>
     </w:p>
     <w:p>
@@ -2841,7 +2841,7 @@
           <w:sz w:val="22"/>
           <w:szCs w:val="22"/>
         </w:rPr>
-        <w:t xml:space="preserve">런타임은 Node.js 22 LTS [9], 웹 프레임워크는 Express.js 4.18 [8], 언어는 JavaScript(ES2024), LLM은 로컬 Ollama [10]를 사용하였다. 저장소는 메모리 큐와 JSON 파일로 구성하였으며, 외부 의존성은 express 1개이다. 외부 라이브러리를 최소화하고 스케줄링 알고리즘을 직접 구현하여 학습 효과를 높이는 것을 목표로 하였다. Ollama의 순차 처리·비중단 특성은 비선점형 설계와 부합하여 실서버 실험에 활용하였다 (5.4절).</w:t>
+        <w:t xml:space="preserve">런타임은 Node.js 22 LTS [9], 웹 프레임워크는 Express.js 4.18 [8], 언어는 JavaScript(ES2024), LLM은 로컬 Ollama [10]를 사용하였다. 저장소는 메모리 큐와 JSON 파일로 구성하였으며, 생산 의존성은 express 1개이다. 외부 라이브러리를 최소화하고 스케줄링 알고리즘을 직접 구현하여 학습 효과를 높이는 것을 목표로 하였다. Ollama의 순차 처리·비중단 특성은 비선점형 설계와 부합하여 실서버 실험에 활용하였다 (5.4절).</w:t>
       </w:r>
     </w:p>
     <w:p>
@@ -3955,7 +3955,7 @@
           <w:sz w:val="22"/>
           <w:szCs w:val="22"/>
         </w:rPr>
-        <w:t xml:space="preserve">처리 비용은 요청 1건당 1로 고정하였다. LLM 출력 토큰 수는 생성 완료 전 알 수 없고, JFI 계산도 처리 건수 기준이라 측정 기준을 일치시키기 위함이다.</w:t>
+        <w:t xml:space="preserve">처리 비용은 요청 1건당 1로 고정하였다. LLM 출력 토큰 수는 생성 완료 전 알 수 없고, JFI 계산도 처리 건수 기준이므로 측정 기준을 일치시키기 위해서이다.</w:t>
       </w:r>
     </w:p>
     <w:p>
@@ -4654,7 +4654,7 @@
           <w:sz w:val="22"/>
           <w:szCs w:val="22"/>
         </w:rPr>
-        <w:t xml:space="preserve">실험은 기본 실험, MLFQ 선점형 실험, 실서버 실험 세 가지로 구분된다 (그림 5). 앞의 두 실험은 시간 기반 시뮬레이션, 실서버 실험은 Ollama를 활용한 실제 LLM 호출로 수행하였다. 시뮬레이션은 요청에 처리 시간을 미리 지정한 뒤 스케줄러가 결정한 순서대로 한 건씩 순차 처리하는 방식으로, 네트워크 지연이나 LLM 상태 변동 없이 알고리즘 자체의 특성만 비교할 수 있다.</w:t>
+        <w:t xml:space="preserve">실험은 기본 실험, MLFQ 선점형 실험, 실서버 실험 세 가지로 구분된다 (그림 5). 앞의 두 실험은 시간 기반 시뮬레이션, 실서버 실험은 Ollama를 활용한 실제 LLM 호출로 수행하였다. 시뮬레이션은 요청에 처리 시간을 미리 지정한 후 스케줄러가 결정한 순서대로 한 건씩 순차 처리하는 방식으로, 네트워크 지연이나 LLM 상태 변동 없이 알고리즘 자체의 특성만 비교할 수 있다.</w:t>
       </w:r>
     </w:p>
     <w:p>
@@ -5206,7 +5206,7 @@
                 <w:sz w:val="20"/>
                 <w:szCs w:val="20"/>
               </w:rPr>
-              <w:t xml:space="preserve">500건 × 5회 반복</w:t>
+              <w:t xml:space="preserve">500건 × 5시드</w:t>
             </w:r>
           </w:p>
         </w:tc>
@@ -6495,7 +6495,7 @@
           <w:sz w:val="22"/>
           <w:szCs w:val="22"/>
         </w:rPr>
-        <w:t xml:space="preserve">Short는 최상위 큐에서 완료되고 Medium·Long은 시간 할당량 초과로 하위 큐로 강등되도록 설계하였다. 버스트 도착(20건 동시)은 대기열에 요청이 쌓인 상태에서 스케줄러가 순서를 결정하도록 유도하기 위함이다. 모든 실험에서 요청은 1건씩 순차 처리된다. 세 실험의 요청을 합산하면 총 3,020건(기본 500 + 선점형 2,500 + 실서버 20)이 된다. JFI 계산 방식의 차이는 5.5절에서 다루며, 대규모 환경은 7.2절 향후 연구 과제로 남긴다.</w:t>
+        <w:t xml:space="preserve">Short는 최상위 큐에서 완료되고 Medium·Long은 시간 할당량 초과로 하위 큐로 강등되도록 설계하였다. 버스트 도착(20건 동시)은 대기열에 요청이 쌓인 상태에서 스케줄러가 순서를 결정하도록 유도하기 위해서이다. 모든 실험에서 요청은 1건씩 순차 처리된다. 세 실험의 요청을 합산하면 총 3,020건(기본 500 + 선점형 2,500 + 실서버 20)이 된다. JFI 계산 방식의 차이는 5.5절에서 다루며, 대규모 환경은 7.2절 향후 연구 과제로 남긴다.</w:t>
       </w:r>
     </w:p>
     <w:p>
@@ -7880,7 +7880,7 @@
           <w:sz w:val="22"/>
           <w:szCs w:val="22"/>
         </w:rPr>
-        <w:t xml:space="preserve">표 9. MLFQ 선점형 vs FCFS 비교 (요청 유형별, 5회 평균, 지표: 응답시간 기준)</w:t>
+        <w:t xml:space="preserve">표 9. MLFQ 선점형 vs FCFS 비교 (요청 유형별, 5시드 평균, 지표: 응답시간 기준)</w:t>
       </w:r>
     </w:p>
     <w:tbl>
@@ -8610,7 +8610,7 @@
           <w:sz w:val="22"/>
           <w:szCs w:val="22"/>
         </w:rPr>
-        <w:t xml:space="preserve">: 5개 시드에서 Short 개선율이 71.8~74.3%의 좁은 범위에 모였으며, 평균은 73.2%, 95% 신뢰구간은 [71.9%, 74.5%]이다. 쌍체 t-검정 결과 t = 45.59, p &lt; 0.001로 FCFS와 MLFQ의 Short 응답시간 차이는 통계적으로 유의하였고, 효과 크기 Cohen's d = 20.39로 매우 큰 차이가 일관되게 나타났다. 시드를 바꾸어 다섯 번 반복해도 비슷한 개선율이 나왔다는 것은, 이 효과가 특정 시드에 우연히 기댄 결과가 아님을 뜻한다. 다만 5개 시드의 제한된 반복이므로 실제 트래픽 패턴에서는 효과가 달라질 수 있다. 시드별 세부와 통계 계산 결과는 부록 B에 정리하였다.</w:t>
+        <w:t xml:space="preserve">: 5개 시드에서 Short 개선율이 71.8~74.3%의 좁은 범위에 모였으며, 평균은 73.2%, 95% 신뢰구간은 [71.9%, 74.5%]이다. 쌍체 t-검정 결과 t = 45.59, p &lt; 0.001로 FCFS와 MLFQ의 Short 응답시간 차이는 통계적으로 유의하였고, 효과 크기 Cohen's d = 20.39로 매우 큰 차이가 일관되게 나타났다. 시드를 바꾸어 다섯 번 반복해도 유사한 개선율이 나왔다는 것은, 이 효과가 특정 시드에 우연히 기댄 결과가 아님을 뜻한다. 다만 5개 시드의 제한된 반복이므로 실제 트래픽 패턴에서는 효과가 달라질 수 있다. 시드별 세부와 통계 계산 결과는 부록 B에 정리하였다.</w:t>
       </w:r>
     </w:p>
     <w:p>
@@ -9918,7 +9918,7 @@
           <w:sz w:val="22"/>
           <w:szCs w:val="22"/>
         </w:rPr>
-        <w:t xml:space="preserve">는 URGENT/HIGH 요청이 먼저 처리되어, 낮은 우선순위의 Enterprise는 FCFS보다 밀렸고 Free의 NORMAL 요청은 앞당겨졌다. </w:t>
+        <w:t xml:space="preserve">는 구독 등급과 요청 우선순위가 독립적임을 드러내기 위해 Enterprise에 낮은 우선순위를, Free에 일부 상위 우선순위를 배정한 실험 구성으로, URGENT/HIGH 요청이 먼저 처리되어 Enterprise는 FCFS보다 밀렸고 Free의 상위 우선순위 요청은 앞당겨졌다. </w:t>
       </w:r>
       <w:r>
         <w:rPr>

</xml_diff>

<commit_message>
Update final report generator to use final-report-v31.md and regenerate DOCX
</commit_message>
<xml_diff>
--- a/06-final-report/final/final-report.docx
+++ b/06-final-report/final/final-report.docx
@@ -1095,7 +1095,7 @@
           <w:sz w:val="22"/>
           <w:szCs w:val="22"/>
         </w:rPr>
-        <w:t xml:space="preserve">xi는 사용자 i의 자원량, n은 사용자 수이다. 모두 동일 배분이면 1, 한 명이 독점하면 1/n에 가까워진다(예: 4명 중 한 명 독점 시 0.25). 스케줄링 맥락에서는 xi로 사용자별 대기시간(값이 작을수록 좋음)이나 처리 건수(값이 클수록 좋음) 등을 대입하여 공정성을 측정하며, 본 프로젝트에서도 실험 목적에 따라 두 기준을 구분해 사용하였다 (5.5절). 공정성 지표에는 JFI 외에 최대-최소 공정성(Max-Min Fairness, 가장 불리한 사용자의 몫을 극대화하는 기준)이나 비례 공정성(Proportional Fairness, 각 사용자의 만족도를 종합적으로 높이는 기준) 등이 있다 [4]. 본 프로젝트에서는 계산이 간단하고 단일 수치로 비교가 용이한 JFI를 선택하였다. 다만 WFQ처럼 가중치 기반으로 의도적 차등을 두는 경우에는 가중치 반영 JFI가 필요하다 (5.5절 참조).</w:t>
+        <w:t xml:space="preserve">xi는 사용자 i의 자원량, n은 사용자 수이다. 모두 동일 배분이면 1, 한 명이 독점하면 1/n에 가까워진다(예: 4명 중 한 명 독점 시 0.25). 스케줄링 맥락에서는 xi로 사용자별 대기시간(값이 작을수록 좋음)이나 처리 건수(값이 클수록 좋음) 등을 대입하여 공정성을 측정하며, 본 프로젝트에서도 실험 목적에 따라 두 기준을 구분해 사용하였다 (5.5절). 공정성 지표에는 JFI 외에 최대-최소 공정성(Max-Min Fairness, 가장 불리한 사용자의 몫을 극대화하는 기준)이나 비례 공정성(Proportional Fairness, 각 사용자의 만족도를 종합적으로 높이는 기준) 등이 있다 [4]. 본 프로젝트에서는 계산이 간단하고 단일 수치로 비교가 용이한 JFI를 선택하였다. 다만 WFQ처럼 가중치 기반으로 의도적 차등을 두는 경우에는 단순 처리 건수로 JFI를 계산하면 "가중치대로 처리되었는가"를 판단할 수 없으므로, xi에 "처리 건수 ÷ 가중치"를 대입해 정규화한 JFI를 사용한다. 본 연구에서도 WFQ에는 이 정규화 방식을 적용하였다 (5.5절).</w:t>
       </w:r>
     </w:p>
     <w:p>
@@ -3790,7 +3790,7 @@
           <w:sz w:val="18"/>
           <w:szCs w:val="18"/>
         </w:rPr>
-        <w:t xml:space="preserve">// MLFQ 스케줄러: 다음 처리할 요청 선택</w:t>
+        <w:t xml:space="preserve">// MLFQ 스케줄러: 다음 처리할 요청 선택 (비선점형)</w:t>
       </w:r>
     </w:p>
     <w:p>
@@ -3899,7 +3899,7 @@
           <w:sz w:val="22"/>
           <w:szCs w:val="22"/>
         </w:rPr>
-        <w:t xml:space="preserve">선점형에서는 500ms 간격으로 실행 시간을 확인해 할당량 초과 시 하위 큐로 이동시키고, 5초 주기 부스팅으로 하위 큐 기아를 방지한다.</w:t>
+        <w:t xml:space="preserve">위 코드는 실서버에도 적용되는 비선점형 구현이다. 선점형 MLFQ는 시뮬레이션 전용으로 `run-multi-seed.js`에 별도 구현하였으며, 500ms 간격으로 실행 시간을 확인해 할당량 초과 시 하위 큐로 이동시키고 5초 주기 부스팅으로 하위 큐 기아를 방지한다.</w:t>
       </w:r>
     </w:p>
     <w:p>
@@ -4045,7 +4045,7 @@
           <w:sz w:val="18"/>
           <w:szCs w:val="18"/>
         </w:rPr>
-        <w:t xml:space="preserve">  this.queue.push(request);</w:t>
+        <w:t xml:space="preserve">  tenant.virtualTime = request.virtualFinishTime;   // 다음 요청의 기준이 됨</w:t>
       </w:r>
     </w:p>
     <w:p>
@@ -4060,7 +4060,7 @@
           <w:sz w:val="18"/>
           <w:szCs w:val="18"/>
         </w:rPr>
-        <w:t xml:space="preserve">}</w:t>
+        <w:t xml:space="preserve">  this.queue.push(request);</w:t>
       </w:r>
     </w:p>
     <w:p>
@@ -4075,7 +4075,7 @@
           <w:sz w:val="18"/>
           <w:szCs w:val="18"/>
         </w:rPr>
-        <w:t xml:space="preserve">// VFT가 가장 작은 요청 선택</w:t>
+        <w:t xml:space="preserve">}</w:t>
       </w:r>
     </w:p>
     <w:p>
@@ -4090,7 +4090,7 @@
           <w:sz w:val="18"/>
           <w:szCs w:val="18"/>
         </w:rPr>
-        <w:t xml:space="preserve">dequeue() {</w:t>
+        <w:t xml:space="preserve">// VFT가 가장 작은 요청 선택</w:t>
       </w:r>
     </w:p>
     <w:p>
@@ -4105,7 +4105,7 @@
           <w:sz w:val="18"/>
           <w:szCs w:val="18"/>
         </w:rPr>
-        <w:t xml:space="preserve">  let minIdx = 0;</w:t>
+        <w:t xml:space="preserve">dequeue() {</w:t>
       </w:r>
     </w:p>
     <w:p>
@@ -4120,7 +4120,7 @@
           <w:sz w:val="18"/>
           <w:szCs w:val="18"/>
         </w:rPr>
-        <w:t xml:space="preserve">  for (let i = 1; i &lt; this.queue.length; i++) {</w:t>
+        <w:t xml:space="preserve">  let minIdx = 0;</w:t>
       </w:r>
     </w:p>
     <w:p>
@@ -4135,7 +4135,7 @@
           <w:sz w:val="18"/>
           <w:szCs w:val="18"/>
         </w:rPr>
-        <w:t xml:space="preserve">    if (this.queue[i].virtualFinishTime &lt; this.queue[minIdx].virtualFinishTime) minIdx = i;</w:t>
+        <w:t xml:space="preserve">  for (let i = 1; i &lt; this.queue.length; i++) {</w:t>
       </w:r>
     </w:p>
     <w:p>
@@ -4150,7 +4150,7 @@
           <w:sz w:val="18"/>
           <w:szCs w:val="18"/>
         </w:rPr>
-        <w:t xml:space="preserve">  }</w:t>
+        <w:t xml:space="preserve">    if (this.queue[i].virtualFinishTime &lt; this.queue[minIdx].virtualFinishTime) minIdx = i;</w:t>
       </w:r>
     </w:p>
     <w:p>
@@ -4165,7 +4165,52 @@
           <w:sz w:val="18"/>
           <w:szCs w:val="18"/>
         </w:rPr>
-        <w:t xml:space="preserve">  return this.queue.splice(minIdx, 1)[0];</w:t>
+        <w:t xml:space="preserve">  }</w:t>
+      </w:r>
+    </w:p>
+    <w:p>
+      <w:pPr>
+        <w:spacing w:after="0" w:line="240"/>
+        <w:ind w:left="360"/>
+      </w:pPr>
+      <w:r>
+        <w:rPr>
+          <w:rFonts w:ascii="Consolas" w:cs="Consolas" w:eastAsia="Consolas" w:hAnsi="Consolas"/>
+          <w:color w:val="333333"/>
+          <w:sz w:val="18"/>
+          <w:szCs w:val="18"/>
+        </w:rPr>
+        <w:t xml:space="preserve">  const req = this.queue.splice(minIdx, 1)[0];</w:t>
+      </w:r>
+    </w:p>
+    <w:p>
+      <w:pPr>
+        <w:spacing w:after="0" w:line="240"/>
+        <w:ind w:left="360"/>
+      </w:pPr>
+      <w:r>
+        <w:rPr>
+          <w:rFonts w:ascii="Consolas" w:cs="Consolas" w:eastAsia="Consolas" w:hAnsi="Consolas"/>
+          <w:color w:val="333333"/>
+          <w:sz w:val="18"/>
+          <w:szCs w:val="18"/>
+        </w:rPr>
+        <w:t xml:space="preserve">  this.globalVirtualTime = req.virtualFinishTime;   // 시스템 가상 시각 갱신</w:t>
+      </w:r>
+    </w:p>
+    <w:p>
+      <w:pPr>
+        <w:spacing w:after="0" w:line="240"/>
+        <w:ind w:left="360"/>
+      </w:pPr>
+      <w:r>
+        <w:rPr>
+          <w:rFonts w:ascii="Consolas" w:cs="Consolas" w:eastAsia="Consolas" w:hAnsi="Consolas"/>
+          <w:color w:val="333333"/>
+          <w:sz w:val="18"/>
+          <w:szCs w:val="18"/>
+        </w:rPr>
+        <w:t xml:space="preserve">  return req;</w:t>
       </w:r>
     </w:p>
     <w:p>
@@ -5266,7 +5311,7 @@
                 <w:sz w:val="20"/>
                 <w:szCs w:val="20"/>
               </w:rPr>
-              <w:t xml:space="preserve">사용자 수</w:t>
+              <w:t xml:space="preserve">사용자 구분</w:t>
             </w:r>
           </w:p>
         </w:tc>
@@ -5324,7 +5369,7 @@
                 <w:sz w:val="20"/>
                 <w:szCs w:val="20"/>
               </w:rPr>
-              <w:t xml:space="preserve">구분 없음</w:t>
+              <w:t xml:space="preserve">미사용 (요청 유형만 구분)</w:t>
             </w:r>
           </w:p>
         </w:tc>
@@ -9918,7 +9963,7 @@
           <w:sz w:val="22"/>
           <w:szCs w:val="22"/>
         </w:rPr>
-        <w:t xml:space="preserve">는 구독 등급과 요청 우선순위가 독립적임을 드러내기 위해 Enterprise에 낮은 우선순위를, Free에 일부 상위 우선순위를 배정한 실험 구성으로, URGENT/HIGH 요청이 먼저 처리되어 Enterprise는 FCFS보다 밀렸고 Free의 상위 우선순위 요청은 앞당겨졌다. </w:t>
+        <w:t xml:space="preserve">는 구독 등급과 요청 우선순위가 독립적임을 드러내기 위해 등급별로 서로 다른 우선순위를 혼합 배정하였다(배정 내역은 부록 표 B.3 참조). 그 결과 Enterprise의 NORMAL 요청이 Premium의 URGENT 요청에 밀려 Enterprise 평균 대기시간이 FCFS 대비 증가(232 → 379ms)하였고, Free의 NORMAL 요청은 Standard의 LOW 요청보다 먼저 처리되어 Free 평균 대기시간은 오히려 감소(2,024 → 1,887ms)하였다. </w:t>
       </w:r>
       <w:r>
         <w:rPr>
@@ -12254,7 +12299,7 @@
           <w:sz w:val="22"/>
           <w:szCs w:val="22"/>
         </w:rPr>
-        <w:t xml:space="preserve">본 프로젝트는 두 가지 면에서 의의가 있다. 첫째, CPU 스케줄링(FCFS, Priority, MLFQ)과 네트워크 자원 배분(WFQ) 알고리즘을 LLM API 환경에 적용해 운영체제 이론의 실제 응용을 확인하였다. 둘째, vLLM·TGI 등 기존 LLM 서빙 도구가 전체 처리량 최적화에 집중하여 사용자별 공정성이나 우선순위 관리를 제공하지 않는다는 점을 확인하고, 이 부분에 스케줄링 이론을 적용한 효과를 비교하였다. 특히 WFQ의 가중치 비례 차등 서비스는 유료 LLM 서비스의 구독 등급 관리에 활용할 가능성을 보여준다. 다만 단일 실험 기준 최대 500건, 세 실험을 합산한 총 3,020건이므로, 대규모 운영 환경에서도 같은 결과가 나올지는 추가 확인이 필요하다.</w:t>
+        <w:t xml:space="preserve">본 프로젝트는 두 가지 면에서 의의가 있다. 첫째, CPU 스케줄링(FCFS, Priority, MLFQ)과 네트워크 자원 배분(WFQ) 알고리즘을 LLM API 환경에 적용해 운영체제 이론의 실제 응용을 확인하였다. 둘째, vLLM·TGI 등 기존 LLM 서빙 도구가 전체 처리량 최적화에 집중하여 사용자별 공정성이나 우선순위 관리를 제공하지 않는다는 점을 확인하고, 이 부분에 스케줄링 이론을 적용한 효과를 비교하였다. 특히 WFQ의 가중치 비례 차등 서비스는 유료 LLM 서비스의 구독 등급 관리에 활용할 가능성을 보여준다. 다만 세 실험을 합산하여도 총 3,020건 규모이므로, 대규모 운영 환경에서도 같은 결과가 나올지는 추가 확인이 필요하다.</w:t>
       </w:r>
     </w:p>
     <w:p>
@@ -15173,7 +15218,7 @@
           <w:sz w:val="22"/>
           <w:szCs w:val="22"/>
         </w:rPr>
-        <w:t xml:space="preserve">t-검정의 귀무가설은 "FCFS와 MLFQ의 Short 요청 평균 응답시간이 동일하다"이다. p 값이 0.001 미만이므로 귀무가설을 기각할 수 있고, Cohen's d 값이 0.8(대효과 기준)보다 훨씬 크므로 두 방식의 차이는 실질적으로도 매우 크다고 해석된다. 단, 5개 시드의 제한된 표본이므로 결과 해석에 참고용으로만 사용한다.</w:t>
+        <w:t xml:space="preserve">t-검정의 귀무가설은 "FCFS와 MLFQ의 Short 요청 평균 응답시간이 동일하다"이다. p 값이 0.001 미만이므로 귀무가설을 기각할 수 있다. Cohen's d = 20.39는 일반적 대효과 기준(0.8)의 25배에 해당하는 값으로, 두 방식의 응답시간 분포가 사실상 겹치지 않음을 뜻한다. 시뮬레이션이 동일 요청 집합을 두 알고리즘에 각각 적용하는 구조이므로 외부 잡음 요인이 거의 없어 이와 같이 극단적인 효과 크기가 나타난 것이며, 실제 운영 환경에서는 변동 요인으로 인해 더 작은 값이 관측될 것으로 예상된다. 단, 5개 시드의 제한된 표본이므로 결과 해석에 참고용으로만 사용한다.</w:t>
       </w:r>
     </w:p>
     <w:p>
@@ -15224,6 +15269,948 @@
           <w:szCs w:val="22"/>
         </w:rPr>
         <w:t xml:space="preserve">: 이 표의 개선율은 LLM 추론을 임의 시점에 중단·재개할 수 있다고 가정했을 때의 이론적 상한이며, 실서버에서는 비선점형 MLFQ만 적용 가능하다 (6.1절).</w:t>
+      </w:r>
+    </w:p>
+    <w:p>
+      <w:pPr>
+        <w:spacing w:after="120" w:line="360"/>
+      </w:pPr>
+      <w:r>
+        <w:rPr>
+          <w:rFonts w:ascii="맑은 고딕" w:cs="맑은 고딕" w:eastAsia="맑은 고딕" w:hAnsi="맑은 고딕"/>
+          <w:b/>
+          <w:bCs/>
+          <w:color w:val="000000"/>
+          <w:sz w:val="22"/>
+          <w:szCs w:val="22"/>
+        </w:rPr>
+        <w:t xml:space="preserve">표 B.3. Ollama 실서버 실험의 Priority 요청 우선순위 배정 (등급 × 요청 번호)</w:t>
+      </w:r>
+    </w:p>
+    <w:tbl>
+      <w:tblPr>
+        <w:tblW w:type="auto" w:w="100"/>
+        <w:tblBorders>
+          <w:top w:val="single" w:color="auto" w:sz="4"/>
+          <w:left w:val="single" w:color="auto" w:sz="4"/>
+          <w:bottom w:val="single" w:color="auto" w:sz="4"/>
+          <w:right w:val="single" w:color="auto" w:sz="4"/>
+          <w:insideH w:val="single" w:color="auto" w:sz="4"/>
+          <w:insideV w:val="single" w:color="auto" w:sz="4"/>
+        </w:tblBorders>
+      </w:tblPr>
+      <w:tblGrid>
+        <w:gridCol w:w="1322"/>
+        <w:gridCol w:w="1322"/>
+        <w:gridCol w:w="1322"/>
+        <w:gridCol w:w="1322"/>
+        <w:gridCol w:w="1322"/>
+        <w:gridCol w:w="1322"/>
+      </w:tblGrid>
+      <w:tr>
+        <w:tc>
+          <w:tcPr>
+            <w:tcW w:type="dxa" w:w="1322"/>
+            <w:tcBorders>
+              <w:top w:val="single" w:color="AAAAAA" w:sz="1"/>
+              <w:left w:val="single" w:color="AAAAAA" w:sz="1"/>
+              <w:bottom w:val="single" w:color="AAAAAA" w:sz="1"/>
+              <w:right w:val="single" w:color="AAAAAA" w:sz="1"/>
+            </w:tcBorders>
+            <w:shd w:fill="D9E2F3" w:val="clear"/>
+            <w:vAlign w:val="center"/>
+          </w:tcPr>
+          <w:p>
+            <w:pPr>
+              <w:spacing w:after="40" w:before="40"/>
+              <w:jc w:val="center"/>
+            </w:pPr>
+            <w:r>
+              <w:rPr>
+                <w:rFonts w:ascii="맑은 고딕" w:cs="맑은 고딕" w:eastAsia="맑은 고딕" w:hAnsi="맑은 고딕"/>
+                <w:b/>
+                <w:bCs/>
+                <w:color w:val="000000"/>
+                <w:sz w:val="20"/>
+                <w:szCs w:val="20"/>
+              </w:rPr>
+              <w:t xml:space="preserve">등급</w:t>
+            </w:r>
+          </w:p>
+        </w:tc>
+        <w:tc>
+          <w:tcPr>
+            <w:tcW w:type="dxa" w:w="1322"/>
+            <w:tcBorders>
+              <w:top w:val="single" w:color="AAAAAA" w:sz="1"/>
+              <w:left w:val="single" w:color="AAAAAA" w:sz="1"/>
+              <w:bottom w:val="single" w:color="AAAAAA" w:sz="1"/>
+              <w:right w:val="single" w:color="AAAAAA" w:sz="1"/>
+            </w:tcBorders>
+            <w:shd w:fill="D9E2F3" w:val="clear"/>
+            <w:vAlign w:val="center"/>
+          </w:tcPr>
+          <w:p>
+            <w:pPr>
+              <w:spacing w:after="40" w:before="40"/>
+              <w:jc w:val="center"/>
+            </w:pPr>
+            <w:r>
+              <w:rPr>
+                <w:rFonts w:ascii="맑은 고딕" w:cs="맑은 고딕" w:eastAsia="맑은 고딕" w:hAnsi="맑은 고딕"/>
+                <w:b/>
+                <w:bCs/>
+                <w:color w:val="000000"/>
+                <w:sz w:val="20"/>
+                <w:szCs w:val="20"/>
+              </w:rPr>
+              <w:t xml:space="preserve">요청 1</w:t>
+            </w:r>
+          </w:p>
+        </w:tc>
+        <w:tc>
+          <w:tcPr>
+            <w:tcW w:type="dxa" w:w="1322"/>
+            <w:tcBorders>
+              <w:top w:val="single" w:color="AAAAAA" w:sz="1"/>
+              <w:left w:val="single" w:color="AAAAAA" w:sz="1"/>
+              <w:bottom w:val="single" w:color="AAAAAA" w:sz="1"/>
+              <w:right w:val="single" w:color="AAAAAA" w:sz="1"/>
+            </w:tcBorders>
+            <w:shd w:fill="D9E2F3" w:val="clear"/>
+            <w:vAlign w:val="center"/>
+          </w:tcPr>
+          <w:p>
+            <w:pPr>
+              <w:spacing w:after="40" w:before="40"/>
+              <w:jc w:val="center"/>
+            </w:pPr>
+            <w:r>
+              <w:rPr>
+                <w:rFonts w:ascii="맑은 고딕" w:cs="맑은 고딕" w:eastAsia="맑은 고딕" w:hAnsi="맑은 고딕"/>
+                <w:b/>
+                <w:bCs/>
+                <w:color w:val="000000"/>
+                <w:sz w:val="20"/>
+                <w:szCs w:val="20"/>
+              </w:rPr>
+              <w:t xml:space="preserve">요청 2</w:t>
+            </w:r>
+          </w:p>
+        </w:tc>
+        <w:tc>
+          <w:tcPr>
+            <w:tcW w:type="dxa" w:w="1322"/>
+            <w:tcBorders>
+              <w:top w:val="single" w:color="AAAAAA" w:sz="1"/>
+              <w:left w:val="single" w:color="AAAAAA" w:sz="1"/>
+              <w:bottom w:val="single" w:color="AAAAAA" w:sz="1"/>
+              <w:right w:val="single" w:color="AAAAAA" w:sz="1"/>
+            </w:tcBorders>
+            <w:shd w:fill="D9E2F3" w:val="clear"/>
+            <w:vAlign w:val="center"/>
+          </w:tcPr>
+          <w:p>
+            <w:pPr>
+              <w:spacing w:after="40" w:before="40"/>
+              <w:jc w:val="center"/>
+            </w:pPr>
+            <w:r>
+              <w:rPr>
+                <w:rFonts w:ascii="맑은 고딕" w:cs="맑은 고딕" w:eastAsia="맑은 고딕" w:hAnsi="맑은 고딕"/>
+                <w:b/>
+                <w:bCs/>
+                <w:color w:val="000000"/>
+                <w:sz w:val="20"/>
+                <w:szCs w:val="20"/>
+              </w:rPr>
+              <w:t xml:space="preserve">요청 3</w:t>
+            </w:r>
+          </w:p>
+        </w:tc>
+        <w:tc>
+          <w:tcPr>
+            <w:tcW w:type="dxa" w:w="1322"/>
+            <w:tcBorders>
+              <w:top w:val="single" w:color="AAAAAA" w:sz="1"/>
+              <w:left w:val="single" w:color="AAAAAA" w:sz="1"/>
+              <w:bottom w:val="single" w:color="AAAAAA" w:sz="1"/>
+              <w:right w:val="single" w:color="AAAAAA" w:sz="1"/>
+            </w:tcBorders>
+            <w:shd w:fill="D9E2F3" w:val="clear"/>
+            <w:vAlign w:val="center"/>
+          </w:tcPr>
+          <w:p>
+            <w:pPr>
+              <w:spacing w:after="40" w:before="40"/>
+              <w:jc w:val="center"/>
+            </w:pPr>
+            <w:r>
+              <w:rPr>
+                <w:rFonts w:ascii="맑은 고딕" w:cs="맑은 고딕" w:eastAsia="맑은 고딕" w:hAnsi="맑은 고딕"/>
+                <w:b/>
+                <w:bCs/>
+                <w:color w:val="000000"/>
+                <w:sz w:val="20"/>
+                <w:szCs w:val="20"/>
+              </w:rPr>
+              <w:t xml:space="preserve">요청 4</w:t>
+            </w:r>
+          </w:p>
+        </w:tc>
+        <w:tc>
+          <w:tcPr>
+            <w:tcW w:type="dxa" w:w="1322"/>
+            <w:tcBorders>
+              <w:top w:val="single" w:color="AAAAAA" w:sz="1"/>
+              <w:left w:val="single" w:color="AAAAAA" w:sz="1"/>
+              <w:bottom w:val="single" w:color="AAAAAA" w:sz="1"/>
+              <w:right w:val="single" w:color="AAAAAA" w:sz="1"/>
+            </w:tcBorders>
+            <w:shd w:fill="D9E2F3" w:val="clear"/>
+            <w:vAlign w:val="center"/>
+          </w:tcPr>
+          <w:p>
+            <w:pPr>
+              <w:spacing w:after="40" w:before="40"/>
+              <w:jc w:val="center"/>
+            </w:pPr>
+            <w:r>
+              <w:rPr>
+                <w:rFonts w:ascii="맑은 고딕" w:cs="맑은 고딕" w:eastAsia="맑은 고딕" w:hAnsi="맑은 고딕"/>
+                <w:b/>
+                <w:bCs/>
+                <w:color w:val="000000"/>
+                <w:sz w:val="20"/>
+                <w:szCs w:val="20"/>
+              </w:rPr>
+              <w:t xml:space="preserve">요청 5</w:t>
+            </w:r>
+          </w:p>
+        </w:tc>
+      </w:tr>
+      <w:tr>
+        <w:tc>
+          <w:tcPr>
+            <w:tcW w:type="dxa" w:w="1322"/>
+            <w:tcBorders>
+              <w:top w:val="single" w:color="AAAAAA" w:sz="1"/>
+              <w:left w:val="single" w:color="AAAAAA" w:sz="1"/>
+              <w:bottom w:val="single" w:color="AAAAAA" w:sz="1"/>
+              <w:right w:val="single" w:color="AAAAAA" w:sz="1"/>
+            </w:tcBorders>
+            <w:vAlign w:val="center"/>
+          </w:tcPr>
+          <w:p>
+            <w:pPr>
+              <w:spacing w:after="40" w:before="40"/>
+              <w:jc w:val="left"/>
+            </w:pPr>
+            <w:r>
+              <w:rPr>
+                <w:rFonts w:ascii="맑은 고딕" w:cs="맑은 고딕" w:eastAsia="맑은 고딕" w:hAnsi="맑은 고딕"/>
+                <w:b w:val="false"/>
+                <w:bCs w:val="false"/>
+                <w:color w:val="000000"/>
+                <w:sz w:val="20"/>
+                <w:szCs w:val="20"/>
+              </w:rPr>
+              <w:t xml:space="preserve">Enterprise</w:t>
+            </w:r>
+          </w:p>
+        </w:tc>
+        <w:tc>
+          <w:tcPr>
+            <w:tcW w:type="dxa" w:w="1322"/>
+            <w:tcBorders>
+              <w:top w:val="single" w:color="AAAAAA" w:sz="1"/>
+              <w:left w:val="single" w:color="AAAAAA" w:sz="1"/>
+              <w:bottom w:val="single" w:color="AAAAAA" w:sz="1"/>
+              <w:right w:val="single" w:color="AAAAAA" w:sz="1"/>
+            </w:tcBorders>
+            <w:vAlign w:val="center"/>
+          </w:tcPr>
+          <w:p>
+            <w:pPr>
+              <w:spacing w:after="40" w:before="40"/>
+              <w:jc w:val="left"/>
+            </w:pPr>
+            <w:r>
+              <w:rPr>
+                <w:rFonts w:ascii="맑은 고딕" w:cs="맑은 고딕" w:eastAsia="맑은 고딕" w:hAnsi="맑은 고딕"/>
+                <w:b w:val="false"/>
+                <w:bCs w:val="false"/>
+                <w:color w:val="000000"/>
+                <w:sz w:val="20"/>
+                <w:szCs w:val="20"/>
+              </w:rPr>
+              <w:t xml:space="preserve">URGENT</w:t>
+            </w:r>
+          </w:p>
+        </w:tc>
+        <w:tc>
+          <w:tcPr>
+            <w:tcW w:type="dxa" w:w="1322"/>
+            <w:tcBorders>
+              <w:top w:val="single" w:color="AAAAAA" w:sz="1"/>
+              <w:left w:val="single" w:color="AAAAAA" w:sz="1"/>
+              <w:bottom w:val="single" w:color="AAAAAA" w:sz="1"/>
+              <w:right w:val="single" w:color="AAAAAA" w:sz="1"/>
+            </w:tcBorders>
+            <w:vAlign w:val="center"/>
+          </w:tcPr>
+          <w:p>
+            <w:pPr>
+              <w:spacing w:after="40" w:before="40"/>
+              <w:jc w:val="left"/>
+            </w:pPr>
+            <w:r>
+              <w:rPr>
+                <w:rFonts w:ascii="맑은 고딕" w:cs="맑은 고딕" w:eastAsia="맑은 고딕" w:hAnsi="맑은 고딕"/>
+                <w:b w:val="false"/>
+                <w:bCs w:val="false"/>
+                <w:color w:val="000000"/>
+                <w:sz w:val="20"/>
+                <w:szCs w:val="20"/>
+              </w:rPr>
+              <w:t xml:space="preserve">HIGH</w:t>
+            </w:r>
+          </w:p>
+        </w:tc>
+        <w:tc>
+          <w:tcPr>
+            <w:tcW w:type="dxa" w:w="1322"/>
+            <w:tcBorders>
+              <w:top w:val="single" w:color="AAAAAA" w:sz="1"/>
+              <w:left w:val="single" w:color="AAAAAA" w:sz="1"/>
+              <w:bottom w:val="single" w:color="AAAAAA" w:sz="1"/>
+              <w:right w:val="single" w:color="AAAAAA" w:sz="1"/>
+            </w:tcBorders>
+            <w:vAlign w:val="center"/>
+          </w:tcPr>
+          <w:p>
+            <w:pPr>
+              <w:spacing w:after="40" w:before="40"/>
+              <w:jc w:val="left"/>
+            </w:pPr>
+            <w:r>
+              <w:rPr>
+                <w:rFonts w:ascii="맑은 고딕" w:cs="맑은 고딕" w:eastAsia="맑은 고딕" w:hAnsi="맑은 고딕"/>
+                <w:b w:val="false"/>
+                <w:bCs w:val="false"/>
+                <w:color w:val="000000"/>
+                <w:sz w:val="20"/>
+                <w:szCs w:val="20"/>
+              </w:rPr>
+              <w:t xml:space="preserve">URGENT</w:t>
+            </w:r>
+          </w:p>
+        </w:tc>
+        <w:tc>
+          <w:tcPr>
+            <w:tcW w:type="dxa" w:w="1322"/>
+            <w:tcBorders>
+              <w:top w:val="single" w:color="AAAAAA" w:sz="1"/>
+              <w:left w:val="single" w:color="AAAAAA" w:sz="1"/>
+              <w:bottom w:val="single" w:color="AAAAAA" w:sz="1"/>
+              <w:right w:val="single" w:color="AAAAAA" w:sz="1"/>
+            </w:tcBorders>
+            <w:vAlign w:val="center"/>
+          </w:tcPr>
+          <w:p>
+            <w:pPr>
+              <w:spacing w:after="40" w:before="40"/>
+              <w:jc w:val="left"/>
+            </w:pPr>
+            <w:r>
+              <w:rPr>
+                <w:rFonts w:ascii="맑은 고딕" w:cs="맑은 고딕" w:eastAsia="맑은 고딕" w:hAnsi="맑은 고딕"/>
+                <w:b w:val="false"/>
+                <w:bCs w:val="false"/>
+                <w:color w:val="000000"/>
+                <w:sz w:val="20"/>
+                <w:szCs w:val="20"/>
+              </w:rPr>
+              <w:t xml:space="preserve">HIGH</w:t>
+            </w:r>
+          </w:p>
+        </w:tc>
+        <w:tc>
+          <w:tcPr>
+            <w:tcW w:type="dxa" w:w="1322"/>
+            <w:tcBorders>
+              <w:top w:val="single" w:color="AAAAAA" w:sz="1"/>
+              <w:left w:val="single" w:color="AAAAAA" w:sz="1"/>
+              <w:bottom w:val="single" w:color="AAAAAA" w:sz="1"/>
+              <w:right w:val="single" w:color="AAAAAA" w:sz="1"/>
+            </w:tcBorders>
+            <w:vAlign w:val="center"/>
+          </w:tcPr>
+          <w:p>
+            <w:pPr>
+              <w:spacing w:after="40" w:before="40"/>
+              <w:jc w:val="left"/>
+            </w:pPr>
+            <w:r>
+              <w:rPr>
+                <w:rFonts w:ascii="맑은 고딕" w:cs="맑은 고딕" w:eastAsia="맑은 고딕" w:hAnsi="맑은 고딕"/>
+                <w:b w:val="false"/>
+                <w:bCs w:val="false"/>
+                <w:color w:val="000000"/>
+                <w:sz w:val="20"/>
+                <w:szCs w:val="20"/>
+              </w:rPr>
+              <w:t xml:space="preserve">NORMAL</w:t>
+            </w:r>
+          </w:p>
+        </w:tc>
+      </w:tr>
+      <w:tr>
+        <w:tc>
+          <w:tcPr>
+            <w:tcW w:type="dxa" w:w="1322"/>
+            <w:tcBorders>
+              <w:top w:val="single" w:color="AAAAAA" w:sz="1"/>
+              <w:left w:val="single" w:color="AAAAAA" w:sz="1"/>
+              <w:bottom w:val="single" w:color="AAAAAA" w:sz="1"/>
+              <w:right w:val="single" w:color="AAAAAA" w:sz="1"/>
+            </w:tcBorders>
+            <w:vAlign w:val="center"/>
+          </w:tcPr>
+          <w:p>
+            <w:pPr>
+              <w:spacing w:after="40" w:before="40"/>
+              <w:jc w:val="left"/>
+            </w:pPr>
+            <w:r>
+              <w:rPr>
+                <w:rFonts w:ascii="맑은 고딕" w:cs="맑은 고딕" w:eastAsia="맑은 고딕" w:hAnsi="맑은 고딕"/>
+                <w:b w:val="false"/>
+                <w:bCs w:val="false"/>
+                <w:color w:val="000000"/>
+                <w:sz w:val="20"/>
+                <w:szCs w:val="20"/>
+              </w:rPr>
+              <w:t xml:space="preserve">Premium</w:t>
+            </w:r>
+          </w:p>
+        </w:tc>
+        <w:tc>
+          <w:tcPr>
+            <w:tcW w:type="dxa" w:w="1322"/>
+            <w:tcBorders>
+              <w:top w:val="single" w:color="AAAAAA" w:sz="1"/>
+              <w:left w:val="single" w:color="AAAAAA" w:sz="1"/>
+              <w:bottom w:val="single" w:color="AAAAAA" w:sz="1"/>
+              <w:right w:val="single" w:color="AAAAAA" w:sz="1"/>
+            </w:tcBorders>
+            <w:vAlign w:val="center"/>
+          </w:tcPr>
+          <w:p>
+            <w:pPr>
+              <w:spacing w:after="40" w:before="40"/>
+              <w:jc w:val="left"/>
+            </w:pPr>
+            <w:r>
+              <w:rPr>
+                <w:rFonts w:ascii="맑은 고딕" w:cs="맑은 고딕" w:eastAsia="맑은 고딕" w:hAnsi="맑은 고딕"/>
+                <w:b w:val="false"/>
+                <w:bCs w:val="false"/>
+                <w:color w:val="000000"/>
+                <w:sz w:val="20"/>
+                <w:szCs w:val="20"/>
+              </w:rPr>
+              <w:t xml:space="preserve">HIGH</w:t>
+            </w:r>
+          </w:p>
+        </w:tc>
+        <w:tc>
+          <w:tcPr>
+            <w:tcW w:type="dxa" w:w="1322"/>
+            <w:tcBorders>
+              <w:top w:val="single" w:color="AAAAAA" w:sz="1"/>
+              <w:left w:val="single" w:color="AAAAAA" w:sz="1"/>
+              <w:bottom w:val="single" w:color="AAAAAA" w:sz="1"/>
+              <w:right w:val="single" w:color="AAAAAA" w:sz="1"/>
+            </w:tcBorders>
+            <w:vAlign w:val="center"/>
+          </w:tcPr>
+          <w:p>
+            <w:pPr>
+              <w:spacing w:after="40" w:before="40"/>
+              <w:jc w:val="left"/>
+            </w:pPr>
+            <w:r>
+              <w:rPr>
+                <w:rFonts w:ascii="맑은 고딕" w:cs="맑은 고딕" w:eastAsia="맑은 고딕" w:hAnsi="맑은 고딕"/>
+                <w:b w:val="false"/>
+                <w:bCs w:val="false"/>
+                <w:color w:val="000000"/>
+                <w:sz w:val="20"/>
+                <w:szCs w:val="20"/>
+              </w:rPr>
+              <w:t xml:space="preserve">NORMAL</w:t>
+            </w:r>
+          </w:p>
+        </w:tc>
+        <w:tc>
+          <w:tcPr>
+            <w:tcW w:type="dxa" w:w="1322"/>
+            <w:tcBorders>
+              <w:top w:val="single" w:color="AAAAAA" w:sz="1"/>
+              <w:left w:val="single" w:color="AAAAAA" w:sz="1"/>
+              <w:bottom w:val="single" w:color="AAAAAA" w:sz="1"/>
+              <w:right w:val="single" w:color="AAAAAA" w:sz="1"/>
+            </w:tcBorders>
+            <w:vAlign w:val="center"/>
+          </w:tcPr>
+          <w:p>
+            <w:pPr>
+              <w:spacing w:after="40" w:before="40"/>
+              <w:jc w:val="left"/>
+            </w:pPr>
+            <w:r>
+              <w:rPr>
+                <w:rFonts w:ascii="맑은 고딕" w:cs="맑은 고딕" w:eastAsia="맑은 고딕" w:hAnsi="맑은 고딕"/>
+                <w:b w:val="false"/>
+                <w:bCs w:val="false"/>
+                <w:color w:val="000000"/>
+                <w:sz w:val="20"/>
+                <w:szCs w:val="20"/>
+              </w:rPr>
+              <w:t xml:space="preserve">HIGH</w:t>
+            </w:r>
+          </w:p>
+        </w:tc>
+        <w:tc>
+          <w:tcPr>
+            <w:tcW w:type="dxa" w:w="1322"/>
+            <w:tcBorders>
+              <w:top w:val="single" w:color="AAAAAA" w:sz="1"/>
+              <w:left w:val="single" w:color="AAAAAA" w:sz="1"/>
+              <w:bottom w:val="single" w:color="AAAAAA" w:sz="1"/>
+              <w:right w:val="single" w:color="AAAAAA" w:sz="1"/>
+            </w:tcBorders>
+            <w:vAlign w:val="center"/>
+          </w:tcPr>
+          <w:p>
+            <w:pPr>
+              <w:spacing w:after="40" w:before="40"/>
+              <w:jc w:val="left"/>
+            </w:pPr>
+            <w:r>
+              <w:rPr>
+                <w:rFonts w:ascii="맑은 고딕" w:cs="맑은 고딕" w:eastAsia="맑은 고딕" w:hAnsi="맑은 고딕"/>
+                <w:b w:val="false"/>
+                <w:bCs w:val="false"/>
+                <w:color w:val="000000"/>
+                <w:sz w:val="20"/>
+                <w:szCs w:val="20"/>
+              </w:rPr>
+              <w:t xml:space="preserve">URGENT</w:t>
+            </w:r>
+          </w:p>
+        </w:tc>
+        <w:tc>
+          <w:tcPr>
+            <w:tcW w:type="dxa" w:w="1322"/>
+            <w:tcBorders>
+              <w:top w:val="single" w:color="AAAAAA" w:sz="1"/>
+              <w:left w:val="single" w:color="AAAAAA" w:sz="1"/>
+              <w:bottom w:val="single" w:color="AAAAAA" w:sz="1"/>
+              <w:right w:val="single" w:color="AAAAAA" w:sz="1"/>
+            </w:tcBorders>
+            <w:vAlign w:val="center"/>
+          </w:tcPr>
+          <w:p>
+            <w:pPr>
+              <w:spacing w:after="40" w:before="40"/>
+              <w:jc w:val="left"/>
+            </w:pPr>
+            <w:r>
+              <w:rPr>
+                <w:rFonts w:ascii="맑은 고딕" w:cs="맑은 고딕" w:eastAsia="맑은 고딕" w:hAnsi="맑은 고딕"/>
+                <w:b w:val="false"/>
+                <w:bCs w:val="false"/>
+                <w:color w:val="000000"/>
+                <w:sz w:val="20"/>
+                <w:szCs w:val="20"/>
+              </w:rPr>
+              <w:t xml:space="preserve">NORMAL</w:t>
+            </w:r>
+          </w:p>
+        </w:tc>
+      </w:tr>
+      <w:tr>
+        <w:tc>
+          <w:tcPr>
+            <w:tcW w:type="dxa" w:w="1322"/>
+            <w:tcBorders>
+              <w:top w:val="single" w:color="AAAAAA" w:sz="1"/>
+              <w:left w:val="single" w:color="AAAAAA" w:sz="1"/>
+              <w:bottom w:val="single" w:color="AAAAAA" w:sz="1"/>
+              <w:right w:val="single" w:color="AAAAAA" w:sz="1"/>
+            </w:tcBorders>
+            <w:vAlign w:val="center"/>
+          </w:tcPr>
+          <w:p>
+            <w:pPr>
+              <w:spacing w:after="40" w:before="40"/>
+              <w:jc w:val="left"/>
+            </w:pPr>
+            <w:r>
+              <w:rPr>
+                <w:rFonts w:ascii="맑은 고딕" w:cs="맑은 고딕" w:eastAsia="맑은 고딕" w:hAnsi="맑은 고딕"/>
+                <w:b w:val="false"/>
+                <w:bCs w:val="false"/>
+                <w:color w:val="000000"/>
+                <w:sz w:val="20"/>
+                <w:szCs w:val="20"/>
+              </w:rPr>
+              <w:t xml:space="preserve">Standard</w:t>
+            </w:r>
+          </w:p>
+        </w:tc>
+        <w:tc>
+          <w:tcPr>
+            <w:tcW w:type="dxa" w:w="1322"/>
+            <w:tcBorders>
+              <w:top w:val="single" w:color="AAAAAA" w:sz="1"/>
+              <w:left w:val="single" w:color="AAAAAA" w:sz="1"/>
+              <w:bottom w:val="single" w:color="AAAAAA" w:sz="1"/>
+              <w:right w:val="single" w:color="AAAAAA" w:sz="1"/>
+            </w:tcBorders>
+            <w:vAlign w:val="center"/>
+          </w:tcPr>
+          <w:p>
+            <w:pPr>
+              <w:spacing w:after="40" w:before="40"/>
+              <w:jc w:val="left"/>
+            </w:pPr>
+            <w:r>
+              <w:rPr>
+                <w:rFonts w:ascii="맑은 고딕" w:cs="맑은 고딕" w:eastAsia="맑은 고딕" w:hAnsi="맑은 고딕"/>
+                <w:b w:val="false"/>
+                <w:bCs w:val="false"/>
+                <w:color w:val="000000"/>
+                <w:sz w:val="20"/>
+                <w:szCs w:val="20"/>
+              </w:rPr>
+              <w:t xml:space="preserve">NORMAL</w:t>
+            </w:r>
+          </w:p>
+        </w:tc>
+        <w:tc>
+          <w:tcPr>
+            <w:tcW w:type="dxa" w:w="1322"/>
+            <w:tcBorders>
+              <w:top w:val="single" w:color="AAAAAA" w:sz="1"/>
+              <w:left w:val="single" w:color="AAAAAA" w:sz="1"/>
+              <w:bottom w:val="single" w:color="AAAAAA" w:sz="1"/>
+              <w:right w:val="single" w:color="AAAAAA" w:sz="1"/>
+            </w:tcBorders>
+            <w:vAlign w:val="center"/>
+          </w:tcPr>
+          <w:p>
+            <w:pPr>
+              <w:spacing w:after="40" w:before="40"/>
+              <w:jc w:val="left"/>
+            </w:pPr>
+            <w:r>
+              <w:rPr>
+                <w:rFonts w:ascii="맑은 고딕" w:cs="맑은 고딕" w:eastAsia="맑은 고딕" w:hAnsi="맑은 고딕"/>
+                <w:b w:val="false"/>
+                <w:bCs w:val="false"/>
+                <w:color w:val="000000"/>
+                <w:sz w:val="20"/>
+                <w:szCs w:val="20"/>
+              </w:rPr>
+              <w:t xml:space="preserve">LOW</w:t>
+            </w:r>
+          </w:p>
+        </w:tc>
+        <w:tc>
+          <w:tcPr>
+            <w:tcW w:type="dxa" w:w="1322"/>
+            <w:tcBorders>
+              <w:top w:val="single" w:color="AAAAAA" w:sz="1"/>
+              <w:left w:val="single" w:color="AAAAAA" w:sz="1"/>
+              <w:bottom w:val="single" w:color="AAAAAA" w:sz="1"/>
+              <w:right w:val="single" w:color="AAAAAA" w:sz="1"/>
+            </w:tcBorders>
+            <w:vAlign w:val="center"/>
+          </w:tcPr>
+          <w:p>
+            <w:pPr>
+              <w:spacing w:after="40" w:before="40"/>
+              <w:jc w:val="left"/>
+            </w:pPr>
+            <w:r>
+              <w:rPr>
+                <w:rFonts w:ascii="맑은 고딕" w:cs="맑은 고딕" w:eastAsia="맑은 고딕" w:hAnsi="맑은 고딕"/>
+                <w:b w:val="false"/>
+                <w:bCs w:val="false"/>
+                <w:color w:val="000000"/>
+                <w:sz w:val="20"/>
+                <w:szCs w:val="20"/>
+              </w:rPr>
+              <w:t xml:space="preserve">NORMAL</w:t>
+            </w:r>
+          </w:p>
+        </w:tc>
+        <w:tc>
+          <w:tcPr>
+            <w:tcW w:type="dxa" w:w="1322"/>
+            <w:tcBorders>
+              <w:top w:val="single" w:color="AAAAAA" w:sz="1"/>
+              <w:left w:val="single" w:color="AAAAAA" w:sz="1"/>
+              <w:bottom w:val="single" w:color="AAAAAA" w:sz="1"/>
+              <w:right w:val="single" w:color="AAAAAA" w:sz="1"/>
+            </w:tcBorders>
+            <w:vAlign w:val="center"/>
+          </w:tcPr>
+          <w:p>
+            <w:pPr>
+              <w:spacing w:after="40" w:before="40"/>
+              <w:jc w:val="left"/>
+            </w:pPr>
+            <w:r>
+              <w:rPr>
+                <w:rFonts w:ascii="맑은 고딕" w:cs="맑은 고딕" w:eastAsia="맑은 고딕" w:hAnsi="맑은 고딕"/>
+                <w:b w:val="false"/>
+                <w:bCs w:val="false"/>
+                <w:color w:val="000000"/>
+                <w:sz w:val="20"/>
+                <w:szCs w:val="20"/>
+              </w:rPr>
+              <w:t xml:space="preserve">HIGH</w:t>
+            </w:r>
+          </w:p>
+        </w:tc>
+        <w:tc>
+          <w:tcPr>
+            <w:tcW w:type="dxa" w:w="1322"/>
+            <w:tcBorders>
+              <w:top w:val="single" w:color="AAAAAA" w:sz="1"/>
+              <w:left w:val="single" w:color="AAAAAA" w:sz="1"/>
+              <w:bottom w:val="single" w:color="AAAAAA" w:sz="1"/>
+              <w:right w:val="single" w:color="AAAAAA" w:sz="1"/>
+            </w:tcBorders>
+            <w:vAlign w:val="center"/>
+          </w:tcPr>
+          <w:p>
+            <w:pPr>
+              <w:spacing w:after="40" w:before="40"/>
+              <w:jc w:val="left"/>
+            </w:pPr>
+            <w:r>
+              <w:rPr>
+                <w:rFonts w:ascii="맑은 고딕" w:cs="맑은 고딕" w:eastAsia="맑은 고딕" w:hAnsi="맑은 고딕"/>
+                <w:b w:val="false"/>
+                <w:bCs w:val="false"/>
+                <w:color w:val="000000"/>
+                <w:sz w:val="20"/>
+                <w:szCs w:val="20"/>
+              </w:rPr>
+              <w:t xml:space="preserve">LOW</w:t>
+            </w:r>
+          </w:p>
+        </w:tc>
+      </w:tr>
+      <w:tr>
+        <w:tc>
+          <w:tcPr>
+            <w:tcW w:type="dxa" w:w="1322"/>
+            <w:tcBorders>
+              <w:top w:val="single" w:color="AAAAAA" w:sz="1"/>
+              <w:left w:val="single" w:color="AAAAAA" w:sz="1"/>
+              <w:bottom w:val="single" w:color="AAAAAA" w:sz="1"/>
+              <w:right w:val="single" w:color="AAAAAA" w:sz="1"/>
+            </w:tcBorders>
+            <w:vAlign w:val="center"/>
+          </w:tcPr>
+          <w:p>
+            <w:pPr>
+              <w:spacing w:after="40" w:before="40"/>
+              <w:jc w:val="left"/>
+            </w:pPr>
+            <w:r>
+              <w:rPr>
+                <w:rFonts w:ascii="맑은 고딕" w:cs="맑은 고딕" w:eastAsia="맑은 고딕" w:hAnsi="맑은 고딕"/>
+                <w:b w:val="false"/>
+                <w:bCs w:val="false"/>
+                <w:color w:val="000000"/>
+                <w:sz w:val="20"/>
+                <w:szCs w:val="20"/>
+              </w:rPr>
+              <w:t xml:space="preserve">Free</w:t>
+            </w:r>
+          </w:p>
+        </w:tc>
+        <w:tc>
+          <w:tcPr>
+            <w:tcW w:type="dxa" w:w="1322"/>
+            <w:tcBorders>
+              <w:top w:val="single" w:color="AAAAAA" w:sz="1"/>
+              <w:left w:val="single" w:color="AAAAAA" w:sz="1"/>
+              <w:bottom w:val="single" w:color="AAAAAA" w:sz="1"/>
+              <w:right w:val="single" w:color="AAAAAA" w:sz="1"/>
+            </w:tcBorders>
+            <w:vAlign w:val="center"/>
+          </w:tcPr>
+          <w:p>
+            <w:pPr>
+              <w:spacing w:after="40" w:before="40"/>
+              <w:jc w:val="left"/>
+            </w:pPr>
+            <w:r>
+              <w:rPr>
+                <w:rFonts w:ascii="맑은 고딕" w:cs="맑은 고딕" w:eastAsia="맑은 고딕" w:hAnsi="맑은 고딕"/>
+                <w:b w:val="false"/>
+                <w:bCs w:val="false"/>
+                <w:color w:val="000000"/>
+                <w:sz w:val="20"/>
+                <w:szCs w:val="20"/>
+              </w:rPr>
+              <w:t xml:space="preserve">LOW</w:t>
+            </w:r>
+          </w:p>
+        </w:tc>
+        <w:tc>
+          <w:tcPr>
+            <w:tcW w:type="dxa" w:w="1322"/>
+            <w:tcBorders>
+              <w:top w:val="single" w:color="AAAAAA" w:sz="1"/>
+              <w:left w:val="single" w:color="AAAAAA" w:sz="1"/>
+              <w:bottom w:val="single" w:color="AAAAAA" w:sz="1"/>
+              <w:right w:val="single" w:color="AAAAAA" w:sz="1"/>
+            </w:tcBorders>
+            <w:vAlign w:val="center"/>
+          </w:tcPr>
+          <w:p>
+            <w:pPr>
+              <w:spacing w:after="40" w:before="40"/>
+              <w:jc w:val="left"/>
+            </w:pPr>
+            <w:r>
+              <w:rPr>
+                <w:rFonts w:ascii="맑은 고딕" w:cs="맑은 고딕" w:eastAsia="맑은 고딕" w:hAnsi="맑은 고딕"/>
+                <w:b w:val="false"/>
+                <w:bCs w:val="false"/>
+                <w:color w:val="000000"/>
+                <w:sz w:val="20"/>
+                <w:szCs w:val="20"/>
+              </w:rPr>
+              <w:t xml:space="preserve">NORMAL</w:t>
+            </w:r>
+          </w:p>
+        </w:tc>
+        <w:tc>
+          <w:tcPr>
+            <w:tcW w:type="dxa" w:w="1322"/>
+            <w:tcBorders>
+              <w:top w:val="single" w:color="AAAAAA" w:sz="1"/>
+              <w:left w:val="single" w:color="AAAAAA" w:sz="1"/>
+              <w:bottom w:val="single" w:color="AAAAAA" w:sz="1"/>
+              <w:right w:val="single" w:color="AAAAAA" w:sz="1"/>
+            </w:tcBorders>
+            <w:vAlign w:val="center"/>
+          </w:tcPr>
+          <w:p>
+            <w:pPr>
+              <w:spacing w:after="40" w:before="40"/>
+              <w:jc w:val="left"/>
+            </w:pPr>
+            <w:r>
+              <w:rPr>
+                <w:rFonts w:ascii="맑은 고딕" w:cs="맑은 고딕" w:eastAsia="맑은 고딕" w:hAnsi="맑은 고딕"/>
+                <w:b w:val="false"/>
+                <w:bCs w:val="false"/>
+                <w:color w:val="000000"/>
+                <w:sz w:val="20"/>
+                <w:szCs w:val="20"/>
+              </w:rPr>
+              <w:t xml:space="preserve">LOW</w:t>
+            </w:r>
+          </w:p>
+        </w:tc>
+        <w:tc>
+          <w:tcPr>
+            <w:tcW w:type="dxa" w:w="1322"/>
+            <w:tcBorders>
+              <w:top w:val="single" w:color="AAAAAA" w:sz="1"/>
+              <w:left w:val="single" w:color="AAAAAA" w:sz="1"/>
+              <w:bottom w:val="single" w:color="AAAAAA" w:sz="1"/>
+              <w:right w:val="single" w:color="AAAAAA" w:sz="1"/>
+            </w:tcBorders>
+            <w:vAlign w:val="center"/>
+          </w:tcPr>
+          <w:p>
+            <w:pPr>
+              <w:spacing w:after="40" w:before="40"/>
+              <w:jc w:val="left"/>
+            </w:pPr>
+            <w:r>
+              <w:rPr>
+                <w:rFonts w:ascii="맑은 고딕" w:cs="맑은 고딕" w:eastAsia="맑은 고딕" w:hAnsi="맑은 고딕"/>
+                <w:b w:val="false"/>
+                <w:bCs w:val="false"/>
+                <w:color w:val="000000"/>
+                <w:sz w:val="20"/>
+                <w:szCs w:val="20"/>
+              </w:rPr>
+              <w:t xml:space="preserve">LOW</w:t>
+            </w:r>
+          </w:p>
+        </w:tc>
+        <w:tc>
+          <w:tcPr>
+            <w:tcW w:type="dxa" w:w="1322"/>
+            <w:tcBorders>
+              <w:top w:val="single" w:color="AAAAAA" w:sz="1"/>
+              <w:left w:val="single" w:color="AAAAAA" w:sz="1"/>
+              <w:bottom w:val="single" w:color="AAAAAA" w:sz="1"/>
+              <w:right w:val="single" w:color="AAAAAA" w:sz="1"/>
+            </w:tcBorders>
+            <w:vAlign w:val="center"/>
+          </w:tcPr>
+          <w:p>
+            <w:pPr>
+              <w:spacing w:after="40" w:before="40"/>
+              <w:jc w:val="left"/>
+            </w:pPr>
+            <w:r>
+              <w:rPr>
+                <w:rFonts w:ascii="맑은 고딕" w:cs="맑은 고딕" w:eastAsia="맑은 고딕" w:hAnsi="맑은 고딕"/>
+                <w:b w:val="false"/>
+                <w:bCs w:val="false"/>
+                <w:color w:val="000000"/>
+                <w:sz w:val="20"/>
+                <w:szCs w:val="20"/>
+              </w:rPr>
+              <w:t xml:space="preserve">NORMAL</w:t>
+            </w:r>
+          </w:p>
+        </w:tc>
+      </w:tr>
+    </w:tbl>
+    <w:p>
+      <w:pPr>
+        <w:spacing w:after="80"/>
+      </w:pPr>
+    </w:p>
+    <w:p>
+      <w:pPr>
+        <w:spacing w:after="120" w:line="360"/>
+      </w:pPr>
+      <w:r>
+        <w:rPr>
+          <w:rFonts w:ascii="맑은 고딕" w:cs="맑은 고딕" w:eastAsia="맑은 고딕" w:hAnsi="맑은 고딕"/>
+          <w:color w:val="000000"/>
+          <w:sz w:val="22"/>
+          <w:szCs w:val="22"/>
+        </w:rPr>
+        <w:t xml:space="preserve">상위 등급일수록 URGENT·HIGH 비율을 높이되, 모든 등급에 여러 우선순위가 섞이도록 배정하였다. 이렇게 한 이유는 구독 등급과 요청 우선순위가 독립적인 두 축임을 실험으로 보이기 위해서이다. 이 배정에 따라 Priority 스케줄러에서는 Enterprise의 NORMAL 요청이 Premium의 URGENT 요청보다 뒤로 밀리고, Free의 NORMAL 요청이 Standard의 LOW 요청보다 앞당겨지는 현상이 5.4절에서 관찰되었다.</w:t>
       </w:r>
     </w:p>
     <w:sectPr>

</xml_diff>

<commit_message>
Add figures and final report for snapshot 20260417_154101
- Added multiple PNG and PPTX files for algorithm concepts, system architecture, data flow, module structure, experiment setup, average wait time, MLFQ vs FCFS, OLLAMA tier, and JFI comparison.
- Included the final report document in DOCX format.
</commit_message>
<xml_diff>
--- a/06-final-report/final/final-report.docx
+++ b/06-final-report/final/final-report.docx
@@ -988,7 +988,7 @@
           <w:sz w:val="22"/>
           <w:szCs w:val="22"/>
         </w:rPr>
-        <w:t xml:space="preserve">는 네트워크 라우터에서 한정된 대역폭을 여러 흐름이 공평하게 나누어 쓰도록 만들어진 알고리즘이다 [4]. 본래 목적은 네트워크 트래픽의 QoS(Quality of Service, 서비스 품질 차등 제공) 보장이며, 인터넷 라우터에 널리 쓰인다. 자원을 완벽히 공평하게 나누는 이상적 모델인 GPS(Generalized Processor Sharing)를 근사하여 구현하기 위해, 각 요청에 가상 완료 시각(Virtual Finish Time, VFT)을 부여한다. 가상 완료 시각이 가장 작은 요청부터 처리하며, 가중치가 큰 사용자의 VFT는 천천히 증가해 결과적으로 더 자주 선택된다. 가중치 비율에 따라 자원을 비례 배분하므로 사용자별 차등 서비스를 자연스럽게 구현할 수 있다. 또한 처리 중단 없이도 차등이 가능하므로 LLM 서빙 도구처럼 비선점형 환경에도 적용할 수 있다. 단점은 모든 요청에 대해 VFT를 계산하고 정렬해야 하므로 단순 큐보다 연산 비용이 크다는 점이다. 본 연구에서는 구독 등급 기반 차등 서비스를 구현하는 알고리즘으로 사용하며, 구체적 VFT 계산은 4.3절에서 설명한다.</w:t>
+        <w:t xml:space="preserve">는 네트워크 라우터에서 한정된 대역폭을 여러 흐름이 공평하게 나누어 쓰도록 만들어진 알고리즘이다 [4]. 본래 목적은 네트워크 트래픽의 QoS(Quality of Service, 서비스 품질 차등 제공) 보장이며, 인터넷 라우터에 널리 쓰인다. 자원을 완벽히 공평하게 나누는 이상적 모델인 GPS(Generalized Processor Sharing)를 비슷하게 만들어 구현하기 위해, 각 요청에 가상 완료 시각(Virtual Finish Time, VFT)을 부여한다. 가상 완료 시각이 가장 작은 요청부터 처리하며, 가중치가 큰 사용자의 VFT는 천천히 증가해 결과적으로 더 자주 선택된다. 가중치 비율에 따라 자원을 비례 배분하므로 사용자별 차등 서비스를 자연스럽게 구현할 수 있다. 또한 처리 중단 없이도 차등이 가능하므로 LLM 서빙 도구처럼 비선점형 환경에도 적용할 수 있다. 단점은 모든 요청에 대해 VFT를 계산하고 정렬해야 하므로 단순 큐보다 연산 비용이 크다는 점이다. 본 연구에서는 구독 등급 기반 차등 서비스를 구현하는 알고리즘으로 사용하며, 구체적 VFT 계산은 4.3절에서 설명한다.</w:t>
       </w:r>
     </w:p>
     <w:p>
@@ -1019,7 +1019,7 @@
           <w:sz w:val="22"/>
           <w:szCs w:val="22"/>
         </w:rPr>
-        <w:t xml:space="preserve">LLM 서빙은 학습된 모델을 실행해 사용자 요청에 응답을 제공하는 것을 뜻한다. LLM은 이전 토큰을 참고해 다음 토큰을 하나씩 생성하며, 매 토큰마다 GPU 자원이 소비된다. GPU 메모리 용량이 동시 처리 가능한 요청 수의 상한을 결정하므로, 다중 사용자 환경에서는 한정된 GPU 자원을 여러 요청이 경쟁하게 된다. 대표 오픈소스 도구인 vLLM [5]과 Hugging Face TGI(Text Generation Inference) [6]는 여러 요청을 동시 처리하는 연속 배치(Continuous Batching)를 지원해 높은 처리량을 달성한다. 연속 배치는 매 토큰 생성 단계마다 새 요청을 배치에 합류시키는 방식으로, 전체 처리량은 늘리지만 각 요청을 어떤 순서로 끼워 넣을지는 별도 결정이 필요하다. 본 프로젝트 실서버 실험에 사용한 Ollama [10]는 로컬에서 REST API로 LLM을 호출하는 도구로, 한 번에 한 요청씩 순차 처리하고 추론 중단이 불가능하다.</w:t>
+        <w:t xml:space="preserve">LLM 서빙은 학습된 모델을 실행해 사용자 요청에 응답을 제공하는 것을 뜻한다. LLM은 이전 토큰(Token, LLM이 한 번에 처리·생성하는 텍스트 조각 단위)을 참고해 다음 토큰을 하나씩 생성하며, 매 토큰마다 GPU 자원이 소비된다. GPU 메모리 용량이 동시 처리 가능한 요청 수의 상한을 결정하므로, 다중 사용자 환경에서는 한정된 GPU 자원을 여러 요청이 경쟁하게 된다. 대표 오픈소스 도구인 vLLM [5]과 Hugging Face TGI(Text Generation Inference) [6]는 여러 요청을 동시 처리하는 연속 배치(Continuous Batching)를 지원해 높은 처리량을 달성한다. 연속 배치는 매 토큰 생성 단계마다 새 요청을 배치에 합류시키는 방식으로, 전체 처리량은 늘리지만 각 요청을 어떤 순서로 끼워 넣을지는 별도 결정이 필요하다. 본 프로젝트 실서버 실험에 사용한 Ollama [10]는 로컬에서 REST API로 LLM을 호출하는 도구로, 한 번에 한 요청씩 순차 처리하고 추론 중단이 불가능하다.</w:t>
       </w:r>
     </w:p>
     <w:p>
@@ -4699,7 +4699,7 @@
           <w:sz w:val="22"/>
           <w:szCs w:val="22"/>
         </w:rPr>
-        <w:t xml:space="preserve">실험은 기본 실험, MLFQ 선점형 실험, 실서버 실험 세 가지로 구분되며, 전체 구조는 그림 5, 실험별 주요 설정은 표 5와 같다. 앞의 두 실험은 시간 기반 시뮬레이션, 실서버 실험은 Ollama를 활용한 실제 LLM 호출로 수행하였다. 시뮬레이션은 요청에 처리 시간을 미리 지정한 후 스케줄러가 결정한 순서대로 한 건씩 순차 처리하는 방식으로, 네트워크 지연이나 LLM 상태 변동 없이 알고리즘 자체의 특성만 비교할 수 있다.</w:t>
+        <w:t xml:space="preserve">실험은 기본 실험, MLFQ 선점형 실험, 실서버 실험 세 가지로 구분되며, 전체 구조는 그림 5, 실험별 주요 설정은 표 5와 같다. 앞의 두 실험은 시간 기반 시뮬레이션, 실서버 실험은 Ollama를 활용한 실제 LLM 호출로 수행하였다. 시뮬레이션은 요청에 처리 시간을 미리 지정한 후 스케줄러가 결정한 순서대로 한 건씩 순차 처리하는 방식으로, 네트워크 지연이나 LLM 상태 변동 없이 알고리즘 자체의 특성만 비교할 수 있다. 반복 실험에는 고정 시드(Seed, 난수 생성의 초기값이며 같은 시드로 실행하면 같은 요청 패턴을 재현할 수 있다)를 사용해 결과 재현성을 확보하였다.</w:t>
       </w:r>
     </w:p>
     <w:p>
@@ -6540,7 +6540,7 @@
           <w:sz w:val="22"/>
           <w:szCs w:val="22"/>
         </w:rPr>
-        <w:t xml:space="preserve">Short는 최상위 큐에서 완료되고 Medium·Long은 시간 할당량 초과로 하위 큐로 강등되도록 설계하였다. 버스트 도착(20건 동시)은 대기열에 요청이 쌓인 상태에서 스케줄러가 순서를 결정하도록 유도하기 위해서이다. 모든 실험에서 요청은 1건씩 순차 처리된다. 세 실험의 요청을 합산하면 총 3,020건(기본 500 + 선점형 2,500 + 실서버 20)이 된다. JFI 계산 방식의 차이는 5.5절에서 다루며, 대규모 환경은 7.2절 향후 연구 과제로 남긴다.</w:t>
+        <w:t xml:space="preserve">Short는 최상위 큐에서 완료되고 Medium·Long은 시간 할당량 초과로 하위 큐로 강등되도록 설계하였다. 버스트(Burst, 짧은 시간에 여러 요청이 동시에 몰리는 상황) 도착 패턴은 대기열에 요청이 쌓인 상태에서 스케줄러가 순서를 결정하도록 유도하기 위해 20건 단위로 동시 투입하는 방식으로 구성하였다. 모든 실험에서 요청은 1건씩 순차 처리된다. 세 실험의 요청을 합산하면 총 3,020건(기본 500 + 선점형 2,500 + 실서버 20)이 된다. JFI 계산 방식의 차이는 5.5절에서 다루며, 대규모 환경은 7.2절 향후 연구 과제로 남긴다.</w:t>
       </w:r>
     </w:p>
     <w:p>
@@ -8655,7 +8655,7 @@
           <w:sz w:val="22"/>
           <w:szCs w:val="22"/>
         </w:rPr>
-        <w:t xml:space="preserve">: 5개 시드에서 Short 개선율이 71.8~74.3%의 좁은 범위에 모였으며, 평균은 73.2%, 95% 신뢰구간은 [71.9%, 74.5%]이다. 쌍체 t-검정 결과 t = 45.59, p &lt; 0.001로 FCFS와 MLFQ의 Short 응답시간 차이는 통계적으로 유의하였고, 효과 크기 Cohen's d = 20.39로 매우 큰 차이가 일관되게 나타났다. 시드를 바꾸어 다섯 번 반복해도 유사한 개선율이 나왔다는 것은, 이 효과가 특정 시드에 우연히 기댄 결과가 아님을 뜻한다. 다만 5개 시드의 제한된 반복이므로 실제 트래픽 패턴에서는 효과가 달라질 수 있다. 시드별 세부와 통계 계산 결과는 부록 B에 정리하였다.</w:t>
+        <w:t xml:space="preserve">: 5개 시드에서 Short 개선율이 71.8~74.3%의 좁은 범위에 모였으며, 평균은 73.2%, 95% 신뢰구간(Confidence Interval, 같은 실험을 반복했을 때 참값이 이 범위 안에 있을 확률이 95%인 구간)은 [71.9%, 74.5%]이다. 쌍체 t-검정(Paired t-test, 같은 실험 조건에 두 방식을 적용하고 차이의 평균이 0인지 확인하는 통계 방법) 결과 t = 45.59, p &lt; 0.001로 FCFS와 MLFQ의 Short 응답시간 차이는 통계적으로 유의하였고, 효과 크기 Cohen's d = 20.39로 매우 큰 차이가 일관되게 나타났다. 시드를 바꾸어 다섯 번 반복해도 유사한 개선율이 나왔다는 것은, 이 효과가 특정 시드에 우연히 기댄 결과가 아님을 뜻한다. 다만 5개 시드의 제한된 반복이므로 실제 트래픽 패턴에서는 효과가 달라질 수 있다. 시드별 세부와 통계 계산 결과는 부록 B에 정리하였다.</w:t>
       </w:r>
     </w:p>
     <w:p>
@@ -15218,7 +15218,7 @@
           <w:sz w:val="22"/>
           <w:szCs w:val="22"/>
         </w:rPr>
-        <w:t xml:space="preserve">t-검정의 귀무가설은 "FCFS와 MLFQ의 Short 요청 평균 응답시간이 동일하다"이다. p 값이 0.001 미만이므로 귀무가설을 기각할 수 있다. Cohen's d = 20.39는 일반적 대효과 기준(0.8)의 25배에 해당하는 값으로, 두 방식의 응답시간 분포가 사실상 겹치지 않음을 뜻한다. 시뮬레이션이 동일 요청 집합을 두 알고리즘에 각각 적용하는 구조이므로 외부 잡음 요인이 거의 없어 이와 같이 극단적인 효과 크기가 나타난 것이며, 실제 운영 환경에서는 변동 요인으로 인해 더 작은 값이 관측될 것으로 예상된다. 단, 5개 시드의 제한된 표본이므로 결과 해석에 참고용으로만 사용한다.</w:t>
+        <w:t xml:space="preserve">t-검정의 귀무가설(Null Hypothesis, "차이가 없다"고 가정하는 기본 전제)은 "FCFS와 MLFQ의 Short 요청 평균 응답시간이 동일하다"이다. 자유도(Degrees of Freedom, 독립적으로 변할 수 있는 값의 수로 표본 수에서 1을 뺀 값)는 5개 시드 표본에서 4가 된다. p 값이 0.001 미만이므로 귀무가설을 기각할 수 있다. Cohen's d = 20.39는 일반적 대효과 기준(0.8)의 25배에 해당하는 값으로, 두 방식의 응답시간 분포가 사실상 겹치지 않음을 뜻한다. 시뮬레이션이 동일 요청 집합을 두 알고리즘에 각각 적용하는 구조이므로 외부 잡음 요인이 거의 없어 이와 같이 극단적인 효과 크기가 나타난 것이며, 실제 운영 환경에서는 변동 요인으로 인해 더 작은 값이 관측될 것으로 예상된다. 단, 5개 시드의 제한된 표본이므로 결과 해석에 참고용으로만 사용한다.</w:t>
       </w:r>
     </w:p>
     <w:p>

</xml_diff>

<commit_message>
Add new figures package and final report documents for snapshot 20260418
- Created a new package.json for figures with dependencies on playwright, pptxgenjs, and sharp.
- Added multiple final report documents in DOCX format for different snapshots.
- Included a snapshot-info.md file detailing the creation date, skill, status, base version, and files included in the snapshot.
</commit_message>
<xml_diff>
--- a/06-final-report/final/final-report.docx
+++ b/06-final-report/final/final-report.docx
@@ -907,7 +907,7 @@
           <w:sz w:val="20"/>
           <w:szCs w:val="20"/>
         </w:rPr>
-        <w:t xml:space="preserve">는 도착 순서대로 처리하는 가장 단순한 스케줄링 방식이며, 운영체제의 일괄 처리 시대부터 사용된 고전 기법이다. 새 요청이 도착하면 대기열의 맨 뒤에 추가되고, 처리는 항상 맨 앞 요청부터 시작된다. 한 요청이 처리되는 동안 다른 요청은 끼어들 수 없으며 비선점형으로만 동작한다. 구현이 매우 쉽고 별도 자료구조도 필요하지 않다. 모든 요청이 결국 처리되므로 기아(Starvation, 특정 요청이 영원히 처리되지 못하는 현상)가 발생하지 않는다. 다만 긴 요청이 앞에 있으면 뒤의 짧은 요청들이 모두 지연되는 호위 효과(Convoy Effect)가 발생한다 [3]. 또한 우선순위나 등급을 고려하지 않아 긴급 요청을 빠르게 처리할 수 없다. 본 연구에서는 다른 알고리즘과 비교하기 위한 기준선으로 사용한다.</w:t>
+        <w:t xml:space="preserve">는 도착 순서대로 처리하는 가장 단순한 스케줄링 방식이며, 운영체제의 일괄 처리 시대부터 사용된 고전 기법이다. 새 요청이 도착하면 대기열의 맨 뒤에 추가되고, 처리는 항상 맨 앞 요청부터 시작된다. 한 요청이 처리되는 동안 다른 요청은 끼어들 수 없으며 비선점형으로만 동작한다. 구현이 매우 쉽고 별도 자료구조도 필요하지 않다. 모든 요청이 결국 처리되므로 기아(Starvation, 특정 요청이 영원히 처리되지 못하는 현상)가 발생하지 않는다. 다만 긴 요청이 앞에 있으면 뒤의 짧은 요청들이 모두 지연되는 호위 효과(Convoy Effect)가 발생한다 [3]. 또한 우선순위나 등급을 고려하지 않아 긴급 요청을 빠르게 처리할 수 없다. 본 프로젝트에서는 다른 알고리즘과 비교하기 위한 기준선으로 사용한다.</w:t>
       </w:r>
     </w:p>
     <w:p>
@@ -932,7 +932,7 @@
           <w:sz w:val="20"/>
           <w:szCs w:val="20"/>
         </w:rPr>
-        <w:t xml:space="preserve">은 각 요청에 우선순위를 부여하여 긴급한 요청을 먼저 처리하는 알고리즘이다. 운영체제에서는 시스템 프로세스나 인터럽트 처리에 우선권을 주기 위해 폭넓게 사용된다. 대기열에서 요청을 꺼낼 때 가장 높은 우선순위의 요청을 먼저 선택하며, 같은 우선순위 요청들 사이에서는 도착 순서대로 처리한다. 구현은 우선순위 큐(Priority Queue) 자료구조를 사용하면 단순하게 만들 수 있다. 단점은 낮은 우선순위 요청이 계속 밀려나 처리되지 못하는 기아 현상이 발생할 수 있다는 점이다. 이를 막기 위해 오래 기다린 요청의 우선순위를 점차 올려주는 에이징(Aging) 기법을 적용하였다 [3]. 또한 긴급도를 사람이 직접 지정해야 하므로 자동 분류는 어렵다. 본 연구에서는 LLM API에서 사용자가 요청 단위로 긴급도를 지정할 수 있는 상황에 적합한 알고리즘으로 채택하였다.</w:t>
+        <w:t xml:space="preserve">은 각 요청에 우선순위를 부여하여 긴급한 요청을 먼저 처리하는 알고리즘이다. 운영체제에서는 시스템 프로세스나 인터럽트 처리에 우선권을 주기 위해 폭넓게 사용된다. 대기열에서 요청을 꺼낼 때 가장 높은 우선순위의 요청을 먼저 선택하며, 같은 우선순위 요청들 사이에서는 도착 순서대로 처리한다. 구현은 우선순위 큐(Priority Queue) 자료구조를 사용하면 단순하게 만들 수 있다. 단점은 낮은 우선순위 요청이 계속 밀려나 처리되지 못하는 기아 현상이 발생할 수 있다는 점이다. 이를 막기 위해 오래 기다린 요청의 우선순위를 점차 올려주는 에이징(Aging) 기법을 적용하였다 [3]. 또한 긴급도를 사람이 직접 지정해야 하므로 자동 분류는 어렵다. 본 프로젝트에서는 LLM API에서 사용자가 요청 단위로 긴급도를 지정할 수 있는 상황에 적합한 알고리즘으로 채택하였다.</w:t>
       </w:r>
     </w:p>
     <w:p>
@@ -957,7 +957,7 @@
           <w:sz w:val="20"/>
           <w:szCs w:val="20"/>
         </w:rPr>
-        <w:t xml:space="preserve">는 여러 단계의 대기열을 두고 작업 특성에 따라 우선순위를 자동으로 조정하는 알고리즘이다. 어떤 요청이 짧은지 미리 모르더라도 실행 시간을 관찰하여 자동으로 분류할 수 있다는 점이 가장 큰 특징이다. 새 요청은 최상위 큐에 들어가고, 시간 할당량(Time Quantum, 한 번에 쓸 수 있는 최대 시간) 안에 끝나지 않으면 하위 큐로 내려간다 [3]. 상위 큐가 비어 있을 때만 하위 큐의 요청이 처리되므로, 짧은 요청은 빠르게 끝나고 긴 요청은 아래로 밀린다. 하위 큐로만 계속 밀리면 기아 상태가 되므로, 일정 주기로 모든 요청을 다시 최상위 큐로 끌어올리는 부스팅(Boosting) 규칙을 적용한다. 짧은 요청의 응답 속도가 빠르고 작업 특성을 미리 알 필요가 없어 범용성이 높다는 장점이 있다. 단점은 시간 할당량 단위로 실행을 중단·재개할 수 있는 환경에서만 효과가 있다는 점으로, 추론 중단이 불가능한 LLM 서빙 도구에서는 적용에 제약이 있다. 본 연구에서는 시뮬레이션과 실서버 양쪽에서 선점형·비선점형을 모두 비교하여 이론적 효과와 실용적 한계를 함께 확인한다.</w:t>
+        <w:t xml:space="preserve">는 여러 단계의 대기열을 두고 작업 특성에 따라 우선순위를 자동으로 조정하는 알고리즘이다. 어떤 요청이 짧은지 미리 모르더라도 실행 시간을 관찰하여 자동으로 분류할 수 있다는 점이 가장 큰 특징이다. 새 요청은 최상위 큐에 들어가고, 시간 할당량(Time Quantum, 한 번에 쓸 수 있는 최대 시간) 안에 끝나지 않으면 하위 큐로 내려간다 [3]. 상위 큐가 비어 있을 때만 하위 큐의 요청이 처리되므로, 짧은 요청은 빠르게 끝나고 긴 요청은 아래로 밀린다. 하위 큐로만 계속 밀리면 기아 상태가 되므로, 일정 주기로 모든 요청을 다시 최상위 큐로 끌어올리는 부스팅(Boosting) 규칙을 적용한다. 짧은 요청의 응답 속도가 빠르고 작업 특성을 미리 알 필요가 없어 범용성이 높다는 장점이 있다. 단점은 시간 할당량 단위로 실행을 중단·재개할 수 있는 환경에서만 효과가 있다는 점으로, 추론 중단이 불가능한 LLM 서빙 도구에서는 적용에 제약이 있다. 본 프로젝트에서는 시뮬레이션과 실서버 양쪽에서 선점형·비선점형을 모두 비교하여 이론적 효과와 실용적 한계를 함께 확인한다.</w:t>
       </w:r>
     </w:p>
     <w:p>
@@ -982,7 +982,7 @@
           <w:sz w:val="20"/>
           <w:szCs w:val="20"/>
         </w:rPr>
-        <w:t xml:space="preserve">는 네트워크 라우터에서 한정된 대역폭을 여러 흐름이 공평하게 나누어 쓰도록 만들어진 알고리즘이다 [4]. 본래 목적은 네트워크 트래픽의 QoS(Quality of Service, 서비스 품질 차등 제공) 보장이며, 인터넷 라우터에 널리 쓰인다. 자원을 완벽히 공평하게 나누는 이상적 모델인 GPS(Generalized Processor Sharing)를 비슷하게 만들어 구현하기 위해, 각 요청에 가상 완료 시각(Virtual Finish Time, VFT)을 부여한다. 가상 완료 시각이 가장 작은 요청부터 처리하며, 가중치가 큰 사용자의 VFT는 천천히 증가해 결과적으로 더 자주 선택된다. 가중치 비율에 따라 자원을 비례 배분하므로 사용자별 차등 서비스를 자연스럽게 구현할 수 있다. 또한 처리 중단 없이도 차등이 가능하므로 LLM 서빙 도구처럼 비선점형 환경에도 적용할 수 있다. 단점은 모든 요청에 대해 VFT를 계산하고 정렬해야 하므로 단순 큐보다 연산 비용이 크다는 점이다. 본 연구에서는 구독 등급 기반 차등 서비스를 구현하는 알고리즘으로 사용하며, 구체적 VFT 계산은 4.3절에서 설명한다.</w:t>
+        <w:t xml:space="preserve">는 네트워크 라우터에서 한정된 대역폭을 여러 흐름이 공평하게 나누어 쓰도록 만들어진 알고리즘이다 [4]. 본래 목적은 네트워크 트래픽의 QoS(Quality of Service, 서비스 품질 차등 제공) 보장이며, 인터넷 라우터에 널리 쓰인다. 자원을 완벽히 공평하게 나누는 이상적 모델인 GPS(Generalized Processor Sharing)를 비슷하게 만들어 구현하기 위해, 각 요청에 가상 완료 시각(Virtual Finish Time, VFT)을 부여한다. 가상 완료 시각이 가장 작은 요청부터 처리하며, 가중치가 큰 사용자의 VFT는 천천히 증가해 결과적으로 더 자주 선택된다. 가중치 비율에 따라 자원을 비례 배분하므로 사용자별 차등 서비스를 자연스럽게 구현할 수 있다. 또한 처리 중단 없이도 차등이 가능하므로 LLM 서빙 도구처럼 비선점형 환경에도 적용할 수 있다. 단점은 모든 요청에 대해 VFT를 계산하고 정렬해야 하므로 단순 큐보다 연산 비용이 크다는 점이다. 본 프로젝트에서는 구독 등급 기반 차등 서비스를 구현하는 알고리즘으로 사용하며, 구체적 VFT 계산은 4.3절에서 설명한다.</w:t>
       </w:r>
     </w:p>
     <w:p>
@@ -1087,7 +1087,7 @@
           <w:sz w:val="20"/>
           <w:szCs w:val="20"/>
         </w:rPr>
-        <w:t xml:space="preserve">xi는 사용자 i의 자원량, n은 사용자 수이다. 모두 동일 배분이면 1, 한 명이 독점하면 1/n에 가까워진다(예: 4명 중 한 명 독점 시 0.25). 스케줄링 맥락에서는 xi로 사용자별 대기시간(값이 작을수록 좋음)이나 처리 건수(값이 클수록 좋음) 등을 대입하여 공정성을 측정하며, 본 프로젝트에서도 실험 목적에 따라 두 기준을 구분해 사용하였다 (5.5절). 공정성 지표에는 JFI 외에 최대-최소 공정성(Max-Min Fairness, 가장 불리한 사용자의 몫을 극대화하는 기준)이나 비례 공정성(Proportional Fairness, 각 사용자의 만족도를 종합적으로 높이는 기준) 등이 있다 [4]. 본 프로젝트에서는 계산이 간단하고 단일 수치로 비교가 용이한 JFI를 선택하였다. 다만 WFQ처럼 가중치 기반으로 의도적 차등을 두는 경우에는 단순 처리 건수로 JFI를 계산하면 "가중치대로 처리되었는가"를 판단할 수 없으므로, xi에 "처리 건수 ÷ 가중치"를 대입해 정규화한 JFI를 사용한다. 본 연구에서도 WFQ에는 이 정규화 방식을 적용하였다 (5.5절).</w:t>
+        <w:t xml:space="preserve">xi는 사용자 i의 자원량, n은 사용자 수이다. 모두 동일 배분이면 1, 한 명이 독점하면 1/n에 가까워진다(예: 4명 중 한 명 독점 시 0.25). 스케줄링 맥락에서는 xi로 사용자별 대기시간(값이 작을수록 좋음)이나 처리 건수(값이 클수록 좋음) 등을 대입하여 공정성을 측정하며, 본 프로젝트에서도 실험 목적에 따라 두 기준을 구분해 사용하였다 (5.5절). 공정성 지표에는 JFI 외에 최대-최소 공정성(Max-Min Fairness, 가장 불리한 사용자의 몫을 극대화하는 기준)이나 비례 공정성(Proportional Fairness, 각 사용자의 만족도를 종합적으로 높이는 기준) 등이 있다 [4]. 본 프로젝트에서는 계산이 간단하고 단일 수치로 비교가 용이한 JFI를 선택하였다. 다만 WFQ처럼 가중치 기반으로 의도적 차등을 두는 경우에는 단순 처리 건수로 JFI를 계산하면 "가중치대로 처리되었는가"를 판단할 수 없으므로, xi에 "처리 건수 ÷ 가중치"를 대입해 정규화한 JFI를 사용한다. 본 프로젝트에서도 WFQ에는 이 정규화 방식을 적용하였다 (5.5절).</w:t>
       </w:r>
     </w:p>
     <w:p>
@@ -15180,7 +15180,7 @@
           <w:sz w:val="20"/>
           <w:szCs w:val="20"/>
         </w:rPr>
-        <w:t xml:space="preserve">t-검정의 귀무가설(Null Hypothesis, "차이가 없다"고 가정하는 기본 전제)은 "FCFS와 MLFQ의 Short 요청 평균 응답시간이 동일하다"이다. 자유도(Degrees of Freedom, 독립적으로 변할 수 있는 값의 수로 표본 수에서 1을 뺀 값)는 5개 시드 표본에서 4가 된다. p 값이 0.001 미만이므로 귀무가설을 기각할 수 있다. Cohen's d = 20.39는 일반적 대효과 기준(0.8)의 25배에 해당하는 값으로, 두 방식의 응답시간 분포가 사실상 겹치지 않음을 뜻한다. 시뮬레이션이 동일 요청 집합을 두 알고리즘에 각각 적용하는 구조이므로 외부 잡음 요인이 거의 없어 이와 같이 극단적인 효과 크기가 나타난 것이며, 실제 운영 환경에서는 변동 요인으로 인해 더 작은 값이 관측될 것으로 예상된다. 단, 5개 시드의 제한된 표본이므로 결과 해석에 참고용으로만 사용한다.</w:t>
+        <w:t xml:space="preserve">t-검정의 귀무가설(Null Hypothesis, "차이가 없다"고 가정하는 기본 전제)은 "FCFS와 MLFQ의 Short 요청 평균 응답시간이 동일하다"이다. 자유도(Degrees of Freedom, 독립적으로 변할 수 있는 값의 수로 표본 수에서 1을 뺀 값)는 5개 시드 표본에서 4가 된다. p 값이 0.001 미만이므로 귀무가설을 기각할 수 있다. Cohen's d = 20.39는 일반적 대효과 기준(0.8)의 25배에 해당하는 값으로, 두 방식의 응답시간 분포가 사실상 겹치지 않음을 뜻한다. 시뮬레이션에서는 같은 요청 집합을 두 알고리즘에 각각 적용하므로 외부 변동이 거의 없어 이처럼 극단적인 값이 나왔다. 실제 운영 환경에서는 다양한 변동 요인 때문에 효과 크기가 더 작게 관측될 수 있다. 단, 5개 시드의 제한된 표본이므로 결과 해석에 참고용으로만 사용한다.</w:t>
       </w:r>
     </w:p>
     <w:p>

</xml_diff>

<commit_message>
Update final report generator to use final-report-v34.md and regenerate DOCX
</commit_message>
<xml_diff>
--- a/06-final-report/final/final-report.docx
+++ b/06-final-report/final/final-report.docx
@@ -982,7 +982,7 @@
           <w:sz w:val="20"/>
           <w:szCs w:val="20"/>
         </w:rPr>
-        <w:t xml:space="preserve">는 네트워크 라우터에서 한정된 대역폭을 여러 흐름이 공평하게 나누어 쓰도록 만들어진 알고리즘이다 [4]. 본래 목적은 네트워크 트래픽의 QoS(Quality of Service, 서비스 품질 차등 제공) 보장이며, 인터넷 라우터에 널리 쓰인다. 자원을 완벽히 공평하게 나누는 이상적 모델인 GPS(Generalized Processor Sharing)를 비슷하게 만들어 구현하기 위해, 각 요청에 가상 완료 시각(Virtual Finish Time, VFT)을 부여한다. 가상 완료 시각이 가장 작은 요청부터 처리하며, 가중치가 큰 사용자의 VFT는 천천히 증가해 결과적으로 더 자주 선택된다. 가중치 비율에 따라 자원을 비례 배분하므로 사용자별 차등 서비스를 자연스럽게 구현할 수 있다. 또한 처리 중단 없이도 차등이 가능하므로 LLM 서빙 도구처럼 비선점형 환경에도 적용할 수 있다. 단점은 모든 요청에 대해 VFT를 계산하고 정렬해야 하므로 단순 큐보다 연산 비용이 크다는 점이다. 본 프로젝트에서는 구독 등급 기반 차등 서비스를 구현하는 알고리즘으로 사용하며, 구체적 VFT 계산은 4.3절에서 설명한다.</w:t>
+        <w:t xml:space="preserve">는 네트워크 라우터에서 한정된 대역폭을 여러 흐름이 공평하게 나누어 쓰도록 만들어진 알고리즘이다 [4]. 본래 목적은 네트워크 트래픽의 QoS(Quality of Service, 서비스 품질 차등 제공) 보장이며, 인터넷 라우터에 널리 쓰인다. 자원을 완벽히 공평하게 나누는 이상적 모델인 GPS(Generalized Processor Sharing)를 근사 구현하기 위해, 각 요청에 가상 완료 시각(Virtual Finish Time, VFT)을 부여한다. 가상 완료 시각이 가장 작은 요청부터 처리하며, 가중치가 큰 사용자의 VFT는 천천히 증가해 결과적으로 더 자주 선택된다. 가중치 비율에 따라 자원을 비례 배분하므로 사용자별 차등 서비스를 자연스럽게 구현할 수 있다. 또한 처리 중단 없이도 차등이 가능하므로 비선점형 환경에도 적용할 수 있어, Ollama와 같이 추론 중단이 불가능한 LLM 서빙 도구에서도 사용할 수 있다. 단점은 모든 요청에 대해 VFT를 계산하고 정렬해야 하므로 단순 큐보다 연산 비용이 크다는 점이다. 본 프로젝트에서는 구독 등급 기반 차등 서비스를 구현하는 알고리즘으로 사용하며, 구체적 VFT 계산은 4.3절에서 설명한다.</w:t>
       </w:r>
     </w:p>
     <w:p>
@@ -12268,7 +12268,7 @@
           <w:sz w:val="20"/>
           <w:szCs w:val="20"/>
         </w:rPr>
-        <w:t xml:space="preserve">본 프로젝트는 두 가지 면에서 의의가 있다. 첫째, CPU 스케줄링(FCFS, Priority, MLFQ)과 네트워크 자원 배분(WFQ) 알고리즘을 LLM API 환경에 적용해 운영체제 이론의 실제 응용을 확인하였다. 둘째, vLLM·TGI 등 기존 LLM 서빙 도구가 전체 처리량 최적화에 집중하여 사용자별 공정성이나 우선순위 관리를 제공하지 않는다는 점을 확인하고, 이 부분에 스케줄링 이론을 적용한 효과를 비교하였다. 특히 WFQ의 가중치 비례 차등 서비스는 유료 LLM 서비스의 구독 등급 관리에 활용할 가능성을 보여준다. 다만 세 실험을 합산하여도 총 3,020건 규모이므로, 대규모 운영 환경에서도 같은 결과가 나올지는 추가 확인이 필요하다.</w:t>
+        <w:t xml:space="preserve">본 프로젝트는 두 가지 면에서 의의가 있다. 첫째, CPU 스케줄링(FCFS, Priority, MLFQ)과 네트워크 자원 배분(WFQ) 알고리즘을 LLM API 환경에 적용해 운영체제 이론의 실제 응용을 확인하였다. 둘째, vLLM·TGI 등 기존 LLM 서빙 도구가 전체 처리량 최적화에 집중하여 사용자별 공정성이나 우선순위 관리를 제공하지 않는다는 점을 확인하였다. 본 프로젝트는 이 부분에 스케줄링 이론을 적용하여 알고리즘별 효과를 비교하였다. 특히 WFQ의 가중치 비례 차등 서비스는 유료 LLM 서비스의 구독 등급 관리에 활용할 가능성을 보여준다. 다만 세 실험을 합산하여도 총 3,020건 규모이므로, 대규모 운영 환경에서도 같은 결과가 나올지는 추가 확인이 필요하다.</w:t>
       </w:r>
     </w:p>
     <w:p>
@@ -15180,7 +15180,7 @@
           <w:sz w:val="20"/>
           <w:szCs w:val="20"/>
         </w:rPr>
-        <w:t xml:space="preserve">t-검정의 귀무가설(Null Hypothesis, "차이가 없다"고 가정하는 기본 전제)은 "FCFS와 MLFQ의 Short 요청 평균 응답시간이 동일하다"이다. 자유도(Degrees of Freedom, 독립적으로 변할 수 있는 값의 수로 표본 수에서 1을 뺀 값)는 5개 시드 표본에서 4가 된다. p 값이 0.001 미만이므로 귀무가설을 기각할 수 있다. Cohen's d = 20.39는 일반적 대효과 기준(0.8)의 25배에 해당하는 값으로, 두 방식의 응답시간 분포가 사실상 겹치지 않음을 뜻한다. 시뮬레이션에서는 같은 요청 집합을 두 알고리즘에 각각 적용하므로 외부 변동이 거의 없어 이처럼 극단적인 값이 나왔다. 실제 운영 환경에서는 다양한 변동 요인 때문에 효과 크기가 더 작게 관측될 수 있다. 단, 5개 시드의 제한된 표본이므로 결과 해석에 참고용으로만 사용한다.</w:t>
+        <w:t xml:space="preserve">t-검정의 귀무가설(Null Hypothesis, "차이가 없다"고 가정하는 기본 전제)은 "FCFS와 MLFQ의 Short 요청 평균 응답시간이 동일하다"이다. 자유도(Degrees of Freedom, 독립적으로 변할 수 있는 값의 수로 표본 수에서 1을 뺀 값)는 5개 시드 표본에서 4가 된다. p 값이 0.001 미만이므로 귀무가설을 기각할 수 있다. Cohen's d = 20.39는 일반적 대효과 기준(0.8)의 25배에 해당하는 값으로, 두 방식의 응답시간 분포가 사실상 겹치지 않음을 뜻한다. 시뮬레이션에서는 같은 요청 집합을 두 알고리즘에 각각 적용하므로 외부 변동이 거의 없어 효과 크기가 이처럼 크게 나타났다. 실제 운영 환경에서는 다양한 변동 요인 때문에 효과 크기가 더 작게 관측될 수 있다. 단, 5개 시드의 제한된 표본이므로 결과 해석에 참고용으로만 사용한다.</w:t>
       </w:r>
     </w:p>
     <w:p>

</xml_diff>

<commit_message>
Update final report generation to use version 36 and adjust formatting
- Changed the input markdown file from final-report-v35.md to final-report-v36.md in generate-final.js.
- Updated page size settings for A4 formatting in the final report generation.
- Modified figure generation scripts to reflect updated experiment details, including changes in tenant representation.
- Updated binary figures in the report to reflect the latest versions.
- Regenerated final report document to include the latest changes.
</commit_message>
<xml_diff>
--- a/06-final-report/final/final-report.docx
+++ b/06-final-report/final/final-report.docx
@@ -12595,7 +12595,7 @@
           <w:sz w:val="20"/>
           <w:szCs w:val="20"/>
         </w:rPr>
-        <w:t xml:space="preserve">[4] J. Kurose and K. Ross, "Computer Networking: A Top-Down Approach," 8th Edition, Pearson, 2021. [온라인] Available: https://gaia.cs.umass.edu/kurose_ross/index.php</w:t>
+        <w:t xml:space="preserve">[4] Wikipedia, "Fair queuing." [온라인] Available: https://en.wikipedia.org/wiki/Fair_queuing (접속: 2026-04-19)</w:t>
       </w:r>
     </w:p>
     <w:p>
@@ -12700,7 +12700,7 @@
           <w:sz w:val="20"/>
           <w:szCs w:val="20"/>
         </w:rPr>
-        <w:t xml:space="preserve">[11] A. Silberschatz, P. B. Galvin, and G. Gagne, "Operating System Concepts," 10th Edition, Wiley, 2018. [온라인] Available: https://www.os-book.com/</w:t>
+        <w:t xml:space="preserve">[11] MIT OpenCourseWare, "6.828 Operating System Engineering (Fall 2012)," Massachusetts Institute of Technology. [온라인] Available: https://ocw.mit.edu/courses/6-828-operating-system-engineering-fall-2012/ (접속: 2026-04-19)</w:t>
       </w:r>
     </w:p>
     <w:p>

</xml_diff>

<commit_message>
Add initial figures package and multiple final report documents
- Created a new package.json for the figures directory with dependencies including playwright, pptxgenjs, and sharp.
- Added several new final report documents in different snapshots, including:
- final-report.docx (snapshot 20260415)
- final-report.docx (snapshot 20260415, second instance)
- final-report-v17-pre.docx (snapshot 20260416)
- final-report-v19.docx (snapshot 20260416)
- final-report-v21.docx (snapshot 20260416)
</commit_message>
<xml_diff>
--- a/06-final-report/final/final-report.docx
+++ b/06-final-report/final/final-report.docx
@@ -9938,7 +9938,7 @@
           <w:sz w:val="20"/>
           <w:szCs w:val="20"/>
         </w:rPr>
-        <w:t xml:space="preserve">는 구독 등급과 요청 우선순위가 독립적임을 드러내기 위해 등급별로 서로 다른 우선순위를 혼합 배정하였다(배정 내역은 부록 표 B.3 참조). 그 결과 Enterprise의 NORMAL 요청이 Premium의 URGENT 요청에 밀려 Enterprise 평균 대기시간이 FCFS 대비 증가(232 → 379ms)하였고, Free의 NORMAL 요청은 Standard의 LOW 요청보다 먼저 처리되어 Free 평균 대기시간은 오히려 감소(2,024 → 1,887ms)하였다. </w:t>
+        <w:t xml:space="preserve">는 구독 등급과 요청 우선순위가 독립적임을 드러내기 위해 등급별로 서로 다른 우선순위를 혼합 배정하였다(배정 내역은 부록 표 B.3 참조). 그 결과 Enterprise의 NORMAL 요청이 Premium의 URGENT 요청에 밀려 Enterprise 평균 대기시간은 FCFS 대비 증가하였다(232 → 379ms). 반면 Free의 NORMAL 요청은 Standard의 LOW 요청보다 먼저 처리되어 Free 평균 대기시간은 오히려 감소하였다(2,024 → 1,887ms). </w:t>
       </w:r>
       <w:r>
         <w:rPr>
@@ -12595,7 +12595,7 @@
           <w:sz w:val="20"/>
           <w:szCs w:val="20"/>
         </w:rPr>
-        <w:t xml:space="preserve">[4] Wikipedia, "Fair queuing." [온라인] Available: https://en.wikipedia.org/wiki/Fair_queuing (접속: 2026-04-19)</w:t>
+        <w:t xml:space="preserve">[4] L. Peterson and B. Davie, "Computer Networks: A Systems Approach," 6th ed., Systems Approach LLC, 2022. [온라인] Available: https://book.systemsapproach.org/ (접속: 2026-04-19)</w:t>
       </w:r>
     </w:p>
     <w:p>

</xml_diff>

<commit_message>
Add final report snapshots and supporting files
- Created package.json for figures with dependencies on playwright, pptxgenjs, and sharp.
- Added multiple versions of the final report in DOCX format.
- Included snapshot-info.md detailing the creation date, skill, source markdown, status, trigger, and files included in the snapshot.
</commit_message>
<xml_diff>
--- a/06-final-report/final/final-report.docx
+++ b/06-final-report/final/final-report.docx
@@ -809,7 +809,7 @@
           <w:sz w:val="20"/>
           <w:szCs w:val="20"/>
         </w:rPr>
-        <w:t xml:space="preserve">프로세스 스케줄링은 운영체제에서 CPU 자원을 여러 프로세스에 나누어 주는 방법이다 [3][11]. 본 프로젝트에서 사용한 네 가지 알고리즘의 핵심 특성은 그림 1과 같다.</w:t>
+        <w:t xml:space="preserve">프로세스 스케줄링은 운영체제에서 CPU 자원을 여러 프로세스에 나누어 주는 방법이다 [3]. 본 프로젝트에서 사용한 네 가지 알고리즘의 핵심 특성은 그림 1과 같다.</w:t>
       </w:r>
     </w:p>
     <w:p>
@@ -4256,7 +4256,7 @@
           <w:sz w:val="20"/>
           <w:szCs w:val="20"/>
         </w:rPr>
-        <w:t xml:space="preserve">Rate Limiter는 스케줄링 비교 대상이 아닌 요청 진입 관리 전처리 단계이며, 스케줄러와 독립적으로 동작한다. 토큰 버킷(Token Bucket, 일정 시간마다 요청 권한인 토큰이 새로 발급되고 요청이 들어올 때마다 토큰 하나씩 소모하는 방식) 방식으로 구현하였다. 구독 등급별 분당 허용 수(표 4)를 제한하고, 토큰이 없으면 HTTP 429(Too Many Requests, 요청 한도 초과를 알리는 표준 응답 코드) [12]로 거부한다.</w:t>
+        <w:t xml:space="preserve">Rate Limiter는 스케줄링 비교 대상이 아닌 요청 진입 관리 전처리 단계이며, 스케줄러와 독립적으로 동작한다. 토큰 버킷(Token Bucket, 일정 시간마다 요청 권한인 토큰이 새로 발급되고 요청이 들어올 때마다 토큰 하나씩 소모하는 방식) 방식으로 구현하였다. 구독 등급별 분당 허용 수(표 4)를 제한하고, 토큰이 없으면 HTTP 429(Too Many Requests, 요청 한도 초과를 알리는 표준 응답 코드) [11]로 거부한다.</w:t>
       </w:r>
     </w:p>
     <w:p>
@@ -10091,7 +10091,7 @@
           <w:sz w:val="20"/>
           <w:szCs w:val="20"/>
         </w:rPr>
-        <w:t xml:space="preserve">따라서 표 12 및 그림 9에 정리된 0.316과 1.000을 단순 비교하는 것은 부적절하며, WFQ의 0.316은 "공정성 실패"가 아닌 "의도된 차등이 작동 중"을 의미한다.</w:t>
+        <w:t xml:space="preserve">따라서 표 12 및 그림 9의 0.316과 1.000은 계산 기준이 달라 직접 비교하지 않는다. 각 값의 의미는 아래에서 따로 해석한다.</w:t>
       </w:r>
     </w:p>
     <w:p>
@@ -12700,22 +12700,7 @@
           <w:sz w:val="20"/>
           <w:szCs w:val="20"/>
         </w:rPr>
-        <w:t xml:space="preserve">[11] MIT OpenCourseWare, "6.828 Operating System Engineering (Fall 2012)," Massachusetts Institute of Technology. [온라인] Available: https://ocw.mit.edu/courses/6-828-operating-system-engineering-fall-2012/ (접속: 2026-04-19)</w:t>
-      </w:r>
-    </w:p>
-    <w:p>
-      <w:pPr>
-        <w:spacing w:after="100" w:line="240"/>
-        <w:ind w:left="480" w:hanging="480"/>
-      </w:pPr>
-      <w:r>
-        <w:rPr>
-          <w:rFonts w:ascii="맑은 고딕" w:cs="맑은 고딕" w:eastAsia="맑은 고딕" w:hAnsi="맑은 고딕"/>
-          <w:color w:val="000000"/>
-          <w:sz w:val="20"/>
-          <w:szCs w:val="20"/>
-        </w:rPr>
-        <w:t xml:space="preserve">[12] MDN Web Docs, "HTTP 429 Too Many Requests," Mozilla Developer Network. [온라인] Available: https://developer.mozilla.org/en-US/docs/Web/HTTP/Status/429 (접속: 2026-04-09)</w:t>
+        <w:t xml:space="preserve">[11] MDN Web Docs, "HTTP 429 Too Many Requests," Mozilla Developer Network. [온라인] Available: https://developer.mozilla.org/en-US/docs/Web/HTTP/Status/429 (접속: 2026-04-09)</w:t>
       </w:r>
     </w:p>
     <w:p>

</xml_diff>

<commit_message>
Add final report and presentation materials for graduation project
- Created package.json for figures generation with dependencies: playwright, pptxgenjs, sharp.
- Added .gitkeep file in final directory to maintain structure.
- Included final report document (final-report.docx) in the final directory.
- Added review report (REVIEW-260419.md) for presentation consistency checks against the final report.
- Created TODO.md for remaining tasks leading up to the presentation.
- Developed detailed presentation script (script.md) for the graduation project, including slide transitions and Q&A preparation.
</commit_message>
<xml_diff>
--- a/06-final-report/final/final-report.docx
+++ b/06-final-report/final/final-report.docx
@@ -474,7 +474,7 @@
           <w:sz w:val="20"/>
           <w:szCs w:val="20"/>
         </w:rPr>
-        <w:t xml:space="preserve">ChatGPT, Claude, Gemini 등 대규모 언어 모델(Large Language Model, LLM) 서비스는 주로 API(Application Programming Interface) 형태로 제공된다. 기업이나 연구실에서는 하나의 조직 계정을 여러 구성원이 공유하거나 자체 LLM 서버를 운영하는 사례가 늘어나고 있다.</w:t>
+        <w:t xml:space="preserve">ChatGPT, Claude, Gemini 등 대규모 언어 모델(Large Language Model, LLM) 서비스는 주로 API(Application Programming Interface) 형태로 제공된다. 기업이나 연구실에서는 조직 계정 하나를 여러 구성원이 공유하거나 자체 LLM 서버를 운영하는 사례가 늘고 있다.</w:t>
       </w:r>
     </w:p>
     <w:p>
@@ -2825,7 +2825,7 @@
           <w:sz w:val="20"/>
           <w:szCs w:val="20"/>
         </w:rPr>
-        <w:t xml:space="preserve">런타임은 Node.js 22 LTS [9], 웹 프레임워크는 Express.js 4.18 [8], 언어는 JavaScript(ES2024), LLM은 로컬 Ollama [10]를 사용하였다. 저장소는 메모리 큐와 JSON 파일로 구성하였으며, 생산 의존성은 express 1개이다. 외부 라이브러리를 최소화하고 스케줄링 알고리즘을 직접 구현하여 학습 효과를 높이는 것을 목표로 하였다. Ollama의 순차 처리·비중단 특성은 비선점형 설계와 부합하여 실서버 실험에 활용하였다 (5.4절).</w:t>
+        <w:t xml:space="preserve">런타임은 Node.js 22 LTS [9], 웹 프레임워크는 Express.js 4.18 [8], 언어는 JavaScript(ES2024), LLM 실행 도구로는 로컬 Ollama [10]를 사용하였다. 저장소는 메모리 큐와 JSON 파일로 구성하였으며, 외부 라이브러리 의존성은 express 1개이다. 외부 라이브러리를 최소화하고 스케줄링 알고리즘을 직접 구현하여 학습 효과를 높이는 것을 목표로 하였다. Ollama의 순차 처리·비중단 특성은 비선점형 설계와 부합하여 실서버 실험에 활용하였다 (5.4절).</w:t>
       </w:r>
     </w:p>
     <w:p>

</xml_diff>

<commit_message>
Add presentation slides generator with initial setup
- Created package.json for project metadata and dependencies.
- Added package-lock.json for dependency management.
- Included initial PPTX file for the graduation project presentation.
</commit_message>
<xml_diff>
--- a/06-final-report/final/final-report.docx
+++ b/06-final-report/final/final-report.docx
@@ -4626,7 +4626,7 @@
           <w:sz w:val="20"/>
           <w:szCs w:val="20"/>
         </w:rPr>
-        <w:t xml:space="preserve">스케줄러 4종과 Rate Limiter를 모두 구현하여 동작을 확인하였고, 스케줄러별 단위 테스트를 작성·통과시켰다. 환경변수(`SCHEDULER_TYPE`)로 알고리즘을 실시간 전환할 수 있으며, 동일 요청에 대해 알고리즘별 처리 순서를 시각적으로 비교할 수 있는 데모 환경도 구성하였다.</w:t>
+        <w:t xml:space="preserve">스케줄러 4종과 Rate Limiter를 모두 구현하여 동작을 확인하였고, 스케줄러별 단위 테스트를 작성·통과시켰다. 환경변수(`SCHEDULER_TYPE`)로 알고리즘을 실시간 전환할 수 있으며, 대기열 상태와 처리 통계를 브라우저에서 확인할 수 있는 웹 대시보드(`public/dashboard.html`)를 함께 구성하여 동일 요청에 대한 알고리즘별 처리 순서를 시각적으로 비교할 수 있도록 하였다.</w:t>
       </w:r>
     </w:p>
     <w:p>
@@ -7314,7 +7314,7 @@
           <w:sz w:val="20"/>
           <w:szCs w:val="20"/>
         </w:rPr>
-        <w:t xml:space="preserve">는 순서가 바뀌었으나 전체 평균은 FCFS와 근접하였다. 처리 시간이 짧아(10~100ms) 에이징이 작동하기 전에 처리가 끝났기 때문이다. </w:t>
+        <w:t xml:space="preserve">는 순서가 바뀌었으나 전체 평균은 FCFS와 거의 같은 수준이었다(약 216ms 차이). 우선순위 큐의 삽입·추출 연산이 단순 FIFO보다 약간 무거워 발생한 미세 차이로 해석되며, 처리 시간이 짧아(10~100ms) 에이징이 작동하기 전에 처리가 끝나 우선순위 효과 자체는 거의 드러나지 않았다. </w:t>
       </w:r>
       <w:r>
         <w:rPr>
@@ -8661,7 +8661,7 @@
           <w:sz w:val="20"/>
           <w:szCs w:val="20"/>
         </w:rPr>
-        <w:t xml:space="preserve">시뮬레이션에서 확인한 스케줄링 순서 차이가 실제 LLM 환경에서도 재현되는지 확인하기 위해 Ollama를 활용한 실서버 실험을 수행하였다. 사용 모델은 llama3.2, 출력은 최대 20토큰으로 제한하였다. 총 20건(등급별 5건)을 동시에 큐에 투입한 뒤 FCFS, Priority, WFQ 세 알고리즘을 비교하였다 (비선점형 MLFQ는 5.2절에서 FCFS와 동일함이 확인되어 제외). 전체 결과는 표 10, 구독 등급별 세부는 표 11 및 그림 8에 정리하였다.</w:t>
+        <w:t xml:space="preserve">시뮬레이션에서 확인한 스케줄링 순서 차이가 실제 LLM 환경에서도 재현되는지 확인하기 위해 Ollama를 활용한 실서버 실험을 수행하였다. 사용 모델은 2026년 4월 공개된 Google Gemma 4 계열의 `gemma4:e4b`(4B 파라미터, Effective 4B, 멀티모달 지원)이며, 로컬 Ollama 서버에서 실행하였다. 출력은 최대 20토큰으로 제한하였다. 총 20건(등급별 5건)을 동시에 큐에 투입한 뒤 FCFS, Priority, WFQ 세 알고리즘을 비교하였다 (비선점형 MLFQ는 5.2절에서 FCFS와 동일함이 확인되어 제외). 전체 결과는 표 10, 구독 등급별 세부는 표 11 및 그림 8에 정리하였다.</w:t>
       </w:r>
     </w:p>
     <w:p>
@@ -8875,65 +8875,65 @@
                 <w:sz w:val="18"/>
                 <w:szCs w:val="18"/>
               </w:rPr>
-              <w:t xml:space="preserve">약 1,120ms</w:t>
-            </w:r>
-          </w:p>
-        </w:tc>
-        <w:tc>
-          <w:tcPr>
-            <w:tcW w:type="dxa" w:w="1983"/>
-            <w:tcBorders>
-              <w:top w:val="single" w:color="AAAAAA" w:sz="1"/>
-              <w:left w:val="single" w:color="AAAAAA" w:sz="1"/>
-              <w:bottom w:val="single" w:color="AAAAAA" w:sz="1"/>
-              <w:right w:val="single" w:color="AAAAAA" w:sz="1"/>
-            </w:tcBorders>
-            <w:vAlign w:val="center"/>
-          </w:tcPr>
-          <w:p>
-            <w:pPr>
-              <w:spacing w:after="40" w:before="40"/>
-              <w:jc w:val="left"/>
-            </w:pPr>
-            <w:r>
-              <w:rPr>
-                <w:rFonts w:ascii="맑은 고딕" w:cs="맑은 고딕" w:eastAsia="맑은 고딕" w:hAnsi="맑은 고딕"/>
-                <w:b w:val="false"/>
-                <w:bCs w:val="false"/>
-                <w:color w:val="000000"/>
-                <w:sz w:val="18"/>
-                <w:szCs w:val="18"/>
-              </w:rPr>
-              <w:t xml:space="preserve">약 119ms</w:t>
-            </w:r>
-          </w:p>
-        </w:tc>
-        <w:tc>
-          <w:tcPr>
-            <w:tcW w:type="dxa" w:w="1983"/>
-            <w:tcBorders>
-              <w:top w:val="single" w:color="AAAAAA" w:sz="1"/>
-              <w:left w:val="single" w:color="AAAAAA" w:sz="1"/>
-              <w:bottom w:val="single" w:color="AAAAAA" w:sz="1"/>
-              <w:right w:val="single" w:color="AAAAAA" w:sz="1"/>
-            </w:tcBorders>
-            <w:vAlign w:val="center"/>
-          </w:tcPr>
-          <w:p>
-            <w:pPr>
-              <w:spacing w:after="40" w:before="40"/>
-              <w:jc w:val="left"/>
-            </w:pPr>
-            <w:r>
-              <w:rPr>
-                <w:rFonts w:ascii="맑은 고딕" w:cs="맑은 고딕" w:eastAsia="맑은 고딕" w:hAnsi="맑은 고딕"/>
-                <w:b w:val="false"/>
-                <w:bCs w:val="false"/>
-                <w:color w:val="000000"/>
-                <w:sz w:val="18"/>
-                <w:szCs w:val="18"/>
-              </w:rPr>
-              <w:t xml:space="preserve">약 2,378ms</w:t>
+              <w:t xml:space="preserve">약 1,998ms</w:t>
+            </w:r>
+          </w:p>
+        </w:tc>
+        <w:tc>
+          <w:tcPr>
+            <w:tcW w:type="dxa" w:w="1983"/>
+            <w:tcBorders>
+              <w:top w:val="single" w:color="AAAAAA" w:sz="1"/>
+              <w:left w:val="single" w:color="AAAAAA" w:sz="1"/>
+              <w:bottom w:val="single" w:color="AAAAAA" w:sz="1"/>
+              <w:right w:val="single" w:color="AAAAAA" w:sz="1"/>
+            </w:tcBorders>
+            <w:vAlign w:val="center"/>
+          </w:tcPr>
+          <w:p>
+            <w:pPr>
+              <w:spacing w:after="40" w:before="40"/>
+              <w:jc w:val="left"/>
+            </w:pPr>
+            <w:r>
+              <w:rPr>
+                <w:rFonts w:ascii="맑은 고딕" w:cs="맑은 고딕" w:eastAsia="맑은 고딕" w:hAnsi="맑은 고딕"/>
+                <w:b w:val="false"/>
+                <w:bCs w:val="false"/>
+                <w:color w:val="000000"/>
+                <w:sz w:val="18"/>
+                <w:szCs w:val="18"/>
+              </w:rPr>
+              <w:t xml:space="preserve">약 209ms</w:t>
+            </w:r>
+          </w:p>
+        </w:tc>
+        <w:tc>
+          <w:tcPr>
+            <w:tcW w:type="dxa" w:w="1983"/>
+            <w:tcBorders>
+              <w:top w:val="single" w:color="AAAAAA" w:sz="1"/>
+              <w:left w:val="single" w:color="AAAAAA" w:sz="1"/>
+              <w:bottom w:val="single" w:color="AAAAAA" w:sz="1"/>
+              <w:right w:val="single" w:color="AAAAAA" w:sz="1"/>
+            </w:tcBorders>
+            <w:vAlign w:val="center"/>
+          </w:tcPr>
+          <w:p>
+            <w:pPr>
+              <w:spacing w:after="40" w:before="40"/>
+              <w:jc w:val="left"/>
+            </w:pPr>
+            <w:r>
+              <w:rPr>
+                <w:rFonts w:ascii="맑은 고딕" w:cs="맑은 고딕" w:eastAsia="맑은 고딕" w:hAnsi="맑은 고딕"/>
+                <w:b w:val="false"/>
+                <w:bCs w:val="false"/>
+                <w:color w:val="000000"/>
+                <w:sz w:val="18"/>
+                <w:szCs w:val="18"/>
+              </w:rPr>
+              <w:t xml:space="preserve">약 4,178ms</w:t>
             </w:r>
           </w:p>
         </w:tc>
@@ -8993,65 +8993,65 @@
                 <w:sz w:val="18"/>
                 <w:szCs w:val="18"/>
               </w:rPr>
-              <w:t xml:space="preserve">약 1,112ms</w:t>
-            </w:r>
-          </w:p>
-        </w:tc>
-        <w:tc>
-          <w:tcPr>
-            <w:tcW w:type="dxa" w:w="1983"/>
-            <w:tcBorders>
-              <w:top w:val="single" w:color="AAAAAA" w:sz="1"/>
-              <w:left w:val="single" w:color="AAAAAA" w:sz="1"/>
-              <w:bottom w:val="single" w:color="AAAAAA" w:sz="1"/>
-              <w:right w:val="single" w:color="AAAAAA" w:sz="1"/>
-            </w:tcBorders>
-            <w:vAlign w:val="center"/>
-          </w:tcPr>
-          <w:p>
-            <w:pPr>
-              <w:spacing w:after="40" w:before="40"/>
-              <w:jc w:val="left"/>
-            </w:pPr>
-            <w:r>
-              <w:rPr>
-                <w:rFonts w:ascii="맑은 고딕" w:cs="맑은 고딕" w:eastAsia="맑은 고딕" w:hAnsi="맑은 고딕"/>
-                <w:b w:val="false"/>
-                <w:bCs w:val="false"/>
-                <w:color w:val="000000"/>
-                <w:sz w:val="18"/>
-                <w:szCs w:val="18"/>
-              </w:rPr>
-              <w:t xml:space="preserve">약 116ms</w:t>
-            </w:r>
-          </w:p>
-        </w:tc>
-        <w:tc>
-          <w:tcPr>
-            <w:tcW w:type="dxa" w:w="1983"/>
-            <w:tcBorders>
-              <w:top w:val="single" w:color="AAAAAA" w:sz="1"/>
-              <w:left w:val="single" w:color="AAAAAA" w:sz="1"/>
-              <w:bottom w:val="single" w:color="AAAAAA" w:sz="1"/>
-              <w:right w:val="single" w:color="AAAAAA" w:sz="1"/>
-            </w:tcBorders>
-            <w:vAlign w:val="center"/>
-          </w:tcPr>
-          <w:p>
-            <w:pPr>
-              <w:spacing w:after="40" w:before="40"/>
-              <w:jc w:val="left"/>
-            </w:pPr>
-            <w:r>
-              <w:rPr>
-                <w:rFonts w:ascii="맑은 고딕" w:cs="맑은 고딕" w:eastAsia="맑은 고딕" w:hAnsi="맑은 고딕"/>
-                <w:b w:val="false"/>
-                <w:bCs w:val="false"/>
-                <w:color w:val="000000"/>
-                <w:sz w:val="18"/>
-                <w:szCs w:val="18"/>
-              </w:rPr>
-              <w:t xml:space="preserve">약 2,327ms</w:t>
+              <w:t xml:space="preserve">약 1,977ms</w:t>
+            </w:r>
+          </w:p>
+        </w:tc>
+        <w:tc>
+          <w:tcPr>
+            <w:tcW w:type="dxa" w:w="1983"/>
+            <w:tcBorders>
+              <w:top w:val="single" w:color="AAAAAA" w:sz="1"/>
+              <w:left w:val="single" w:color="AAAAAA" w:sz="1"/>
+              <w:bottom w:val="single" w:color="AAAAAA" w:sz="1"/>
+              <w:right w:val="single" w:color="AAAAAA" w:sz="1"/>
+            </w:tcBorders>
+            <w:vAlign w:val="center"/>
+          </w:tcPr>
+          <w:p>
+            <w:pPr>
+              <w:spacing w:after="40" w:before="40"/>
+              <w:jc w:val="left"/>
+            </w:pPr>
+            <w:r>
+              <w:rPr>
+                <w:rFonts w:ascii="맑은 고딕" w:cs="맑은 고딕" w:eastAsia="맑은 고딕" w:hAnsi="맑은 고딕"/>
+                <w:b w:val="false"/>
+                <w:bCs w:val="false"/>
+                <w:color w:val="000000"/>
+                <w:sz w:val="18"/>
+                <w:szCs w:val="18"/>
+              </w:rPr>
+              <w:t xml:space="preserve">약 208ms</w:t>
+            </w:r>
+          </w:p>
+        </w:tc>
+        <w:tc>
+          <w:tcPr>
+            <w:tcW w:type="dxa" w:w="1983"/>
+            <w:tcBorders>
+              <w:top w:val="single" w:color="AAAAAA" w:sz="1"/>
+              <w:left w:val="single" w:color="AAAAAA" w:sz="1"/>
+              <w:bottom w:val="single" w:color="AAAAAA" w:sz="1"/>
+              <w:right w:val="single" w:color="AAAAAA" w:sz="1"/>
+            </w:tcBorders>
+            <w:vAlign w:val="center"/>
+          </w:tcPr>
+          <w:p>
+            <w:pPr>
+              <w:spacing w:after="40" w:before="40"/>
+              <w:jc w:val="left"/>
+            </w:pPr>
+            <w:r>
+              <w:rPr>
+                <w:rFonts w:ascii="맑은 고딕" w:cs="맑은 고딕" w:eastAsia="맑은 고딕" w:hAnsi="맑은 고딕"/>
+                <w:b w:val="false"/>
+                <w:bCs w:val="false"/>
+                <w:color w:val="000000"/>
+                <w:sz w:val="18"/>
+                <w:szCs w:val="18"/>
+              </w:rPr>
+              <w:t xml:space="preserve">약 4,154ms</w:t>
             </w:r>
           </w:p>
         </w:tc>
@@ -9111,65 +9111,65 @@
                 <w:sz w:val="18"/>
                 <w:szCs w:val="18"/>
               </w:rPr>
-              <w:t xml:space="preserve">약 1,110ms</w:t>
-            </w:r>
-          </w:p>
-        </w:tc>
-        <w:tc>
-          <w:tcPr>
-            <w:tcW w:type="dxa" w:w="1983"/>
-            <w:tcBorders>
-              <w:top w:val="single" w:color="AAAAAA" w:sz="1"/>
-              <w:left w:val="single" w:color="AAAAAA" w:sz="1"/>
-              <w:bottom w:val="single" w:color="AAAAAA" w:sz="1"/>
-              <w:right w:val="single" w:color="AAAAAA" w:sz="1"/>
-            </w:tcBorders>
-            <w:vAlign w:val="center"/>
-          </w:tcPr>
-          <w:p>
-            <w:pPr>
-              <w:spacing w:after="40" w:before="40"/>
-              <w:jc w:val="left"/>
-            </w:pPr>
-            <w:r>
-              <w:rPr>
-                <w:rFonts w:ascii="맑은 고딕" w:cs="맑은 고딕" w:eastAsia="맑은 고딕" w:hAnsi="맑은 고딕"/>
-                <w:b w:val="false"/>
-                <w:bCs w:val="false"/>
-                <w:color w:val="000000"/>
-                <w:sz w:val="18"/>
-                <w:szCs w:val="18"/>
-              </w:rPr>
-              <w:t xml:space="preserve">약 116ms</w:t>
-            </w:r>
-          </w:p>
-        </w:tc>
-        <w:tc>
-          <w:tcPr>
-            <w:tcW w:type="dxa" w:w="1983"/>
-            <w:tcBorders>
-              <w:top w:val="single" w:color="AAAAAA" w:sz="1"/>
-              <w:left w:val="single" w:color="AAAAAA" w:sz="1"/>
-              <w:bottom w:val="single" w:color="AAAAAA" w:sz="1"/>
-              <w:right w:val="single" w:color="AAAAAA" w:sz="1"/>
-            </w:tcBorders>
-            <w:vAlign w:val="center"/>
-          </w:tcPr>
-          <w:p>
-            <w:pPr>
-              <w:spacing w:after="40" w:before="40"/>
-              <w:jc w:val="left"/>
-            </w:pPr>
-            <w:r>
-              <w:rPr>
-                <w:rFonts w:ascii="맑은 고딕" w:cs="맑은 고딕" w:eastAsia="맑은 고딕" w:hAnsi="맑은 고딕"/>
-                <w:b w:val="false"/>
-                <w:bCs w:val="false"/>
-                <w:color w:val="000000"/>
-                <w:sz w:val="18"/>
-                <w:szCs w:val="18"/>
-              </w:rPr>
-              <w:t xml:space="preserve">약 2,323ms</w:t>
+              <w:t xml:space="preserve">약 1,976ms</w:t>
+            </w:r>
+          </w:p>
+        </w:tc>
+        <w:tc>
+          <w:tcPr>
+            <w:tcW w:type="dxa" w:w="1983"/>
+            <w:tcBorders>
+              <w:top w:val="single" w:color="AAAAAA" w:sz="1"/>
+              <w:left w:val="single" w:color="AAAAAA" w:sz="1"/>
+              <w:bottom w:val="single" w:color="AAAAAA" w:sz="1"/>
+              <w:right w:val="single" w:color="AAAAAA" w:sz="1"/>
+            </w:tcBorders>
+            <w:vAlign w:val="center"/>
+          </w:tcPr>
+          <w:p>
+            <w:pPr>
+              <w:spacing w:after="40" w:before="40"/>
+              <w:jc w:val="left"/>
+            </w:pPr>
+            <w:r>
+              <w:rPr>
+                <w:rFonts w:ascii="맑은 고딕" w:cs="맑은 고딕" w:eastAsia="맑은 고딕" w:hAnsi="맑은 고딕"/>
+                <w:b w:val="false"/>
+                <w:bCs w:val="false"/>
+                <w:color w:val="000000"/>
+                <w:sz w:val="18"/>
+                <w:szCs w:val="18"/>
+              </w:rPr>
+              <w:t xml:space="preserve">약 208ms</w:t>
+            </w:r>
+          </w:p>
+        </w:tc>
+        <w:tc>
+          <w:tcPr>
+            <w:tcW w:type="dxa" w:w="1983"/>
+            <w:tcBorders>
+              <w:top w:val="single" w:color="AAAAAA" w:sz="1"/>
+              <w:left w:val="single" w:color="AAAAAA" w:sz="1"/>
+              <w:bottom w:val="single" w:color="AAAAAA" w:sz="1"/>
+              <w:right w:val="single" w:color="AAAAAA" w:sz="1"/>
+            </w:tcBorders>
+            <w:vAlign w:val="center"/>
+          </w:tcPr>
+          <w:p>
+            <w:pPr>
+              <w:spacing w:after="40" w:before="40"/>
+              <w:jc w:val="left"/>
+            </w:pPr>
+            <w:r>
+              <w:rPr>
+                <w:rFonts w:ascii="맑은 고딕" w:cs="맑은 고딕" w:eastAsia="맑은 고딕" w:hAnsi="맑은 고딕"/>
+                <w:b w:val="false"/>
+                <w:bCs w:val="false"/>
+                <w:color w:val="000000"/>
+                <w:sz w:val="18"/>
+                <w:szCs w:val="18"/>
+              </w:rPr>
+              <w:t xml:space="preserve">약 4,167ms</w:t>
             </w:r>
           </w:p>
         </w:tc>
@@ -9391,65 +9391,65 @@
                 <w:sz w:val="18"/>
                 <w:szCs w:val="18"/>
               </w:rPr>
-              <w:t xml:space="preserve">약 232ms</w:t>
-            </w:r>
-          </w:p>
-        </w:tc>
-        <w:tc>
-          <w:tcPr>
-            <w:tcW w:type="dxa" w:w="1983"/>
-            <w:tcBorders>
-              <w:top w:val="single" w:color="AAAAAA" w:sz="1"/>
-              <w:left w:val="single" w:color="AAAAAA" w:sz="1"/>
-              <w:bottom w:val="single" w:color="AAAAAA" w:sz="1"/>
-              <w:right w:val="single" w:color="AAAAAA" w:sz="1"/>
-            </w:tcBorders>
-            <w:vAlign w:val="center"/>
-          </w:tcPr>
-          <w:p>
-            <w:pPr>
-              <w:spacing w:after="40" w:before="40"/>
-              <w:jc w:val="left"/>
-            </w:pPr>
-            <w:r>
-              <w:rPr>
-                <w:rFonts w:ascii="맑은 고딕" w:cs="맑은 고딕" w:eastAsia="맑은 고딕" w:hAnsi="맑은 고딕"/>
-                <w:b w:val="false"/>
-                <w:bCs w:val="false"/>
-                <w:color w:val="000000"/>
-                <w:sz w:val="18"/>
-                <w:szCs w:val="18"/>
-              </w:rPr>
-              <w:t xml:space="preserve">약 379ms</w:t>
-            </w:r>
-          </w:p>
-        </w:tc>
-        <w:tc>
-          <w:tcPr>
-            <w:tcW w:type="dxa" w:w="1983"/>
-            <w:tcBorders>
-              <w:top w:val="single" w:color="AAAAAA" w:sz="1"/>
-              <w:left w:val="single" w:color="AAAAAA" w:sz="1"/>
-              <w:bottom w:val="single" w:color="AAAAAA" w:sz="1"/>
-              <w:right w:val="single" w:color="AAAAAA" w:sz="1"/>
-            </w:tcBorders>
-            <w:vAlign w:val="center"/>
-          </w:tcPr>
-          <w:p>
-            <w:pPr>
-              <w:spacing w:after="40" w:before="40"/>
-              <w:jc w:val="left"/>
-            </w:pPr>
-            <w:r>
-              <w:rPr>
-                <w:rFonts w:ascii="맑은 고딕" w:cs="맑은 고딕" w:eastAsia="맑은 고딕" w:hAnsi="맑은 고딕"/>
-                <w:b w:val="false"/>
-                <w:bCs w:val="false"/>
-                <w:color w:val="000000"/>
-                <w:sz w:val="18"/>
-                <w:szCs w:val="18"/>
-              </w:rPr>
-              <w:t xml:space="preserve">약 241ms</w:t>
+              <w:t xml:space="preserve">약 432ms</w:t>
+            </w:r>
+          </w:p>
+        </w:tc>
+        <w:tc>
+          <w:tcPr>
+            <w:tcW w:type="dxa" w:w="1983"/>
+            <w:tcBorders>
+              <w:top w:val="single" w:color="AAAAAA" w:sz="1"/>
+              <w:left w:val="single" w:color="AAAAAA" w:sz="1"/>
+              <w:bottom w:val="single" w:color="AAAAAA" w:sz="1"/>
+              <w:right w:val="single" w:color="AAAAAA" w:sz="1"/>
+            </w:tcBorders>
+            <w:vAlign w:val="center"/>
+          </w:tcPr>
+          <w:p>
+            <w:pPr>
+              <w:spacing w:after="40" w:before="40"/>
+              <w:jc w:val="left"/>
+            </w:pPr>
+            <w:r>
+              <w:rPr>
+                <w:rFonts w:ascii="맑은 고딕" w:cs="맑은 고딕" w:eastAsia="맑은 고딕" w:hAnsi="맑은 고딕"/>
+                <w:b w:val="false"/>
+                <w:bCs w:val="false"/>
+                <w:color w:val="000000"/>
+                <w:sz w:val="18"/>
+                <w:szCs w:val="18"/>
+              </w:rPr>
+              <w:t xml:space="preserve">약 664ms</w:t>
+            </w:r>
+          </w:p>
+        </w:tc>
+        <w:tc>
+          <w:tcPr>
+            <w:tcW w:type="dxa" w:w="1983"/>
+            <w:tcBorders>
+              <w:top w:val="single" w:color="AAAAAA" w:sz="1"/>
+              <w:left w:val="single" w:color="AAAAAA" w:sz="1"/>
+              <w:bottom w:val="single" w:color="AAAAAA" w:sz="1"/>
+              <w:right w:val="single" w:color="AAAAAA" w:sz="1"/>
+            </w:tcBorders>
+            <w:vAlign w:val="center"/>
+          </w:tcPr>
+          <w:p>
+            <w:pPr>
+              <w:spacing w:after="40" w:before="40"/>
+              <w:jc w:val="left"/>
+            </w:pPr>
+            <w:r>
+              <w:rPr>
+                <w:rFonts w:ascii="맑은 고딕" w:cs="맑은 고딕" w:eastAsia="맑은 고딕" w:hAnsi="맑은 고딕"/>
+                <w:b w:val="false"/>
+                <w:bCs w:val="false"/>
+                <w:color w:val="000000"/>
+                <w:sz w:val="18"/>
+                <w:szCs w:val="18"/>
+              </w:rPr>
+              <w:t xml:space="preserve">약 410ms</w:t>
             </w:r>
           </w:p>
         </w:tc>
@@ -9509,65 +9509,65 @@
                 <w:sz w:val="18"/>
                 <w:szCs w:val="18"/>
               </w:rPr>
-              <w:t xml:space="preserve">약 810ms</w:t>
-            </w:r>
-          </w:p>
-        </w:tc>
-        <w:tc>
-          <w:tcPr>
-            <w:tcW w:type="dxa" w:w="1983"/>
-            <w:tcBorders>
-              <w:top w:val="single" w:color="AAAAAA" w:sz="1"/>
-              <w:left w:val="single" w:color="AAAAAA" w:sz="1"/>
-              <w:bottom w:val="single" w:color="AAAAAA" w:sz="1"/>
-              <w:right w:val="single" w:color="AAAAAA" w:sz="1"/>
-            </w:tcBorders>
-            <w:vAlign w:val="center"/>
-          </w:tcPr>
-          <w:p>
-            <w:pPr>
-              <w:spacing w:after="40" w:before="40"/>
-              <w:jc w:val="left"/>
-            </w:pPr>
-            <w:r>
-              <w:rPr>
-                <w:rFonts w:ascii="맑은 고딕" w:cs="맑은 고딕" w:eastAsia="맑은 고딕" w:hAnsi="맑은 고딕"/>
-                <w:b w:val="false"/>
-                <w:bCs w:val="false"/>
-                <w:color w:val="000000"/>
-                <w:sz w:val="18"/>
-                <w:szCs w:val="18"/>
-              </w:rPr>
-              <w:t xml:space="preserve">약 755ms</w:t>
-            </w:r>
-          </w:p>
-        </w:tc>
-        <w:tc>
-          <w:tcPr>
-            <w:tcW w:type="dxa" w:w="1983"/>
-            <w:tcBorders>
-              <w:top w:val="single" w:color="AAAAAA" w:sz="1"/>
-              <w:left w:val="single" w:color="AAAAAA" w:sz="1"/>
-              <w:bottom w:val="single" w:color="AAAAAA" w:sz="1"/>
-              <w:right w:val="single" w:color="AAAAAA" w:sz="1"/>
-            </w:tcBorders>
-            <w:vAlign w:val="center"/>
-          </w:tcPr>
-          <w:p>
-            <w:pPr>
-              <w:spacing w:after="40" w:before="40"/>
-              <w:jc w:val="left"/>
-            </w:pPr>
-            <w:r>
-              <w:rPr>
-                <w:rFonts w:ascii="맑은 고딕" w:cs="맑은 고딕" w:eastAsia="맑은 고딕" w:hAnsi="맑은 고딕"/>
-                <w:b w:val="false"/>
-                <w:bCs w:val="false"/>
-                <w:color w:val="000000"/>
-                <w:sz w:val="18"/>
-                <w:szCs w:val="18"/>
-              </w:rPr>
-              <w:t xml:space="preserve">약 821ms</w:t>
+              <w:t xml:space="preserve">약 1,480ms</w:t>
+            </w:r>
+          </w:p>
+        </w:tc>
+        <w:tc>
+          <w:tcPr>
+            <w:tcW w:type="dxa" w:w="1983"/>
+            <w:tcBorders>
+              <w:top w:val="single" w:color="AAAAAA" w:sz="1"/>
+              <w:left w:val="single" w:color="AAAAAA" w:sz="1"/>
+              <w:bottom w:val="single" w:color="AAAAAA" w:sz="1"/>
+              <w:right w:val="single" w:color="AAAAAA" w:sz="1"/>
+            </w:tcBorders>
+            <w:vAlign w:val="center"/>
+          </w:tcPr>
+          <w:p>
+            <w:pPr>
+              <w:spacing w:after="40" w:before="40"/>
+              <w:jc w:val="left"/>
+            </w:pPr>
+            <w:r>
+              <w:rPr>
+                <w:rFonts w:ascii="맑은 고딕" w:cs="맑은 고딕" w:eastAsia="맑은 고딕" w:hAnsi="맑은 고딕"/>
+                <w:b w:val="false"/>
+                <w:bCs w:val="false"/>
+                <w:color w:val="000000"/>
+                <w:sz w:val="18"/>
+                <w:szCs w:val="18"/>
+              </w:rPr>
+              <w:t xml:space="preserve">약 1,333ms</w:t>
+            </w:r>
+          </w:p>
+        </w:tc>
+        <w:tc>
+          <w:tcPr>
+            <w:tcW w:type="dxa" w:w="1983"/>
+            <w:tcBorders>
+              <w:top w:val="single" w:color="AAAAAA" w:sz="1"/>
+              <w:left w:val="single" w:color="AAAAAA" w:sz="1"/>
+              <w:bottom w:val="single" w:color="AAAAAA" w:sz="1"/>
+              <w:right w:val="single" w:color="AAAAAA" w:sz="1"/>
+            </w:tcBorders>
+            <w:vAlign w:val="center"/>
+          </w:tcPr>
+          <w:p>
+            <w:pPr>
+              <w:spacing w:after="40" w:before="40"/>
+              <w:jc w:val="left"/>
+            </w:pPr>
+            <w:r>
+              <w:rPr>
+                <w:rFonts w:ascii="맑은 고딕" w:cs="맑은 고딕" w:eastAsia="맑은 고딕" w:hAnsi="맑은 고딕"/>
+                <w:b w:val="false"/>
+                <w:bCs w:val="false"/>
+                <w:color w:val="000000"/>
+                <w:sz w:val="18"/>
+                <w:szCs w:val="18"/>
+              </w:rPr>
+              <w:t xml:space="preserve">약 1,458ms</w:t>
             </w:r>
           </w:p>
         </w:tc>
@@ -9627,65 +9627,65 @@
                 <w:sz w:val="18"/>
                 <w:szCs w:val="18"/>
               </w:rPr>
-              <w:t xml:space="preserve">약 1,414ms</w:t>
-            </w:r>
-          </w:p>
-        </w:tc>
-        <w:tc>
-          <w:tcPr>
-            <w:tcW w:type="dxa" w:w="1983"/>
-            <w:tcBorders>
-              <w:top w:val="single" w:color="AAAAAA" w:sz="1"/>
-              <w:left w:val="single" w:color="AAAAAA" w:sz="1"/>
-              <w:bottom w:val="single" w:color="AAAAAA" w:sz="1"/>
-              <w:right w:val="single" w:color="AAAAAA" w:sz="1"/>
-            </w:tcBorders>
-            <w:vAlign w:val="center"/>
-          </w:tcPr>
-          <w:p>
-            <w:pPr>
-              <w:spacing w:after="40" w:before="40"/>
-              <w:jc w:val="left"/>
-            </w:pPr>
-            <w:r>
-              <w:rPr>
-                <w:rFonts w:ascii="맑은 고딕" w:cs="맑은 고딕" w:eastAsia="맑은 고딕" w:hAnsi="맑은 고딕"/>
-                <w:b w:val="false"/>
-                <w:bCs w:val="false"/>
-                <w:color w:val="000000"/>
-                <w:sz w:val="18"/>
-                <w:szCs w:val="18"/>
-              </w:rPr>
-              <w:t xml:space="preserve">약 1,427ms</w:t>
-            </w:r>
-          </w:p>
-        </w:tc>
-        <w:tc>
-          <w:tcPr>
-            <w:tcW w:type="dxa" w:w="1983"/>
-            <w:tcBorders>
-              <w:top w:val="single" w:color="AAAAAA" w:sz="1"/>
-              <w:left w:val="single" w:color="AAAAAA" w:sz="1"/>
-              <w:bottom w:val="single" w:color="AAAAAA" w:sz="1"/>
-              <w:right w:val="single" w:color="AAAAAA" w:sz="1"/>
-            </w:tcBorders>
-            <w:vAlign w:val="center"/>
-          </w:tcPr>
-          <w:p>
-            <w:pPr>
-              <w:spacing w:after="40" w:before="40"/>
-              <w:jc w:val="left"/>
-            </w:pPr>
-            <w:r>
-              <w:rPr>
-                <w:rFonts w:ascii="맑은 고딕" w:cs="맑은 고딕" w:eastAsia="맑은 고딕" w:hAnsi="맑은 고딕"/>
-                <w:b w:val="false"/>
-                <w:bCs w:val="false"/>
-                <w:color w:val="000000"/>
-                <w:sz w:val="18"/>
-                <w:szCs w:val="18"/>
-              </w:rPr>
-              <w:t xml:space="preserve">약 1,392ms</w:t>
+              <w:t xml:space="preserve">약 2,522ms</w:t>
+            </w:r>
+          </w:p>
+        </w:tc>
+        <w:tc>
+          <w:tcPr>
+            <w:tcW w:type="dxa" w:w="1983"/>
+            <w:tcBorders>
+              <w:top w:val="single" w:color="AAAAAA" w:sz="1"/>
+              <w:left w:val="single" w:color="AAAAAA" w:sz="1"/>
+              <w:bottom w:val="single" w:color="AAAAAA" w:sz="1"/>
+              <w:right w:val="single" w:color="AAAAAA" w:sz="1"/>
+            </w:tcBorders>
+            <w:vAlign w:val="center"/>
+          </w:tcPr>
+          <w:p>
+            <w:pPr>
+              <w:spacing w:after="40" w:before="40"/>
+              <w:jc w:val="left"/>
+            </w:pPr>
+            <w:r>
+              <w:rPr>
+                <w:rFonts w:ascii="맑은 고딕" w:cs="맑은 고딕" w:eastAsia="맑은 고딕" w:hAnsi="맑은 고딕"/>
+                <w:b w:val="false"/>
+                <w:bCs w:val="false"/>
+                <w:color w:val="000000"/>
+                <w:sz w:val="18"/>
+                <w:szCs w:val="18"/>
+              </w:rPr>
+              <w:t xml:space="preserve">약 2,541ms</w:t>
+            </w:r>
+          </w:p>
+        </w:tc>
+        <w:tc>
+          <w:tcPr>
+            <w:tcW w:type="dxa" w:w="1983"/>
+            <w:tcBorders>
+              <w:top w:val="single" w:color="AAAAAA" w:sz="1"/>
+              <w:left w:val="single" w:color="AAAAAA" w:sz="1"/>
+              <w:bottom w:val="single" w:color="AAAAAA" w:sz="1"/>
+              <w:right w:val="single" w:color="AAAAAA" w:sz="1"/>
+            </w:tcBorders>
+            <w:vAlign w:val="center"/>
+          </w:tcPr>
+          <w:p>
+            <w:pPr>
+              <w:spacing w:after="40" w:before="40"/>
+              <w:jc w:val="left"/>
+            </w:pPr>
+            <w:r>
+              <w:rPr>
+                <w:rFonts w:ascii="맑은 고딕" w:cs="맑은 고딕" w:eastAsia="맑은 고딕" w:hAnsi="맑은 고딕"/>
+                <w:b w:val="false"/>
+                <w:bCs w:val="false"/>
+                <w:color w:val="000000"/>
+                <w:sz w:val="18"/>
+                <w:szCs w:val="18"/>
+              </w:rPr>
+              <w:t xml:space="preserve">약 2,496ms</w:t>
             </w:r>
           </w:p>
         </w:tc>
@@ -9745,65 +9745,65 @@
                 <w:sz w:val="18"/>
                 <w:szCs w:val="18"/>
               </w:rPr>
-              <w:t xml:space="preserve">약 2,024ms</w:t>
-            </w:r>
-          </w:p>
-        </w:tc>
-        <w:tc>
-          <w:tcPr>
-            <w:tcW w:type="dxa" w:w="1983"/>
-            <w:tcBorders>
-              <w:top w:val="single" w:color="AAAAAA" w:sz="1"/>
-              <w:left w:val="single" w:color="AAAAAA" w:sz="1"/>
-              <w:bottom w:val="single" w:color="AAAAAA" w:sz="1"/>
-              <w:right w:val="single" w:color="AAAAAA" w:sz="1"/>
-            </w:tcBorders>
-            <w:vAlign w:val="center"/>
-          </w:tcPr>
-          <w:p>
-            <w:pPr>
-              <w:spacing w:after="40" w:before="40"/>
-              <w:jc w:val="left"/>
-            </w:pPr>
-            <w:r>
-              <w:rPr>
-                <w:rFonts w:ascii="맑은 고딕" w:cs="맑은 고딕" w:eastAsia="맑은 고딕" w:hAnsi="맑은 고딕"/>
-                <w:b w:val="false"/>
-                <w:bCs w:val="false"/>
-                <w:color w:val="000000"/>
-                <w:sz w:val="18"/>
-                <w:szCs w:val="18"/>
-              </w:rPr>
-              <w:t xml:space="preserve">약 1,887ms</w:t>
-            </w:r>
-          </w:p>
-        </w:tc>
-        <w:tc>
-          <w:tcPr>
-            <w:tcW w:type="dxa" w:w="1983"/>
-            <w:tcBorders>
-              <w:top w:val="single" w:color="AAAAAA" w:sz="1"/>
-              <w:left w:val="single" w:color="AAAAAA" w:sz="1"/>
-              <w:bottom w:val="single" w:color="AAAAAA" w:sz="1"/>
-              <w:right w:val="single" w:color="AAAAAA" w:sz="1"/>
-            </w:tcBorders>
-            <w:vAlign w:val="center"/>
-          </w:tcPr>
-          <w:p>
-            <w:pPr>
-              <w:spacing w:after="40" w:before="40"/>
-              <w:jc w:val="left"/>
-            </w:pPr>
-            <w:r>
-              <w:rPr>
-                <w:rFonts w:ascii="맑은 고딕" w:cs="맑은 고딕" w:eastAsia="맑은 고딕" w:hAnsi="맑은 고딕"/>
-                <w:b w:val="false"/>
-                <w:bCs w:val="false"/>
-                <w:color w:val="000000"/>
-                <w:sz w:val="18"/>
-                <w:szCs w:val="18"/>
-              </w:rPr>
-              <w:t xml:space="preserve">약 1,985ms</w:t>
+              <w:t xml:space="preserve">약 3,561ms</w:t>
+            </w:r>
+          </w:p>
+        </w:tc>
+        <w:tc>
+          <w:tcPr>
+            <w:tcW w:type="dxa" w:w="1983"/>
+            <w:tcBorders>
+              <w:top w:val="single" w:color="AAAAAA" w:sz="1"/>
+              <w:left w:val="single" w:color="AAAAAA" w:sz="1"/>
+              <w:bottom w:val="single" w:color="AAAAAA" w:sz="1"/>
+              <w:right w:val="single" w:color="AAAAAA" w:sz="1"/>
+            </w:tcBorders>
+            <w:vAlign w:val="center"/>
+          </w:tcPr>
+          <w:p>
+            <w:pPr>
+              <w:spacing w:after="40" w:before="40"/>
+              <w:jc w:val="left"/>
+            </w:pPr>
+            <w:r>
+              <w:rPr>
+                <w:rFonts w:ascii="맑은 고딕" w:cs="맑은 고딕" w:eastAsia="맑은 고딕" w:hAnsi="맑은 고딕"/>
+                <w:b w:val="false"/>
+                <w:bCs w:val="false"/>
+                <w:color w:val="000000"/>
+                <w:sz w:val="18"/>
+                <w:szCs w:val="18"/>
+              </w:rPr>
+              <w:t xml:space="preserve">약 3,371ms</w:t>
+            </w:r>
+          </w:p>
+        </w:tc>
+        <w:tc>
+          <w:tcPr>
+            <w:tcW w:type="dxa" w:w="1983"/>
+            <w:tcBorders>
+              <w:top w:val="single" w:color="AAAAAA" w:sz="1"/>
+              <w:left w:val="single" w:color="AAAAAA" w:sz="1"/>
+              <w:bottom w:val="single" w:color="AAAAAA" w:sz="1"/>
+              <w:right w:val="single" w:color="AAAAAA" w:sz="1"/>
+            </w:tcBorders>
+            <w:vAlign w:val="center"/>
+          </w:tcPr>
+          <w:p>
+            <w:pPr>
+              <w:spacing w:after="40" w:before="40"/>
+              <w:jc w:val="left"/>
+            </w:pPr>
+            <w:r>
+              <w:rPr>
+                <w:rFonts w:ascii="맑은 고딕" w:cs="맑은 고딕" w:eastAsia="맑은 고딕" w:hAnsi="맑은 고딕"/>
+                <w:b w:val="false"/>
+                <w:bCs w:val="false"/>
+                <w:color w:val="000000"/>
+                <w:sz w:val="18"/>
+                <w:szCs w:val="18"/>
+              </w:rPr>
+              <w:t xml:space="preserve">약 3,542ms</w:t>
             </w:r>
           </w:p>
         </w:tc>
@@ -9898,7 +9898,7 @@
           <w:sz w:val="20"/>
           <w:szCs w:val="20"/>
         </w:rPr>
-        <w:t xml:space="preserve">세 알고리즘의 평균 처리 시간이 모두 약 116~119ms로 거의 동일하다. 스케줄러는 "누구를 먼저 처리할지"만 결정할 뿐 LLM 추론 속도를 바꾸지 못한다. </w:t>
+        <w:t xml:space="preserve">세 알고리즘의 평균 처리 시간이 모두 약 208~209ms로 거의 동일하다. 스케줄러는 "누구를 먼저 처리할지"만 결정할 뿐 LLM 추론 속도를 바꾸지 못한다. </w:t>
       </w:r>
       <w:r>
         <w:rPr>
@@ -9938,7 +9938,7 @@
           <w:sz w:val="20"/>
           <w:szCs w:val="20"/>
         </w:rPr>
-        <w:t xml:space="preserve">는 구독 등급과 요청 우선순위가 독립적임을 드러내기 위해 등급별로 서로 다른 우선순위를 혼합 배정하였다(배정 내역은 부록 표 B.3 참조). 그 결과 Enterprise의 NORMAL 요청이 Premium의 URGENT 요청에 밀려 Enterprise 평균 대기시간은 FCFS 대비 증가하였다(232 → 379ms). 반면 Free의 NORMAL 요청은 Standard의 LOW 요청보다 먼저 처리되어 Free 평균 대기시간은 오히려 감소하였다(2,024 → 1,887ms). </w:t>
+        <w:t xml:space="preserve">는 구독 등급과 요청 우선순위가 독립적임을 드러내기 위해 등급별로 서로 다른 우선순위를 혼합 배정하였다(배정 내역은 부록 표 B.3 참조). 그 결과 Enterprise의 NORMAL 요청이 Premium의 URGENT 요청에 밀려 Enterprise 평균 대기시간은 FCFS 대비 증가하였다(432 → 664ms). 반면 Free의 NORMAL 요청은 Standard의 LOW 요청보다 먼저 처리되어 Free 평균 대기시간은 오히려 감소하였다(3,561 → 3,371ms). </w:t>
       </w:r>
       <w:r>
         <w:rPr>
@@ -12475,16 +12475,46 @@
           <w:sz w:val="20"/>
           <w:szCs w:val="20"/>
         </w:rPr>
-        <w:t xml:space="preserve">실시간 모니터링 대시보드</w:t>
-      </w:r>
-      <w:r>
-        <w:rPr>
-          <w:rFonts w:ascii="맑은 고딕" w:cs="맑은 고딕" w:eastAsia="맑은 고딕" w:hAnsi="맑은 고딕"/>
-          <w:color w:val="000000"/>
-          <w:sz w:val="20"/>
-          <w:szCs w:val="20"/>
-        </w:rPr>
-        <w:t xml:space="preserve">: 현재는 JSON 파일로 사후 분석하는 방식이다. 대기열 상태, 알고리즘별 처리 현황, JFI 변화를 실시간으로 확인할 수 있는 웹 대시보드를 추가하면 관리자의 상태 파악이 직관적이 된다.</w:t>
+        <w:t xml:space="preserve">대시보드 고도화</w:t>
+      </w:r>
+      <w:r>
+        <w:rPr>
+          <w:rFonts w:ascii="맑은 고딕" w:cs="맑은 고딕" w:eastAsia="맑은 고딕" w:hAnsi="맑은 고딕"/>
+          <w:color w:val="000000"/>
+          <w:sz w:val="20"/>
+          <w:szCs w:val="20"/>
+        </w:rPr>
+        <w:t xml:space="preserve">: 현재 대시보드는 주기적 조회(폴링) 방식으로 상태를 갱신한다. WebSocket 기반 푸시 갱신, 사용자 인증, JFI 추이 그래프 등을 추가하면 운영 환경 모니터링 도구로 확장할 수 있다.</w:t>
+      </w:r>
+    </w:p>
+    <w:p>
+      <w:pPr>
+        <w:pStyle w:val="ListParagraph"/>
+        <w:numPr>
+          <w:ilvl w:val="0"/>
+          <w:numId w:val="3"/>
+        </w:numPr>
+        <w:spacing w:after="80" w:line="240"/>
+      </w:pPr>
+      <w:r>
+        <w:rPr>
+          <w:rFonts w:ascii="맑은 고딕" w:cs="맑은 고딕" w:eastAsia="맑은 고딕" w:hAnsi="맑은 고딕"/>
+          <w:b/>
+          <w:bCs/>
+          <w:color w:val="000000"/>
+          <w:sz w:val="20"/>
+          <w:szCs w:val="20"/>
+        </w:rPr>
+        <w:t xml:space="preserve">동일 등급 내 공정성 검증</w:t>
+      </w:r>
+      <w:r>
+        <w:rPr>
+          <w:rFonts w:ascii="맑은 고딕" w:cs="맑은 고딕" w:eastAsia="맑은 고딕" w:hAnsi="맑은 고딕"/>
+          <w:color w:val="000000"/>
+          <w:sz w:val="20"/>
+          <w:szCs w:val="20"/>
+        </w:rPr>
+        <w:t xml:space="preserve">: 본 실험은 등급당 1명씩 배치한 구성이었다 (5.5절). 같은 등급에 여러 사용자가 있을 때의 균등 배분(등급 내 JFI)을 확인하려면 등급당 N명을 동시에 배치한 반복 실험이 필요하다.</w:t>
       </w:r>
     </w:p>
     <w:p>
@@ -15165,7 +15195,7 @@
           <w:sz w:val="20"/>
           <w:szCs w:val="20"/>
         </w:rPr>
-        <w:t xml:space="preserve">t-검정의 귀무가설(Null Hypothesis, "차이가 없다"고 가정하는 기본 전제)은 "FCFS와 MLFQ의 Short 요청 평균 응답시간이 동일하다"이다. 자유도(Degrees of Freedom, 독립적으로 변할 수 있는 값의 수로 표본 수에서 1을 뺀 값)는 5개 시드 표본에서 4가 된다. p 값이 0.001 미만이므로 귀무가설을 기각할 수 있다. Cohen's d = 20.39는 일반적 대효과 기준(0.8)의 25배에 해당하는 값으로, 두 방식의 응답시간 분포가 사실상 겹치지 않음을 뜻한다. 시뮬레이션에서는 같은 요청 집합을 두 알고리즘에 각각 적용하므로 외부 변동이 거의 없어 효과 크기가 이처럼 크게 나타났다. 실제 운영 환경에서는 다양한 변동 요인 때문에 효과 크기가 더 작게 관측될 수 있다. 단, 5개 시드의 제한된 표본이므로 결과 해석에 참고용으로만 사용한다.</w:t>
+        <w:t xml:space="preserve">t-검정의 귀무가설(Null Hypothesis, "차이가 없다"고 가정하는 기본 전제)은 "FCFS와 MLFQ의 Short 요청 평균 응답시간이 동일하다"이다. 자유도(Degrees of Freedom, 독립적으로 변할 수 있는 값의 수로 표본 수에서 1을 뺀 값)는 5개 시드 표본에서 4가 된다. p 값이 0.001 미만이므로 귀무가설을 기각할 수 있다. Cohen's d = 20.39는 일반적 대효과 기준(0.8)을 크게 웃도는 값으로, 두 방식의 응답시간 분포가 사실상 겹치지 않음을 뜻한다. 시뮬레이션에서는 같은 요청 집합을 두 알고리즘에 각각 적용하므로 외부 변동이 거의 없어 효과 크기가 이처럼 크게 나타났으며, 실제 운영 환경에서는 다양한 변동 요인 때문에 효과 크기가 더 작게 관측될 수 있다.</w:t>
       </w:r>
     </w:p>
     <w:p>

</xml_diff>

<commit_message>
Update final report and presentation materials
- Updated the processing time in slide 10 of the presentation to reflect new measurements (from 116ms to 208ms).
- Updated the final report document.
- Updated the presentation slides file.
</commit_message>
<xml_diff>
--- a/06-final-report/final/final-report.docx
+++ b/06-final-report/final/final-report.docx
@@ -6518,7 +6518,7 @@
           <w:sz w:val="20"/>
           <w:szCs w:val="20"/>
         </w:rPr>
-        <w:t xml:space="preserve">Short는 최상위 큐에서 완료되고 Medium·Long은 시간 할당량 초과로 하위 큐로 강등되도록 설계하였다. 버스트(Burst, 짧은 시간에 여러 요청이 동시에 몰리는 상황) 도착 패턴은 대기열에 요청이 쌓인 상태에서 스케줄러가 순서를 결정하도록 유도하기 위해 20건 단위로 동시 투입하는 방식으로 구성하였다. 모든 실험에서 요청은 1건씩 순차 처리된다. 세 실험의 요청을 합산하면 총 3,020건(기본 500 + 선점형 2,500 + 실서버 20)이 된다. JFI 계산 방식의 차이는 5.5절에서 다루며, 대규모 환경은 7.2절 향후 연구 과제로 남긴다.</w:t>
+        <w:t xml:space="preserve">Short는 최상위 큐에서 완료되고 Medium·Long은 시간 할당량 초과로 하위 큐로 강등되도록 설계하였다. 버스트(Burst, 짧은 시간에 여러 요청이 동시에 몰리는 상황) 도착 패턴은 대기열에 요청이 쌓인 상태에서 스케줄러가 순서를 결정하도록 유도하기 위해 20건 단위로 동시 투입하는 방식으로 구성하였다. 모든 실험에서 요청은 1건씩 순차 처리된다. JFI 계산 방식의 차이는 5.5절에서 다루며, 대규모 환경은 7.2절 향후 연구 과제로 남긴다.</w:t>
       </w:r>
     </w:p>
     <w:p>
@@ -8661,7 +8661,7 @@
           <w:sz w:val="20"/>
           <w:szCs w:val="20"/>
         </w:rPr>
-        <w:t xml:space="preserve">시뮬레이션에서 확인한 스케줄링 순서 차이가 실제 LLM 환경에서도 재현되는지 확인하기 위해 Ollama를 활용한 실서버 실험을 수행하였다. 사용 모델은 2026년 4월 공개된 Google Gemma 4 계열의 `gemma4:e4b`(4B 파라미터, Effective 4B, 멀티모달 지원)이며, 로컬 Ollama 서버에서 실행하였다. 출력은 최대 20토큰으로 제한하였다. 총 20건(등급별 5건)을 동시에 큐에 투입한 뒤 FCFS, Priority, WFQ 세 알고리즘을 비교하였다 (비선점형 MLFQ는 5.2절에서 FCFS와 동일함이 확인되어 제외). 전체 결과는 표 10, 구독 등급별 세부는 표 11 및 그림 8에 정리하였다.</w:t>
+        <w:t xml:space="preserve">시뮬레이션에서 확인한 스케줄링 순서 차이가 실제 LLM 환경에서도 재현되는지 확인하기 위해 Ollama를 활용한 실서버 실험을 수행하였다. 사용 모델은 2026년 4월 공개된 Google Gemma 4 계열의 `gemma4:e4b`(Effective 4B 모드, 활성 파라미터 약 4B, 멀티모달 지원)이며, 로컬 Ollama 서버에서 실행하였다. 출력은 최대 20토큰으로 제한하였다. 총 20건(등급별 5건)을 동시에 큐에 투입한 뒤 FCFS, Priority, WFQ 세 알고리즘을 비교하였다 (비선점형 MLFQ는 5.2절에서 FCFS와 동일함이 확인되어 제외). 전체 결과는 표 10, 구독 등급별 세부는 표 11 및 그림 8에 정리하였다.</w:t>
       </w:r>
     </w:p>
     <w:p>
@@ -9958,7 +9958,7 @@
           <w:sz w:val="20"/>
           <w:szCs w:val="20"/>
         </w:rPr>
-        <w:t xml:space="preserve">는 가중치에 따라 Enterprise가 먼저 처리되었다. 요청 수가 적어(등급별 5건) 가중치 차이가 크게 드러나지는 않았지만 시뮬레이션과 동일한 패턴이 나타났다.</w:t>
+        <w:t xml:space="preserve">는 가중치에 따라 Enterprise가 먼저 처리되었다. 요청 수가 적어 등급별 극단적 차이까지는 드러나지 않았지만 시뮬레이션과 동일한 패턴이 나타났다.</w:t>
       </w:r>
     </w:p>
     <w:p>

</xml_diff>

<commit_message>
Add supervisor checklist and unexpected questions response guide for Minji's presentation preparation
- Created a comprehensive checklist for supervisors to assist Minji in her presentation preparation, covering various phases from one week prior to the day of the presentation.
- Developed a guide for handling unexpected questions, providing structured responses to potential inquiries from professors, categorized by topic.
</commit_message>
<xml_diff>
--- a/06-final-report/final/final-report.docx
+++ b/06-final-report/final/final-report.docx
@@ -714,7 +714,7 @@
           <w:sz w:val="20"/>
           <w:szCs w:val="20"/>
         </w:rPr>
-        <w:t xml:space="preserve">: 성능은 평균 대기시간·처리량(req/s), 공정성은 JFI.</w:t>
+        <w:t xml:space="preserve">: 성능은 평균 대기시간과 처리량(req/s, 초당 처리한 요청 수)으로, 공정성은 JFI로 측정한다.</w:t>
       </w:r>
     </w:p>
     <w:p>
@@ -982,7 +982,7 @@
           <w:sz w:val="20"/>
           <w:szCs w:val="20"/>
         </w:rPr>
-        <w:t xml:space="preserve">는 네트워크 라우터에서 한정된 대역폭을 여러 흐름이 공평하게 나누어 쓰도록 만들어진 알고리즘이다 [4]. 본래 목적은 네트워크 트래픽의 QoS(Quality of Service, 서비스 품질 차등 제공) 보장이며, 인터넷 라우터에 널리 쓰인다. 자원을 완벽히 공평하게 나누는 이상적 모델인 GPS(Generalized Processor Sharing)를 비슷하게 만들어 구현하기 위해, 각 요청에 가상 완료 시각(Virtual Finish Time, VFT)을 부여한다. 가상 완료 시각이 가장 작은 요청부터 처리하며, 가중치가 큰 사용자의 VFT는 천천히 증가해 결과적으로 더 자주 선택된다. 가중치 비율에 따라 자원을 비례 배분하므로 사용자별 차등 서비스를 자연스럽게 구현할 수 있다. 또한 처리 중단 없이도 차등이 가능하므로 비선점형 환경에도 적용할 수 있어, Ollama와 같이 추론 중단이 불가능한 LLM 서빙 도구에서도 사용할 수 있다. 단점은 모든 요청에 대해 VFT를 계산하고 정렬해야 하므로 단순 큐보다 연산 비용이 크다는 점이다. 본 프로젝트에서는 구독 등급 기반 차등 서비스를 구현하는 알고리즘으로 사용하며, 구체적 VFT 계산은 4.3절에서 설명한다.</w:t>
+        <w:t xml:space="preserve">는 네트워크 라우터에서 한정된 대역폭을 여러 흐름이 공평하게 나누어 쓰도록 만들어진 알고리즘이다 [4]. 본래 목적은 네트워크 트래픽의 QoS(Quality of Service, 서비스 품질 차등 제공) 보장이며, 인터넷 라우터에 널리 쓰인다. 자원을 완벽히 공평하게 나누는 이상적 모델인 GPS(Generalized Processor Sharing)를 비슷하게 만들어 구현하기 위해, 각 요청에 가상 완료 시각(Virtual Finish Time, VFT)을 부여한다. 가상 완료 시각이 가장 작은 요청부터 처리하며, 가중치가 큰 사용자의 VFT는 천천히 증가해 결과적으로 더 자주 처리된다. 가중치 비율에 따라 자원을 비례 배분하므로 사용자별 차등 서비스를 자연스럽게 구현할 수 있다. 또한 처리 중단 없이도 차등이 가능하므로 비선점형 환경에도 적용할 수 있어, Ollama와 같이 추론 중단이 불가능한 LLM 서빙 도구에서도 사용할 수 있다. 단점은 모든 요청에 대해 VFT를 계산하고 정렬해야 하므로 단순 큐보다 연산 비용이 크다는 점이다. 본 프로젝트에서는 구독 등급 기반 차등 서비스를 구현하는 알고리즘으로 사용하며, 구체적 VFT 계산은 4.3절에서 설명한다.</w:t>
       </w:r>
     </w:p>
     <w:p>
@@ -1012,7 +1012,7 @@
           <w:sz w:val="20"/>
           <w:szCs w:val="20"/>
         </w:rPr>
-        <w:t xml:space="preserve">LLM 서빙은 학습된 모델을 실행해 사용자 요청에 응답을 제공하는 것을 뜻한다. LLM은 이전 토큰(Token, LLM이 한 번에 처리·생성하는 텍스트 조각 단위)을 참고해 다음 토큰을 하나씩 생성하며, 매 토큰마다 GPU 자원이 소비된다. GPU 메모리 용량이 동시 처리 가능한 요청 수의 상한을 결정하므로, 다중 사용자 환경에서는 한정된 GPU 자원을 여러 요청이 경쟁하게 된다. 대표 오픈소스 도구인 vLLM [5]과 Hugging Face TGI(Text Generation Inference) [6]는 여러 요청을 동시 처리하는 연속 배치(Continuous Batching)를 지원해 높은 처리량을 달성한다. 연속 배치는 매 토큰 생성 단계마다 새 요청을 배치에 합류시키는 방식으로, 전체 처리량은 늘리지만 각 요청을 어떤 순서로 끼워 넣을지는 별도 결정이 필요하다. 본 프로젝트 실서버 실험에 사용한 Ollama [10]는 로컬에서 REST API로 LLM을 호출하는 도구로, 한 번에 한 요청씩 순차 처리하고 추론 중단이 불가능하다.</w:t>
+        <w:t xml:space="preserve">LLM 서빙은 학습된 모델을 실행해 사용자 요청에 응답을 제공하는 것을 뜻한다. LLM은 이전 토큰(Token, LLM이 한 번에 처리·생성하는 텍스트 조각 단위)을 참고해 다음 토큰을 하나씩 생성하며, 매 토큰마다 GPU 자원이 소비된다. GPU 메모리 용량이 동시에 처리할 수 있는 요청 수를 정하므로, 다중 사용자 환경에서는 한정된 GPU 자원을 여러 요청이 경쟁하게 된다. 대표 오픈소스 도구인 vLLM [5]과 Hugging Face TGI(Text Generation Inference) [6]는 여러 요청을 동시 처리하는 연속 배치(Continuous Batching)를 지원해 높은 처리량을 달성한다. 연속 배치는 매 토큰 생성 단계마다 새 요청을 배치에 합류시키는 방식으로, 전체 처리량은 늘리지만 각 요청을 어떤 순서로 끼워 넣을지는 별도 결정이 필요하다. 본 프로젝트 실서버 실험에 사용한 Ollama [10]는 로컬에서 REST API로 LLM을 호출하는 도구로, 한 번에 한 요청씩 순차 처리하고 추론 중단이 불가능하다.</w:t>
       </w:r>
     </w:p>
     <w:p>
@@ -1087,7 +1087,7 @@
           <w:sz w:val="20"/>
           <w:szCs w:val="20"/>
         </w:rPr>
-        <w:t xml:space="preserve">xi는 사용자 i의 자원량, n은 사용자 수이다. 모두 동일 배분이면 1, 한 명이 독점하면 1/n에 가까워진다(예: 4명 중 한 명 독점 시 0.25). 스케줄링 맥락에서는 xi로 사용자별 대기시간(값이 작을수록 좋음)이나 처리 건수(값이 클수록 좋음) 등을 대입하여 공정성을 측정하며, 본 프로젝트에서도 실험 목적에 따라 두 기준을 구분해 사용하였다 (5.5절). 공정성 지표에는 JFI 외에 최대-최소 공정성(Max-Min Fairness, 가장 불리한 사용자의 몫을 극대화하는 기준)이나 비례 공정성(Proportional Fairness, 각 사용자의 만족도를 종합적으로 높이는 기준) 등이 있다 [4]. 본 프로젝트에서는 계산이 간단하고 단일 수치로 비교가 용이한 JFI를 선택하였다. 다만 WFQ처럼 가중치 기반으로 의도적 차등을 두는 경우에는 단순 처리 건수로 JFI를 계산하면 "가중치대로 처리되었는가"를 판단할 수 없으므로, xi에 "처리 건수 ÷ 가중치"를 대입해 정규화한 JFI를 사용한다. 본 프로젝트에서도 WFQ에는 이 정규화 방식을 적용하였다 (5.5절).</w:t>
+        <w:t xml:space="preserve">xi는 사용자 i의 자원량, n은 사용자 수이다. 모두 동일 배분이면 1, 한 명이 독점하면 1/n에 가까워진다(예: 4명 중 한 명 독점 시 0.25). 스케줄링 맥락에서는 xi 자리에 사용자별 대기시간(값이 작을수록 좋음)이나 처리 건수(값이 클수록 좋음) 같은 값을 넣어 공정성을 측정한다. 본 프로젝트에서도 실험 목적에 따라 두 기준을 구분해 사용하였다 (5.5절). 공정성 지표에는 JFI 외에 최대-최소 공정성(Max-Min Fairness, 가장 불리한 사용자의 몫을 극대화하는 기준)이나 비례 공정성(Proportional Fairness, 각 사용자의 만족도를 종합적으로 높이는 기준) 등이 있다 [4]. 본 프로젝트에서는 계산이 간단하고 단일 수치로 비교가 용이한 JFI를 선택하였다. 다만 WFQ처럼 가중치로 일부러 차이를 두는 방식에서는 단순 처리 건수로 JFI를 계산하면 "가중치대로 처리되었는가"를 판단할 수 없다. 그래서 xi 자리에 "처리 건수 ÷ 가중치"를 넣어 계산한 정규화(가중치 차이를 상쇄해 비교 기준을 맞추는 것) JFI를 사용하며, 본 프로젝트에서도 WFQ에는 이 방식을 적용하였다 (5.5절).</w:t>
       </w:r>
     </w:p>
     <w:p>
@@ -1887,7 +1887,7 @@
           <w:sz w:val="20"/>
           <w:szCs w:val="20"/>
         </w:rPr>
-        <w:t xml:space="preserve">은 Express.js [8] 기반 HTTP 서버로 요청 접수·스케줄러 전환·통계 조회를 제공하며, 요청 객체를 생성해 Rate Limiter를 거쳐 스케줄러에 전달한다. </w:t>
+        <w:t xml:space="preserve">은 Express.js [8] 기반 HTTP 서버로, 요청을 받고 스케줄러를 전환하며 통계를 조회하는 역할을 한다. 도착한 요청은 객체로 만든 뒤 Rate Limiter를 거쳐 스케줄러에 전달된다. </w:t>
       </w:r>
       <w:r>
         <w:rPr>
@@ -2651,7 +2651,7 @@
           <w:sz w:val="20"/>
           <w:szCs w:val="20"/>
         </w:rPr>
-        <w:t xml:space="preserve">: 구독 등급 가중치(Enterprise 100, Premium 50, Standard 10, Free 1)를 VFT 계산에 반영. 가중치는 Free를 기준으로 10배·50배·100배 차이를 두도록 실험 목적에 따라 임의 설정하였다.</w:t>
+        <w:t xml:space="preserve">: 구독 등급 가중치(Enterprise 100, Premium 50, Standard 10, Free 1)를 VFT 계산에 반영. 가중치 값은 Free를 기준으로 10배·50배·100배 차이를 두도록 실험을 위해 직접 정하였다.</w:t>
       </w:r>
     </w:p>
     <w:p>
@@ -4677,7 +4677,7 @@
           <w:sz w:val="20"/>
           <w:szCs w:val="20"/>
         </w:rPr>
-        <w:t xml:space="preserve">실험은 기본 실험, MLFQ 선점형 실험, 실서버 실험 세 가지로 구분되며, 전체 구조는 그림 5, 실험별 주요 설정은 표 5와 같다. 앞의 두 실험은 시간 기반 시뮬레이션, 실서버 실험은 Ollama를 활용한 실제 LLM 호출로 수행하였다. 시뮬레이션은 요청에 처리 시간을 미리 지정한 후 스케줄러가 결정한 순서대로 한 건씩 순차 처리하는 방식으로, 네트워크 지연이나 LLM 상태 변동 없이 알고리즘 자체의 특성만 비교할 수 있다. 반복 실험에는 고정 시드(Seed, 난수 생성의 초기값이며 같은 시드로 실행하면 같은 요청 패턴을 재현할 수 있다)를 사용해 결과 재현성을 확보하였다.</w:t>
+        <w:t xml:space="preserve">실험은 기본 실험, MLFQ 선점형 실험, 실서버 실험 세 가지로 구분되며, 전체 구조는 그림 5, 실험별 주요 설정은 표 5와 같다. 앞의 두 실험은 시간 기반 시뮬레이션, 실서버 실험은 Ollama를 활용한 실제 LLM 호출로 수행하였다. 시뮬레이션은 요청에 처리 시간을 미리 지정한 뒤 스케줄러가 결정한 순서대로 한 건씩 처리하는 방식이다. 네트워크 지연이나 LLM 상태 변동이 없으므로 알고리즘 자체의 특성만 비교할 수 있다. 반복 실험에는 고정 시드(Seed, 난수 생성의 초기값이며 같은 시드로 실행하면 같은 요청 패턴을 다시 만들 수 있다)를 사용해 같은 결과를 다시 얻을 수 있도록 하였다.</w:t>
       </w:r>
     </w:p>
     <w:p>
@@ -7294,7 +7294,7 @@
           <w:sz w:val="20"/>
           <w:szCs w:val="20"/>
         </w:rPr>
-        <w:t xml:space="preserve">는 도착 순서대로 처리되어 4명이 대기시간을 고르게 부담하였다 (JFI = 1.000). </w:t>
+        <w:t xml:space="preserve">는 도착 순서대로 처리되어 네 명이 대기시간을 고르게 부담하였다 (JFI = 1.000). </w:t>
       </w:r>
       <w:r>
         <w:rPr>
@@ -7314,7 +7314,7 @@
           <w:sz w:val="20"/>
           <w:szCs w:val="20"/>
         </w:rPr>
-        <w:t xml:space="preserve">는 순서가 바뀌었으나 전체 평균은 FCFS와 거의 같은 수준이었다(약 216ms 차이). 우선순위 큐의 삽입·추출 연산이 단순 FIFO보다 약간 무거워 발생한 미세 차이로 해석되며, 처리 시간이 짧아(10~100ms) 에이징이 작동하기 전에 처리가 끝나 우선순위 효과 자체는 거의 드러나지 않았다. </w:t>
+        <w:t xml:space="preserve">는 처리 순서가 바뀌었으나 전체 평균은 FCFS와 거의 같은 수준이었다(약 216ms 차이). 우선순위 큐가 단순 FIFO보다 넣고 빼는 계산이 조금 더 필요해 생긴 작은 차이로 볼 수 있다. 또한 처리 시간이 짧아(10~100ms) 에이징이 작동하기 전에 처리가 끝나 우선순위 효과 자체는 거의 드러나지 않았다. </w:t>
       </w:r>
       <w:r>
         <w:rPr>
@@ -7334,7 +7334,7 @@
           <w:sz w:val="20"/>
           <w:szCs w:val="20"/>
         </w:rPr>
-        <w:t xml:space="preserve">은 FCFS와 동일한 결과였다. 모든 요청이 Q0 할당량(1,000ms) 안에 완료되어 강등이 일어나지 않았고, 비선점형 특성상 요청이 도착 순서대로 처리되었다. 이론적 효과 확인을 위해 5.3절의 선점형 실험을 추가하였다. </w:t>
+        <w:t xml:space="preserve">은 FCFS와 동일한 결과였다. 모든 요청이 Q0 할당량(1,000ms) 안에 완료되어 하위 큐로 내려가는 일이 없었고, 비선점형 특성상 요청이 도착 순서대로 처리되었다. 이론적 효과 확인을 위해 5.3절의 선점형 실험을 추가하였다. </w:t>
       </w:r>
       <w:r>
         <w:rPr>
@@ -8661,7 +8661,7 @@
           <w:sz w:val="20"/>
           <w:szCs w:val="20"/>
         </w:rPr>
-        <w:t xml:space="preserve">시뮬레이션에서 확인한 스케줄링 순서 차이가 실제 LLM 환경에서도 재현되는지 확인하기 위해 Ollama를 활용한 실서버 실험을 수행하였다. 사용 모델은 2026년 4월 공개된 Google Gemma 4 계열의 `gemma4:e4b`(Effective 4B 모드, 활성 파라미터 약 4B, 멀티모달 지원)이며, 로컬 Ollama 서버에서 실행하였다. 출력은 최대 20토큰으로 제한하였다. 총 20건(등급별 5건)을 동시에 큐에 투입한 뒤 FCFS, Priority, WFQ 세 알고리즘을 비교하였다 (비선점형 MLFQ는 5.2절에서 FCFS와 동일함이 확인되어 제외). 전체 결과는 표 10, 구독 등급별 세부는 표 11 및 그림 8에 정리하였다.</w:t>
+        <w:t xml:space="preserve">시뮬레이션에서 확인한 스케줄링 순서 차이가 실제 LLM 환경에서도 재현되는지 확인하기 위해 Ollama를 활용한 실서버 실험을 수행하였다. 사용 모델은 2026년 4월 공개된 Google Gemma 4 계열의 `gemma4:e4b`이며, 약 40억 개 파라미터(Parameter, 모델이 학습해 가진 가중치 값)를 사용하는 중형 모델로 로컬 Ollama 서버에서 실행하였다. 출력은 최대 20토큰으로 제한하였다. 총 20건(등급별 5건)을 동시에 큐에 투입한 뒤 FCFS, Priority, WFQ 세 알고리즘을 비교하였다 (비선점형 MLFQ는 5.2절에서 FCFS와 동일함이 확인되어 제외). 전체 결과는 표 10, 구독 등급별 세부는 표 11 및 그림 8에 정리하였다.</w:t>
       </w:r>
     </w:p>
     <w:p>
@@ -12484,7 +12484,7 @@
           <w:sz w:val="20"/>
           <w:szCs w:val="20"/>
         </w:rPr>
-        <w:t xml:space="preserve">: 현재 대시보드는 주기적 조회(폴링) 방식으로 상태를 갱신한다. WebSocket 기반 푸시 갱신, 사용자 인증, JFI 추이 그래프 등을 추가하면 운영 환경 모니터링 도구로 확장할 수 있다.</w:t>
+        <w:t xml:space="preserve">: 현재 대시보드는 주기적 조회(폴링) 방식으로 상태를 갱신한다. WebSocket(서버가 클라이언트에 실시간으로 알림을 보낼 수 있는 웹 통신 방식) 기반 푸시 갱신, 사용자 인증, JFI 추이 그래프 등을 추가하면 운영 환경 모니터링 도구로 확장할 수 있다.</w:t>
       </w:r>
     </w:p>
     <w:p>
@@ -13813,7 +13813,7 @@
                 <w:sz w:val="18"/>
                 <w:szCs w:val="18"/>
               </w:rPr>
-              <w:t xml:space="preserve">시드별 개선율 재현성 검증 (부록 B)</w:t>
+              <w:t xml:space="preserve">시드별 개선율 재현 확인 (부록 B)</w:t>
             </w:r>
           </w:p>
         </w:tc>
@@ -15195,7 +15195,7 @@
           <w:sz w:val="20"/>
           <w:szCs w:val="20"/>
         </w:rPr>
-        <w:t xml:space="preserve">t-검정의 귀무가설(Null Hypothesis, "차이가 없다"고 가정하는 기본 전제)은 "FCFS와 MLFQ의 Short 요청 평균 응답시간이 동일하다"이다. 자유도(Degrees of Freedom, 독립적으로 변할 수 있는 값의 수로 표본 수에서 1을 뺀 값)는 5개 시드 표본에서 4가 된다. p 값이 0.001 미만이므로 귀무가설을 기각할 수 있다. Cohen's d = 20.39는 일반적 대효과 기준(0.8)을 크게 웃도는 값으로, 두 방식의 응답시간 분포가 사실상 겹치지 않음을 뜻한다. 시뮬레이션에서는 같은 요청 집합을 두 알고리즘에 각각 적용하므로 외부 변동이 거의 없어 효과 크기가 이처럼 크게 나타났으며, 실제 운영 환경에서는 다양한 변동 요인 때문에 효과 크기가 더 작게 관측될 수 있다.</w:t>
+        <w:t xml:space="preserve">t-검정의 귀무가설(Null Hypothesis, "차이가 없다"고 가정하는 기본 전제)은 "FCFS와 MLFQ의 Short 요청 평균 응답시간이 같다"이다. 자유도(Degrees of Freedom, 독립적으로 변할 수 있는 값의 수로 표본 수에서 1을 뺀 값)는 5개 시드 표본에서 4가 된다. p 값이 0.001 미만이므로, 즉 두 방식의 평균 응답시간이 실제로 다르다고 볼 수 있다. Cohen's d = 20.39는 통상 "큰 효과"의 기준인 0.8을 크게 넘어서는 값으로, 두 방식의 응답시간이 거의 겹치지 않을 만큼 뚜렷한 차이를 보인다는 뜻이다. 시뮬레이션에서는 같은 요청 집합을 두 알고리즘에 각각 적용하므로 네트워크 지연 같은 외부 요인이 거의 없어 효과 크기가 이처럼 크게 나타났으며, 실제 운영 환경에서는 다양한 변동 요인 때문에 효과 크기가 더 작게 나타날 수 있다.</w:t>
       </w:r>
     </w:p>
     <w:p>
@@ -15211,16 +15211,16 @@
           <w:sz w:val="20"/>
           <w:szCs w:val="20"/>
         </w:rPr>
-        <w:t xml:space="preserve">부스팅 트리거 차이</w:t>
-      </w:r>
-      <w:r>
-        <w:rPr>
-          <w:rFonts w:ascii="맑은 고딕" w:cs="맑은 고딕" w:eastAsia="맑은 고딕" w:hAnsi="맑은 고딕"/>
-          <w:color w:val="000000"/>
-          <w:sz w:val="20"/>
-          <w:szCs w:val="20"/>
-        </w:rPr>
-        <w:t xml:space="preserve">: 기본 실험(run-extended.js)은 "30건 처리마다", 선점형 실험(run-multi-seed.js)은 "5,000ms마다"이다. 기본 실험은 모든 요청이 Q0 안에서 완료되어 영향이 없다.</w:t>
+        <w:t xml:space="preserve">부스팅이 작동하는 기준 차이</w:t>
+      </w:r>
+      <w:r>
+        <w:rPr>
+          <w:rFonts w:ascii="맑은 고딕" w:cs="맑은 고딕" w:eastAsia="맑은 고딕" w:hAnsi="맑은 고딕"/>
+          <w:color w:val="000000"/>
+          <w:sz w:val="20"/>
+          <w:szCs w:val="20"/>
+        </w:rPr>
+        <w:t xml:space="preserve">: 기본 실험(run-extended.js)은 "30건 처리마다", 선점형 실험(run-multi-seed.js)은 "5,000ms마다"이다. 기본 실험은 모든 요청이 Q0 안에서 완료되므로 부스팅이 실제로 적용되는 일은 없다.</w:t>
       </w:r>
     </w:p>
     <w:p>
@@ -15245,7 +15245,7 @@
           <w:sz w:val="20"/>
           <w:szCs w:val="20"/>
         </w:rPr>
-        <w:t xml:space="preserve">: 이 표의 개선율은 LLM 추론을 임의 시점에 중단·재개할 수 있다고 가정했을 때의 이론적 상한이며, 실서버에서는 비선점형 MLFQ만 적용 가능하다 (6.1절).</w:t>
+        <w:t xml:space="preserve">: 이 표의 개선율은 LLM 추론을 원하는 때에 멈추고 다시 시작할 수 있다고 가정했을 때, 이론적으로 얻을 수 있는 최대 개선폭이다. 실서버에서는 비선점형 MLFQ만 적용할 수 있다 (6.1절).</w:t>
       </w:r>
     </w:p>
     <w:p>
@@ -16187,7 +16187,7 @@
           <w:sz w:val="20"/>
           <w:szCs w:val="20"/>
         </w:rPr>
-        <w:t xml:space="preserve">상위 등급일수록 URGENT·HIGH 비율을 높이되, 모든 등급에 여러 우선순위가 섞이도록 배정하였다. 이렇게 한 이유는 구독 등급과 요청 우선순위가 독립적인 두 축임을 실험으로 보이기 위해서이다. 이 배정에 따라 Priority 스케줄러에서는 Enterprise의 NORMAL 요청이 Premium의 URGENT 요청보다 뒤로 밀리고, Free의 NORMAL 요청이 Standard의 LOW 요청보다 앞당겨지는 현상이 5.4절에서 관찰되었다.</w:t>
+        <w:t xml:space="preserve">상위 등급일수록 URGENT·HIGH 비율을 높이되, 모든 등급에 여러 우선순위가 섞이도록 배정하였다. 이렇게 한 이유는 구독 등급과 요청 우선순위가 서로 상관없는 두 기준임을 실험으로 확인하기 위해서이다. 이 배정에 따라 Priority 스케줄러에서는 Enterprise의 NORMAL 요청이 Premium의 URGENT 요청보다 뒤로 밀리고, Free의 NORMAL 요청이 Standard의 LOW 요청보다 앞당겨지는 현상이 5.4절에서 확인되었다.</w:t>
       </w:r>
     </w:p>
     <w:sectPr>

</xml_diff>

<commit_message>
Update final report and manifest files; add new PDF report and modify existing DOCX report. Adjust timestamps and verification status in manifest.yaml. Update file sizes and checksums for various source code and experiment scripts.
</commit_message>
<xml_diff>
--- a/06-final-report/final/final-report.docx
+++ b/06-final-report/final/final-report.docx
@@ -714,7 +714,7 @@
           <w:sz w:val="20"/>
           <w:szCs w:val="20"/>
         </w:rPr>
-        <w:t xml:space="preserve">: 성능은 평균 대기시간과 처리량(req/s, 초당 처리한 요청 수)으로, 공정성은 JFI로 측정한다.</w:t>
+        <w:t xml:space="preserve">: 성능에는 평균 대기시간과 처리량(req/s, 초당 처리한 요청 수)을, 공정성에는 JFI를 사용한다.</w:t>
       </w:r>
     </w:p>
     <w:p>
@@ -2993,7 +2993,7 @@
           <w:sz w:val="20"/>
           <w:szCs w:val="20"/>
         </w:rPr>
-        <w:t xml:space="preserve">소스 코드는 핵심 모듈과 보조 요소로 구성된다 (그림 4). 핵심 모듈은 api(REST 라우터), schedulers(4개 알고리즘), queue(메모리 대기열), storage(JSON 기록), llm(Ollama 호출)이다. 보조 요소로는 index.js(메인 진입점), server.js(Express 서버 구성 모듈), rate-limiter가 있다. `npm start` 실행 시 index.js가 server.js의 `createServer()`를 호출하여 Express 서버를 기동한다.</w:t>
+        <w:t xml:space="preserve">소스 코드는 핵심 모듈과 보조 요소로 구성된다 (그림 4). 핵심 모듈은 api(REST 라우터), schedulers(4개 알고리즘), queue(메모리 대기열), storage(JSON 기록), llm(Ollama 호출)이다. 보조 요소로는 index.js(메인 진입점), server.js(Express 서버 구성 모듈), rate-limiter가 있다. `npm start` 실행 시 index.js가 server.js의 `createServer()`를 호출하여 Express 서버를 시작한다.</w:t>
       </w:r>
     </w:p>
     <w:p>
@@ -4764,7 +4764,7 @@
           <w:sz w:val="20"/>
           <w:szCs w:val="20"/>
         </w:rPr>
-        <w:t xml:space="preserve">스케줄러 4종과 Rate Limiter를 모두 구현하여 동작을 확인하였고, 스케줄러별 단위 테스트를 작성·통과시켰다. 환경변수(`SCHEDULER_TYPE`)로 알고리즘을 즉시 전환할 수 있으며, 대기열 상태와 처리 통계를 브라우저에서 확인할 수 있는 웹 대시보드(`public/dashboard.html`)를 함께 구성하여 동일 요청에 대한 알고리즘별 처리 순서를 시각적으로 비교할 수 있도록 하였다.</w:t>
+        <w:t xml:space="preserve">스케줄러 4종과 Rate Limiter를 모두 구현하여 동작을 확인하였고, 스케줄러별 단위 테스트를 작성·통과시켰다. 환경변수(`SCHEDULER_TYPE`)로 알고리즘을 즉시 전환할 수 있다. 또한 대기열 상태와 처리 통계를 브라우저에서 확인할 수 있는 웹 대시보드(`public/dashboard.html`)를 함께 구성하여, 동일 요청에 대한 알고리즘별 처리 순서를 시각적으로 비교할 수 있도록 하였다.</w:t>
       </w:r>
     </w:p>
     <w:p>
@@ -6656,7 +6656,7 @@
           <w:sz w:val="20"/>
           <w:szCs w:val="20"/>
         </w:rPr>
-        <w:t xml:space="preserve">Short는 최상위 큐에서 완료되고 Medium·Long은 시간 할당량 초과로 하위 큐로 강등되도록 설계하였다. 버스트(Burst, 짧은 시간에 여러 요청이 동시에 몰리는 상황) 도착 패턴은 대기열에 요청이 쌓인 상태에서 스케줄러가 순서를 결정하도록 유도하기 위해 20건 단위로 동시 투입하는 방식으로 구성하였다. 모든 실험에서 요청은 1건씩 순차 처리된다. JFI 계산 방식의 차이는 5.5절에서 다루며, 대규모 환경은 7.2절 향후 연구 과제로 남긴다.</w:t>
+        <w:t xml:space="preserve">Short는 최상위 큐에서 완료되고 Medium·Long은 시간 할당량 초과로 하위 큐로 강등되도록 설계하였다. 버스트(Burst, 짧은 시간에 여러 요청이 동시에 몰리는 상황) 도착 패턴은 대기열에 요청이 쌓인 상태에서 스케줄러가 순서를 결정하도록 유도한다. 본 실험에서는 이를 위해 20건씩 동시에 투입하는 방식으로 구성하였다. 모든 실험에서 요청은 1건씩 순차 처리된다. JFI 계산 방식의 차이는 5.5절에서 다루며, 대규모 환경은 7.2절 향후 연구 과제로 남긴다.</w:t>
       </w:r>
     </w:p>
     <w:p>
@@ -12346,7 +12346,7 @@
           <w:sz w:val="20"/>
           <w:szCs w:val="20"/>
         </w:rPr>
-        <w:t xml:space="preserve">: 짧은 요청 우대 효과가 뛰어나지만 선점형이 필요해 현재 LLM 서빙 환경에서의 효용은 제한적이다. 향후 LLM 서빙에 중단·재개 기능이 추가된다면 활용 가능성이 있다.</w:t>
+        <w:t xml:space="preserve">: 짧은 요청 우대 효과가 뛰어나지만 선점형이 필요해 현재 LLM 서빙 환경에서는 활용 범위가 좁다. 향후 LLM 서빙에 중단·재개 기능이 추가된다면 활용 가능성이 있다.</w:t>
       </w:r>
     </w:p>
     <w:p>
@@ -12507,7 +12507,7 @@
           <w:sz w:val="20"/>
           <w:szCs w:val="20"/>
         </w:rPr>
-        <w:t xml:space="preserve">: 비선점형 환경에서 네 알고리즘의 전체 처리량은 유사하였다. 스케줄러는 순서만 결정할 뿐 처리 속도 자체를 바꾸지 못하기 때문이다. 선점형 MLFQ에서는 짧은 요청 응답시간이 약 73% 감소, 긴 요청은 약 89% 증가하였다. 개선 효과는 5개 시드에서 71.8~74.3% 범위로 일관되게 재현되었다 (시드별 세부는 부록 B). WFQ에서는 Enterprise의 평균 대기시간이 Free의 약 1/12 수준으로 나타났다.</w:t>
+        <w:t xml:space="preserve">: 비선점형 환경에서 네 알고리즘의 전체 처리량은 거의 같았다. 스케줄러는 순서만 결정할 뿐 처리 속도 자체를 바꾸지 못하기 때문이다. 선점형 MLFQ에서는 짧은 요청 응답시간이 약 73% 감소, 긴 요청은 약 89% 증가하였다. 개선 효과는 5개 시드에서 71.8~74.3% 범위로 일관되게 재현되었다 (시드별 세부는 부록 B). WFQ에서는 Enterprise의 평균 대기시간이 Free의 약 1/12 수준으로 나타났다.</w:t>
       </w:r>
     </w:p>
     <w:p>

</xml_diff>

<commit_message>
Add submission checklist and update manifest with new snapshot details
- Created a new submission checklist markdown file to ensure all submission requirements are met before final submission.
- Updated the manifest.yaml file with the latest generated timestamp and previous snapshot reference.
- Updated the final report document with new binary changes.
</commit_message>
<xml_diff>
--- a/06-final-report/final/final-report.docx
+++ b/06-final-report/final/final-report.docx
@@ -1887,7 +1887,7 @@
           <w:sz w:val="20"/>
           <w:szCs w:val="20"/>
         </w:rPr>
-        <w:t xml:space="preserve">은 Express.js [8] 기반 HTTP 서버로, 요청을 받고 스케줄러를 전환하며 통계를 조회하는 역할을 한다. 도착한 요청은 객체로 만든 뒤 Rate Limiter를 거쳐 스케줄러에 전달된다. </w:t>
+        <w:t xml:space="preserve">은 Express.js [8] 기반 HTTP 서버로, 요청을 받고 스케줄러를 전환하며 통계를 제공하는 역할을 한다. 도착한 요청은 객체로 만든 뒤 Rate Limiter를 거쳐 스케줄러에 전달된다. </w:t>
       </w:r>
       <w:r>
         <w:rPr>
@@ -15333,7 +15333,7 @@
           <w:sz w:val="20"/>
           <w:szCs w:val="20"/>
         </w:rPr>
-        <w:t xml:space="preserve">t-검정의 귀무가설(Null Hypothesis, "차이가 없다"고 가정하는 기본 전제)은 "FCFS와 MLFQ의 Short 요청 평균 응답시간이 같다"이다. 자유도(Degrees of Freedom, 독립적으로 변할 수 있는 값의 수로 표본 수에서 1을 뺀 값)는 5개 시드 표본에서 4가 된다. p 값이 0.001 미만이므로, 즉 두 방식의 평균 응답시간이 실제로 다르다고 볼 수 있다. Cohen's d = 20.39는 통상 "큰 효과"의 기준인 0.8을 크게 넘어서는 값으로, 두 방식의 응답시간이 거의 겹치지 않을 만큼 뚜렷한 차이를 보인다는 뜻이다. 시뮬레이션에서는 같은 요청 집합을 두 알고리즘에 각각 적용하므로 네트워크 지연 같은 외부 요인이 거의 없어 효과 크기가 이처럼 크게 나타났으며, 실제 운영 환경에서는 다양한 변동 요인 때문에 효과 크기가 더 작게 나타날 수 있다.</w:t>
+        <w:t xml:space="preserve">t-검정의 귀무가설(Null Hypothesis, "차이가 없다"고 가정하는 기본 전제)은 "FCFS와 MLFQ의 Short 요청 평균 응답시간이 같다"이다. 자유도(Degrees of Freedom, 독립적으로 변할 수 있는 값의 수로 표본 수에서 1을 뺀 값)는 5개 시드 표본에서 4가 된다. p 값이 0.001 미만이므로 두 방식의 평균 응답시간이 실제로 다르다고 볼 수 있다. Cohen's d = 20.39는 통상 "큰 효과"의 기준인 0.8을 크게 넘어서는 값으로, 두 방식의 응답시간이 거의 겹치지 않을 만큼 뚜렷한 차이를 보인다는 뜻이다. 시뮬레이션에서는 같은 요청 집합을 두 알고리즘에 각각 적용하므로 네트워크 지연 같은 외부 요인이 거의 없어 효과 크기가 이처럼 크게 나타났으며, 실제 운영 환경에서는 다양한 변동 요인 때문에 효과 크기가 더 작게 나타날 수 있다.</w:t>
       </w:r>
     </w:p>
     <w:p>

</xml_diff>

<commit_message>
Add submission checklist and update manifest with new file details
- Created a new submission checklist markdown file to ensure all submission requirements are met before final submission.
- Updated the manifest.yaml to reflect the latest generated timestamp and file details, including sizes and checksums for various documents and source code files.
- Updated the final report document with new content.
</commit_message>
<xml_diff>
--- a/06-final-report/final/final-report.docx
+++ b/06-final-report/final/final-report.docx
@@ -474,7 +474,7 @@
           <w:sz w:val="20"/>
           <w:szCs w:val="20"/>
         </w:rPr>
-        <w:t xml:space="preserve">ChatGPT, Claude, Gemini 등 대규모 언어 모델(Large Language Model, LLM) 서비스는 주로 API(Application Programming Interface) 형태로 제공된다. 기업이나 연구실에서는 조직 계정 하나를 여러 구성원이 공유하거나 자체 LLM 서버를 운영하는 사례가 늘고 있다.</w:t>
+        <w:t xml:space="preserve">ChatGPT, Claude, Gemini 등 대규모 언어 모델(Large Language Model, LLM) 서비스는 주로 API(Application Programming Interface) 형태로 제공된다. 개별 사용자가 직접 가입해 쓰기도 하지만, 기업이나 연구실에서는 조직 계정 하나를 여러 구성원이 공유하거나 자체 LLM 서버를 운영하는 사례가 늘고 있다.</w:t>
       </w:r>
     </w:p>
     <w:p>
@@ -488,7 +488,7 @@
           <w:sz w:val="20"/>
           <w:szCs w:val="20"/>
         </w:rPr>
-        <w:t xml:space="preserve">다중 사용자 환경에서는 요청을 어떻게 관리할지가 문제이다. OpenAI는 조직(Organization) 단위로 분당 요청 수·토큰 수 한도를 두고 [1], Anthropic은 사용 등급별 호출 한도를 적용한다 [2]. 이 한도가 조직 단위로 적용되므로, 구성원들이 한정된 호출 한도를 어떻게 나누어 쓸지는 별도로 관리해야 한다. 자체 LLM 서버도 동시 처리 수가 제한되어 같은 문제가 발생한다. 별도 관리 기능이 없으면 도착 순서대로 처리하거나 단순한 호출 횟수 제한만 거는 수준에 그친다. 이 경우 긴급한 요청이 뒤로 밀리고, 사용자별 차등 배분도 어렵다.</w:t>
+        <w:t xml:space="preserve">다중 사용자 환경에서는 요청을 어떻게 관리할지가 문제이다. OpenAI는 조직(Organization) 단위로 분당 요청 수·토큰 수 한도를 두고 [1], Anthropic은 사용 등급별 호출 한도를 적용한다 [2]. 한도는 조직 단위로 묶여 있으므로, 구성원끼리 그것을 어떻게 나누어 쓸지는 운영자가 따로 정해야 한다. 자체 LLM 서버도 동시 처리 수가 제한되어 같은 문제가 생긴다. 별도 관리 기능이 없으면 도착 순서대로 처리하거나 호출 횟수만 제한하는 수준에 머무른다. 그러면 긴급한 요청이 뒤로 밀리고, 사용자별 차등 배분도 어려워진다.</w:t>
       </w:r>
     </w:p>
     <w:p>
@@ -779,7 +779,7 @@
           <w:sz w:val="20"/>
           <w:szCs w:val="20"/>
         </w:rPr>
-        <w:t xml:space="preserve">이 장에서는 본 프로젝트에서 활용한 스케줄링 알고리즘의 이론적 배경, 기존 LLM 서빙 도구의 현황, 그리고 공정성 측정 방법을 살펴본다.</w:t>
+        <w:t xml:space="preserve">이 장에서 다루는 내용은 세 가지이다. 본 프로젝트에서 사용한 스케줄링 알고리즘의 이론, 기존 LLM 서빙 도구의 동작 방식, 그리고 자원 배분의 공정성을 측정하는 방법이다.</w:t>
       </w:r>
     </w:p>
     <w:p>
@@ -907,7 +907,7 @@
           <w:sz w:val="20"/>
           <w:szCs w:val="20"/>
         </w:rPr>
-        <w:t xml:space="preserve">는 도착 순서대로 처리하는 가장 단순한 스케줄링 방식이며, 운영체제의 일괄 처리 시대부터 사용된 고전 기법이다. 새 요청이 도착하면 대기열의 맨 뒤에 추가되고, 처리는 항상 맨 앞 요청부터 시작된다. 한 요청이 처리되는 동안 다른 요청은 끼어들 수 없으며 비선점형으로만 동작한다. 구현이 매우 쉽고 별도 자료구조도 필요하지 않다. 모든 요청이 결국 처리되므로 기아(Starvation, 특정 요청이 영원히 처리되지 못하는 현상)가 발생하지 않는다. 다만 긴 요청이 앞에 있으면 뒤의 짧은 요청들이 모두 지연되는 호위 효과(Convoy Effect)가 발생한다 [3]. 또한 우선순위나 등급을 고려하지 않아 긴급 요청을 빠르게 처리할 수 없다. 본 프로젝트에서는 다른 알고리즘과 비교하기 위한 기준선으로 사용한다.</w:t>
+        <w:t xml:space="preserve">는 도착 순서대로 처리하는 가장 단순한 스케줄링 방식이며, 운영체제의 일괄 처리 시대부터 사용된 고전 기법이다. 새 요청이 도착하면 대기열의 맨 뒤에 추가되고, 처리는 항상 맨 앞 요청부터 시작된다. 한 요청이 처리되는 동안 다른 요청은 끼어들 수 없으며 비선점형으로만 동작한다. 구현이 매우 쉽고 별도 자료구조도 필요 없다. 어느 요청이든 차례가 오기 마련이므로 기아(Starvation, 특정 요청이 영원히 처리되지 못하는 현상)는 일어나지 않는다. 다만 긴 요청이 앞에 있으면 뒤에 있는 짧은 요청들이 모두 지연되는 호위 효과(Convoy Effect)가 생긴다 [3]. 우선순위나 등급은 고려하지 않으므로 긴급 요청을 따로 빠르게 처리하지 못한다. 이 알고리즘은 다른 세 알고리즘과 비교할 때 기준선 역할을 맡는다.</w:t>
       </w:r>
     </w:p>
     <w:p>
@@ -932,7 +932,7 @@
           <w:sz w:val="20"/>
           <w:szCs w:val="20"/>
         </w:rPr>
-        <w:t xml:space="preserve">은 각 요청에 우선순위를 부여하여 긴급한 요청을 먼저 처리하는 알고리즘이다. 운영체제에서는 시스템 프로세스나 인터럽트 처리에 우선권을 주기 위해 폭넓게 사용된다. 대기열에서 요청을 꺼낼 때 가장 높은 우선순위의 요청을 먼저 선택하며, 같은 우선순위 요청들 사이에서는 도착 순서대로 처리한다. 구현은 우선순위 큐(Priority Queue) 자료구조를 사용하면 단순하게 만들 수 있다. 단점은 낮은 우선순위 요청이 계속 밀려나 처리되지 못하는 기아 현상이 발생할 수 있다는 점이다. 이를 막기 위해 오래 기다린 요청의 우선순위를 점차 올려주는 에이징(Aging) 기법을 적용하였다 [3]. 또한 긴급도를 사람이 직접 지정해야 하므로 자동 분류는 어렵다. 본 프로젝트에서는 LLM API에서 사용자가 요청 단위로 긴급도를 지정할 수 있는 상황에 적합한 알고리즘으로 채택하였다.</w:t>
+        <w:t xml:space="preserve">은 각 요청에 우선순위를 부여하여 긴급한 요청을 먼저 처리하는 알고리즘이다. 운영체제에서는 시스템 프로세스나 인터럽트 처리에 우선권을 주기 위해 폭넓게 사용된다. 대기열에서 요청을 꺼낼 때 가장 높은 우선순위의 요청을 먼저 선택하며, 같은 우선순위 요청들 사이에서는 도착 순서대로 처리한다. 구현은 우선순위 큐(Priority Queue) 자료구조를 쓰면 단순해진다. 낮은 우선순위 요청은 계속 밀려나 끝내 처리되지 못하는 기아 현상에 빠질 수 있다는 단점이 있다. 이를 막으려고 오래 기다린 요청의 우선순위를 점차 올려주는 에이징(Aging) 기법을 적용하였다 [3]. 단, 긴급도를 사람이 직접 지정해야 하므로 자동 분류는 어렵다. 사용자가 요청마다 긴급도를 지정할 수 있는 LLM API 환경에 잘 맞아 채택하였다.</w:t>
       </w:r>
     </w:p>
     <w:p>
@@ -957,7 +957,7 @@
           <w:sz w:val="20"/>
           <w:szCs w:val="20"/>
         </w:rPr>
-        <w:t xml:space="preserve">는 여러 단계의 대기열을 두고 작업 특성에 따라 우선순위를 자동으로 조정하는 알고리즘이다. 어떤 요청이 짧은지 미리 모르더라도 실행 시간을 관찰하여 자동으로 분류할 수 있다는 점이 가장 큰 특징이다. 새 요청은 최상위 큐에 들어가고, 시간 할당량(Time Quantum, 한 번에 쓸 수 있는 최대 시간) 안에 끝나지 않으면 하위 큐로 내려간다 [3]. 상위 큐가 비어 있을 때만 하위 큐의 요청이 처리되므로, 짧은 요청은 빠르게 끝나고 긴 요청은 아래로 밀린다. 하위 큐로만 계속 밀리면 기아 상태가 되므로, 일정 주기로 모든 요청을 다시 최상위 큐로 끌어올리는 부스팅(Boosting) 규칙을 적용한다. 짧은 요청의 응답 속도가 빠르고 작업 특성을 미리 알 필요가 없어 범용성이 높다는 장점이 있다. 단점은 시간 할당량 단위로 실행을 중단·재개할 수 있는 환경에서만 효과가 있다는 점으로, 추론 중단이 불가능한 LLM 서빙 도구에서는 적용에 제약이 있다. 본 프로젝트에서는 시뮬레이션과 실서버 양쪽에서 선점형·비선점형을 모두 비교하여 이론적 효과와 실용적 한계를 함께 확인한다.</w:t>
+        <w:t xml:space="preserve">는 여러 단계의 대기열을 두고 작업 특성에 따라 우선순위를 자동으로 조정하는 알고리즘이다. 이 알고리즘의 가장 큰 특징은, 어떤 요청이 짧은지 미리 모르더라도 실행 시간을 관찰해 자동으로 분류한다는 점이다. 새 요청은 최상위 큐에 들어가고, 시간 할당량(Time Quantum, 한 번에 쓸 수 있는 최대 시간) 안에 끝나지 않으면 하위 큐로 내려간다 [3]. 처리할 때는 상위 큐가 비어 있을 때만 하위 큐를 본다. 그래서 짧은 요청은 빠르게 끝나고 긴 요청은 점점 아래로 밀린다. 하위 큐로만 계속 밀리면 기아 상태가 되므로, 일정 주기로 모든 요청을 다시 최상위 큐로 끌어올리는 부스팅(Boosting) 규칙을 두었다. 짧은 요청의 응답 속도가 빠르고 작업 특성을 미리 알 필요가 없어 범용성이 높다는 점이 장점이다. 반면 시간 할당량 단위로 실행을 중단·재개할 수 있어야만 효과가 나타나므로, 추론 중단이 불가능한 LLM 서빙 도구에서는 적용에 제약이 있다. 이론적 효과와 실용적 한계를 모두 살펴보고자 시뮬레이션에서는 선점형·비선점형을 함께 비교하고, 실서버에서는 비선점형만 적용하였다.</w:t>
       </w:r>
     </w:p>
     <w:p>
@@ -982,7 +982,7 @@
           <w:sz w:val="20"/>
           <w:szCs w:val="20"/>
         </w:rPr>
-        <w:t xml:space="preserve">는 네트워크 라우터에서 한정된 대역폭을 여러 흐름이 공평하게 나누어 쓰도록 만들어진 알고리즘이다 [4]. 본래 목적은 네트워크 트래픽의 QoS(Quality of Service, 서비스 품질 차등 제공) 보장이며, 인터넷 라우터에 널리 쓰인다. 자원을 완벽히 공평하게 나누는 이상적 모델인 GPS(Generalized Processor Sharing)를 비슷하게 만들어 구현하기 위해, 각 요청에 가상 완료 시각(Virtual Finish Time, VFT)을 부여한다. 가상 완료 시각이 가장 작은 요청부터 처리하며, 가중치가 큰 사용자의 VFT는 천천히 증가해 결과적으로 더 자주 처리된다. 가중치 비율에 따라 자원을 비례 배분하므로 사용자별 차등 서비스를 자연스럽게 구현할 수 있다. 또한 처리 중단 없이도 차등이 가능하므로 비선점형 환경에도 적용할 수 있어, Ollama와 같이 추론 중단이 불가능한 LLM 서빙 도구에서도 사용할 수 있다. 단점은 모든 요청에 대해 VFT를 계산하고 정렬해야 하므로 단순 큐보다 연산 비용이 크다는 점이다. 본 프로젝트에서는 구독 등급 기반 차등 서비스를 구현하는 알고리즘으로 사용하며, 구체적 VFT 계산은 4.3절에서 설명한다.</w:t>
+        <w:t xml:space="preserve">는 네트워크 라우터에서 한정된 대역폭을 여러 흐름이 공평하게 나누어 쓰도록 만들어진 알고리즘이다 [4]. 본래 목적은 네트워크 트래픽의 QoS(Quality of Service) 보장이며, 인터넷 라우터에 널리 쓰인다. 자원을 완벽히 공평하게 나누는 이상적 모델인 GPS(Generalized Processor Sharing)에 가깝게 동작하도록, 각 요청에 가상 완료 시각(Virtual Finish Time, VFT)을 부여한다. 가상 완료 시각이 가장 작은 요청부터 처리하며, 가중치가 큰 사용자의 VFT는 천천히 증가해 결과적으로 더 자주 처리된다. 가중치 비율에 따라 자원을 비례 배분하므로 사용자별 차등 서비스를 자연스럽게 구현할 수 있다. 처리 중단 없이도 가중치 차등이 작동하므로 비선점형 환경에 적용할 수 있다. 덕분에 Ollama처럼 추론 중단이 불가능한 LLM 서빙 도구에서도 쓸 수 있다. 다만 모든 요청에 대해 VFT를 계산하고 정렬해야 하므로 단순 큐보다 연산 비용이 크다. 구독 등급별 차등 서비스를 구현할 알고리즘으로 사용하였으며, 자세한 VFT 계산은 4.3절에서 다룬다.</w:t>
       </w:r>
     </w:p>
     <w:p>
@@ -1026,7 +1026,7 @@
           <w:sz w:val="20"/>
           <w:szCs w:val="20"/>
         </w:rPr>
-        <w:t xml:space="preserve">이들 도구는 모두 다중 사용자 환경에서의 우선순위 관리나 공정성 보장 기능을 제공하지 않고, 전체 처리량을 높이는 데 집중한다. OpenAI [1]와 Anthropic [2]의 상용 API도 조직 단위의 분당 한도만 제공할 뿐 조직 내부에서 사용자별 차등이나 우선순위 처리는 지원하지 않는다. 즉 "어떤 사용자를 먼저 처리할 것인가"는 서비스 운영자가 별도로 구현해야 하는 부분이며, 본 프로젝트는 이 부분에 스케줄링 이론을 적용하였다.</w:t>
+        <w:t xml:space="preserve">이들 도구는 다중 사용자 환경의 우선순위 관리나 공정성 보장 기능을 따로 두지 않으며, 초점은 전체 처리량을 높이는 데 있다. OpenAI [1]와 Anthropic [2]의 상용 API도 조직 단위의 분당 한도만 제공할 뿐 조직 내부에서 사용자별 차등이나 우선순위 처리는 지원하지 않는다. 결국 "어떤 사용자를 먼저 처리할 것인가"는 서비스 운영자의 몫이며, 본 프로젝트가 이 자리에 스케줄링 이론을 끌어와 적용하였다.</w:t>
       </w:r>
     </w:p>
     <w:p>
@@ -1087,7 +1087,7 @@
           <w:sz w:val="20"/>
           <w:szCs w:val="20"/>
         </w:rPr>
-        <w:t xml:space="preserve">xi는 사용자 i의 자원량, n은 사용자 수이다. 모두 동일 배분이면 1, 한 명이 독점하면 1/n에 가까워진다(예: 4명 중 한 명 독점 시 0.25). 스케줄링 맥락에서는 xi 자리에 사용자별 대기시간(값이 작을수록 좋음)이나 처리 건수(값이 클수록 좋음) 같은 값을 넣어 공정성을 측정한다. 본 프로젝트에서도 실험 목적에 따라 두 기준을 구분해 사용하였다 (5.5절). 공정성 지표에는 JFI 외에 최대-최소 공정성(Max-Min Fairness, 가장 불리한 사용자의 몫을 극대화하는 기준)이나 비례 공정성(Proportional Fairness, 각 사용자의 만족도를 종합적으로 높이는 기준) 등이 있다 [4]. 본 프로젝트에서는 계산이 간단하고 단일 수치로 비교가 용이한 JFI를 선택하였다. 다만 WFQ처럼 가중치로 일부러 차이를 두는 방식에서는 단순 처리 건수로 JFI를 계산하면 "가중치대로 처리되었는가"를 판단할 수 없다. 그래서 xi 자리에 "처리 건수 ÷ 가중치"를 넣어 계산한 정규화(가중치 차이를 상쇄해 비교 기준을 맞추는 것) JFI를 사용하며, 본 프로젝트에서도 WFQ에는 이 방식을 적용하였다 (5.5절).</w:t>
+        <w:t xml:space="preserve">xi는 사용자 i의 자원량, n은 사용자 수이다. 모두 동일 배분이면 1, 한 명이 독점하면 1/n에 가까워진다(예: 4명 중 한 명 독점 시 0.25). 스케줄링 맥락에서는 xi 자리에 사용자별 대기시간(값이 작을수록 좋음)이나 처리 건수(값이 클수록 좋음) 같은 값을 넣어 공정성을 측정한다. 실험 목적에 따라 두 기준을 구분해 사용하였다 (5.5절). 공정성 지표는 JFI 외에도 최대-최소 공정성(Max-Min Fairness, 가장 불리한 사용자의 몫을 극대화하는 기준)이나 비례 공정성(Proportional Fairness, 각 사용자의 만족도를 종합적으로 높이는 기준) 등이 있다 [4]. 그 가운데 계산이 간단하고 단일 수치로 비교하기 좋다는 점에서 JFI를 골랐다. 다만 WFQ처럼 가중치로 일부러 차이를 두는 방식에서는 단순 처리 건수로 JFI를 계산하면 "가중치대로 처리되었는가"를 판단할 수 없다. 그래서 xi 자리에 "처리 건수 ÷ 가중치"를 넣어 계산한 정규화(가중치 차이를 상쇄해 비교 기준을 맞추는 것) JFI를 사용한다. 본 보고서의 WFQ에도 이 방식을 적용하였다 (5.5절).</w:t>
       </w:r>
     </w:p>
     <w:p>
@@ -1101,7 +1101,7 @@
           <w:sz w:val="20"/>
           <w:szCs w:val="20"/>
         </w:rPr>
-        <w:t xml:space="preserve">다음 장에서는 이러한 이론을 LLM API 요청 관리에 적용한 시스템 설계를 설명한다.</w:t>
+        <w:t xml:space="preserve">이러한 이론적 토대 위에서, 다음 장에서는 시스템 설계를 다룬다.</w:t>
       </w:r>
     </w:p>
     <w:p>
@@ -1152,7 +1152,7 @@
           <w:sz w:val="20"/>
           <w:szCs w:val="20"/>
         </w:rPr>
-        <w:t xml:space="preserve">본 시스템의 기본 아이디어는 OS에서 프로세스가 CPU를 할당받기 위해 준비 큐에서 대기하는 구조와 같이, LLM API 요청도 대기열에서 순서를 기다리는 구조로 만드는 것이다 (표 1).</w:t>
+        <w:t xml:space="preserve">본 시스템의 기본 아이디어는 OS의 프로세스 준비 큐 구조에서 가져왔다. 프로세스가 CPU를 할당받기 위해 준비 큐에서 대기하듯, LLM API 요청도 대기열에서 순서를 기다리는 구조로 두었다 (표 1).</w:t>
       </w:r>
     </w:p>
     <w:p>
@@ -1887,7 +1887,7 @@
           <w:sz w:val="20"/>
           <w:szCs w:val="20"/>
         </w:rPr>
-        <w:t xml:space="preserve">은 Express.js [8] 기반 HTTP 서버로, 요청을 받고 스케줄러를 전환하며 통계를 제공하는 역할을 한다. 도착한 요청은 객체로 만든 뒤 Rate Limiter를 거쳐 스케줄러에 전달된다. </w:t>
+        <w:t xml:space="preserve">은 Express.js [8] 기반 HTTP 서버이며, 요청을 받고 스케줄러를 전환하고 통계를 제공한다. 도착한 요청은 객체로 만들어진 뒤 Rate Limiter를 거쳐 스케줄러에 전달된다. </w:t>
       </w:r>
       <w:r>
         <w:rPr>
@@ -1907,7 +1907,7 @@
           <w:sz w:val="20"/>
           <w:szCs w:val="20"/>
         </w:rPr>
-        <w:t xml:space="preserve">은 네 알고리즘이 공통 인터페이스(enqueue/dequeue)를 구현하여 환경변수로 선택된 알고리즘에 따라 처리 순서를 결정한다. </w:t>
+        <w:t xml:space="preserve">에서는 네 알고리즘이 공통 인터페이스(enqueue/dequeue)를 구현하며, 환경변수로 선택된 알고리즘에 따라 처리 순서가 정해진다. </w:t>
       </w:r>
       <w:r>
         <w:rPr>
@@ -1927,7 +1927,7 @@
           <w:sz w:val="20"/>
           <w:szCs w:val="20"/>
         </w:rPr>
-        <w:t xml:space="preserve">은 메모리 큐로 요청을 관리하고 JSON 파일로 처리 이력을 기록하며, LLM 호출은 로컬의 Ollama로 수행한다.</w:t>
+        <w:t xml:space="preserve">은 메모리 큐로 요청을 관리하고 JSON 파일로 처리 이력을 기록한다. 실제 LLM 호출은 로컬의 Ollama로 수행한다.</w:t>
       </w:r>
     </w:p>
     <w:p>
@@ -2531,7 +2531,7 @@
           <w:sz w:val="20"/>
           <w:szCs w:val="20"/>
         </w:rPr>
-        <w:t xml:space="preserve">두 개념은 독립적이어서 Enterprise 사용자가 LOW 우선순위 요청을 보낼 수 있다. FCFS와 MLFQ는 우선순위·등급과 무관하게 동작한다.</w:t>
+        <w:t xml:space="preserve">두 개념은 서로 독립적이어서 Enterprise 사용자가 LOW 우선순위 요청을 보낼 수도 있다. FCFS와 MLFQ는 우선순위·등급과 무관하게 동작한다.</w:t>
       </w:r>
     </w:p>
     <w:p>
@@ -2561,7 +2561,7 @@
           <w:sz w:val="20"/>
           <w:szCs w:val="20"/>
         </w:rPr>
-        <w:t xml:space="preserve">실서버 환경에서는 Ollama 등 대부분의 LLM 서빙 도구가 추론 중단을 지원하지 않으므로, 본 시스템도 비선점형(Non-preemptive, 실행 중인 요청을 끝까지 처리하고 중단하지 않는 방식)으로 동작하도록 구현하였다. MLFQ의 이론적 효과 확인을 위해 선점형(Preemptive, 할당량 소진 시 실행 중인 요청을 중단하고 다른 요청으로 교체하는 방식, 500ms 간격 할당량 확인)은 시뮬레이션에만 추가 구현하였다 (5.3절). 각 알고리즘의 세부 설정은 다음과 같다.</w:t>
+        <w:t xml:space="preserve">Ollama를 비롯한 대부분의 LLM 서빙 도구가 추론 중단을 지원하지 않는다. 그래서 본 시스템도 비선점형(Non-preemptive, 실행 중인 요청을 끝까지 처리하고 중단하지 않는 방식)으로 동작하도록 구현하였다. 다만 MLFQ의 이론적 효과를 확인하려고 선점형(Preemptive, 할당량 소진 시 실행 중인 요청을 중단하고 다른 요청으로 교체하는 방식, 500ms 간격 할당량 확인)은 시뮬레이션에만 추가 구현하였다 (5.3절). 각 알고리즘의 세부 설정은 다음과 같다.</w:t>
       </w:r>
     </w:p>
     <w:p>
@@ -2963,7 +2963,7 @@
           <w:sz w:val="20"/>
           <w:szCs w:val="20"/>
         </w:rPr>
-        <w:t xml:space="preserve">런타임은 Node.js 22 LTS [9], 웹 프레임워크는 Express.js 4.18 [8], 언어는 JavaScript(ES2024), LLM 실행 도구로는 로컬 Ollama [10]를 사용하였다. 저장소는 메모리 큐와 JSON 파일로 구성하였으며, 외부 라이브러리 의존성은 express 1개이다. 외부 라이브러리를 최소화하고 스케줄링 알고리즘을 직접 구현하여 학습 효과를 높이는 것을 목표로 하였다. Ollama의 순차 처리·비중단 특성은 비선점형 설계와 부합하여 실서버 실험에 활용하였다 (5.4절).</w:t>
+        <w:t xml:space="preserve">런타임은 Node.js 22 LTS [9], 웹 프레임워크는 Express.js 4.18 [8], 언어는 JavaScript(ES2024)를 사용하였다. LLM 실행에는 로컬 Ollama [10]를 썼고, 저장소는 메모리 큐와 JSON 파일로 구성하였다. 외부 라이브러리 의존성은 express 1개뿐이다. 외부 라이브러리를 최소화하고 스케줄링 알고리즘을 직접 구현해 학습 효과를 높이는 것이 목표였다. Ollama의 순차 처리·비중단 특성은 비선점형 설계와 잘 맞아 실서버 실험에 사용하였다 (5.4절).</w:t>
       </w:r>
     </w:p>
     <w:p>
@@ -2993,7 +2993,7 @@
           <w:sz w:val="20"/>
           <w:szCs w:val="20"/>
         </w:rPr>
-        <w:t xml:space="preserve">소스 코드는 핵심 모듈과 보조 요소로 구성된다 (그림 4). 핵심 모듈은 api(REST 라우터), schedulers(4개 알고리즘), queue(메모리 대기열), storage(JSON 기록), llm(Ollama 호출)이다. 보조 요소로는 index.js(메인 진입점), server.js(Express 서버 구성 모듈), rate-limiter가 있다. `npm start` 실행 시 index.js가 server.js의 `createServer()`를 호출하여 Express 서버를 시작한다.</w:t>
+        <w:t xml:space="preserve">소스 코드는 핵심 모듈과 보조 요소로 구성된다 (그림 4). 핵심 모듈은 다섯 가지로, api(REST 라우터), schedulers(4개 알고리즘), queue(메모리 대기열), storage(JSON 기록), llm(Ollama 호출)이다. 보조 요소에는 index.js(메인 진입점), server.js(Express 서버 구성 모듈), rate-limiter가 있다. `npm start`로 실행하면 index.js가 server.js의 `createServer()`를 호출해 Express 서버를 띄운다.</w:t>
       </w:r>
     </w:p>
     <w:p>
@@ -4019,7 +4019,7 @@
           <w:sz w:val="20"/>
           <w:szCs w:val="20"/>
         </w:rPr>
-        <w:t xml:space="preserve">위 코드는 실서버에도 적용되는 비선점형 구현이다. 선점형 MLFQ는 시뮬레이션 전용으로 `run-multi-seed.js`에 별도 구현하였으며, 500ms 간격으로 실행 시간을 확인해 할당량 초과 시 하위 큐로 이동시키고 5초 주기 부스팅으로 하위 큐 기아를 방지한다.</w:t>
+        <w:t xml:space="preserve">위 코드는 실서버에도 적용되는 비선점형 구현이다. 선점형 MLFQ는 시뮬레이션 전용으로 `run-multi-seed.js`에 따로 구현하였다. 500ms 간격으로 실행 시간을 확인해 할당량 초과 시 하위 큐로 옮기며, 5초 주기 부스팅으로 하위 큐의 기아를 막는다.</w:t>
       </w:r>
     </w:p>
     <w:p>
@@ -4394,7 +4394,7 @@
           <w:sz w:val="20"/>
           <w:szCs w:val="20"/>
         </w:rPr>
-        <w:t xml:space="preserve">Rate Limiter는 스케줄링 비교 대상이 아닌 요청 진입 관리 전처리 단계이며, 스케줄러와 독립적으로 동작한다. 토큰 버킷(Token Bucket, 일정 시간마다 요청 권한인 토큰이 새로 발급되고 요청이 들어올 때마다 토큰 하나씩 소모하는 방식) 방식으로 구현하였다. 구독 등급별 분당 허용 수(표 4)를 제한하고, 토큰이 없으면 HTTP 429(Too Many Requests, 요청 한도 초과를 알리는 표준 응답 코드) [11]로 거부한다.</w:t>
+        <w:t xml:space="preserve">Rate Limiter는 스케줄링 비교 대상이 아니라 요청 진입을 관리하는 전처리 단계이며, 스케줄러와 독립적으로 동작한다. 토큰 버킷(Token Bucket, 일정 시간마다 요청 권한인 토큰이 새로 발급되고 요청이 들어올 때마다 토큰 하나씩 소모하는 방식) 방식으로 만들었다. 구독 등급별 분당 허용 수(표 4)를 제한하고, 토큰이 없으면 HTTP 429(Too Many Requests, 요청 한도 초과를 알리는 표준 응답 코드) [11]로 거부한다.</w:t>
       </w:r>
     </w:p>
     <w:p>
@@ -4764,7 +4764,7 @@
           <w:sz w:val="20"/>
           <w:szCs w:val="20"/>
         </w:rPr>
-        <w:t xml:space="preserve">스케줄러 4종과 Rate Limiter를 모두 구현하여 동작을 확인하였고, 스케줄러별 단위 테스트를 작성·통과시켰다. 환경변수(`SCHEDULER_TYPE`)로 알고리즘을 즉시 전환할 수 있다. 또한 대기열 상태와 처리 통계를 브라우저에서 확인할 수 있는 웹 대시보드(`public/dashboard.html`)를 함께 구성하여, 동일 요청에 대한 알고리즘별 처리 순서를 시각적으로 비교할 수 있도록 하였다.</w:t>
+        <w:t xml:space="preserve">스케줄러 4종과 Rate Limiter를 모두 구현해 동작을 확인하였고, 스케줄러별 단위 테스트도 작성·통과시켰다. 환경변수(`SCHEDULER_TYPE`)만 바꾸면 알고리즘을 즉시 전환할 수 있다. 대기열 상태와 처리 통계를 브라우저에서 확인할 수 있도록 웹 대시보드(`public/dashboard.html`)도 함께 만들었다. 동일 요청을 알고리즘별로 어떻게 처리하는지 눈으로 비교할 수 있다.</w:t>
       </w:r>
     </w:p>
     <w:p>
@@ -4815,7 +4815,7 @@
           <w:sz w:val="20"/>
           <w:szCs w:val="20"/>
         </w:rPr>
-        <w:t xml:space="preserve">실험은 기본 실험, MLFQ 선점형 실험, 실서버 실험 세 가지로 구분되며, 전체 구조는 그림 5, 실험별 주요 설정은 표 5와 같다. 앞의 두 실험은 시간 기반 시뮬레이션, 실서버 실험은 Ollama를 활용한 실제 LLM 호출로 수행하였다. 시뮬레이션은 요청에 처리 시간을 미리 지정한 뒤 스케줄러가 결정한 순서대로 한 건씩 처리하는 방식이다. 네트워크 지연이나 LLM 상태 변동이 없으므로 알고리즘 자체의 특성만 비교할 수 있다. 반복 실험에는 고정 시드(Seed, 난수 생성의 초기값이며 같은 시드로 실행하면 같은 요청 패턴을 다시 만들 수 있다)를 사용해 같은 결과를 다시 얻을 수 있도록 하였다.</w:t>
+        <w:t xml:space="preserve">실험은 세 갈래로 나뉜다. 기본 실험, MLFQ 선점형 실험, 그리고 실서버 실험이다. 전체 구조는 그림 5, 실험별 주요 설정은 표 5에 정리하였다. 앞의 두 실험은 시간 기반 시뮬레이션이고, 실서버 실험은 Ollama로 실제 LLM을 호출해 진행하였다. 시뮬레이션은 요청에 처리 시간을 미리 지정해두고 스케줄러가 결정한 순서대로 한 건씩 처리하는 방식이다. 네트워크 지연이나 LLM 상태 변동이 없어 알고리즘 자체의 특성만 비교할 수 있다. 반복 실험에는 고정 시드(Seed, 난수 생성의 초기값이며 같은 시드로 실행하면 같은 요청 패턴을 다시 만들 수 있다)를 써서 같은 결과를 다시 얻도록 하였다.</w:t>
       </w:r>
     </w:p>
     <w:p>
@@ -6656,7 +6656,7 @@
           <w:sz w:val="20"/>
           <w:szCs w:val="20"/>
         </w:rPr>
-        <w:t xml:space="preserve">Short는 최상위 큐에서 완료되고 Medium·Long은 시간 할당량 초과로 하위 큐로 강등되도록 설계하였다. 버스트(Burst, 짧은 시간에 여러 요청이 동시에 몰리는 상황) 도착 패턴은 대기열에 요청이 쌓인 상태에서 스케줄러가 순서를 결정하도록 유도한다. 본 실험에서는 이를 위해 20건씩 동시에 투입하는 방식으로 구성하였다. 모든 실험에서 요청은 1건씩 순차 처리된다. JFI 계산 방식의 차이는 5.5절에서 다루며, 대규모 환경은 7.2절 향후 연구 과제로 남긴다.</w:t>
+        <w:t xml:space="preserve">Short는 최상위 큐에서 완료되고 Medium·Long은 시간 할당량 초과로 하위 큐로 강등되도록 설계하였다. 버스트(Burst, 짧은 시간에 여러 요청이 동시에 몰리는 상황) 도착 패턴은 대기열에 요청이 쌓인 상태에서 스케줄러가 순서를 결정하도록 유도한다. 이를 위해 20건씩 동시에 투입하였다. 모든 실험에서 요청은 1건씩 순차 처리된다. JFI 계산 방식의 차이는 5.5절에서 다루며, 대규모 환경은 향후 연구 과제로 남긴다 (7.2절).</w:t>
       </w:r>
     </w:p>
     <w:p>
@@ -7334,7 +7334,7 @@
           <w:sz w:val="20"/>
           <w:szCs w:val="20"/>
         </w:rPr>
-        <w:t xml:space="preserve">"대기시간(wait time)"은 요청이 대기열에 들어간 시점부터 처리가 시작된 시점까지이다. 5.3절의 선점형 MLFQ 비교에서는 처리가 여러 번 중단·재개되므로 "응답시간(도착부터 완료까지)"을 사용한다.</w:t>
+        <w:t xml:space="preserve">"대기시간(wait time)"은 요청이 대기열에 들어간 시점부터 처리가 시작된 시점까지이다. 단, 5.3절의 선점형 MLFQ 비교에서는 처리가 여러 번 중단·재개되므로 "응답시간(도착부터 완료까지)"으로 단위를 바꾼다.</w:t>
       </w:r>
     </w:p>
     <w:p>
@@ -7417,22 +7417,31 @@
       <w:r>
         <w:rPr>
           <w:rFonts w:ascii="맑은 고딕" w:cs="맑은 고딕" w:eastAsia="맑은 고딕" w:hAnsi="맑은 고딕"/>
+          <w:color w:val="000000"/>
+          <w:sz w:val="20"/>
+          <w:szCs w:val="20"/>
+        </w:rPr>
+        <w:t xml:space="preserve">FCFS에서는 도착 순서대로 처리되어 네 명이 대기시간을 고르게 부담하였다 (JFI = 1.000). Priority는 처리 순서가 바뀌었지만 전체 평균은 FCFS와 거의 같았다(약 216ms 차이). 우선순위 큐는 단순 FIFO보다 삽입·추출에 약간 더 많은 계산이 들어가는데, 이 차이가 평균에 살짝 반영된 것으로 보인다. 거기에 처리 시간이 짧아(10~100ms) 에이징이 작동하기 전에 처리가 끝나서 우선순위 효과 자체는 거의 드러나지 않았다. </w:t>
+      </w:r>
+      <w:r>
+        <w:rPr>
+          <w:rFonts w:ascii="맑은 고딕" w:cs="맑은 고딕" w:eastAsia="맑은 고딕" w:hAnsi="맑은 고딕"/>
           <w:b/>
           <w:bCs/>
           <w:color w:val="000000"/>
           <w:sz w:val="20"/>
           <w:szCs w:val="20"/>
         </w:rPr>
-        <w:t xml:space="preserve">FCFS</w:t>
-      </w:r>
-      <w:r>
-        <w:rPr>
-          <w:rFonts w:ascii="맑은 고딕" w:cs="맑은 고딕" w:eastAsia="맑은 고딕" w:hAnsi="맑은 고딕"/>
-          <w:color w:val="000000"/>
-          <w:sz w:val="20"/>
-          <w:szCs w:val="20"/>
-        </w:rPr>
-        <w:t xml:space="preserve">는 도착 순서대로 처리되어 네 명이 대기시간을 고르게 부담하였다 (JFI = 1.000). </w:t>
+        <w:t xml:space="preserve">MLFQ(비선점형)</w:t>
+      </w:r>
+      <w:r>
+        <w:rPr>
+          <w:rFonts w:ascii="맑은 고딕" w:cs="맑은 고딕" w:eastAsia="맑은 고딕" w:hAnsi="맑은 고딕"/>
+          <w:color w:val="000000"/>
+          <w:sz w:val="20"/>
+          <w:szCs w:val="20"/>
+        </w:rPr>
+        <w:t xml:space="preserve">의 결과는 FCFS와 동일하였다. 모든 요청이 Q0 할당량(1,000ms) 안에 완료되어 하위 큐로 내려갈 일이 없었고, 비선점형 특성상 요청이 도착 순서대로 처리된 탓이다. 이론적 효과를 따로 확인하려고 5.3절에서 선점형 실험을 추가하였다. </w:t>
       </w:r>
       <w:r>
         <w:rPr>
@@ -7443,46 +7452,6 @@
           <w:sz w:val="20"/>
           <w:szCs w:val="20"/>
         </w:rPr>
-        <w:t xml:space="preserve">Priority</w:t>
-      </w:r>
-      <w:r>
-        <w:rPr>
-          <w:rFonts w:ascii="맑은 고딕" w:cs="맑은 고딕" w:eastAsia="맑은 고딕" w:hAnsi="맑은 고딕"/>
-          <w:color w:val="000000"/>
-          <w:sz w:val="20"/>
-          <w:szCs w:val="20"/>
-        </w:rPr>
-        <w:t xml:space="preserve">는 처리 순서가 바뀌었으나 전체 평균은 FCFS와 거의 같은 수준이었다(약 216ms 차이). 우선순위 큐가 단순 FIFO보다 넣고 빼는 계산이 조금 더 필요해 생긴 작은 차이로 볼 수 있다. 또한 처리 시간이 짧아(10~100ms) 에이징이 작동하기 전에 처리가 끝나 우선순위 효과 자체는 거의 드러나지 않았다. </w:t>
-      </w:r>
-      <w:r>
-        <w:rPr>
-          <w:rFonts w:ascii="맑은 고딕" w:cs="맑은 고딕" w:eastAsia="맑은 고딕" w:hAnsi="맑은 고딕"/>
-          <w:b/>
-          <w:bCs/>
-          <w:color w:val="000000"/>
-          <w:sz w:val="20"/>
-          <w:szCs w:val="20"/>
-        </w:rPr>
-        <w:t xml:space="preserve">MLFQ(비선점형)</w:t>
-      </w:r>
-      <w:r>
-        <w:rPr>
-          <w:rFonts w:ascii="맑은 고딕" w:cs="맑은 고딕" w:eastAsia="맑은 고딕" w:hAnsi="맑은 고딕"/>
-          <w:color w:val="000000"/>
-          <w:sz w:val="20"/>
-          <w:szCs w:val="20"/>
-        </w:rPr>
-        <w:t xml:space="preserve">은 FCFS와 동일한 결과였다. 모든 요청이 Q0 할당량(1,000ms) 안에 완료되어 하위 큐로 내려가는 일이 없었고, 비선점형 특성상 요청이 도착 순서대로 처리되었다. 이론적 효과 확인을 위해 5.3절의 선점형 실험을 추가하였다. </w:t>
-      </w:r>
-      <w:r>
-        <w:rPr>
-          <w:rFonts w:ascii="맑은 고딕" w:cs="맑은 고딕" w:eastAsia="맑은 고딕" w:hAnsi="맑은 고딕"/>
-          <w:b/>
-          <w:bCs/>
-          <w:color w:val="000000"/>
-          <w:sz w:val="20"/>
-          <w:szCs w:val="20"/>
-        </w:rPr>
         <w:t xml:space="preserve">WFQ</w:t>
       </w:r>
       <w:r>
@@ -7492,7 +7461,7 @@
           <w:sz w:val="20"/>
           <w:szCs w:val="20"/>
         </w:rPr>
-        <w:t xml:space="preserve">는 전체 평균은 가장 낮았으나 구독 등급별 차이가 컸다 (표 8). JFI = 0.316은 5.5절에서 분석한다.</w:t>
+        <w:t xml:space="preserve">는 전체 평균이 가장 낮았으나 구독 등급별 차이가 컸다 (표 8). JFI = 0.316은 5.5절에서 분석한다.</w:t>
       </w:r>
     </w:p>
     <w:p>
@@ -8023,7 +7992,7 @@
           <w:sz w:val="20"/>
           <w:szCs w:val="20"/>
         </w:rPr>
-        <w:t xml:space="preserve">비선점형 MLFQ가 FCFS와 동일한 결과를 보였으므로, MLFQ의 이론적 효과를 검증하기 위해 선점형 시뮬레이션을 추가 수행하였다. 요청 500건, 처리 시간 최대 10초, 버스트 도착 구조로 5개 시드에 걸쳐 반복하였다. 지표는 응답시간(도착부터 완료까지)을 사용한다. 요청 유형별 응답시간 비교 결과는 표 9 및 그림 7과 같다.</w:t>
+        <w:t xml:space="preserve">비선점형 MLFQ가 FCFS와 동일한 결과를 보였기에, MLFQ의 이론적 효과를 따로 검증하려고 선점형 시뮬레이션을 추가하였다. 요청 500건, 처리 시간 최대 10초, 버스트 도착 구조로 5개 시드에 걸쳐 반복하였다. 지표는 응답시간(도착부터 완료까지)을 사용한다. 요청 유형별 응답시간 비교 결과는 표 9 및 그림 7과 같다.</w:t>
       </w:r>
     </w:p>
     <w:p>
@@ -8769,7 +8738,7 @@
           <w:sz w:val="20"/>
           <w:szCs w:val="20"/>
         </w:rPr>
-        <w:t xml:space="preserve">: 5개 시드에서 Short 개선율이 71.8~74.3%의 좁은 범위에 모였으며, 평균은 73.2%, 95% 신뢰구간(Confidence Interval, 같은 실험을 반복했을 때 참값이 이 범위 안에 있을 확률이 95%인 구간)은 [71.9%, 74.5%]이다. 쌍체 t-검정(Paired t-test, 같은 실험 조건에 두 방식을 적용하고 차이의 평균이 0인지 확인하는 통계 방법) 결과 t = 45.59, p &lt; 0.001로 FCFS와 MLFQ의 Short 응답시간 차이는 통계적으로 유의하였고, 효과 크기 Cohen's d = 20.39로 매우 큰 차이가 일관되게 나타났다. 시드를 바꾸어 다섯 번 반복해도 유사한 개선율이 나왔다는 것은, 이 효과가 특정 시드에 우연히 기댄 결과가 아님을 뜻한다. 다만 5개 시드의 제한된 반복이므로 실제 트래픽 패턴에서는 효과가 달라질 수 있다. 시드별 세부와 통계 계산 결과는 부록 B에 정리하였다.</w:t>
+        <w:t xml:space="preserve">: 5개 시드에서 Short 개선율이 71.8~74.3%의 좁은 범위에 모였다. 평균은 73.2%, 95% 신뢰구간(Confidence Interval, 같은 실험을 반복했을 때 참값이 이 범위 안에 있을 확률이 95%인 구간)은 [71.9%, 74.5%]였다. 쌍체 t-검정(Paired t-test, 같은 실험 조건에 두 방식을 적용하고 차이의 평균이 0인지 확인하는 통계 방법) 결과 t = 45.59, p &lt; 0.001로 FCFS와 MLFQ의 Short 응답시간 차이는 통계적으로 유의하였고, 효과 크기 Cohen's d = 20.39로 매우 큰 차이가 일관되게 나타났다. 시드를 바꿔 다섯 번 반복해도 비슷한 개선율이 나왔다는 점은 이 효과가 특정 시드에 우연히 기댄 결과가 아니라는 뜻이다. 다만 5개 시드의 제한된 반복이라 실제 트래픽 패턴에서는 효과가 달라질 수 있다. 시드별 세부와 통계 계산 결과는 부록 B에 정리하였다.</w:t>
       </w:r>
     </w:p>
     <w:p>
@@ -8799,7 +8768,7 @@
           <w:sz w:val="20"/>
           <w:szCs w:val="20"/>
         </w:rPr>
-        <w:t xml:space="preserve">시뮬레이션에서 확인한 스케줄링 순서 차이가 실제 LLM 환경에서도 재현되는지 확인하기 위해 Ollama를 활용한 실서버 실험을 수행하였다. 사용 모델은 2026년 4월 공개된 Google Gemma 4 계열의 `gemma4:e4b`이며, 약 40억 개 파라미터(Parameter, 모델이 학습해 가진 가중치 값)를 사용하는 중형 모델로 로컬 Ollama 서버에서 실행하였다. 출력은 최대 20토큰으로 제한하였다. 총 20건(등급별 5건)을 동시에 큐에 투입한 뒤 FCFS, Priority, WFQ 세 알고리즘을 비교하였다 (비선점형 MLFQ는 5.2절에서 FCFS와 동일함이 확인되어 제외). 전체 결과는 표 10, 구독 등급별 세부는 표 11 및 그림 8에 정리하였다.</w:t>
+        <w:t xml:space="preserve">시뮬레이션에서 확인한 스케줄링 순서 차이가 실제 LLM 환경에서도 재현되는지 보고자 Ollama로 실서버 실험을 수행하였다. 사용 모델은 2026년 4월 공개된 Google Gemma 4 계열의 `gemma4:e4b`이며, 약 40억 개 파라미터(Parameter, 모델이 학습해 가진 가중치 값)를 가진 중형 모델로 로컬 Ollama 서버에서 실행하였다. 출력은 최대 20토큰으로 제한하였다. 총 20건(등급별 5건)을 동시에 큐에 투입한 뒤 FCFS, Priority, WFQ 세 알고리즘을 비교하였다(비선점형 MLFQ는 5.2절에서 FCFS와 동일함이 확인되어 제외하였다). 전체 결과는 표 10, 구독 등급별 세부는 표 11 및 그림 8에 정리하였다.</w:t>
       </w:r>
     </w:p>
     <w:p>
@@ -10036,7 +10005,7 @@
           <w:sz w:val="20"/>
           <w:szCs w:val="20"/>
         </w:rPr>
-        <w:t xml:space="preserve">세 알고리즘의 평균 처리 시간이 모두 약 208~209ms로 거의 동일하다. 스케줄러는 "누구를 먼저 처리할지"만 결정할 뿐 LLM 추론 속도를 바꾸지 못한다. </w:t>
+        <w:t xml:space="preserve">세 알고리즘의 평균 처리 시간이 모두 약 208~209ms로 거의 같았다. 스케줄러는 "누구를 먼저 처리할지"만 결정할 뿐 LLM 추론 속도를 바꾸지 못한다. FCFS에서는 도착 순서대로 처리되어 Enterprise → Free 순으로 대기시간이 늘었다(Enterprise를 먼저 투입). Priority의 경우 구독 등급과 요청 우선순위가 독립적임을 드러내고자 등급별로 서로 다른 우선순위를 혼합 배정하였다(배정 내역은 부록 표 B.3 참조). 그 결과 Enterprise의 NORMAL 요청이 Premium의 URGENT 요청에 밀려 Enterprise 평균 대기시간은 FCFS 대비 증가하였다(432 → 664ms). 반면 Free의 NORMAL 요청은 Standard의 LOW 요청보다 먼저 처리되어 Free 평균 대기시간은 오히려 감소하였다(3,561 → 3,371ms). </w:t>
       </w:r>
       <w:r>
         <w:rPr>
@@ -10047,46 +10016,6 @@
           <w:sz w:val="20"/>
           <w:szCs w:val="20"/>
         </w:rPr>
-        <w:t xml:space="preserve">FCFS</w:t>
-      </w:r>
-      <w:r>
-        <w:rPr>
-          <w:rFonts w:ascii="맑은 고딕" w:cs="맑은 고딕" w:eastAsia="맑은 고딕" w:hAnsi="맑은 고딕"/>
-          <w:color w:val="000000"/>
-          <w:sz w:val="20"/>
-          <w:szCs w:val="20"/>
-        </w:rPr>
-        <w:t xml:space="preserve">는 도착 순서대로 처리되어 Enterprise → Free 순으로 대기시간이 늘었다(Enterprise를 먼저 투입). </w:t>
-      </w:r>
-      <w:r>
-        <w:rPr>
-          <w:rFonts w:ascii="맑은 고딕" w:cs="맑은 고딕" w:eastAsia="맑은 고딕" w:hAnsi="맑은 고딕"/>
-          <w:b/>
-          <w:bCs/>
-          <w:color w:val="000000"/>
-          <w:sz w:val="20"/>
-          <w:szCs w:val="20"/>
-        </w:rPr>
-        <w:t xml:space="preserve">Priority</w:t>
-      </w:r>
-      <w:r>
-        <w:rPr>
-          <w:rFonts w:ascii="맑은 고딕" w:cs="맑은 고딕" w:eastAsia="맑은 고딕" w:hAnsi="맑은 고딕"/>
-          <w:color w:val="000000"/>
-          <w:sz w:val="20"/>
-          <w:szCs w:val="20"/>
-        </w:rPr>
-        <w:t xml:space="preserve">는 구독 등급과 요청 우선순위가 독립적임을 드러내기 위해 등급별로 서로 다른 우선순위를 혼합 배정하였다(배정 내역은 부록 표 B.3 참조). 그 결과 Enterprise의 NORMAL 요청이 Premium의 URGENT 요청에 밀려 Enterprise 평균 대기시간은 FCFS 대비 증가하였다(432 → 664ms). 반면 Free의 NORMAL 요청은 Standard의 LOW 요청보다 먼저 처리되어 Free 평균 대기시간은 오히려 감소하였다(3,561 → 3,371ms). </w:t>
-      </w:r>
-      <w:r>
-        <w:rPr>
-          <w:rFonts w:ascii="맑은 고딕" w:cs="맑은 고딕" w:eastAsia="맑은 고딕" w:hAnsi="맑은 고딕"/>
-          <w:b/>
-          <w:bCs/>
-          <w:color w:val="000000"/>
-          <w:sz w:val="20"/>
-          <w:szCs w:val="20"/>
-        </w:rPr>
         <w:t xml:space="preserve">WFQ</w:t>
       </w:r>
       <w:r>
@@ -10096,7 +10025,7 @@
           <w:sz w:val="20"/>
           <w:szCs w:val="20"/>
         </w:rPr>
-        <w:t xml:space="preserve">는 가중치에 따라 Enterprise가 먼저 처리되었다. 요청 수가 적어 등급별 극단적 차이까지는 드러나지 않았지만 시뮬레이션과 동일한 패턴이 나타났다.</w:t>
+        <w:t xml:space="preserve">는 가중치에 따라 Enterprise가 먼저 처리되었다. 요청 수가 적어 등급별 극단적 차이까지는 드러나지 않았으나 시뮬레이션과 동일한 패턴이 나타났다.</w:t>
       </w:r>
     </w:p>
     <w:p>
@@ -10118,26 +10047,18 @@
     <w:p>
       <w:pPr>
         <w:spacing w:after="120" w:line="240"/>
-      </w:pPr>
-      <w:r>
-        <w:rPr>
-          <w:rFonts w:ascii="맑은 고딕" w:cs="맑은 고딕" w:eastAsia="맑은 고딕" w:hAnsi="맑은 고딕"/>
-          <w:b/>
-          <w:bCs/>
-          <w:color w:val="000000"/>
-          <w:sz w:val="20"/>
-          <w:szCs w:val="20"/>
-        </w:rPr>
-        <w:t xml:space="preserve">JFI 계산 방식 차이</w:t>
-      </w:r>
-      <w:r>
-        <w:rPr>
-          <w:rFonts w:ascii="맑은 고딕" w:cs="맑은 고딕" w:eastAsia="맑은 고딕" w:hAnsi="맑은 고딕"/>
-          <w:color w:val="000000"/>
-          <w:sz w:val="20"/>
-          <w:szCs w:val="20"/>
-        </w:rPr>
-        <w:t xml:space="preserve">: 두 가지 기준을 실험 목적에 맞게 구분해 사용하였다.</w:t>
+        <w:ind w:left="360"/>
+      </w:pPr>
+      <w:r>
+        <w:rPr>
+          <w:rFonts w:ascii="맑은 고딕" w:cs="맑은 고딕" w:eastAsia="맑은 고딕" w:hAnsi="맑은 고딕"/>
+          <w:i/>
+          <w:iCs/>
+          <w:color w:val="333333"/>
+          <w:sz w:val="20"/>
+          <w:szCs w:val="20"/>
+        </w:rPr>
+        <w:t xml:space="preserve">JFI 계산 방식의 차이부터 짚어둔다. 본 분석에서는 두 가지 기준을 실험 목적에 맞게 구분해 사용하였다.</w:t>
       </w:r>
     </w:p>
     <w:p>
@@ -10229,7 +10150,7 @@
           <w:sz w:val="20"/>
           <w:szCs w:val="20"/>
         </w:rPr>
-        <w:t xml:space="preserve">따라서 표 12 및 그림 9의 0.316과 1.000은 계산 기준이 달라 직접 비교하지 않는다. 각 값의 의미는 아래에서 따로 해석한다.</w:t>
+        <w:t xml:space="preserve">표 12 및 그림 9의 0.316과 1.000은 계산 기준이 달라 직접 비교하지 않는다. 각 값의 의미는 아래에서 따로 해석한다.</w:t>
       </w:r>
     </w:p>
     <w:p>
@@ -10964,7 +10885,7 @@
           <w:sz w:val="20"/>
           <w:szCs w:val="20"/>
         </w:rPr>
-        <w:t xml:space="preserve">WFQ의 공정성은 두 관점에서 본다. (1) </w:t>
+        <w:t xml:space="preserve">WFQ의 공정성은 두 관점에서 본다. 첫째, </w:t>
       </w:r>
       <w:r>
         <w:rPr>
@@ -10984,27 +10905,7 @@
           <w:sz w:val="20"/>
           <w:szCs w:val="20"/>
         </w:rPr>
-        <w:t xml:space="preserve">은 WFQScheduler가 "처리 요청 수 ÷ 가중치"로 계산한 값이다. 사용자당 125건씩 동일 배정했으므로 Free(가중치 1)의 비율이 커지고 Enterprise(100)는 작아져 JFI가 1에서 멀어진다. 즉, 이 값 자체가 WFQ가 가중치를 반영해 처리했다는 증거이다. (2) </w:t>
-      </w:r>
-      <w:r>
-        <w:rPr>
-          <w:rFonts w:ascii="맑은 고딕" w:cs="맑은 고딕" w:eastAsia="맑은 고딕" w:hAnsi="맑은 고딕"/>
-          <w:b/>
-          <w:bCs/>
-          <w:color w:val="000000"/>
-          <w:sz w:val="20"/>
-          <w:szCs w:val="20"/>
-        </w:rPr>
-        <w:t xml:space="preserve">등급 간 대기시간 차등</w:t>
-      </w:r>
-      <w:r>
-        <w:rPr>
-          <w:rFonts w:ascii="맑은 고딕" w:cs="맑은 고딕" w:eastAsia="맑은 고딕" w:hAnsi="맑은 고딕"/>
-          <w:color w:val="000000"/>
-          <w:sz w:val="20"/>
-          <w:szCs w:val="20"/>
-        </w:rPr>
-        <w:t xml:space="preserve">: Enterprise(약 1,862ms)가 Free(약 22,029ms) 대비 약 12배 짧아 가중치 비율(100:1)에 대응한다. 등급당 1명만 배치하였으므로 같은 등급 내 공정성은 향후 연구 과제로 남긴다.</w:t>
+        <w:t xml:space="preserve">은 WFQScheduler가 "처리 요청 수 ÷ 가중치"로 계산한 값이다. 사용자당 125건씩 동일 배정했으므로 Free(가중치 1)의 비율이 커지고 Enterprise(100)는 작아져 JFI가 1에서 멀어진다. 이 값 자체가 WFQ가 가중치를 반영해 처리했다는 증거가 된다. 둘째, 등급 간 대기시간을 보면 Enterprise(약 1,862ms)가 Free(약 22,029ms) 대비 약 12배 짧아 가중치 비율(100:1)에 대응한다. 등급당 1명만 배치한 구성이라 같은 등급 내 공정성은 향후 연구 과제로 남긴다.</w:t>
       </w:r>
     </w:p>
     <w:p>
@@ -12160,7 +12061,7 @@
           <w:sz w:val="20"/>
           <w:szCs w:val="20"/>
         </w:rPr>
-        <w:t xml:space="preserve">본 시뮬레이션은 알고리즘 특성 비교에 적합하지만 실제 LLM 서빙 환경과 다음 차이가 있다. 첫째, </w:t>
+        <w:t xml:space="preserve">본 시뮬레이션은 알고리즘 특성을 비교하기에는 적합하지만, 실제 LLM 서빙 환경과 비교하면 몇 가지 한계가 있다. 첫 번째 한계는 </w:t>
       </w:r>
       <w:r>
         <w:rPr>
@@ -12171,76 +12072,16 @@
           <w:sz w:val="20"/>
           <w:szCs w:val="20"/>
         </w:rPr>
-        <w:t xml:space="preserve">선점형 MLFQ는 실서버 적용이 어렵다</w:t>
-      </w:r>
-      <w:r>
-        <w:rPr>
-          <w:rFonts w:ascii="맑은 고딕" w:cs="맑은 고딕" w:eastAsia="맑은 고딕" w:hAnsi="맑은 고딕"/>
-          <w:color w:val="000000"/>
-          <w:sz w:val="20"/>
-          <w:szCs w:val="20"/>
-        </w:rPr>
-        <w:t xml:space="preserve">. Ollama를 비롯한 대부분의 LLM 서빙 도구는 추론 중단을 지원하지 않아, 5.3절 Short 약 73% 개선은 시뮬레이션에서만 확인 가능하다. 둘째, </w:t>
-      </w:r>
-      <w:r>
-        <w:rPr>
-          <w:rFonts w:ascii="맑은 고딕" w:cs="맑은 고딕" w:eastAsia="맑은 고딕" w:hAnsi="맑은 고딕"/>
-          <w:b/>
-          <w:bCs/>
-          <w:color w:val="000000"/>
-          <w:sz w:val="20"/>
-          <w:szCs w:val="20"/>
-        </w:rPr>
-        <w:t xml:space="preserve">처리 시간 분포가 실제와 다르다</w:t>
-      </w:r>
-      <w:r>
-        <w:rPr>
-          <w:rFonts w:ascii="맑은 고딕" w:cs="맑은 고딕" w:eastAsia="맑은 고딕" w:hAnsi="맑은 고딕"/>
-          <w:color w:val="000000"/>
-          <w:sz w:val="20"/>
-          <w:szCs w:val="20"/>
-        </w:rPr>
-        <w:t xml:space="preserve">. 기본 실험 10~100ms와 달리 실제 LLM 추론은 입력 길이·토큰·모델 크기에 따라 수백 ms~수십 초로 다양하며, 길어질수록 Priority 에이징 효과나 FCFS 호위 효과의 영향이 커진다. 셋째, </w:t>
-      </w:r>
-      <w:r>
-        <w:rPr>
-          <w:rFonts w:ascii="맑은 고딕" w:cs="맑은 고딕" w:eastAsia="맑은 고딕" w:hAnsi="맑은 고딕"/>
-          <w:b/>
-          <w:bCs/>
-          <w:color w:val="000000"/>
-          <w:sz w:val="20"/>
-          <w:szCs w:val="20"/>
-        </w:rPr>
-        <w:t xml:space="preserve">동시 처리를 고려하지 않았다</w:t>
-      </w:r>
-      <w:r>
-        <w:rPr>
-          <w:rFonts w:ascii="맑은 고딕" w:cs="맑은 고딕" w:eastAsia="맑은 고딕" w:hAnsi="맑은 고딕"/>
-          <w:color w:val="000000"/>
-          <w:sz w:val="20"/>
-          <w:szCs w:val="20"/>
-        </w:rPr>
-        <w:t xml:space="preserve">. 한 번에 1건씩 처리하였으나, 실제 LLM 서빙(vLLM, TGI)은 연속 배치로 여러 요청을 동시 처리한다. 한 배치 내부에서는 순서가 영향을 주지 않으므로 WFQ·Priority의 차등 효과는 약해질 수 있다. 넷째, </w:t>
-      </w:r>
-      <w:r>
-        <w:rPr>
-          <w:rFonts w:ascii="맑은 고딕" w:cs="맑은 고딕" w:eastAsia="맑은 고딕" w:hAnsi="맑은 고딕"/>
-          <w:b/>
-          <w:bCs/>
-          <w:color w:val="000000"/>
-          <w:sz w:val="20"/>
-          <w:szCs w:val="20"/>
-        </w:rPr>
-        <w:t xml:space="preserve">실서버 실험 규모가 제한적이다</w:t>
-      </w:r>
-      <w:r>
-        <w:rPr>
-          <w:rFonts w:ascii="맑은 고딕" w:cs="맑은 고딕" w:eastAsia="맑은 고딕" w:hAnsi="맑은 고딕"/>
-          <w:color w:val="000000"/>
-          <w:sz w:val="20"/>
-          <w:szCs w:val="20"/>
-        </w:rPr>
-        <w:t xml:space="preserve">(20건). 대기열 경합이나 극단적 트래픽은 재현하지 못하였으며, 실무 적용에는 대규모 부하 시험이 필요하다.</w:t>
+        <w:t xml:space="preserve">선점형 MLFQ를 실서버에 적용하기가 어렵다</w:t>
+      </w:r>
+      <w:r>
+        <w:rPr>
+          <w:rFonts w:ascii="맑은 고딕" w:cs="맑은 고딕" w:eastAsia="맑은 고딕" w:hAnsi="맑은 고딕"/>
+          <w:color w:val="000000"/>
+          <w:sz w:val="20"/>
+          <w:szCs w:val="20"/>
+        </w:rPr>
+        <w:t xml:space="preserve">는 점이다. Ollama를 비롯한 대부분의 LLM 서빙 도구는 추론 중단을 지원하지 않으므로, 5.3절에서 확인한 Short 약 73% 개선은 시뮬레이션 안에서만 가능하다. 다음으로 처리 시간 분포가 실제와 다르다. 기본 실험은 10~100ms 범위였으나, 실제 LLM 추론은 입력 길이·토큰·모델 크기에 따라 수백 ms에서 수십 초까지 폭이 넓고, 길어질수록 Priority 에이징 효과나 FCFS 호위 효과의 영향이 커진다. 또한 동시 처리도 고려하지 못하였다. 한 번에 1건씩 처리하였으나 실제 LLM 서빙(vLLM, TGI)은 연속 배치로 여러 요청을 동시 처리한다. 한 배치 내부에서는 순서가 영향을 주지 않으므로 WFQ·Priority의 차등 효과는 약해질 수 있다. 끝으로 실서버 실험 규모가 20건으로 제한적이다. 대기열 경합이나 극단적 트래픽은 재현하지 못하였으며, 실무에 적용하려면 대규모 부하 시험이 필요하다.</w:t>
       </w:r>
     </w:p>
     <w:p>
@@ -12286,7 +12127,7 @@
           <w:sz w:val="20"/>
           <w:szCs w:val="20"/>
         </w:rPr>
-        <w:t xml:space="preserve">: 모든 사용자·요청을 동등하게 처리하는 가장 단순한 방식. 구현이 간단해 기본 정책에 적합하다.</w:t>
+        <w:t xml:space="preserve">: 모든 사용자·요청을 동등하게 처리하는 가장 단순한 방식이다. 구현이 간단해 기본 정책으로 두기에 알맞다.</w:t>
       </w:r>
     </w:p>
     <w:p>
@@ -12316,7 +12157,7 @@
           <w:sz w:val="20"/>
           <w:szCs w:val="20"/>
         </w:rPr>
-        <w:t xml:space="preserve">: 긴급도를 직접 지정할 수 있는 환경에 적합. 에이징 효과가 나타나려면 처리 시간이 어느 정도 길어야 한다.</w:t>
+        <w:t xml:space="preserve">: 긴급도를 직접 지정할 수 있는 환경에 적합하다. 다만 에이징 효과가 나타나려면 처리 시간이 어느 정도 길어야 한다.</w:t>
       </w:r>
     </w:p>
     <w:p>
@@ -12346,7 +12187,7 @@
           <w:sz w:val="20"/>
           <w:szCs w:val="20"/>
         </w:rPr>
-        <w:t xml:space="preserve">: 짧은 요청 우대 효과가 뛰어나지만 선점형이 필요해 현재 LLM 서빙 환경에서는 활용 범위가 좁다. 향후 LLM 서빙에 중단·재개 기능이 추가된다면 활용 가능성이 있다.</w:t>
+        <w:t xml:space="preserve">: 짧은 요청 우대 효과가 뛰어나지만 선점형이 필요한 만큼, 현재 LLM 서빙 환경에서는 활용 범위가 좁다. 추론 중단·재개 기능이 추가된다면 활용 가능성이 열린다.</w:t>
       </w:r>
     </w:p>
     <w:p>
@@ -12376,7 +12217,7 @@
           <w:sz w:val="20"/>
           <w:szCs w:val="20"/>
         </w:rPr>
-        <w:t xml:space="preserve">: 구독 등급별 차등 배분이 필요한 유료 서비스에 적합. 비선점형에서도 잘 동작하여 실서버 적용이 가능하다.</w:t>
+        <w:t xml:space="preserve">: 구독 등급별 차등 배분이 필요한 유료 서비스에 적합하다. 비선점형에서도 잘 동작하여 실서버 적용이 가능하다.</w:t>
       </w:r>
     </w:p>
     <w:p>
@@ -12406,7 +12247,7 @@
           <w:sz w:val="20"/>
           <w:szCs w:val="20"/>
         </w:rPr>
-        <w:t xml:space="preserve">이 프로젝트는 두 가지 면에서 의의가 있다. 첫째, CPU 스케줄링(FCFS, Priority, MLFQ)과 네트워크 자원 배분(WFQ) 알고리즘을 LLM API 환경에 적용해 운영체제 이론의 실제 응용을 확인하였다. 둘째, vLLM·TGI 등 기존 LLM 서빙 도구가 전체 처리량 최적화에 집중하여 사용자별 공정성이나 우선순위 관리를 제공하지 않는다는 점을 확인하였다. 본 프로젝트는 이 부분에 스케줄링 이론을 적용하여 알고리즘별 효과를 비교하였다. 특히 WFQ의 가중치 비례 차등 서비스는 유료 LLM 서비스의 구독 등급 관리에 활용할 가능성을 보여준다. 다만 세 실험을 합산하여도 총 3,020건 규모이므로, 대규모 운영 환경에서도 같은 결과가 나올지는 추가 확인이 필요하다.</w:t>
+        <w:t xml:space="preserve">이 프로젝트는 두 가지 면에서 의의가 있다. 우선 CPU 스케줄링(FCFS, Priority, MLFQ)과 네트워크 자원 배분(WFQ) 알고리즘을 LLM API 환경에 적용해 운영체제 이론을 실제 문제에 응용해 본 점이다. 더해서 vLLM·TGI 같은 기존 LLM 서빙 도구가 전체 처리량 최적화에 집중하느라 사용자별 공정성이나 우선순위 관리를 제공하지 않는다는 점을 확인하고, 그 빈자리에 스케줄링 이론을 적용해 알고리즘별 효과를 비교했다는 점도 의미가 있다. 특히 WFQ의 가중치 비례 차등 서비스는 유료 LLM 서비스의 구독 등급 관리에 쓸 수 있는 가능성을 보여준다. 다만 세 실험을 합산해도 총 3,020건 규모이므로, 대규모 운영 환경에서도 같은 결과가 나올지는 추가 확인이 필요하다.</w:t>
       </w:r>
     </w:p>
     <w:p>
@@ -12622,7 +12463,7 @@
           <w:sz w:val="20"/>
           <w:szCs w:val="20"/>
         </w:rPr>
-        <w:t xml:space="preserve">: 현재 대시보드는 주기적 조회(폴링) 방식으로 상태를 갱신한다. WebSocket(서버가 클라이언트에 실시간으로 알림을 보낼 수 있는 웹 통신 방식) 기반 푸시 갱신, 사용자 인증, JFI 추이 그래프 등을 추가하면 운영 환경 모니터링 도구로 확장할 수 있다.</w:t>
+        <w:t xml:space="preserve">: 현재 대시보드는 주기적 조회(폴링) 방식으로 상태를 갱신한다. WebSocket(서버가 클라이언트에 실시간으로 알림을 보낼 수 있는 웹 통신 방식) 기반 푸시 갱신, 사용자 인증, JFI 추이 그래프 등을 더하면 운영 환경 모니터링 도구로 확장할 수 있다.</w:t>
       </w:r>
     </w:p>
     <w:p>
@@ -12652,7 +12493,7 @@
           <w:sz w:val="20"/>
           <w:szCs w:val="20"/>
         </w:rPr>
-        <w:t xml:space="preserve">: 본 실험은 등급당 1명씩 배치한 구성이었다 (5.5절). 같은 등급에 여러 사용자가 있을 때의 균등 배분(등급 내 JFI)을 확인하려면 등급당 N명을 동시에 배치한 반복 실험이 필요하다.</w:t>
+        <w:t xml:space="preserve">: 이번 실험은 등급당 1명씩 배치한 구성이었다 (5.5절). 같은 등급에 여러 사용자가 있을 때의 균등 배분(등급 내 JFI)을 확인하려면 등급당 N명을 동시에 배치한 반복 실험이 필요하다.</w:t>
       </w:r>
     </w:p>
     <w:p>
@@ -12682,7 +12523,7 @@
           <w:sz w:val="20"/>
           <w:szCs w:val="20"/>
         </w:rPr>
-        <w:t xml:space="preserve">: 수천 건 이상의 요청, 더 많은 사용자, 더 긴 처리 시간 환경에서 각 알고리즘의 특성을 추가 확인할 수 있다.</w:t>
+        <w:t xml:space="preserve">: 수천 건 이상의 요청, 더 많은 사용자, 더 긴 처리 시간 환경에서 각 알고리즘의 특성을 추가로 확인할 수 있다.</w:t>
       </w:r>
     </w:p>
     <w:p>

</xml_diff>

<commit_message>
Refactor code structure and optimize performance across multiple modules
</commit_message>
<xml_diff>
--- a/06-final-report/final/final-report.docx
+++ b/06-final-report/final/final-report.docx
@@ -757,7 +757,7 @@
           <w:sz w:val="20"/>
           <w:szCs w:val="20"/>
         </w:rPr>
-        <w:t>는 도착 순서대로 처리하는 가장 단순한 스케줄링 방식이며, 운영체제의 일괄 처리 시대부터 사용된 고전 기법이다. 새 요청이 도착하면 대기열의 맨 뒤에 추가되고, 처리는 항상 맨 앞 요청부터 시작된다. 한 요청이 처리되는 동안 다른 요청은 끼어들 수 없으며 비선점형으로만 동작한다. 구현이 매우 쉽고 별도 자료구조도 필요 없다. 어느 요청이든 차례가 오기 마련이므로 기아(Starvation, 특정 요청이 영원히 처리되지 못하는 현상)는 일어나지 않는다. 다만 긴 요청이 앞에 있으면 뒤에 있는 짧은 요청들이 모두 지연되는 호위 효과(Convoy Effect)가 생긴다 [3]. 우선순위나 등급은 고려하지 않으므로 긴급 요청을 따로 빠르게 처리하지 못한다. 이 알고리즘은 다른 세 알고리즘과 비교할 때 기준선 역할을 한다.</w:t>
+        <w:t>는 도착 순서대로 한 건씩 처리하는 가장 단순한 비선점형 스케줄링 방식이다 [3]. 우선순위나 등급을 전혀 고려하지 않으므로, 다른 세 알고리즘의 효과를 같은 조건에서 비교하기 위한 기준선(baseline)으로 채택하였다.</w:t>
       </w:r>
     </w:p>
     <w:p>
@@ -785,7 +785,7 @@
           <w:sz w:val="20"/>
           <w:szCs w:val="20"/>
         </w:rPr>
-        <w:t>은 각 요청에 우선순위를 부여하여 긴급한 요청을 먼저 처리하는 알고리즘이다. 운영체제에서는 시스템 프로세스나 인터럽트 처리에 우선권을 주기 위해 폭넓게 사용된다. 대기열에서 요청을 꺼낼 때 가장 높은 우선순위의 요청을 먼저 선택하며, 같은 우선순위 요청들 사이에서는 도착 순서대로 처리한다. 구현은 우선순위 큐(Priority Queue) 자료구조를 쓰면 단순해진다. 낮은 우선순위 요청은 계속 밀려나 끝내 처리되지 못하는 기아 현상에 빠질 수 있다는 단점이 있다. 이를 막으려고 오래 기다린 요청의 우선순위를 점차 올려주는 에이징(Aging) 기법을 적용하였다 [3]. 단, 긴급도를 사람이 직접 지정해야 하므로 자동 분류는 어렵다. 사용자가 요청마다 긴급도를 지정할 수 있는 LLM API 환경에 잘 맞아 채택하였다.</w:t>
+        <w:t>은 각 요청에 우선순위를 부여하고 가장 높은 우선순위의 요청부터 처리하는 알고리즘이다 [3]. 사용자가 요청마다 긴급도를 직접 지정할 수 있는 LLM API 환경에 그대로 대응되어 채택하였다. 낮은 우선순위 요청이 무한정 밀려 처리되지 못하는 기아(Starvation) 현상을 막기 위해, 오래 대기한 요청의 우선순위를 점차 올려주는 에이징(Aging) 기법을 함께 적용하였다.</w:t>
       </w:r>
     </w:p>
     <w:p>
@@ -813,7 +813,7 @@
           <w:sz w:val="20"/>
           <w:szCs w:val="20"/>
         </w:rPr>
-        <w:t>는 여러 단계의 대기열을 두고 작업 특성에 따라 우선순위를 자동으로 조정하는 알고리즘이다. 이 알고리즘의 가장 큰 특징은, 어떤 요청이 짧은지 미리 모르더라도 실행 시간을 관찰해 자동으로 분류한다는 점이다. 새 요청은 최상위 큐에 들어가고, 시간 할당량(Time Quantum, 한 번에 쓸 수 있는 최대 시간) 안에 끝나지 않으면 하위 큐로 내려간다 [3]. 처리할 때는 상위 큐가 비어 있을 때만 하위 큐를 본다. 그래서 짧은 요청은 빠르게 끝나고 긴 요청은 점점 아래로 밀린다. 하위 큐로만 계속 밀리면 기아 상태가 되므로, 일정 주기로 모든 요청을 다시 최상위 큐로 끌어올리는 부스팅(Boosting) 규칙을 두었다. 짧은 요청의 응답 속도가 빠르고 작업 특성을 미리 알 필요가 없어 범용성이 높다는 점이 장점이다. 반면 시간 할당량 단위로 실행을 중단하고 다시 시작할 수 있어야만 효과가 나타나므로, 추론 중단이 불가능한 LLM 서빙 도구에서는 적용에 제약이 있다. 이론적 효과와 실용적 한계를 모두 살펴보고자 시뮬레이션에서는 선점형과 비선점형을 함께 비교하고, 실서버에서는 비선점형만 적용하였다.</w:t>
+        <w:t>는 여러 단계의 대기열을 두고 실행 시간을 관찰해 우선순위를 자동 조정함으로써, 사전 정보 없이도 짧은 요청의 응답 속도를 높이는 알고리즘이다 [3]. 출력 토큰 수를 미리 알 수 없는 LLM 환경에서 짧은 요청 우대 효과를 검증할 수 있어 채택하였다. 다만 시간 할당량 단위로 실행을 중단하고 재개할 수 있어야 효과가 나타나므로, 추론 중단을 지원하지 않는 Ollama에는 비선점형으로만 적용하고, 이론적 개선폭은 시뮬레이션의 선점형 모드로 따로 검증하였다 (5.3절).</w:t>
       </w:r>
     </w:p>
     <w:p>
@@ -841,7 +841,7 @@
           <w:sz w:val="20"/>
           <w:szCs w:val="20"/>
         </w:rPr>
-        <w:t>는 네트워크 라우터에서 한정된 대역폭을 여러 흐름이 공평하게 나누어 쓰도록 만들어진 알고리즘이다 [4]. 원래 네트워크 트래픽의 QoS(Quality of Service) 보장을 위한 것으로, 인터넷 라우터에 널리 쓰인다. 자원을 완벽히 공평하게 나누는 이상적 모델인 GPS(Generalized Processor Sharing)에 가깝게 동작하도록, 각 요청에 가상 완료 시각(Virtual Finish Time, VFT)을 부여한다. 가상 완료 시각이 가장 작은 요청부터 처리하며, 가중치가 큰 사용자의 VFT는 천천히 증가해 결과적으로 더 자주 처리된다. 가중치 비율에 따라 자원을 비례 배분하므로 사용자별 차등 서비스를 자연스럽게 구현할 수 있다. 처리 중단 없이도 가중치 차등이 작동하므로 비선점형 환경에 적용할 수 있다. 덕분에 Ollama처럼 추론 중단이 불가능한 LLM 서빙 도구에서도 쓸 수 있다. 다만 모든 요청에 대해 VFT를 계산하고 정렬해야 하므로 단순 큐보다 연산 비용이 크다. 구독 등급별 차등 서비스를 구현할 알고리즘으로 사용하였으며, 자세한 VFT 계산은 4.3절에서 다룬다.</w:t>
+        <w:t>는 네트워크 라우터에서 가중치 비율에 따라 대역폭을 비례 배분하기 위해 제안된 알고리즘이다 [4]. 각 요청에 부여된 가상 완료 시각(Virtual Finish Time, VFT)이 가장 작은 요청부터 처리하므로 가중치가 큰 사용자가 더 자주 처리되며, 처리 중단 없이도 차등이 작동하기 때문에 비선점형 LLM 서빙 환경에 그대로 적용할 수 있다. 구독 등급별 차등 서비스를 구현할 알고리즘으로 채택하였으며, VFT 계산 방식은 4.3절에서 다룬다.</w:t>
       </w:r>
     </w:p>
     <w:p>

</xml_diff>

<commit_message>
Update presentation materials: modified handout.pdf and presentation.pptx
</commit_message>
<xml_diff>
--- a/06-final-report/final/final-report.docx
+++ b/06-final-report/final/final-report.docx
@@ -2920,7 +2920,7 @@
           <w:sz w:val="20"/>
           <w:szCs w:val="20"/>
         </w:rPr>
-        <w:t xml:space="preserve">소스 코드는 핵심 모듈과 보조 요소로 구성된다 (그림 3). 핵심 모듈은 다섯 가지로, api(REST 라우터), schedulers(4개 알고리즘), queue(메모리 대기열), storage(JSON 기록), llm(Ollama 호출)이다. 보조 요소에는 index.js(메인 진입점), server.js(Express 서버 구성 모듈), rate-limiter가 있다. `npm start`로 실행하면 index.js가 server.js의 `createServer()`를 호출해 Express 서버를 띄운다.</w:t>
+        <w:t xml:space="preserve">소스 코드는 핵심 모듈과 보조 요소로 구성된다 (그림 3). 핵심 모듈은 다섯 가지로, api(REST API 라우터), schedulers(4개 알고리즘), queue(메모리 큐), storage(JSON 파일 저장), llm(Ollama 연동)이다. 보조 요소로는 index.js(메인 진입점), server.js(Express 서버 구성), utils/rateLimiter.js(요청 제한) 등이 있다. `npm start`로 실행하면 index.js가 server.js의 `createServer()`를 호출해 Express 서버를 띄운다.</w:t>
       </w:r>
     </w:p>
     <w:p>
@@ -3062,7 +3062,116 @@
           <w:sz w:val="20"/>
           <w:szCs w:val="20"/>
         </w:rPr>
-        <w:t xml:space="preserve"> OSTEP [3]의 5가지 규칙에 따라 구현하였다 (표 3).</w:t>
+        <w:t xml:space="preserve"> OSTEP [3]의 5가지 규칙에 따라 구현하였다. MLFQ는 4개의 우선순위 큐(Q0~Q3)를 두는데, Q0이 최상위 큐(우선순위 가장 높음)이고 Q3이 최하위 큐이다.</w:t>
+      </w:r>
+    </w:p>
+    <w:p>
+      <w:pPr>
+        <w:pStyle w:val="ListParagraph"/>
+        <w:numPr>
+          <w:ilvl w:val="0"/>
+          <w:numId w:val="3"/>
+        </w:numPr>
+        <w:spacing w:after="80" w:line="240"/>
+      </w:pPr>
+      <w:r>
+        <w:rPr>
+          <w:rFonts w:ascii="맑은 고딕" w:cs="맑은 고딕" w:eastAsia="맑은 고딕" w:hAnsi="맑은 고딕"/>
+          <w:color w:val="000000"/>
+          <w:sz w:val="20"/>
+          <w:szCs w:val="20"/>
+        </w:rPr>
+        <w:t xml:space="preserve">Rule 1: 상위 큐가 하위 큐보다 먼저 처리</w:t>
+      </w:r>
+    </w:p>
+    <w:p>
+      <w:pPr>
+        <w:pStyle w:val="ListParagraph"/>
+        <w:numPr>
+          <w:ilvl w:val="0"/>
+          <w:numId w:val="3"/>
+        </w:numPr>
+        <w:spacing w:after="80" w:line="240"/>
+      </w:pPr>
+      <w:r>
+        <w:rPr>
+          <w:rFonts w:ascii="맑은 고딕" w:cs="맑은 고딕" w:eastAsia="맑은 고딕" w:hAnsi="맑은 고딕"/>
+          <w:color w:val="000000"/>
+          <w:sz w:val="20"/>
+          <w:szCs w:val="20"/>
+        </w:rPr>
+        <w:t xml:space="preserve">Rule 2: 같은 큐 안에서는 도착 순서대로</w:t>
+      </w:r>
+    </w:p>
+    <w:p>
+      <w:pPr>
+        <w:pStyle w:val="ListParagraph"/>
+        <w:numPr>
+          <w:ilvl w:val="0"/>
+          <w:numId w:val="3"/>
+        </w:numPr>
+        <w:spacing w:after="80" w:line="240"/>
+      </w:pPr>
+      <w:r>
+        <w:rPr>
+          <w:rFonts w:ascii="맑은 고딕" w:cs="맑은 고딕" w:eastAsia="맑은 고딕" w:hAnsi="맑은 고딕"/>
+          <w:color w:val="000000"/>
+          <w:sz w:val="20"/>
+          <w:szCs w:val="20"/>
+        </w:rPr>
+        <w:t xml:space="preserve">Rule 3: 새 요청은 Q0로 삽입</w:t>
+      </w:r>
+    </w:p>
+    <w:p>
+      <w:pPr>
+        <w:pStyle w:val="ListParagraph"/>
+        <w:numPr>
+          <w:ilvl w:val="0"/>
+          <w:numId w:val="3"/>
+        </w:numPr>
+        <w:spacing w:after="80" w:line="240"/>
+      </w:pPr>
+      <w:r>
+        <w:rPr>
+          <w:rFonts w:ascii="맑은 고딕" w:cs="맑은 고딕" w:eastAsia="맑은 고딕" w:hAnsi="맑은 고딕"/>
+          <w:color w:val="000000"/>
+          <w:sz w:val="20"/>
+          <w:szCs w:val="20"/>
+        </w:rPr>
+        <w:t xml:space="preserve">Rule 4: 할당량 소진 시 하위 큐로 강등</w:t>
+      </w:r>
+    </w:p>
+    <w:p>
+      <w:pPr>
+        <w:pStyle w:val="ListParagraph"/>
+        <w:numPr>
+          <w:ilvl w:val="0"/>
+          <w:numId w:val="3"/>
+        </w:numPr>
+        <w:spacing w:after="80" w:line="240"/>
+      </w:pPr>
+      <w:r>
+        <w:rPr>
+          <w:rFonts w:ascii="맑은 고딕" w:cs="맑은 고딕" w:eastAsia="맑은 고딕" w:hAnsi="맑은 고딕"/>
+          <w:color w:val="000000"/>
+          <w:sz w:val="20"/>
+          <w:szCs w:val="20"/>
+        </w:rPr>
+        <w:t xml:space="preserve">Rule 5: 일정 주기마다 모두 Q0로 부스팅</w:t>
+      </w:r>
+    </w:p>
+    <w:p>
+      <w:pPr>
+        <w:spacing w:after="120" w:line="240"/>
+      </w:pPr>
+      <w:r>
+        <w:rPr>
+          <w:rFonts w:ascii="맑은 고딕" w:cs="맑은 고딕" w:eastAsia="맑은 고딕" w:hAnsi="맑은 고딕"/>
+          <w:color w:val="000000"/>
+          <w:sz w:val="20"/>
+          <w:szCs w:val="20"/>
+        </w:rPr>
+        <w:t xml:space="preserve">큐별 시간 할당량은 표 3과 같다.</w:t>
       </w:r>
     </w:p>
     <w:p>
@@ -3078,1266 +3187,7 @@
           <w:sz w:val="20"/>
           <w:szCs w:val="20"/>
         </w:rPr>
-        <w:t xml:space="preserve">표 3. MLFQ 규칙 및 큐별 시간 할당량</w:t>
-      </w:r>
-    </w:p>
-    <w:tbl>
-      <w:tblPr>
-        <w:tblW w:type="auto" w:w="100"/>
-        <w:tblBorders>
-          <w:top w:val="single" w:color="auto" w:sz="4"/>
-          <w:left w:val="single" w:color="auto" w:sz="4"/>
-          <w:bottom w:val="single" w:color="auto" w:sz="4"/>
-          <w:right w:val="single" w:color="auto" w:sz="4"/>
-          <w:insideH w:val="single" w:color="auto" w:sz="4"/>
-          <w:insideV w:val="single" w:color="auto" w:sz="4"/>
-        </w:tblBorders>
-      </w:tblPr>
-      <w:tblGrid>
-        <w:gridCol w:w="1983"/>
-        <w:gridCol w:w="1983"/>
-        <w:gridCol w:w="1983"/>
-        <w:gridCol w:w="1983"/>
-      </w:tblGrid>
-      <w:tr>
-        <w:tc>
-          <w:tcPr>
-            <w:tcW w:type="dxa" w:w="1983"/>
-            <w:tcBorders>
-              <w:top w:val="single" w:color="AAAAAA" w:sz="1"/>
-              <w:left w:val="single" w:color="AAAAAA" w:sz="1"/>
-              <w:bottom w:val="single" w:color="AAAAAA" w:sz="1"/>
-              <w:right w:val="single" w:color="AAAAAA" w:sz="1"/>
-            </w:tcBorders>
-            <w:shd w:fill="D9E2F3" w:val="clear"/>
-            <w:vAlign w:val="center"/>
-          </w:tcPr>
-          <w:p>
-            <w:pPr>
-              <w:spacing w:after="40" w:before="40"/>
-              <w:jc w:val="center"/>
-            </w:pPr>
-            <w:r>
-              <w:rPr>
-                <w:rFonts w:ascii="맑은 고딕" w:cs="맑은 고딕" w:eastAsia="맑은 고딕" w:hAnsi="맑은 고딕"/>
-                <w:b/>
-                <w:bCs/>
-                <w:color w:val="000000"/>
-                <w:sz w:val="18"/>
-                <w:szCs w:val="18"/>
-              </w:rPr>
-              <w:t xml:space="preserve">규칙</w:t>
-            </w:r>
-          </w:p>
-        </w:tc>
-        <w:tc>
-          <w:tcPr>
-            <w:tcW w:type="dxa" w:w="1983"/>
-            <w:tcBorders>
-              <w:top w:val="single" w:color="AAAAAA" w:sz="1"/>
-              <w:left w:val="single" w:color="AAAAAA" w:sz="1"/>
-              <w:bottom w:val="single" w:color="AAAAAA" w:sz="1"/>
-              <w:right w:val="single" w:color="AAAAAA" w:sz="1"/>
-            </w:tcBorders>
-            <w:shd w:fill="D9E2F3" w:val="clear"/>
-            <w:vAlign w:val="center"/>
-          </w:tcPr>
-          <w:p>
-            <w:pPr>
-              <w:spacing w:after="40" w:before="40"/>
-              <w:jc w:val="center"/>
-            </w:pPr>
-            <w:r>
-              <w:rPr>
-                <w:rFonts w:ascii="맑은 고딕" w:cs="맑은 고딕" w:eastAsia="맑은 고딕" w:hAnsi="맑은 고딕"/>
-                <w:b/>
-                <w:bCs/>
-                <w:color w:val="000000"/>
-                <w:sz w:val="18"/>
-                <w:szCs w:val="18"/>
-              </w:rPr>
-              <w:t xml:space="preserve">설명</w:t>
-            </w:r>
-          </w:p>
-        </w:tc>
-        <w:tc>
-          <w:tcPr>
-            <w:tcW w:type="dxa" w:w="1983"/>
-            <w:tcBorders>
-              <w:top w:val="single" w:color="AAAAAA" w:sz="1"/>
-              <w:left w:val="single" w:color="AAAAAA" w:sz="1"/>
-              <w:bottom w:val="single" w:color="AAAAAA" w:sz="1"/>
-              <w:right w:val="single" w:color="AAAAAA" w:sz="1"/>
-            </w:tcBorders>
-            <w:shd w:fill="D9E2F3" w:val="clear"/>
-            <w:vAlign w:val="center"/>
-          </w:tcPr>
-          <w:p>
-            <w:pPr>
-              <w:spacing w:after="40" w:before="40"/>
-              <w:jc w:val="center"/>
-            </w:pPr>
-            <w:r>
-              <w:rPr>
-                <w:rFonts w:ascii="맑은 고딕" w:cs="맑은 고딕" w:eastAsia="맑은 고딕" w:hAnsi="맑은 고딕"/>
-                <w:b/>
-                <w:bCs/>
-                <w:color w:val="000000"/>
-                <w:sz w:val="18"/>
-                <w:szCs w:val="18"/>
-              </w:rPr>
-              <w:t xml:space="preserve">큐</w:t>
-            </w:r>
-          </w:p>
-        </w:tc>
-        <w:tc>
-          <w:tcPr>
-            <w:tcW w:type="dxa" w:w="1983"/>
-            <w:tcBorders>
-              <w:top w:val="single" w:color="AAAAAA" w:sz="1"/>
-              <w:left w:val="single" w:color="AAAAAA" w:sz="1"/>
-              <w:bottom w:val="single" w:color="AAAAAA" w:sz="1"/>
-              <w:right w:val="single" w:color="AAAAAA" w:sz="1"/>
-            </w:tcBorders>
-            <w:shd w:fill="D9E2F3" w:val="clear"/>
-            <w:vAlign w:val="center"/>
-          </w:tcPr>
-          <w:p>
-            <w:pPr>
-              <w:spacing w:after="40" w:before="40"/>
-              <w:jc w:val="center"/>
-            </w:pPr>
-            <w:r>
-              <w:rPr>
-                <w:rFonts w:ascii="맑은 고딕" w:cs="맑은 고딕" w:eastAsia="맑은 고딕" w:hAnsi="맑은 고딕"/>
-                <w:b/>
-                <w:bCs/>
-                <w:color w:val="000000"/>
-                <w:sz w:val="18"/>
-                <w:szCs w:val="18"/>
-              </w:rPr>
-              <w:t xml:space="preserve">시간 할당량</w:t>
-            </w:r>
-          </w:p>
-        </w:tc>
-      </w:tr>
-      <w:tr>
-        <w:tc>
-          <w:tcPr>
-            <w:tcW w:type="dxa" w:w="1983"/>
-            <w:tcBorders>
-              <w:top w:val="single" w:color="AAAAAA" w:sz="1"/>
-              <w:left w:val="single" w:color="AAAAAA" w:sz="1"/>
-              <w:bottom w:val="single" w:color="AAAAAA" w:sz="1"/>
-              <w:right w:val="single" w:color="AAAAAA" w:sz="1"/>
-            </w:tcBorders>
-            <w:vAlign w:val="center"/>
-          </w:tcPr>
-          <w:p>
-            <w:pPr>
-              <w:spacing w:after="40" w:before="40"/>
-              <w:jc w:val="left"/>
-            </w:pPr>
-            <w:r>
-              <w:rPr>
-                <w:rFonts w:ascii="맑은 고딕" w:cs="맑은 고딕" w:eastAsia="맑은 고딕" w:hAnsi="맑은 고딕"/>
-                <w:b w:val="false"/>
-                <w:bCs w:val="false"/>
-                <w:color w:val="000000"/>
-                <w:sz w:val="18"/>
-                <w:szCs w:val="18"/>
-              </w:rPr>
-              <w:t xml:space="preserve">Rule 1</w:t>
-            </w:r>
-          </w:p>
-        </w:tc>
-        <w:tc>
-          <w:tcPr>
-            <w:tcW w:type="dxa" w:w="1983"/>
-            <w:tcBorders>
-              <w:top w:val="single" w:color="AAAAAA" w:sz="1"/>
-              <w:left w:val="single" w:color="AAAAAA" w:sz="1"/>
-              <w:bottom w:val="single" w:color="AAAAAA" w:sz="1"/>
-              <w:right w:val="single" w:color="AAAAAA" w:sz="1"/>
-            </w:tcBorders>
-            <w:vAlign w:val="center"/>
-          </w:tcPr>
-          <w:p>
-            <w:pPr>
-              <w:spacing w:after="40" w:before="40"/>
-              <w:jc w:val="left"/>
-            </w:pPr>
-            <w:r>
-              <w:rPr>
-                <w:rFonts w:ascii="맑은 고딕" w:cs="맑은 고딕" w:eastAsia="맑은 고딕" w:hAnsi="맑은 고딕"/>
-                <w:b w:val="false"/>
-                <w:bCs w:val="false"/>
-                <w:color w:val="000000"/>
-                <w:sz w:val="18"/>
-                <w:szCs w:val="18"/>
-              </w:rPr>
-              <w:t xml:space="preserve">높은 큐가 낮은 큐보다 먼저 처리</w:t>
-            </w:r>
-          </w:p>
-        </w:tc>
-        <w:tc>
-          <w:tcPr>
-            <w:tcW w:type="dxa" w:w="1983"/>
-            <w:tcBorders>
-              <w:top w:val="single" w:color="AAAAAA" w:sz="1"/>
-              <w:left w:val="single" w:color="AAAAAA" w:sz="1"/>
-              <w:bottom w:val="single" w:color="AAAAAA" w:sz="1"/>
-              <w:right w:val="single" w:color="AAAAAA" w:sz="1"/>
-            </w:tcBorders>
-            <w:vAlign w:val="center"/>
-          </w:tcPr>
-          <w:p>
-            <w:pPr>
-              <w:spacing w:after="40" w:before="40"/>
-              <w:jc w:val="left"/>
-            </w:pPr>
-            <w:r>
-              <w:rPr>
-                <w:rFonts w:ascii="맑은 고딕" w:cs="맑은 고딕" w:eastAsia="맑은 고딕" w:hAnsi="맑은 고딕"/>
-                <w:b w:val="false"/>
-                <w:bCs w:val="false"/>
-                <w:color w:val="000000"/>
-                <w:sz w:val="18"/>
-                <w:szCs w:val="18"/>
-              </w:rPr>
-              <w:t xml:space="preserve">Q0</w:t>
-            </w:r>
-          </w:p>
-        </w:tc>
-        <w:tc>
-          <w:tcPr>
-            <w:tcW w:type="dxa" w:w="1983"/>
-            <w:tcBorders>
-              <w:top w:val="single" w:color="AAAAAA" w:sz="1"/>
-              <w:left w:val="single" w:color="AAAAAA" w:sz="1"/>
-              <w:bottom w:val="single" w:color="AAAAAA" w:sz="1"/>
-              <w:right w:val="single" w:color="AAAAAA" w:sz="1"/>
-            </w:tcBorders>
-            <w:vAlign w:val="center"/>
-          </w:tcPr>
-          <w:p>
-            <w:pPr>
-              <w:spacing w:after="40" w:before="40"/>
-              <w:jc w:val="left"/>
-            </w:pPr>
-            <w:r>
-              <w:rPr>
-                <w:rFonts w:ascii="맑은 고딕" w:cs="맑은 고딕" w:eastAsia="맑은 고딕" w:hAnsi="맑은 고딕"/>
-                <w:b w:val="false"/>
-                <w:bCs w:val="false"/>
-                <w:color w:val="000000"/>
-                <w:sz w:val="18"/>
-                <w:szCs w:val="18"/>
-              </w:rPr>
-              <w:t xml:space="preserve">1,000ms</w:t>
-            </w:r>
-          </w:p>
-        </w:tc>
-      </w:tr>
-      <w:tr>
-        <w:tc>
-          <w:tcPr>
-            <w:tcW w:type="dxa" w:w="1983"/>
-            <w:tcBorders>
-              <w:top w:val="single" w:color="AAAAAA" w:sz="1"/>
-              <w:left w:val="single" w:color="AAAAAA" w:sz="1"/>
-              <w:bottom w:val="single" w:color="AAAAAA" w:sz="1"/>
-              <w:right w:val="single" w:color="AAAAAA" w:sz="1"/>
-            </w:tcBorders>
-            <w:vAlign w:val="center"/>
-          </w:tcPr>
-          <w:p>
-            <w:pPr>
-              <w:spacing w:after="40" w:before="40"/>
-              <w:jc w:val="left"/>
-            </w:pPr>
-            <w:r>
-              <w:rPr>
-                <w:rFonts w:ascii="맑은 고딕" w:cs="맑은 고딕" w:eastAsia="맑은 고딕" w:hAnsi="맑은 고딕"/>
-                <w:b w:val="false"/>
-                <w:bCs w:val="false"/>
-                <w:color w:val="000000"/>
-                <w:sz w:val="18"/>
-                <w:szCs w:val="18"/>
-              </w:rPr>
-              <w:t xml:space="preserve">Rule 2</w:t>
-            </w:r>
-          </w:p>
-        </w:tc>
-        <w:tc>
-          <w:tcPr>
-            <w:tcW w:type="dxa" w:w="1983"/>
-            <w:tcBorders>
-              <w:top w:val="single" w:color="AAAAAA" w:sz="1"/>
-              <w:left w:val="single" w:color="AAAAAA" w:sz="1"/>
-              <w:bottom w:val="single" w:color="AAAAAA" w:sz="1"/>
-              <w:right w:val="single" w:color="AAAAAA" w:sz="1"/>
-            </w:tcBorders>
-            <w:vAlign w:val="center"/>
-          </w:tcPr>
-          <w:p>
-            <w:pPr>
-              <w:spacing w:after="40" w:before="40"/>
-              <w:jc w:val="left"/>
-            </w:pPr>
-            <w:r>
-              <w:rPr>
-                <w:rFonts w:ascii="맑은 고딕" w:cs="맑은 고딕" w:eastAsia="맑은 고딕" w:hAnsi="맑은 고딕"/>
-                <w:b w:val="false"/>
-                <w:bCs w:val="false"/>
-                <w:color w:val="000000"/>
-                <w:sz w:val="18"/>
-                <w:szCs w:val="18"/>
-              </w:rPr>
-              <w:t xml:space="preserve">같은 큐 안에서는 도착 순서대로</w:t>
-            </w:r>
-          </w:p>
-        </w:tc>
-        <w:tc>
-          <w:tcPr>
-            <w:tcW w:type="dxa" w:w="1983"/>
-            <w:tcBorders>
-              <w:top w:val="single" w:color="AAAAAA" w:sz="1"/>
-              <w:left w:val="single" w:color="AAAAAA" w:sz="1"/>
-              <w:bottom w:val="single" w:color="AAAAAA" w:sz="1"/>
-              <w:right w:val="single" w:color="AAAAAA" w:sz="1"/>
-            </w:tcBorders>
-            <w:vAlign w:val="center"/>
-          </w:tcPr>
-          <w:p>
-            <w:pPr>
-              <w:spacing w:after="40" w:before="40"/>
-              <w:jc w:val="left"/>
-            </w:pPr>
-            <w:r>
-              <w:rPr>
-                <w:rFonts w:ascii="맑은 고딕" w:cs="맑은 고딕" w:eastAsia="맑은 고딕" w:hAnsi="맑은 고딕"/>
-                <w:b w:val="false"/>
-                <w:bCs w:val="false"/>
-                <w:color w:val="000000"/>
-                <w:sz w:val="18"/>
-                <w:szCs w:val="18"/>
-              </w:rPr>
-              <w:t xml:space="preserve">Q1</w:t>
-            </w:r>
-          </w:p>
-        </w:tc>
-        <w:tc>
-          <w:tcPr>
-            <w:tcW w:type="dxa" w:w="1983"/>
-            <w:tcBorders>
-              <w:top w:val="single" w:color="AAAAAA" w:sz="1"/>
-              <w:left w:val="single" w:color="AAAAAA" w:sz="1"/>
-              <w:bottom w:val="single" w:color="AAAAAA" w:sz="1"/>
-              <w:right w:val="single" w:color="AAAAAA" w:sz="1"/>
-            </w:tcBorders>
-            <w:vAlign w:val="center"/>
-          </w:tcPr>
-          <w:p>
-            <w:pPr>
-              <w:spacing w:after="40" w:before="40"/>
-              <w:jc w:val="left"/>
-            </w:pPr>
-            <w:r>
-              <w:rPr>
-                <w:rFonts w:ascii="맑은 고딕" w:cs="맑은 고딕" w:eastAsia="맑은 고딕" w:hAnsi="맑은 고딕"/>
-                <w:b w:val="false"/>
-                <w:bCs w:val="false"/>
-                <w:color w:val="000000"/>
-                <w:sz w:val="18"/>
-                <w:szCs w:val="18"/>
-              </w:rPr>
-              <w:t xml:space="preserve">3,000ms</w:t>
-            </w:r>
-          </w:p>
-        </w:tc>
-      </w:tr>
-      <w:tr>
-        <w:tc>
-          <w:tcPr>
-            <w:tcW w:type="dxa" w:w="1983"/>
-            <w:tcBorders>
-              <w:top w:val="single" w:color="AAAAAA" w:sz="1"/>
-              <w:left w:val="single" w:color="AAAAAA" w:sz="1"/>
-              <w:bottom w:val="single" w:color="AAAAAA" w:sz="1"/>
-              <w:right w:val="single" w:color="AAAAAA" w:sz="1"/>
-            </w:tcBorders>
-            <w:vAlign w:val="center"/>
-          </w:tcPr>
-          <w:p>
-            <w:pPr>
-              <w:spacing w:after="40" w:before="40"/>
-              <w:jc w:val="left"/>
-            </w:pPr>
-            <w:r>
-              <w:rPr>
-                <w:rFonts w:ascii="맑은 고딕" w:cs="맑은 고딕" w:eastAsia="맑은 고딕" w:hAnsi="맑은 고딕"/>
-                <w:b w:val="false"/>
-                <w:bCs w:val="false"/>
-                <w:color w:val="000000"/>
-                <w:sz w:val="18"/>
-                <w:szCs w:val="18"/>
-              </w:rPr>
-              <w:t xml:space="preserve">Rule 3</w:t>
-            </w:r>
-          </w:p>
-        </w:tc>
-        <w:tc>
-          <w:tcPr>
-            <w:tcW w:type="dxa" w:w="1983"/>
-            <w:tcBorders>
-              <w:top w:val="single" w:color="AAAAAA" w:sz="1"/>
-              <w:left w:val="single" w:color="AAAAAA" w:sz="1"/>
-              <w:bottom w:val="single" w:color="AAAAAA" w:sz="1"/>
-              <w:right w:val="single" w:color="AAAAAA" w:sz="1"/>
-            </w:tcBorders>
-            <w:vAlign w:val="center"/>
-          </w:tcPr>
-          <w:p>
-            <w:pPr>
-              <w:spacing w:after="40" w:before="40"/>
-              <w:jc w:val="left"/>
-            </w:pPr>
-            <w:r>
-              <w:rPr>
-                <w:rFonts w:ascii="맑은 고딕" w:cs="맑은 고딕" w:eastAsia="맑은 고딕" w:hAnsi="맑은 고딕"/>
-                <w:b w:val="false"/>
-                <w:bCs w:val="false"/>
-                <w:color w:val="000000"/>
-                <w:sz w:val="18"/>
-                <w:szCs w:val="18"/>
-              </w:rPr>
-              <w:t xml:space="preserve">새 요청은 Q0로 삽입</w:t>
-            </w:r>
-          </w:p>
-        </w:tc>
-        <w:tc>
-          <w:tcPr>
-            <w:tcW w:type="dxa" w:w="1983"/>
-            <w:tcBorders>
-              <w:top w:val="single" w:color="AAAAAA" w:sz="1"/>
-              <w:left w:val="single" w:color="AAAAAA" w:sz="1"/>
-              <w:bottom w:val="single" w:color="AAAAAA" w:sz="1"/>
-              <w:right w:val="single" w:color="AAAAAA" w:sz="1"/>
-            </w:tcBorders>
-            <w:vAlign w:val="center"/>
-          </w:tcPr>
-          <w:p>
-            <w:pPr>
-              <w:spacing w:after="40" w:before="40"/>
-              <w:jc w:val="left"/>
-            </w:pPr>
-            <w:r>
-              <w:rPr>
-                <w:rFonts w:ascii="맑은 고딕" w:cs="맑은 고딕" w:eastAsia="맑은 고딕" w:hAnsi="맑은 고딕"/>
-                <w:b w:val="false"/>
-                <w:bCs w:val="false"/>
-                <w:color w:val="000000"/>
-                <w:sz w:val="18"/>
-                <w:szCs w:val="18"/>
-              </w:rPr>
-              <w:t xml:space="preserve">Q2</w:t>
-            </w:r>
-          </w:p>
-        </w:tc>
-        <w:tc>
-          <w:tcPr>
-            <w:tcW w:type="dxa" w:w="1983"/>
-            <w:tcBorders>
-              <w:top w:val="single" w:color="AAAAAA" w:sz="1"/>
-              <w:left w:val="single" w:color="AAAAAA" w:sz="1"/>
-              <w:bottom w:val="single" w:color="AAAAAA" w:sz="1"/>
-              <w:right w:val="single" w:color="AAAAAA" w:sz="1"/>
-            </w:tcBorders>
-            <w:vAlign w:val="center"/>
-          </w:tcPr>
-          <w:p>
-            <w:pPr>
-              <w:spacing w:after="40" w:before="40"/>
-              <w:jc w:val="left"/>
-            </w:pPr>
-            <w:r>
-              <w:rPr>
-                <w:rFonts w:ascii="맑은 고딕" w:cs="맑은 고딕" w:eastAsia="맑은 고딕" w:hAnsi="맑은 고딕"/>
-                <w:b w:val="false"/>
-                <w:bCs w:val="false"/>
-                <w:color w:val="000000"/>
-                <w:sz w:val="18"/>
-                <w:szCs w:val="18"/>
-              </w:rPr>
-              <w:t xml:space="preserve">8,000ms</w:t>
-            </w:r>
-          </w:p>
-        </w:tc>
-      </w:tr>
-      <w:tr>
-        <w:tc>
-          <w:tcPr>
-            <w:tcW w:type="dxa" w:w="1983"/>
-            <w:tcBorders>
-              <w:top w:val="single" w:color="AAAAAA" w:sz="1"/>
-              <w:left w:val="single" w:color="AAAAAA" w:sz="1"/>
-              <w:bottom w:val="single" w:color="AAAAAA" w:sz="1"/>
-              <w:right w:val="single" w:color="AAAAAA" w:sz="1"/>
-            </w:tcBorders>
-            <w:vAlign w:val="center"/>
-          </w:tcPr>
-          <w:p>
-            <w:pPr>
-              <w:spacing w:after="40" w:before="40"/>
-              <w:jc w:val="left"/>
-            </w:pPr>
-            <w:r>
-              <w:rPr>
-                <w:rFonts w:ascii="맑은 고딕" w:cs="맑은 고딕" w:eastAsia="맑은 고딕" w:hAnsi="맑은 고딕"/>
-                <w:b w:val="false"/>
-                <w:bCs w:val="false"/>
-                <w:color w:val="000000"/>
-                <w:sz w:val="18"/>
-                <w:szCs w:val="18"/>
-              </w:rPr>
-              <w:t xml:space="preserve">Rule 4</w:t>
-            </w:r>
-          </w:p>
-        </w:tc>
-        <w:tc>
-          <w:tcPr>
-            <w:tcW w:type="dxa" w:w="1983"/>
-            <w:tcBorders>
-              <w:top w:val="single" w:color="AAAAAA" w:sz="1"/>
-              <w:left w:val="single" w:color="AAAAAA" w:sz="1"/>
-              <w:bottom w:val="single" w:color="AAAAAA" w:sz="1"/>
-              <w:right w:val="single" w:color="AAAAAA" w:sz="1"/>
-            </w:tcBorders>
-            <w:vAlign w:val="center"/>
-          </w:tcPr>
-          <w:p>
-            <w:pPr>
-              <w:spacing w:after="40" w:before="40"/>
-              <w:jc w:val="left"/>
-            </w:pPr>
-            <w:r>
-              <w:rPr>
-                <w:rFonts w:ascii="맑은 고딕" w:cs="맑은 고딕" w:eastAsia="맑은 고딕" w:hAnsi="맑은 고딕"/>
-                <w:b w:val="false"/>
-                <w:bCs w:val="false"/>
-                <w:color w:val="000000"/>
-                <w:sz w:val="18"/>
-                <w:szCs w:val="18"/>
-              </w:rPr>
-              <w:t xml:space="preserve">할당량 소진 시 하위 큐로</w:t>
-            </w:r>
-          </w:p>
-        </w:tc>
-        <w:tc>
-          <w:tcPr>
-            <w:tcW w:type="dxa" w:w="1983"/>
-            <w:tcBorders>
-              <w:top w:val="single" w:color="AAAAAA" w:sz="1"/>
-              <w:left w:val="single" w:color="AAAAAA" w:sz="1"/>
-              <w:bottom w:val="single" w:color="AAAAAA" w:sz="1"/>
-              <w:right w:val="single" w:color="AAAAAA" w:sz="1"/>
-            </w:tcBorders>
-            <w:vAlign w:val="center"/>
-          </w:tcPr>
-          <w:p>
-            <w:pPr>
-              <w:spacing w:after="40" w:before="40"/>
-              <w:jc w:val="left"/>
-            </w:pPr>
-            <w:r>
-              <w:rPr>
-                <w:rFonts w:ascii="맑은 고딕" w:cs="맑은 고딕" w:eastAsia="맑은 고딕" w:hAnsi="맑은 고딕"/>
-                <w:b w:val="false"/>
-                <w:bCs w:val="false"/>
-                <w:color w:val="000000"/>
-                <w:sz w:val="18"/>
-                <w:szCs w:val="18"/>
-              </w:rPr>
-              <w:t xml:space="preserve">Q3</w:t>
-            </w:r>
-          </w:p>
-        </w:tc>
-        <w:tc>
-          <w:tcPr>
-            <w:tcW w:type="dxa" w:w="1983"/>
-            <w:tcBorders>
-              <w:top w:val="single" w:color="AAAAAA" w:sz="1"/>
-              <w:left w:val="single" w:color="AAAAAA" w:sz="1"/>
-              <w:bottom w:val="single" w:color="AAAAAA" w:sz="1"/>
-              <w:right w:val="single" w:color="AAAAAA" w:sz="1"/>
-            </w:tcBorders>
-            <w:vAlign w:val="center"/>
-          </w:tcPr>
-          <w:p>
-            <w:pPr>
-              <w:spacing w:after="40" w:before="40"/>
-              <w:jc w:val="left"/>
-            </w:pPr>
-            <w:r>
-              <w:rPr>
-                <w:rFonts w:ascii="맑은 고딕" w:cs="맑은 고딕" w:eastAsia="맑은 고딕" w:hAnsi="맑은 고딕"/>
-                <w:b w:val="false"/>
-                <w:bCs w:val="false"/>
-                <w:color w:val="000000"/>
-                <w:sz w:val="18"/>
-                <w:szCs w:val="18"/>
-              </w:rPr>
-              <w:t xml:space="preserve">무제한</w:t>
-            </w:r>
-          </w:p>
-        </w:tc>
-      </w:tr>
-      <w:tr>
-        <w:tc>
-          <w:tcPr>
-            <w:tcW w:type="dxa" w:w="1983"/>
-            <w:tcBorders>
-              <w:top w:val="single" w:color="AAAAAA" w:sz="1"/>
-              <w:left w:val="single" w:color="AAAAAA" w:sz="1"/>
-              <w:bottom w:val="single" w:color="AAAAAA" w:sz="1"/>
-              <w:right w:val="single" w:color="AAAAAA" w:sz="1"/>
-            </w:tcBorders>
-            <w:vAlign w:val="center"/>
-          </w:tcPr>
-          <w:p>
-            <w:pPr>
-              <w:spacing w:after="40" w:before="40"/>
-              <w:jc w:val="left"/>
-            </w:pPr>
-            <w:r>
-              <w:rPr>
-                <w:rFonts w:ascii="맑은 고딕" w:cs="맑은 고딕" w:eastAsia="맑은 고딕" w:hAnsi="맑은 고딕"/>
-                <w:b w:val="false"/>
-                <w:bCs w:val="false"/>
-                <w:color w:val="000000"/>
-                <w:sz w:val="18"/>
-                <w:szCs w:val="18"/>
-              </w:rPr>
-              <w:t xml:space="preserve">Rule 5</w:t>
-            </w:r>
-          </w:p>
-        </w:tc>
-        <w:tc>
-          <w:tcPr>
-            <w:tcW w:type="dxa" w:w="1983"/>
-            <w:tcBorders>
-              <w:top w:val="single" w:color="AAAAAA" w:sz="1"/>
-              <w:left w:val="single" w:color="AAAAAA" w:sz="1"/>
-              <w:bottom w:val="single" w:color="AAAAAA" w:sz="1"/>
-              <w:right w:val="single" w:color="AAAAAA" w:sz="1"/>
-            </w:tcBorders>
-            <w:vAlign w:val="center"/>
-          </w:tcPr>
-          <w:p>
-            <w:pPr>
-              <w:spacing w:after="40" w:before="40"/>
-              <w:jc w:val="left"/>
-            </w:pPr>
-            <w:r>
-              <w:rPr>
-                <w:rFonts w:ascii="맑은 고딕" w:cs="맑은 고딕" w:eastAsia="맑은 고딕" w:hAnsi="맑은 고딕"/>
-                <w:b w:val="false"/>
-                <w:bCs w:val="false"/>
-                <w:color w:val="000000"/>
-                <w:sz w:val="18"/>
-                <w:szCs w:val="18"/>
-              </w:rPr>
-              <w:t xml:space="preserve">일정 주기로 모두 Q0로 부스팅</w:t>
-            </w:r>
-          </w:p>
-        </w:tc>
-        <w:tc>
-          <w:tcPr>
-            <w:tcW w:type="dxa" w:w="1983"/>
-            <w:tcBorders>
-              <w:top w:val="single" w:color="AAAAAA" w:sz="1"/>
-              <w:left w:val="single" w:color="AAAAAA" w:sz="1"/>
-              <w:bottom w:val="single" w:color="AAAAAA" w:sz="1"/>
-              <w:right w:val="single" w:color="AAAAAA" w:sz="1"/>
-            </w:tcBorders>
-            <w:vAlign w:val="center"/>
-          </w:tcPr>
-          <w:p>
-            <w:pPr>
-              <w:spacing w:after="40" w:before="40"/>
-              <w:jc w:val="left"/>
-            </w:pPr>
-            <w:r>
-              <w:rPr>
-                <w:rFonts w:ascii="맑은 고딕" w:cs="맑은 고딕" w:eastAsia="맑은 고딕" w:hAnsi="맑은 고딕"/>
-                <w:sz w:val="20"/>
-                <w:szCs w:val="20"/>
-              </w:rPr>
-              <w:t xml:space="preserve"/>
-            </w:r>
-          </w:p>
-        </w:tc>
-        <w:tc>
-          <w:tcPr>
-            <w:tcW w:type="dxa" w:w="1983"/>
-            <w:tcBorders>
-              <w:top w:val="single" w:color="AAAAAA" w:sz="1"/>
-              <w:left w:val="single" w:color="AAAAAA" w:sz="1"/>
-              <w:bottom w:val="single" w:color="AAAAAA" w:sz="1"/>
-              <w:right w:val="single" w:color="AAAAAA" w:sz="1"/>
-            </w:tcBorders>
-            <w:vAlign w:val="center"/>
-          </w:tcPr>
-          <w:p>
-            <w:pPr>
-              <w:spacing w:after="40" w:before="40"/>
-              <w:jc w:val="left"/>
-            </w:pPr>
-            <w:r>
-              <w:rPr>
-                <w:rFonts w:ascii="맑은 고딕" w:cs="맑은 고딕" w:eastAsia="맑은 고딕" w:hAnsi="맑은 고딕"/>
-                <w:sz w:val="20"/>
-                <w:szCs w:val="20"/>
-              </w:rPr>
-              <w:t xml:space="preserve"/>
-            </w:r>
-          </w:p>
-        </w:tc>
-      </w:tr>
-    </w:tbl>
-    <w:p>
-      <w:pPr>
-        <w:spacing w:after="80"/>
-      </w:pPr>
-    </w:p>
-    <w:p>
-      <w:pPr>
-        <w:spacing w:after="120" w:line="240"/>
-      </w:pPr>
-      <w:r>
-        <w:rPr>
-          <w:rFonts w:ascii="맑은 고딕" w:cs="맑은 고딕" w:eastAsia="맑은 고딕" w:hAnsi="맑은 고딕"/>
-          <w:color w:val="000000"/>
-          <w:sz w:val="20"/>
-          <w:szCs w:val="20"/>
-        </w:rPr>
-        <w:t xml:space="preserve">dequeue는 Rule 1을 따라 상위 큐부터 FIFO(First-In, First-Out, 선입선출 — 먼저 들어온 요청부터 처리) 방식으로 꺼낸다.</w:t>
-      </w:r>
-    </w:p>
-    <w:p>
-      <w:pPr>
-        <w:spacing w:after="0" w:line="240"/>
-        <w:ind w:left="360"/>
-      </w:pPr>
-      <w:r>
-        <w:rPr>
-          <w:rFonts w:ascii="Consolas" w:cs="Consolas" w:eastAsia="Consolas" w:hAnsi="Consolas"/>
-          <w:color w:val="333333"/>
-          <w:sz w:val="18"/>
-          <w:szCs w:val="18"/>
-        </w:rPr>
-        <w:t xml:space="preserve">// MLFQ 스케줄러: 다음 처리할 요청 선택 (비선점형)</w:t>
-      </w:r>
-    </w:p>
-    <w:p>
-      <w:pPr>
-        <w:spacing w:after="0" w:line="240"/>
-        <w:ind w:left="360"/>
-      </w:pPr>
-      <w:r>
-        <w:rPr>
-          <w:rFonts w:ascii="Consolas" w:cs="Consolas" w:eastAsia="Consolas" w:hAnsi="Consolas"/>
-          <w:color w:val="333333"/>
-          <w:sz w:val="18"/>
-          <w:szCs w:val="18"/>
-        </w:rPr>
-        <w:t xml:space="preserve">dequeue() {</w:t>
-      </w:r>
-    </w:p>
-    <w:p>
-      <w:pPr>
-        <w:spacing w:after="0" w:line="240"/>
-        <w:ind w:left="360"/>
-      </w:pPr>
-      <w:r>
-        <w:rPr>
-          <w:rFonts w:ascii="Consolas" w:cs="Consolas" w:eastAsia="Consolas" w:hAnsi="Consolas"/>
-          <w:color w:val="333333"/>
-          <w:sz w:val="18"/>
-          <w:szCs w:val="18"/>
-        </w:rPr>
-        <w:t xml:space="preserve">  for (let i = 0; i &lt; 4; i++) {</w:t>
-      </w:r>
-    </w:p>
-    <w:p>
-      <w:pPr>
-        <w:spacing w:after="0" w:line="240"/>
-        <w:ind w:left="360"/>
-      </w:pPr>
-      <w:r>
-        <w:rPr>
-          <w:rFonts w:ascii="Consolas" w:cs="Consolas" w:eastAsia="Consolas" w:hAnsi="Consolas"/>
-          <w:color w:val="333333"/>
-          <w:sz w:val="18"/>
-          <w:szCs w:val="18"/>
-        </w:rPr>
-        <w:t xml:space="preserve">    if (this.queues[i].length &gt; 0) return this.queues[i].shift();</w:t>
-      </w:r>
-    </w:p>
-    <w:p>
-      <w:pPr>
-        <w:spacing w:after="0" w:line="240"/>
-        <w:ind w:left="360"/>
-      </w:pPr>
-      <w:r>
-        <w:rPr>
-          <w:rFonts w:ascii="Consolas" w:cs="Consolas" w:eastAsia="Consolas" w:hAnsi="Consolas"/>
-          <w:color w:val="333333"/>
-          <w:sz w:val="18"/>
-          <w:szCs w:val="18"/>
-        </w:rPr>
-        <w:t xml:space="preserve">  }</w:t>
-      </w:r>
-    </w:p>
-    <w:p>
-      <w:pPr>
-        <w:spacing w:after="0" w:line="240"/>
-        <w:ind w:left="360"/>
-      </w:pPr>
-      <w:r>
-        <w:rPr>
-          <w:rFonts w:ascii="Consolas" w:cs="Consolas" w:eastAsia="Consolas" w:hAnsi="Consolas"/>
-          <w:color w:val="333333"/>
-          <w:sz w:val="18"/>
-          <w:szCs w:val="18"/>
-        </w:rPr>
-        <w:t xml:space="preserve">  return null;</w:t>
-      </w:r>
-    </w:p>
-    <w:p>
-      <w:pPr>
-        <w:spacing w:after="0" w:line="240"/>
-        <w:ind w:left="360"/>
-      </w:pPr>
-      <w:r>
-        <w:rPr>
-          <w:rFonts w:ascii="Consolas" w:cs="Consolas" w:eastAsia="Consolas" w:hAnsi="Consolas"/>
-          <w:color w:val="333333"/>
-          <w:sz w:val="18"/>
-          <w:szCs w:val="18"/>
-        </w:rPr>
-        <w:t xml:space="preserve">}</w:t>
-      </w:r>
-    </w:p>
-    <w:p>
-      <w:pPr>
-        <w:spacing w:after="80"/>
-      </w:pPr>
-    </w:p>
-    <w:p>
-      <w:pPr>
-        <w:spacing w:after="120" w:line="240"/>
-      </w:pPr>
-      <w:r>
-        <w:rPr>
-          <w:rFonts w:ascii="맑은 고딕" w:cs="맑은 고딕" w:eastAsia="맑은 고딕" w:hAnsi="맑은 고딕"/>
-          <w:color w:val="000000"/>
-          <w:sz w:val="20"/>
-          <w:szCs w:val="20"/>
-        </w:rPr>
-        <w:t xml:space="preserve">위 코드는 실서버에도 적용되는 비선점형 구현이다. 선점형 MLFQ는 시뮬레이션 전용으로 `run-multi-seed.js`에 따로 구현하였다. 500ms 간격으로 실행 시간을 확인해 할당량 초과 시 하위 큐로 옮기며, 5초 주기 부스팅으로 하위 큐의 기아를 막는다.</w:t>
-      </w:r>
-    </w:p>
-    <w:p>
-      <w:pPr>
-        <w:spacing w:after="120" w:line="240"/>
-      </w:pPr>
-      <w:r>
-        <w:rPr>
-          <w:rFonts w:ascii="맑은 고딕" w:cs="맑은 고딕" w:eastAsia="맑은 고딕" w:hAnsi="맑은 고딕"/>
-          <w:b/>
-          <w:bCs/>
-          <w:color w:val="000000"/>
-          <w:sz w:val="20"/>
-          <w:szCs w:val="20"/>
-        </w:rPr>
-        <w:t xml:space="preserve">WFQ 구현.</w:t>
-      </w:r>
-      <w:r>
-        <w:rPr>
-          <w:rFonts w:ascii="맑은 고딕" w:cs="맑은 고딕" w:eastAsia="맑은 고딕" w:hAnsi="맑은 고딕"/>
-          <w:color w:val="000000"/>
-          <w:sz w:val="20"/>
-          <w:szCs w:val="20"/>
-        </w:rPr>
-        <w:t xml:space="preserve"> WFQ는 각 요청의 가상 완료 시각(VFT)을 계산해 가장 작은 값부터 처리한다.</w:t>
-      </w:r>
-    </w:p>
-    <w:p>
-      <w:pPr>
-        <w:spacing w:after="120" w:line="240"/>
-        <w:ind w:left="360"/>
-      </w:pPr>
-      <w:r>
-        <w:rPr>
-          <w:rFonts w:ascii="맑은 고딕" w:cs="맑은 고딕" w:eastAsia="맑은 고딕" w:hAnsi="맑은 고딕"/>
-          <w:i/>
-          <w:iCs/>
-          <w:color w:val="333333"/>
-          <w:sz w:val="20"/>
-          <w:szCs w:val="20"/>
-        </w:rPr>
-        <w:t xml:space="preserve">VFT_i = VFT_(i-1) + 처리 비용 / 가중치</w:t>
-      </w:r>
-    </w:p>
-    <w:p>
-      <w:pPr>
-        <w:spacing w:after="120" w:line="240"/>
-      </w:pPr>
-      <w:r>
-        <w:rPr>
-          <w:rFonts w:ascii="맑은 고딕" w:cs="맑은 고딕" w:eastAsia="맑은 고딕" w:hAnsi="맑은 고딕"/>
-          <w:color w:val="000000"/>
-          <w:sz w:val="20"/>
-          <w:szCs w:val="20"/>
-        </w:rPr>
-        <w:t xml:space="preserve">처리 비용은 요청 1건당 1로 고정하였다. LLM 출력 토큰 수는 생성 완료 전 알 수 없고, JFI 계산도 처리 건수 기준이므로 측정 기준을 일치시키기 위해서이다.</w:t>
-      </w:r>
-    </w:p>
-    <w:p>
-      <w:pPr>
-        <w:spacing w:after="0" w:line="240"/>
-        <w:ind w:left="360"/>
-      </w:pPr>
-      <w:r>
-        <w:rPr>
-          <w:rFonts w:ascii="Consolas" w:cs="Consolas" w:eastAsia="Consolas" w:hAnsi="Consolas"/>
-          <w:color w:val="333333"/>
-          <w:sz w:val="18"/>
-          <w:szCs w:val="18"/>
-        </w:rPr>
-        <w:t xml:space="preserve">// WFQ: VFT 계산 후 enqueue</w:t>
-      </w:r>
-    </w:p>
-    <w:p>
-      <w:pPr>
-        <w:spacing w:after="0" w:line="240"/>
-        <w:ind w:left="360"/>
-      </w:pPr>
-      <w:r>
-        <w:rPr>
-          <w:rFonts w:ascii="Consolas" w:cs="Consolas" w:eastAsia="Consolas" w:hAnsi="Consolas"/>
-          <w:color w:val="333333"/>
-          <w:sz w:val="18"/>
-          <w:szCs w:val="18"/>
-        </w:rPr>
-        <w:t xml:space="preserve">enqueue(request) {</w:t>
-      </w:r>
-    </w:p>
-    <w:p>
-      <w:pPr>
-        <w:spacing w:after="0" w:line="240"/>
-        <w:ind w:left="360"/>
-      </w:pPr>
-      <w:r>
-        <w:rPr>
-          <w:rFonts w:ascii="Consolas" w:cs="Consolas" w:eastAsia="Consolas" w:hAnsi="Consolas"/>
-          <w:color w:val="333333"/>
-          <w:sz w:val="18"/>
-          <w:szCs w:val="18"/>
-        </w:rPr>
-        <w:t xml:space="preserve">  const tenant = this.tenants.get(request.tenantId);</w:t>
-      </w:r>
-    </w:p>
-    <w:p>
-      <w:pPr>
-        <w:spacing w:after="0" w:line="240"/>
-        <w:ind w:left="360"/>
-      </w:pPr>
-      <w:r>
-        <w:rPr>
-          <w:rFonts w:ascii="Consolas" w:cs="Consolas" w:eastAsia="Consolas" w:hAnsi="Consolas"/>
-          <w:color w:val="333333"/>
-          <w:sz w:val="18"/>
-          <w:szCs w:val="18"/>
-        </w:rPr>
-        <w:t xml:space="preserve">  const startTime = Math.max(tenant.virtualTime, this.globalVirtualTime);</w:t>
-      </w:r>
-    </w:p>
-    <w:p>
-      <w:pPr>
-        <w:spacing w:after="0" w:line="240"/>
-        <w:ind w:left="360"/>
-      </w:pPr>
-      <w:r>
-        <w:rPr>
-          <w:rFonts w:ascii="Consolas" w:cs="Consolas" w:eastAsia="Consolas" w:hAnsi="Consolas"/>
-          <w:color w:val="333333"/>
-          <w:sz w:val="18"/>
-          <w:szCs w:val="18"/>
-        </w:rPr>
-        <w:t xml:space="preserve">  request.virtualFinishTime = startTime + (1 / tenant.weight);</w:t>
-      </w:r>
-    </w:p>
-    <w:p>
-      <w:pPr>
-        <w:spacing w:after="0" w:line="240"/>
-        <w:ind w:left="360"/>
-      </w:pPr>
-      <w:r>
-        <w:rPr>
-          <w:rFonts w:ascii="Consolas" w:cs="Consolas" w:eastAsia="Consolas" w:hAnsi="Consolas"/>
-          <w:color w:val="333333"/>
-          <w:sz w:val="18"/>
-          <w:szCs w:val="18"/>
-        </w:rPr>
-        <w:t xml:space="preserve">  tenant.virtualTime = request.virtualFinishTime;   // 다음 요청의 기준이 됨</w:t>
-      </w:r>
-    </w:p>
-    <w:p>
-      <w:pPr>
-        <w:spacing w:after="0" w:line="240"/>
-        <w:ind w:left="360"/>
-      </w:pPr>
-      <w:r>
-        <w:rPr>
-          <w:rFonts w:ascii="Consolas" w:cs="Consolas" w:eastAsia="Consolas" w:hAnsi="Consolas"/>
-          <w:color w:val="333333"/>
-          <w:sz w:val="18"/>
-          <w:szCs w:val="18"/>
-        </w:rPr>
-        <w:t xml:space="preserve">  this.queue.push(request);</w:t>
-      </w:r>
-    </w:p>
-    <w:p>
-      <w:pPr>
-        <w:spacing w:after="0" w:line="240"/>
-        <w:ind w:left="360"/>
-      </w:pPr>
-      <w:r>
-        <w:rPr>
-          <w:rFonts w:ascii="Consolas" w:cs="Consolas" w:eastAsia="Consolas" w:hAnsi="Consolas"/>
-          <w:color w:val="333333"/>
-          <w:sz w:val="18"/>
-          <w:szCs w:val="18"/>
-        </w:rPr>
-        <w:t xml:space="preserve">}</w:t>
-      </w:r>
-    </w:p>
-    <w:p>
-      <w:pPr>
-        <w:spacing w:after="0" w:line="240"/>
-        <w:ind w:left="360"/>
-      </w:pPr>
-      <w:r>
-        <w:rPr>
-          <w:rFonts w:ascii="Consolas" w:cs="Consolas" w:eastAsia="Consolas" w:hAnsi="Consolas"/>
-          <w:color w:val="333333"/>
-          <w:sz w:val="18"/>
-          <w:szCs w:val="18"/>
-        </w:rPr>
-        <w:t xml:space="preserve">// VFT가 가장 작은 요청 선택</w:t>
-      </w:r>
-    </w:p>
-    <w:p>
-      <w:pPr>
-        <w:spacing w:after="0" w:line="240"/>
-        <w:ind w:left="360"/>
-      </w:pPr>
-      <w:r>
-        <w:rPr>
-          <w:rFonts w:ascii="Consolas" w:cs="Consolas" w:eastAsia="Consolas" w:hAnsi="Consolas"/>
-          <w:color w:val="333333"/>
-          <w:sz w:val="18"/>
-          <w:szCs w:val="18"/>
-        </w:rPr>
-        <w:t xml:space="preserve">dequeue() {</w:t>
-      </w:r>
-    </w:p>
-    <w:p>
-      <w:pPr>
-        <w:spacing w:after="0" w:line="240"/>
-        <w:ind w:left="360"/>
-      </w:pPr>
-      <w:r>
-        <w:rPr>
-          <w:rFonts w:ascii="Consolas" w:cs="Consolas" w:eastAsia="Consolas" w:hAnsi="Consolas"/>
-          <w:color w:val="333333"/>
-          <w:sz w:val="18"/>
-          <w:szCs w:val="18"/>
-        </w:rPr>
-        <w:t xml:space="preserve">  let minIdx = 0;</w:t>
-      </w:r>
-    </w:p>
-    <w:p>
-      <w:pPr>
-        <w:spacing w:after="0" w:line="240"/>
-        <w:ind w:left="360"/>
-      </w:pPr>
-      <w:r>
-        <w:rPr>
-          <w:rFonts w:ascii="Consolas" w:cs="Consolas" w:eastAsia="Consolas" w:hAnsi="Consolas"/>
-          <w:color w:val="333333"/>
-          <w:sz w:val="18"/>
-          <w:szCs w:val="18"/>
-        </w:rPr>
-        <w:t xml:space="preserve">  for (let i = 1; i &lt; this.queue.length; i++) {</w:t>
-      </w:r>
-    </w:p>
-    <w:p>
-      <w:pPr>
-        <w:spacing w:after="0" w:line="240"/>
-        <w:ind w:left="360"/>
-      </w:pPr>
-      <w:r>
-        <w:rPr>
-          <w:rFonts w:ascii="Consolas" w:cs="Consolas" w:eastAsia="Consolas" w:hAnsi="Consolas"/>
-          <w:color w:val="333333"/>
-          <w:sz w:val="18"/>
-          <w:szCs w:val="18"/>
-        </w:rPr>
-        <w:t xml:space="preserve">    if (this.queue[i].virtualFinishTime &lt; this.queue[minIdx].virtualFinishTime) minIdx = i;</w:t>
-      </w:r>
-    </w:p>
-    <w:p>
-      <w:pPr>
-        <w:spacing w:after="0" w:line="240"/>
-        <w:ind w:left="360"/>
-      </w:pPr>
-      <w:r>
-        <w:rPr>
-          <w:rFonts w:ascii="Consolas" w:cs="Consolas" w:eastAsia="Consolas" w:hAnsi="Consolas"/>
-          <w:color w:val="333333"/>
-          <w:sz w:val="18"/>
-          <w:szCs w:val="18"/>
-        </w:rPr>
-        <w:t xml:space="preserve">  }</w:t>
-      </w:r>
-    </w:p>
-    <w:p>
-      <w:pPr>
-        <w:spacing w:after="0" w:line="240"/>
-        <w:ind w:left="360"/>
-      </w:pPr>
-      <w:r>
-        <w:rPr>
-          <w:rFonts w:ascii="Consolas" w:cs="Consolas" w:eastAsia="Consolas" w:hAnsi="Consolas"/>
-          <w:color w:val="333333"/>
-          <w:sz w:val="18"/>
-          <w:szCs w:val="18"/>
-        </w:rPr>
-        <w:t xml:space="preserve">  const req = this.queue.splice(minIdx, 1)[0];</w:t>
-      </w:r>
-    </w:p>
-    <w:p>
-      <w:pPr>
-        <w:spacing w:after="0" w:line="240"/>
-        <w:ind w:left="360"/>
-      </w:pPr>
-      <w:r>
-        <w:rPr>
-          <w:rFonts w:ascii="Consolas" w:cs="Consolas" w:eastAsia="Consolas" w:hAnsi="Consolas"/>
-          <w:color w:val="333333"/>
-          <w:sz w:val="18"/>
-          <w:szCs w:val="18"/>
-        </w:rPr>
-        <w:t xml:space="preserve">  this.globalVirtualTime = req.virtualFinishTime;   // 시스템 가상 시각 갱신</w:t>
-      </w:r>
-    </w:p>
-    <w:p>
-      <w:pPr>
-        <w:spacing w:after="0" w:line="240"/>
-        <w:ind w:left="360"/>
-      </w:pPr>
-      <w:r>
-        <w:rPr>
-          <w:rFonts w:ascii="Consolas" w:cs="Consolas" w:eastAsia="Consolas" w:hAnsi="Consolas"/>
-          <w:color w:val="333333"/>
-          <w:sz w:val="18"/>
-          <w:szCs w:val="18"/>
-        </w:rPr>
-        <w:t xml:space="preserve">  return req;</w:t>
-      </w:r>
-    </w:p>
-    <w:p>
-      <w:pPr>
-        <w:spacing w:after="0" w:line="240"/>
-        <w:ind w:left="360"/>
-      </w:pPr>
-      <w:r>
-        <w:rPr>
-          <w:rFonts w:ascii="Consolas" w:cs="Consolas" w:eastAsia="Consolas" w:hAnsi="Consolas"/>
-          <w:color w:val="333333"/>
-          <w:sz w:val="18"/>
-          <w:szCs w:val="18"/>
-        </w:rPr>
-        <w:t xml:space="preserve">}</w:t>
-      </w:r>
-    </w:p>
-    <w:p>
-      <w:pPr>
-        <w:spacing w:after="80"/>
-      </w:pPr>
-    </w:p>
-    <w:p>
-      <w:pPr>
-        <w:spacing w:after="120" w:line="240"/>
-      </w:pPr>
-      <w:r>
-        <w:rPr>
-          <w:rFonts w:ascii="맑은 고딕" w:cs="맑은 고딕" w:eastAsia="맑은 고딕" w:hAnsi="맑은 고딕"/>
-          <w:color w:val="000000"/>
-          <w:sz w:val="20"/>
-          <w:szCs w:val="20"/>
-        </w:rPr>
-        <w:t xml:space="preserve">가중치가 큰 사용자는 VFT 증가분이 작아 자주 선택된다. Enterprise(가중치 100)와 Free(가중치 1)가 동시에 요청하면 VFT 증가분이 0.01 대 1로 Enterprise가 먼저 처리된다.</w:t>
-      </w:r>
-    </w:p>
-    <w:p>
-      <w:pPr>
-        <w:spacing w:after="130" w:before="220" w:line="240"/>
-      </w:pPr>
-      <w:r>
-        <w:rPr>
-          <w:rFonts w:ascii="맑은 고딕" w:cs="맑은 고딕" w:eastAsia="맑은 고딕" w:hAnsi="맑은 고딕"/>
-          <w:b/>
-          <w:bCs/>
-          <w:color w:val="333333"/>
-          <w:sz w:val="24"/>
-          <w:szCs w:val="24"/>
-        </w:rPr>
-        <w:t xml:space="preserve">4.4 Rate Limiter</w:t>
-      </w:r>
-    </w:p>
-    <w:p>
-      <w:pPr>
-        <w:spacing w:after="120" w:line="240"/>
-      </w:pPr>
-      <w:r>
-        <w:rPr>
-          <w:rFonts w:ascii="맑은 고딕" w:cs="맑은 고딕" w:eastAsia="맑은 고딕" w:hAnsi="맑은 고딕"/>
-          <w:color w:val="000000"/>
-          <w:sz w:val="20"/>
-          <w:szCs w:val="20"/>
-        </w:rPr>
-        <w:t xml:space="preserve">Rate Limiter는 스케줄링 비교 대상이 아니라 요청 진입을 관리하는 전처리 단계이며, 스케줄러와 독립적으로 동작한다. 토큰 버킷(Token Bucket, 일정 시간마다 요청 권한인 토큰이 새로 발급되고 요청이 들어올 때마다 토큰 하나씩 소모하는 방식) 방식으로 만들었다. 구독 등급별 분당 허용 수(표 4)를 제한하고, 토큰이 없으면 HTTP 429(Too Many Requests, 요청 한도 초과를 알리는 표준 응답 코드) [11]로 거부한다.</w:t>
-      </w:r>
-    </w:p>
-    <w:p>
-      <w:pPr>
-        <w:spacing w:after="80" w:line="240"/>
-      </w:pPr>
-      <w:r>
-        <w:rPr>
-          <w:rFonts w:ascii="맑은 고딕" w:cs="맑은 고딕" w:eastAsia="맑은 고딕" w:hAnsi="맑은 고딕"/>
-          <w:b/>
-          <w:bCs/>
-          <w:color w:val="000000"/>
-          <w:sz w:val="20"/>
-          <w:szCs w:val="20"/>
-        </w:rPr>
-        <w:t xml:space="preserve">표 4. 구독 등급별 요청 한도</w:t>
+        <w:t xml:space="preserve">표 3. MLFQ 큐별 시간 할당량</w:t>
       </w:r>
     </w:p>
     <w:tbl>
@@ -4383,7 +3233,7 @@
                 <w:sz w:val="18"/>
                 <w:szCs w:val="18"/>
               </w:rPr>
-              <w:t xml:space="preserve">구독 등급</w:t>
+              <w:t xml:space="preserve">큐</w:t>
             </w:r>
           </w:p>
         </w:tc>
@@ -4413,7 +3263,7 @@
                 <w:sz w:val="18"/>
                 <w:szCs w:val="18"/>
               </w:rPr>
-              <w:t xml:space="preserve">분당 허용 요청 수</w:t>
+              <w:t xml:space="preserve">시간 할당량</w:t>
             </w:r>
           </w:p>
         </w:tc>
@@ -4444,7 +3294,7 @@
                 <w:sz w:val="18"/>
                 <w:szCs w:val="18"/>
               </w:rPr>
-              <w:t xml:space="preserve">Enterprise</w:t>
+              <w:t xml:space="preserve">Q0</w:t>
             </w:r>
           </w:p>
         </w:tc>
@@ -4473,7 +3323,7 @@
                 <w:sz w:val="18"/>
                 <w:szCs w:val="18"/>
               </w:rPr>
-              <w:t xml:space="preserve">100 req/min</w:t>
+              <w:t xml:space="preserve">1,000ms</w:t>
             </w:r>
           </w:p>
         </w:tc>
@@ -4504,7 +3354,7 @@
                 <w:sz w:val="18"/>
                 <w:szCs w:val="18"/>
               </w:rPr>
-              <w:t xml:space="preserve">Premium</w:t>
+              <w:t xml:space="preserve">Q1</w:t>
             </w:r>
           </w:p>
         </w:tc>
@@ -4533,7 +3383,7 @@
                 <w:sz w:val="18"/>
                 <w:szCs w:val="18"/>
               </w:rPr>
-              <w:t xml:space="preserve">50 req/min</w:t>
+              <w:t xml:space="preserve">3,000ms</w:t>
             </w:r>
           </w:p>
         </w:tc>
@@ -4564,7 +3414,7 @@
                 <w:sz w:val="18"/>
                 <w:szCs w:val="18"/>
               </w:rPr>
-              <w:t xml:space="preserve">Standard</w:t>
+              <w:t xml:space="preserve">Q2</w:t>
             </w:r>
           </w:p>
         </w:tc>
@@ -4593,7 +3443,7 @@
                 <w:sz w:val="18"/>
                 <w:szCs w:val="18"/>
               </w:rPr>
-              <w:t xml:space="preserve">10 req/min</w:t>
+              <w:t xml:space="preserve">8,000ms</w:t>
             </w:r>
           </w:p>
         </w:tc>
@@ -4624,7 +3474,7 @@
                 <w:sz w:val="18"/>
                 <w:szCs w:val="18"/>
               </w:rPr>
-              <w:t xml:space="preserve">Free</w:t>
+              <w:t xml:space="preserve">Q3</w:t>
             </w:r>
           </w:p>
         </w:tc>
@@ -4653,7 +3503,7 @@
                 <w:sz w:val="18"/>
                 <w:szCs w:val="18"/>
               </w:rPr>
-              <w:t xml:space="preserve">5 req/min</w:t>
+              <w:t xml:space="preserve">무제한</w:t>
             </w:r>
           </w:p>
         </w:tc>
@@ -4675,7 +3525,476 @@
           <w:sz w:val="20"/>
           <w:szCs w:val="20"/>
         </w:rPr>
-        <w:t xml:space="preserve">동작 확인을 위해 Free 등급(분당 5건) 테넌트에서 20회 연속 요청을 보내본 결과, 5건이 수락되고 15건이 HTTP 429로 거부되어 등급별 한도가 정확히 강제됨을 확인하였다.</w:t>
+        <w:t xml:space="preserve">dequeue는 Rule 1과 Rule 2에 따라 상위 큐부터 FIFO(First-In, First-Out, 선입선출 — 먼저 들어온 요청부터 처리) 방식으로 꺼낸다.</w:t>
+      </w:r>
+    </w:p>
+    <w:p>
+      <w:pPr>
+        <w:spacing w:after="0" w:line="240"/>
+        <w:ind w:left="360"/>
+      </w:pPr>
+      <w:r>
+        <w:rPr>
+          <w:rFonts w:ascii="Consolas" w:cs="Consolas" w:eastAsia="Consolas" w:hAnsi="Consolas"/>
+          <w:color w:val="333333"/>
+          <w:sz w:val="18"/>
+          <w:szCs w:val="18"/>
+        </w:rPr>
+        <w:t xml:space="preserve">// MLFQ 스케줄러: 상위 큐 우선으로 다음 요청 선택</w:t>
+      </w:r>
+    </w:p>
+    <w:p>
+      <w:pPr>
+        <w:spacing w:after="0" w:line="240"/>
+        <w:ind w:left="360"/>
+      </w:pPr>
+      <w:r>
+        <w:rPr>
+          <w:rFonts w:ascii="Consolas" w:cs="Consolas" w:eastAsia="Consolas" w:hAnsi="Consolas"/>
+          <w:color w:val="333333"/>
+          <w:sz w:val="18"/>
+          <w:szCs w:val="18"/>
+        </w:rPr>
+        <w:t xml:space="preserve">dequeue() {</w:t>
+      </w:r>
+    </w:p>
+    <w:p>
+      <w:pPr>
+        <w:spacing w:after="0" w:line="240"/>
+        <w:ind w:left="360"/>
+      </w:pPr>
+      <w:r>
+        <w:rPr>
+          <w:rFonts w:ascii="Consolas" w:cs="Consolas" w:eastAsia="Consolas" w:hAnsi="Consolas"/>
+          <w:color w:val="333333"/>
+          <w:sz w:val="18"/>
+          <w:szCs w:val="18"/>
+        </w:rPr>
+        <w:t xml:space="preserve">  for (let i = 0; i &lt; 4; i++) {</w:t>
+      </w:r>
+    </w:p>
+    <w:p>
+      <w:pPr>
+        <w:spacing w:after="0" w:line="240"/>
+        <w:ind w:left="360"/>
+      </w:pPr>
+      <w:r>
+        <w:rPr>
+          <w:rFonts w:ascii="Consolas" w:cs="Consolas" w:eastAsia="Consolas" w:hAnsi="Consolas"/>
+          <w:color w:val="333333"/>
+          <w:sz w:val="18"/>
+          <w:szCs w:val="18"/>
+        </w:rPr>
+        <w:t xml:space="preserve">    if (this.queues[i].length &gt; 0) return this.queues[i].shift();</w:t>
+      </w:r>
+    </w:p>
+    <w:p>
+      <w:pPr>
+        <w:spacing w:after="0" w:line="240"/>
+        <w:ind w:left="360"/>
+      </w:pPr>
+      <w:r>
+        <w:rPr>
+          <w:rFonts w:ascii="Consolas" w:cs="Consolas" w:eastAsia="Consolas" w:hAnsi="Consolas"/>
+          <w:color w:val="333333"/>
+          <w:sz w:val="18"/>
+          <w:szCs w:val="18"/>
+        </w:rPr>
+        <w:t xml:space="preserve">  }</w:t>
+      </w:r>
+    </w:p>
+    <w:p>
+      <w:pPr>
+        <w:spacing w:after="0" w:line="240"/>
+        <w:ind w:left="360"/>
+      </w:pPr>
+      <w:r>
+        <w:rPr>
+          <w:rFonts w:ascii="Consolas" w:cs="Consolas" w:eastAsia="Consolas" w:hAnsi="Consolas"/>
+          <w:color w:val="333333"/>
+          <w:sz w:val="18"/>
+          <w:szCs w:val="18"/>
+        </w:rPr>
+        <w:t xml:space="preserve">  return null;</w:t>
+      </w:r>
+    </w:p>
+    <w:p>
+      <w:pPr>
+        <w:spacing w:after="0" w:line="240"/>
+        <w:ind w:left="360"/>
+      </w:pPr>
+      <w:r>
+        <w:rPr>
+          <w:rFonts w:ascii="Consolas" w:cs="Consolas" w:eastAsia="Consolas" w:hAnsi="Consolas"/>
+          <w:color w:val="333333"/>
+          <w:sz w:val="18"/>
+          <w:szCs w:val="18"/>
+        </w:rPr>
+        <w:t xml:space="preserve">}</w:t>
+      </w:r>
+    </w:p>
+    <w:p>
+      <w:pPr>
+        <w:spacing w:after="80"/>
+      </w:pPr>
+    </w:p>
+    <w:p>
+      <w:pPr>
+        <w:spacing w:after="120" w:line="240"/>
+      </w:pPr>
+      <w:r>
+        <w:rPr>
+          <w:rFonts w:ascii="맑은 고딕" w:cs="맑은 고딕" w:eastAsia="맑은 고딕" w:hAnsi="맑은 고딕"/>
+          <w:color w:val="000000"/>
+          <w:sz w:val="20"/>
+          <w:szCs w:val="20"/>
+        </w:rPr>
+        <w:t xml:space="preserve">실서버는 위 dequeue로 꺼낸 요청을 끝까지 처리하는 비선점형 흐름을 사용한다. 클래스에는 선점 메서드(`checkPreemption`, `preempt`)도 함께 정의되어 있으며, 시뮬레이션 스크립트(`run-multi-seed.js`, 5개 시드로 반복하는 다중 시드 실험기)가 이를 호출해 선점형 동작을 검증한다. 시뮬레이션은 500ms 타임 슬라이스 단위로 누적 사용 시간을 점검해 할당량을 넘기면 하위 큐로 강등하고, 5초 주기 부스팅으로 하위 큐의 기아를 막는다.</w:t>
+      </w:r>
+    </w:p>
+    <w:p>
+      <w:pPr>
+        <w:spacing w:after="120" w:line="240"/>
+      </w:pPr>
+      <w:r>
+        <w:rPr>
+          <w:rFonts w:ascii="맑은 고딕" w:cs="맑은 고딕" w:eastAsia="맑은 고딕" w:hAnsi="맑은 고딕"/>
+          <w:b/>
+          <w:bCs/>
+          <w:color w:val="000000"/>
+          <w:sz w:val="20"/>
+          <w:szCs w:val="20"/>
+        </w:rPr>
+        <w:t xml:space="preserve">WFQ 구현.</w:t>
+      </w:r>
+      <w:r>
+        <w:rPr>
+          <w:rFonts w:ascii="맑은 고딕" w:cs="맑은 고딕" w:eastAsia="맑은 고딕" w:hAnsi="맑은 고딕"/>
+          <w:color w:val="000000"/>
+          <w:sz w:val="20"/>
+          <w:szCs w:val="20"/>
+        </w:rPr>
+        <w:t xml:space="preserve"> WFQ는 각 요청의 가상 완료 시각(VFT)을 계산해 가장 작은 값부터 처리한다.</w:t>
+      </w:r>
+    </w:p>
+    <w:p>
+      <w:pPr>
+        <w:spacing w:after="120" w:line="240"/>
+        <w:ind w:left="360"/>
+      </w:pPr>
+      <w:r>
+        <w:rPr>
+          <w:rFonts w:ascii="맑은 고딕" w:cs="맑은 고딕" w:eastAsia="맑은 고딕" w:hAnsi="맑은 고딕"/>
+          <w:i/>
+          <w:iCs/>
+          <w:color w:val="333333"/>
+          <w:sz w:val="20"/>
+          <w:szCs w:val="20"/>
+        </w:rPr>
+        <w:t xml:space="preserve">VFT_i = VFT_(i-1) + 처리 비용 / 가중치</w:t>
+      </w:r>
+    </w:p>
+    <w:p>
+      <w:pPr>
+        <w:spacing w:after="120" w:line="240"/>
+      </w:pPr>
+      <w:r>
+        <w:rPr>
+          <w:rFonts w:ascii="맑은 고딕" w:cs="맑은 고딕" w:eastAsia="맑은 고딕" w:hAnsi="맑은 고딕"/>
+          <w:color w:val="000000"/>
+          <w:sz w:val="20"/>
+          <w:szCs w:val="20"/>
+        </w:rPr>
+        <w:t xml:space="preserve">처리 비용은 요청 1건당 1로 고정하였다. LLM 출력 토큰 수는 생성 완료 전 알 수 없고, JFI 계산도 처리 건수 기준이므로 측정 기준을 일치시키기 위해서이다.</w:t>
+      </w:r>
+    </w:p>
+    <w:p>
+      <w:pPr>
+        <w:spacing w:after="0" w:line="240"/>
+        <w:ind w:left="360"/>
+      </w:pPr>
+      <w:r>
+        <w:rPr>
+          <w:rFonts w:ascii="Consolas" w:cs="Consolas" w:eastAsia="Consolas" w:hAnsi="Consolas"/>
+          <w:color w:val="333333"/>
+          <w:sz w:val="18"/>
+          <w:szCs w:val="18"/>
+        </w:rPr>
+        <w:t xml:space="preserve">// WFQ: VFT 계산 후 enqueue</w:t>
+      </w:r>
+    </w:p>
+    <w:p>
+      <w:pPr>
+        <w:spacing w:after="0" w:line="240"/>
+        <w:ind w:left="360"/>
+      </w:pPr>
+      <w:r>
+        <w:rPr>
+          <w:rFonts w:ascii="Consolas" w:cs="Consolas" w:eastAsia="Consolas" w:hAnsi="Consolas"/>
+          <w:color w:val="333333"/>
+          <w:sz w:val="18"/>
+          <w:szCs w:val="18"/>
+        </w:rPr>
+        <w:t xml:space="preserve">enqueue(request) {</w:t>
+      </w:r>
+    </w:p>
+    <w:p>
+      <w:pPr>
+        <w:spacing w:after="0" w:line="240"/>
+        <w:ind w:left="360"/>
+      </w:pPr>
+      <w:r>
+        <w:rPr>
+          <w:rFonts w:ascii="Consolas" w:cs="Consolas" w:eastAsia="Consolas" w:hAnsi="Consolas"/>
+          <w:color w:val="333333"/>
+          <w:sz w:val="18"/>
+          <w:szCs w:val="18"/>
+        </w:rPr>
+        <w:t xml:space="preserve">  const tenant = this.tenants.get(request.tenantId);</w:t>
+      </w:r>
+    </w:p>
+    <w:p>
+      <w:pPr>
+        <w:spacing w:after="0" w:line="240"/>
+        <w:ind w:left="360"/>
+      </w:pPr>
+      <w:r>
+        <w:rPr>
+          <w:rFonts w:ascii="Consolas" w:cs="Consolas" w:eastAsia="Consolas" w:hAnsi="Consolas"/>
+          <w:color w:val="333333"/>
+          <w:sz w:val="18"/>
+          <w:szCs w:val="18"/>
+        </w:rPr>
+        <w:t xml:space="preserve">  const startTime = Math.max(tenant.virtualTime, this.globalVirtualTime);</w:t>
+      </w:r>
+    </w:p>
+    <w:p>
+      <w:pPr>
+        <w:spacing w:after="0" w:line="240"/>
+        <w:ind w:left="360"/>
+      </w:pPr>
+      <w:r>
+        <w:rPr>
+          <w:rFonts w:ascii="Consolas" w:cs="Consolas" w:eastAsia="Consolas" w:hAnsi="Consolas"/>
+          <w:color w:val="333333"/>
+          <w:sz w:val="18"/>
+          <w:szCs w:val="18"/>
+        </w:rPr>
+        <w:t xml:space="preserve">  request.virtualFinishTime = startTime + (1 / tenant.weight);</w:t>
+      </w:r>
+    </w:p>
+    <w:p>
+      <w:pPr>
+        <w:spacing w:after="0" w:line="240"/>
+        <w:ind w:left="360"/>
+      </w:pPr>
+      <w:r>
+        <w:rPr>
+          <w:rFonts w:ascii="Consolas" w:cs="Consolas" w:eastAsia="Consolas" w:hAnsi="Consolas"/>
+          <w:color w:val="333333"/>
+          <w:sz w:val="18"/>
+          <w:szCs w:val="18"/>
+        </w:rPr>
+        <w:t xml:space="preserve">  tenant.virtualTime = request.virtualFinishTime;   // 다음 요청의 기준이 됨</w:t>
+      </w:r>
+    </w:p>
+    <w:p>
+      <w:pPr>
+        <w:spacing w:after="0" w:line="240"/>
+        <w:ind w:left="360"/>
+      </w:pPr>
+      <w:r>
+        <w:rPr>
+          <w:rFonts w:ascii="Consolas" w:cs="Consolas" w:eastAsia="Consolas" w:hAnsi="Consolas"/>
+          <w:color w:val="333333"/>
+          <w:sz w:val="18"/>
+          <w:szCs w:val="18"/>
+        </w:rPr>
+        <w:t xml:space="preserve">  this.queue.push(request);</w:t>
+      </w:r>
+    </w:p>
+    <w:p>
+      <w:pPr>
+        <w:spacing w:after="0" w:line="240"/>
+        <w:ind w:left="360"/>
+      </w:pPr>
+      <w:r>
+        <w:rPr>
+          <w:rFonts w:ascii="Consolas" w:cs="Consolas" w:eastAsia="Consolas" w:hAnsi="Consolas"/>
+          <w:color w:val="333333"/>
+          <w:sz w:val="18"/>
+          <w:szCs w:val="18"/>
+        </w:rPr>
+        <w:t xml:space="preserve">}</w:t>
+      </w:r>
+    </w:p>
+    <w:p>
+      <w:pPr>
+        <w:spacing w:after="0" w:line="240"/>
+        <w:ind w:left="360"/>
+      </w:pPr>
+      <w:r>
+        <w:rPr>
+          <w:rFonts w:ascii="Consolas" w:cs="Consolas" w:eastAsia="Consolas" w:hAnsi="Consolas"/>
+          <w:color w:val="333333"/>
+          <w:sz w:val="18"/>
+          <w:szCs w:val="18"/>
+        </w:rPr>
+        <w:t xml:space="preserve">// VFT가 가장 작은 요청 선택</w:t>
+      </w:r>
+    </w:p>
+    <w:p>
+      <w:pPr>
+        <w:spacing w:after="0" w:line="240"/>
+        <w:ind w:left="360"/>
+      </w:pPr>
+      <w:r>
+        <w:rPr>
+          <w:rFonts w:ascii="Consolas" w:cs="Consolas" w:eastAsia="Consolas" w:hAnsi="Consolas"/>
+          <w:color w:val="333333"/>
+          <w:sz w:val="18"/>
+          <w:szCs w:val="18"/>
+        </w:rPr>
+        <w:t xml:space="preserve">dequeue() {</w:t>
+      </w:r>
+    </w:p>
+    <w:p>
+      <w:pPr>
+        <w:spacing w:after="0" w:line="240"/>
+        <w:ind w:left="360"/>
+      </w:pPr>
+      <w:r>
+        <w:rPr>
+          <w:rFonts w:ascii="Consolas" w:cs="Consolas" w:eastAsia="Consolas" w:hAnsi="Consolas"/>
+          <w:color w:val="333333"/>
+          <w:sz w:val="18"/>
+          <w:szCs w:val="18"/>
+        </w:rPr>
+        <w:t xml:space="preserve">  let minIdx = 0;</w:t>
+      </w:r>
+    </w:p>
+    <w:p>
+      <w:pPr>
+        <w:spacing w:after="0" w:line="240"/>
+        <w:ind w:left="360"/>
+      </w:pPr>
+      <w:r>
+        <w:rPr>
+          <w:rFonts w:ascii="Consolas" w:cs="Consolas" w:eastAsia="Consolas" w:hAnsi="Consolas"/>
+          <w:color w:val="333333"/>
+          <w:sz w:val="18"/>
+          <w:szCs w:val="18"/>
+        </w:rPr>
+        <w:t xml:space="preserve">  for (let i = 1; i &lt; this.queue.length; i++) {</w:t>
+      </w:r>
+    </w:p>
+    <w:p>
+      <w:pPr>
+        <w:spacing w:after="0" w:line="240"/>
+        <w:ind w:left="360"/>
+      </w:pPr>
+      <w:r>
+        <w:rPr>
+          <w:rFonts w:ascii="Consolas" w:cs="Consolas" w:eastAsia="Consolas" w:hAnsi="Consolas"/>
+          <w:color w:val="333333"/>
+          <w:sz w:val="18"/>
+          <w:szCs w:val="18"/>
+        </w:rPr>
+        <w:t xml:space="preserve">    if (this.queue[i].virtualFinishTime &lt; this.queue[minIdx].virtualFinishTime) minIdx = i;</w:t>
+      </w:r>
+    </w:p>
+    <w:p>
+      <w:pPr>
+        <w:spacing w:after="0" w:line="240"/>
+        <w:ind w:left="360"/>
+      </w:pPr>
+      <w:r>
+        <w:rPr>
+          <w:rFonts w:ascii="Consolas" w:cs="Consolas" w:eastAsia="Consolas" w:hAnsi="Consolas"/>
+          <w:color w:val="333333"/>
+          <w:sz w:val="18"/>
+          <w:szCs w:val="18"/>
+        </w:rPr>
+        <w:t xml:space="preserve">  }</w:t>
+      </w:r>
+    </w:p>
+    <w:p>
+      <w:pPr>
+        <w:spacing w:after="0" w:line="240"/>
+        <w:ind w:left="360"/>
+      </w:pPr>
+      <w:r>
+        <w:rPr>
+          <w:rFonts w:ascii="Consolas" w:cs="Consolas" w:eastAsia="Consolas" w:hAnsi="Consolas"/>
+          <w:color w:val="333333"/>
+          <w:sz w:val="18"/>
+          <w:szCs w:val="18"/>
+        </w:rPr>
+        <w:t xml:space="preserve">  const req = this.queue.splice(minIdx, 1)[0];</w:t>
+      </w:r>
+    </w:p>
+    <w:p>
+      <w:pPr>
+        <w:spacing w:after="0" w:line="240"/>
+        <w:ind w:left="360"/>
+      </w:pPr>
+      <w:r>
+        <w:rPr>
+          <w:rFonts w:ascii="Consolas" w:cs="Consolas" w:eastAsia="Consolas" w:hAnsi="Consolas"/>
+          <w:color w:val="333333"/>
+          <w:sz w:val="18"/>
+          <w:szCs w:val="18"/>
+        </w:rPr>
+        <w:t xml:space="preserve">  this.globalVirtualTime = req.virtualFinishTime;   // 시스템 가상 시각 갱신</w:t>
+      </w:r>
+    </w:p>
+    <w:p>
+      <w:pPr>
+        <w:spacing w:after="0" w:line="240"/>
+        <w:ind w:left="360"/>
+      </w:pPr>
+      <w:r>
+        <w:rPr>
+          <w:rFonts w:ascii="Consolas" w:cs="Consolas" w:eastAsia="Consolas" w:hAnsi="Consolas"/>
+          <w:color w:val="333333"/>
+          <w:sz w:val="18"/>
+          <w:szCs w:val="18"/>
+        </w:rPr>
+        <w:t xml:space="preserve">  return req;</w:t>
+      </w:r>
+    </w:p>
+    <w:p>
+      <w:pPr>
+        <w:spacing w:after="0" w:line="240"/>
+        <w:ind w:left="360"/>
+      </w:pPr>
+      <w:r>
+        <w:rPr>
+          <w:rFonts w:ascii="Consolas" w:cs="Consolas" w:eastAsia="Consolas" w:hAnsi="Consolas"/>
+          <w:color w:val="333333"/>
+          <w:sz w:val="18"/>
+          <w:szCs w:val="18"/>
+        </w:rPr>
+        <w:t xml:space="preserve">}</w:t>
+      </w:r>
+    </w:p>
+    <w:p>
+      <w:pPr>
+        <w:spacing w:after="80"/>
+      </w:pPr>
+    </w:p>
+    <w:p>
+      <w:pPr>
+        <w:spacing w:after="120" w:line="240"/>
+      </w:pPr>
+      <w:r>
+        <w:rPr>
+          <w:rFonts w:ascii="맑은 고딕" w:cs="맑은 고딕" w:eastAsia="맑은 고딕" w:hAnsi="맑은 고딕"/>
+          <w:color w:val="000000"/>
+          <w:sz w:val="20"/>
+          <w:szCs w:val="20"/>
+        </w:rPr>
+        <w:t xml:space="preserve">가중치가 큰 사용자는 VFT 증가분이 작아 자주 선택된다. Enterprise(가중치 100)와 Free(가중치 1)가 동시에 요청하면 VFT 증가분이 0.01 대 1로 Enterprise가 먼저 처리된다.</w:t>
       </w:r>
     </w:p>
     <w:p>
@@ -4691,6 +4010,390 @@
           <w:sz w:val="24"/>
           <w:szCs w:val="24"/>
         </w:rPr>
+        <w:t xml:space="preserve">4.4 Rate Limiter</w:t>
+      </w:r>
+    </w:p>
+    <w:p>
+      <w:pPr>
+        <w:spacing w:after="120" w:line="240"/>
+      </w:pPr>
+      <w:r>
+        <w:rPr>
+          <w:rFonts w:ascii="맑은 고딕" w:cs="맑은 고딕" w:eastAsia="맑은 고딕" w:hAnsi="맑은 고딕"/>
+          <w:color w:val="000000"/>
+          <w:sz w:val="20"/>
+          <w:szCs w:val="20"/>
+        </w:rPr>
+        <w:t xml:space="preserve">Rate Limiter는 스케줄링 비교 대상이 아니라 요청 진입을 관리하는 전처리 단계이며, 스케줄러와 독립적으로 동작한다. 토큰 버킷(Token Bucket, 일정 시간마다 요청 권한인 토큰이 새로 발급되고 요청이 들어올 때마다 토큰 하나씩 소모하는 방식) 방식으로 만들었다. 구독 등급별 분당 허용 수(표 4)를 제한하고, 토큰이 없으면 HTTP 429(Too Many Requests, 요청 한도 초과를 알리는 표준 응답 코드) [11]로 거부한다.</w:t>
+      </w:r>
+    </w:p>
+    <w:p>
+      <w:pPr>
+        <w:spacing w:after="80" w:line="240"/>
+      </w:pPr>
+      <w:r>
+        <w:rPr>
+          <w:rFonts w:ascii="맑은 고딕" w:cs="맑은 고딕" w:eastAsia="맑은 고딕" w:hAnsi="맑은 고딕"/>
+          <w:b/>
+          <w:bCs/>
+          <w:color w:val="000000"/>
+          <w:sz w:val="20"/>
+          <w:szCs w:val="20"/>
+        </w:rPr>
+        <w:t xml:space="preserve">표 4. 구독 등급별 요청 한도</w:t>
+      </w:r>
+    </w:p>
+    <w:tbl>
+      <w:tblPr>
+        <w:tblW w:type="auto" w:w="100"/>
+        <w:tblBorders>
+          <w:top w:val="single" w:color="auto" w:sz="4"/>
+          <w:left w:val="single" w:color="auto" w:sz="4"/>
+          <w:bottom w:val="single" w:color="auto" w:sz="4"/>
+          <w:right w:val="single" w:color="auto" w:sz="4"/>
+          <w:insideH w:val="single" w:color="auto" w:sz="4"/>
+          <w:insideV w:val="single" w:color="auto" w:sz="4"/>
+        </w:tblBorders>
+      </w:tblPr>
+      <w:tblGrid>
+        <w:gridCol w:w="3967"/>
+        <w:gridCol w:w="3967"/>
+      </w:tblGrid>
+      <w:tr>
+        <w:tc>
+          <w:tcPr>
+            <w:tcW w:type="dxa" w:w="3967"/>
+            <w:tcBorders>
+              <w:top w:val="single" w:color="AAAAAA" w:sz="1"/>
+              <w:left w:val="single" w:color="AAAAAA" w:sz="1"/>
+              <w:bottom w:val="single" w:color="AAAAAA" w:sz="1"/>
+              <w:right w:val="single" w:color="AAAAAA" w:sz="1"/>
+            </w:tcBorders>
+            <w:shd w:fill="D9E2F3" w:val="clear"/>
+            <w:vAlign w:val="center"/>
+          </w:tcPr>
+          <w:p>
+            <w:pPr>
+              <w:spacing w:after="40" w:before="40"/>
+              <w:jc w:val="center"/>
+            </w:pPr>
+            <w:r>
+              <w:rPr>
+                <w:rFonts w:ascii="맑은 고딕" w:cs="맑은 고딕" w:eastAsia="맑은 고딕" w:hAnsi="맑은 고딕"/>
+                <w:b/>
+                <w:bCs/>
+                <w:color w:val="000000"/>
+                <w:sz w:val="18"/>
+                <w:szCs w:val="18"/>
+              </w:rPr>
+              <w:t xml:space="preserve">구독 등급</w:t>
+            </w:r>
+          </w:p>
+        </w:tc>
+        <w:tc>
+          <w:tcPr>
+            <w:tcW w:type="dxa" w:w="3967"/>
+            <w:tcBorders>
+              <w:top w:val="single" w:color="AAAAAA" w:sz="1"/>
+              <w:left w:val="single" w:color="AAAAAA" w:sz="1"/>
+              <w:bottom w:val="single" w:color="AAAAAA" w:sz="1"/>
+              <w:right w:val="single" w:color="AAAAAA" w:sz="1"/>
+            </w:tcBorders>
+            <w:shd w:fill="D9E2F3" w:val="clear"/>
+            <w:vAlign w:val="center"/>
+          </w:tcPr>
+          <w:p>
+            <w:pPr>
+              <w:spacing w:after="40" w:before="40"/>
+              <w:jc w:val="center"/>
+            </w:pPr>
+            <w:r>
+              <w:rPr>
+                <w:rFonts w:ascii="맑은 고딕" w:cs="맑은 고딕" w:eastAsia="맑은 고딕" w:hAnsi="맑은 고딕"/>
+                <w:b/>
+                <w:bCs/>
+                <w:color w:val="000000"/>
+                <w:sz w:val="18"/>
+                <w:szCs w:val="18"/>
+              </w:rPr>
+              <w:t xml:space="preserve">분당 허용 요청 수</w:t>
+            </w:r>
+          </w:p>
+        </w:tc>
+      </w:tr>
+      <w:tr>
+        <w:tc>
+          <w:tcPr>
+            <w:tcW w:type="dxa" w:w="3967"/>
+            <w:tcBorders>
+              <w:top w:val="single" w:color="AAAAAA" w:sz="1"/>
+              <w:left w:val="single" w:color="AAAAAA" w:sz="1"/>
+              <w:bottom w:val="single" w:color="AAAAAA" w:sz="1"/>
+              <w:right w:val="single" w:color="AAAAAA" w:sz="1"/>
+            </w:tcBorders>
+            <w:vAlign w:val="center"/>
+          </w:tcPr>
+          <w:p>
+            <w:pPr>
+              <w:spacing w:after="40" w:before="40"/>
+              <w:jc w:val="left"/>
+            </w:pPr>
+            <w:r>
+              <w:rPr>
+                <w:rFonts w:ascii="맑은 고딕" w:cs="맑은 고딕" w:eastAsia="맑은 고딕" w:hAnsi="맑은 고딕"/>
+                <w:b w:val="false"/>
+                <w:bCs w:val="false"/>
+                <w:color w:val="000000"/>
+                <w:sz w:val="18"/>
+                <w:szCs w:val="18"/>
+              </w:rPr>
+              <w:t xml:space="preserve">Enterprise</w:t>
+            </w:r>
+          </w:p>
+        </w:tc>
+        <w:tc>
+          <w:tcPr>
+            <w:tcW w:type="dxa" w:w="3967"/>
+            <w:tcBorders>
+              <w:top w:val="single" w:color="AAAAAA" w:sz="1"/>
+              <w:left w:val="single" w:color="AAAAAA" w:sz="1"/>
+              <w:bottom w:val="single" w:color="AAAAAA" w:sz="1"/>
+              <w:right w:val="single" w:color="AAAAAA" w:sz="1"/>
+            </w:tcBorders>
+            <w:vAlign w:val="center"/>
+          </w:tcPr>
+          <w:p>
+            <w:pPr>
+              <w:spacing w:after="40" w:before="40"/>
+              <w:jc w:val="left"/>
+            </w:pPr>
+            <w:r>
+              <w:rPr>
+                <w:rFonts w:ascii="맑은 고딕" w:cs="맑은 고딕" w:eastAsia="맑은 고딕" w:hAnsi="맑은 고딕"/>
+                <w:b w:val="false"/>
+                <w:bCs w:val="false"/>
+                <w:color w:val="000000"/>
+                <w:sz w:val="18"/>
+                <w:szCs w:val="18"/>
+              </w:rPr>
+              <w:t xml:space="preserve">100 req/min</w:t>
+            </w:r>
+          </w:p>
+        </w:tc>
+      </w:tr>
+      <w:tr>
+        <w:tc>
+          <w:tcPr>
+            <w:tcW w:type="dxa" w:w="3967"/>
+            <w:tcBorders>
+              <w:top w:val="single" w:color="AAAAAA" w:sz="1"/>
+              <w:left w:val="single" w:color="AAAAAA" w:sz="1"/>
+              <w:bottom w:val="single" w:color="AAAAAA" w:sz="1"/>
+              <w:right w:val="single" w:color="AAAAAA" w:sz="1"/>
+            </w:tcBorders>
+            <w:vAlign w:val="center"/>
+          </w:tcPr>
+          <w:p>
+            <w:pPr>
+              <w:spacing w:after="40" w:before="40"/>
+              <w:jc w:val="left"/>
+            </w:pPr>
+            <w:r>
+              <w:rPr>
+                <w:rFonts w:ascii="맑은 고딕" w:cs="맑은 고딕" w:eastAsia="맑은 고딕" w:hAnsi="맑은 고딕"/>
+                <w:b w:val="false"/>
+                <w:bCs w:val="false"/>
+                <w:color w:val="000000"/>
+                <w:sz w:val="18"/>
+                <w:szCs w:val="18"/>
+              </w:rPr>
+              <w:t xml:space="preserve">Premium</w:t>
+            </w:r>
+          </w:p>
+        </w:tc>
+        <w:tc>
+          <w:tcPr>
+            <w:tcW w:type="dxa" w:w="3967"/>
+            <w:tcBorders>
+              <w:top w:val="single" w:color="AAAAAA" w:sz="1"/>
+              <w:left w:val="single" w:color="AAAAAA" w:sz="1"/>
+              <w:bottom w:val="single" w:color="AAAAAA" w:sz="1"/>
+              <w:right w:val="single" w:color="AAAAAA" w:sz="1"/>
+            </w:tcBorders>
+            <w:vAlign w:val="center"/>
+          </w:tcPr>
+          <w:p>
+            <w:pPr>
+              <w:spacing w:after="40" w:before="40"/>
+              <w:jc w:val="left"/>
+            </w:pPr>
+            <w:r>
+              <w:rPr>
+                <w:rFonts w:ascii="맑은 고딕" w:cs="맑은 고딕" w:eastAsia="맑은 고딕" w:hAnsi="맑은 고딕"/>
+                <w:b w:val="false"/>
+                <w:bCs w:val="false"/>
+                <w:color w:val="000000"/>
+                <w:sz w:val="18"/>
+                <w:szCs w:val="18"/>
+              </w:rPr>
+              <w:t xml:space="preserve">50 req/min</w:t>
+            </w:r>
+          </w:p>
+        </w:tc>
+      </w:tr>
+      <w:tr>
+        <w:tc>
+          <w:tcPr>
+            <w:tcW w:type="dxa" w:w="3967"/>
+            <w:tcBorders>
+              <w:top w:val="single" w:color="AAAAAA" w:sz="1"/>
+              <w:left w:val="single" w:color="AAAAAA" w:sz="1"/>
+              <w:bottom w:val="single" w:color="AAAAAA" w:sz="1"/>
+              <w:right w:val="single" w:color="AAAAAA" w:sz="1"/>
+            </w:tcBorders>
+            <w:vAlign w:val="center"/>
+          </w:tcPr>
+          <w:p>
+            <w:pPr>
+              <w:spacing w:after="40" w:before="40"/>
+              <w:jc w:val="left"/>
+            </w:pPr>
+            <w:r>
+              <w:rPr>
+                <w:rFonts w:ascii="맑은 고딕" w:cs="맑은 고딕" w:eastAsia="맑은 고딕" w:hAnsi="맑은 고딕"/>
+                <w:b w:val="false"/>
+                <w:bCs w:val="false"/>
+                <w:color w:val="000000"/>
+                <w:sz w:val="18"/>
+                <w:szCs w:val="18"/>
+              </w:rPr>
+              <w:t xml:space="preserve">Standard</w:t>
+            </w:r>
+          </w:p>
+        </w:tc>
+        <w:tc>
+          <w:tcPr>
+            <w:tcW w:type="dxa" w:w="3967"/>
+            <w:tcBorders>
+              <w:top w:val="single" w:color="AAAAAA" w:sz="1"/>
+              <w:left w:val="single" w:color="AAAAAA" w:sz="1"/>
+              <w:bottom w:val="single" w:color="AAAAAA" w:sz="1"/>
+              <w:right w:val="single" w:color="AAAAAA" w:sz="1"/>
+            </w:tcBorders>
+            <w:vAlign w:val="center"/>
+          </w:tcPr>
+          <w:p>
+            <w:pPr>
+              <w:spacing w:after="40" w:before="40"/>
+              <w:jc w:val="left"/>
+            </w:pPr>
+            <w:r>
+              <w:rPr>
+                <w:rFonts w:ascii="맑은 고딕" w:cs="맑은 고딕" w:eastAsia="맑은 고딕" w:hAnsi="맑은 고딕"/>
+                <w:b w:val="false"/>
+                <w:bCs w:val="false"/>
+                <w:color w:val="000000"/>
+                <w:sz w:val="18"/>
+                <w:szCs w:val="18"/>
+              </w:rPr>
+              <w:t xml:space="preserve">10 req/min</w:t>
+            </w:r>
+          </w:p>
+        </w:tc>
+      </w:tr>
+      <w:tr>
+        <w:tc>
+          <w:tcPr>
+            <w:tcW w:type="dxa" w:w="3967"/>
+            <w:tcBorders>
+              <w:top w:val="single" w:color="AAAAAA" w:sz="1"/>
+              <w:left w:val="single" w:color="AAAAAA" w:sz="1"/>
+              <w:bottom w:val="single" w:color="AAAAAA" w:sz="1"/>
+              <w:right w:val="single" w:color="AAAAAA" w:sz="1"/>
+            </w:tcBorders>
+            <w:vAlign w:val="center"/>
+          </w:tcPr>
+          <w:p>
+            <w:pPr>
+              <w:spacing w:after="40" w:before="40"/>
+              <w:jc w:val="left"/>
+            </w:pPr>
+            <w:r>
+              <w:rPr>
+                <w:rFonts w:ascii="맑은 고딕" w:cs="맑은 고딕" w:eastAsia="맑은 고딕" w:hAnsi="맑은 고딕"/>
+                <w:b w:val="false"/>
+                <w:bCs w:val="false"/>
+                <w:color w:val="000000"/>
+                <w:sz w:val="18"/>
+                <w:szCs w:val="18"/>
+              </w:rPr>
+              <w:t xml:space="preserve">Free</w:t>
+            </w:r>
+          </w:p>
+        </w:tc>
+        <w:tc>
+          <w:tcPr>
+            <w:tcW w:type="dxa" w:w="3967"/>
+            <w:tcBorders>
+              <w:top w:val="single" w:color="AAAAAA" w:sz="1"/>
+              <w:left w:val="single" w:color="AAAAAA" w:sz="1"/>
+              <w:bottom w:val="single" w:color="AAAAAA" w:sz="1"/>
+              <w:right w:val="single" w:color="AAAAAA" w:sz="1"/>
+            </w:tcBorders>
+            <w:vAlign w:val="center"/>
+          </w:tcPr>
+          <w:p>
+            <w:pPr>
+              <w:spacing w:after="40" w:before="40"/>
+              <w:jc w:val="left"/>
+            </w:pPr>
+            <w:r>
+              <w:rPr>
+                <w:rFonts w:ascii="맑은 고딕" w:cs="맑은 고딕" w:eastAsia="맑은 고딕" w:hAnsi="맑은 고딕"/>
+                <w:b w:val="false"/>
+                <w:bCs w:val="false"/>
+                <w:color w:val="000000"/>
+                <w:sz w:val="18"/>
+                <w:szCs w:val="18"/>
+              </w:rPr>
+              <w:t xml:space="preserve">5 req/min</w:t>
+            </w:r>
+          </w:p>
+        </w:tc>
+      </w:tr>
+    </w:tbl>
+    <w:p>
+      <w:pPr>
+        <w:spacing w:after="80"/>
+      </w:pPr>
+    </w:p>
+    <w:p>
+      <w:pPr>
+        <w:spacing w:after="120" w:line="240"/>
+      </w:pPr>
+      <w:r>
+        <w:rPr>
+          <w:rFonts w:ascii="맑은 고딕" w:cs="맑은 고딕" w:eastAsia="맑은 고딕" w:hAnsi="맑은 고딕"/>
+          <w:color w:val="000000"/>
+          <w:sz w:val="20"/>
+          <w:szCs w:val="20"/>
+        </w:rPr>
+        <w:t xml:space="preserve">동작 확인을 위해 Free 등급(분당 5건) 테넌트에서 20회 연속 요청을 보내본 결과, 5건이 수락되고 15건이 HTTP 429로 거부되어 등급별 한도가 정확히 강제됨을 확인하였다.</w:t>
+      </w:r>
+    </w:p>
+    <w:p>
+      <w:pPr>
+        <w:spacing w:after="130" w:before="220" w:line="240"/>
+      </w:pPr>
+      <w:r>
+        <w:rPr>
+          <w:rFonts w:ascii="맑은 고딕" w:cs="맑은 고딕" w:eastAsia="맑은 고딕" w:hAnsi="맑은 고딕"/>
+          <w:b/>
+          <w:bCs/>
+          <w:color w:val="333333"/>
+          <w:sz w:val="24"/>
+          <w:szCs w:val="24"/>
+        </w:rPr>
         <w:t xml:space="preserve">4.5 구현 결과 요약</w:t>
       </w:r>
     </w:p>
@@ -4705,7 +4408,7 @@
           <w:sz w:val="20"/>
           <w:szCs w:val="20"/>
         </w:rPr>
-        <w:t xml:space="preserve">스케줄러 4종과 Rate Limiter를 모두 만들어 동작을 확인했고, 스케줄러별 단위 테스트도 작성해서 모두 통과하는지 확인했다. 환경변수(`SCHEDULER_TYPE`)만 바꾸면 알고리즘을 즉시 전환할 수 있다. 대기열 상태와 처리 통계를 브라우저에서 확인할 수 있도록 웹 대시보드(`public/dashboard.html`)도 함께 만들었다. 동일 요청을 알고리즘별로 어떻게 처리하는지 눈으로 비교할 수 있다.</w:t>
+        <w:t xml:space="preserve">스케줄러 4종과 Rate Limiter를 모두 구현하였고, 스케줄러별 단위 테스트를 작성하여 정상 동작을 확인하였다. 환경변수(`SCHEDULER_TYPE`)만 바꾸면 알고리즘을 즉시 전환할 수 있다. 대기열 상태와 처리 통계를 브라우저에서 확인할 수 있도록 웹 대시보드(`public/dashboard.html`)도 함께 만들었다. 동일 요청을 알고리즘별로 어떻게 처리하는지 눈으로 비교할 수 있다.</w:t>
       </w:r>
     </w:p>
     <w:p>

</xml_diff>

<commit_message>
Update final report and presentation materials with revised figures and documents
- Updated system architecture, data flow, module structure, MLFQ vs FCFS, and Ollama tier figures in PPTX format.
- Revised final report in both DOCX and PDF formats.
- Updated presentation slides and handout materials.
- Adjusted manifest.yaml with new generated timestamps and file sizes for all included documents and figures.
</commit_message>
<xml_diff>
--- a/06-final-report/final/final-report.docx
+++ b/06-final-report/final/final-report.docx
@@ -3649,7 +3649,7 @@
           <w:sz w:val="20"/>
           <w:szCs w:val="20"/>
         </w:rPr>
-        <w:t xml:space="preserve">실서버는 위 dequeue로 꺼낸 요청을 끝까지 처리하는 비선점형 흐름을 사용한다. 클래스에는 선점 메서드(`checkPreemption`, `preempt`)도 함께 정의되어 있으며, 시뮬레이션 스크립트(`run-multi-seed.js`, 5개 시드로 반복하는 다중 시드 실험기)가 이를 호출해 선점형 동작을 확인한다. 시뮬레이션은 500ms 타임 슬라이스 단위로 누적 사용 시간을 점검해 할당량을 넘기면 하위 큐로 강등하고, 5초 주기 부스팅으로 하위 큐의 기아를 막는다.</w:t>
+        <w:t xml:space="preserve">실서버는 위 dequeue로 꺼낸 요청을 끝까지 처리하는 비선점형 흐름을 사용한다. 클래스에는 선점 메서드(`checkPreemption`, `preempt`)도 함께 정의되어 있으며, 기본 실험(`run-extended.js`)과 5개 시드로 반복하는 선점형 시뮬레이션(`run-multi-seed.js`) 모두 이를 호출하지만, 처리 시간 폭이 넓은 후자에서만 실제 강등과 선점이 다수 발생한다. 시뮬레이션은 500ms 타임 슬라이스 단위로 누적 사용 시간을 점검해 할당량을 넘기면 하위 큐로 강등하고, 5초 주기 부스팅으로 하위 큐의 기아를 막는다.</w:t>
       </w:r>
     </w:p>
     <w:p>
@@ -4459,7 +4459,21 @@
           <w:sz w:val="20"/>
           <w:szCs w:val="20"/>
         </w:rPr>
-        <w:t xml:space="preserve">실험은 세 가지로 나누어 진행하였다. 기본 실험, MLFQ 선점형 실험, 실서버 실험이다. 실험별 주요 설정은 표 5에 정리하였다. 앞의 두 실험은 시간 기반 시뮬레이션이고, 실서버 실험은 Ollama로 실제 LLM을 호출해 진행하였다. 기본 실험은 짧은 요청을 차례로 보내서 4개 알고리즘을 같은 조건에서 비교하였고, MLFQ 선점형 실험은 처리 시간이 다양한 요청을 한꺼번에 몰아 보내서 MLFQ의 강등과 선점 효과를 따로 확인하였다. 시뮬레이션은 각 요청에 처리 시간을 미리 정해 두고, 스케줄러가 정한 순서대로 한 건씩 처리하는 방식이다. 네트워크 지연이나 LLM 응답 시간의 변동이 없어서 알고리즘 자체의 특성만 비교할 수 있다. 시드 정책은 실험마다 다른데, 기본 실험은 처리 시간 폭이 좁아서(10~100ms) 고정 시드(Seed, 난수의 시작값이라 같은 시드로 실행하면 같은 요청 패턴을 다시 만들 수 있다)를 한 번 써도 결과가 일관되게 나온다. 반면 MLFQ 선점형 실험은 처리 시간이 100ms~10초로 폭이 넓고 시드에 따라 어떤 요청이 짧거나 긴 요청이 될지 달라지므로, 5개 시드로 반복해 개선율이 특정 시드에 의존하지 않는지 확인하였다. 실서버 실험은 우선순위 배정과 프롬프트가 고정되어 있어 시드를 따로 쓰지 않았다.</w:t>
+        <w:t xml:space="preserve">실험은 세 가지로 나누어 진행하였다. 기본 실험, MLFQ 선점형 실험, 실서버 실험이다. 실험별 주요 설정은 표 5에 정리하였다. 앞의 두 실험은 시간 기반 시뮬레이션이고, 실서버 실험은 Ollama로 실제 LLM을 호출해 진행하였다. 기본 실험은 짧은 요청을 차례로 보내서 4개 알고리즘을 같은 조건에서 비교하였고, MLFQ 선점형 실험은 처리 시간이 다양한 요청을 한꺼번에 몰아 보내서 MLFQ의 강등과 선점 효과를 따로 확인하였다. 시뮬레이션은 각 요청에 처리 시간을 미리 정해 두고, 스케줄러가 정한 순서대로 한 건씩 처리하는 방식이다. 네트워크 지연이나 LLM 응답 시간의 변동이 없어서 알고리즘 자체의 특성만 비교할 수 있다.</w:t>
+      </w:r>
+    </w:p>
+    <w:p>
+      <w:pPr>
+        <w:spacing w:after="120" w:line="240"/>
+      </w:pPr>
+      <w:r>
+        <w:rPr>
+          <w:rFonts w:ascii="맑은 고딕" w:cs="맑은 고딕" w:eastAsia="맑은 고딕" w:hAnsi="맑은 고딕"/>
+          <w:color w:val="000000"/>
+          <w:sz w:val="20"/>
+          <w:szCs w:val="20"/>
+        </w:rPr>
+        <w:t xml:space="preserve">시드(Seed) 정책은 실험마다 다른데, 기본 실험은 처리 시간 폭이 좁아서(10~100ms) 시드를 바꿔도 결과가 크게 달라지지 않을 것으로 보고 고정 시드(42)만 사용하였다. 반면 MLFQ 선점형 실험은 처리 시간이 100ms~10초로 폭이 넓고 시드에 따라 어떤 요청이 짧거나 긴 요청이 될지 달라지므로, 5개 시드로 반복해 개선율이 특정 시드에 의존하지 않는지 확인하였다. 실서버 실험은 우선순위 배정과 프롬프트가 고정되어 있어 시드를 따로 쓰지 않았다.</w:t>
       </w:r>
     </w:p>
     <w:p>
@@ -5381,7 +5395,7 @@
                 <w:sz w:val="18"/>
                 <w:szCs w:val="18"/>
               </w:rPr>
-              <w:t xml:space="preserve">비선점형</w:t>
+              <w:t xml:space="preserve">선점형 (강등 미발생)</w:t>
             </w:r>
           </w:p>
         </w:tc>
@@ -5646,7 +5660,7 @@
                 <w:sz w:val="18"/>
                 <w:szCs w:val="18"/>
               </w:rPr>
-              <w:t xml:space="preserve">5개 랜덤 시드</w:t>
+              <w:t xml:space="preserve">5개 시드</w:t>
             </w:r>
           </w:p>
         </w:tc>
@@ -6678,7 +6692,7 @@
                 <w:sz w:val="18"/>
                 <w:szCs w:val="18"/>
               </w:rPr>
-              <w:t xml:space="preserve">MLFQ (비선점형)</w:t>
+              <w:t xml:space="preserve">MLFQ</w:t>
             </w:r>
           </w:p>
         </w:tc>
@@ -6930,16 +6944,16 @@
           <w:sz w:val="20"/>
           <w:szCs w:val="20"/>
         </w:rPr>
-        <w:t xml:space="preserve">MLFQ(비선점형)</w:t>
-      </w:r>
-      <w:r>
-        <w:rPr>
-          <w:rFonts w:ascii="맑은 고딕" w:cs="맑은 고딕" w:eastAsia="맑은 고딕" w:hAnsi="맑은 고딕"/>
-          <w:color w:val="000000"/>
-          <w:sz w:val="20"/>
-          <w:szCs w:val="20"/>
-        </w:rPr>
-        <w:t xml:space="preserve">의 결과는 FCFS와 같았다. 모든 요청이 Q0 할당량(1,000ms) 안에 완료되어 하위 큐로 내려갈 일이 없었고, 비선점형 특성상 요청이 도착 순서대로 처리된 탓이다. 이론적 효과를 따로 확인하려고 5.3절에서 선점형 실험을 추가하였다. </w:t>
+        <w:t xml:space="preserve">MLFQ</w:t>
+      </w:r>
+      <w:r>
+        <w:rPr>
+          <w:rFonts w:ascii="맑은 고딕" w:cs="맑은 고딕" w:eastAsia="맑은 고딕" w:hAnsi="맑은 고딕"/>
+          <w:color w:val="000000"/>
+          <w:sz w:val="20"/>
+          <w:szCs w:val="20"/>
+        </w:rPr>
+        <w:t xml:space="preserve">의 결과는 FCFS와 같았다. 모든 요청이 Q0 할당량(1,000ms) 안에 완료되어 하위 큐로 내려갈 일이 없었고, 강등이 일어나지 않아 결과적으로 도착 순서대로 처리되었다. 이론적 효과를 따로 확인하려고 5.3절에서 선점형 실험을 추가하였다. </w:t>
       </w:r>
       <w:r>
         <w:rPr>
@@ -10069,7 +10083,7 @@
                 <w:sz w:val="18"/>
                 <w:szCs w:val="18"/>
               </w:rPr>
-              <w:t xml:space="preserve">MLFQ (비선점형)</w:t>
+              <w:t xml:space="preserve">MLFQ</w:t>
             </w:r>
           </w:p>
         </w:tc>
@@ -10296,7 +10310,7 @@
           <w:sz w:val="20"/>
           <w:szCs w:val="20"/>
         </w:rPr>
-        <w:t xml:space="preserve">FCFS, Priority, MLFQ(비선점형)의 JFI 1.000은 세 알고리즘이 구독 등급을 고려하지 않기 때문이다. Priority는 처리 순서는 바뀌지만 우선순위가 요청 단위로 배정되어 사용자 간 차이는 없다.</w:t>
+        <w:t xml:space="preserve">FCFS, Priority, MLFQ의 JFI 1.000은 세 알고리즘이 구독 등급을 고려하지 않기 때문이다. Priority는 처리 순서는 바뀌지만 우선순위가 요청 단위로 배정되어 사용자 간 차이는 없다.</w:t>
       </w:r>
     </w:p>
     <w:p>
@@ -11798,7 +11812,7 @@
           <w:sz w:val="20"/>
           <w:szCs w:val="20"/>
         </w:rPr>
-        <w:t xml:space="preserve">: FCFS, Priority, MLFQ(비선점형)의 JFI는 모두 1.000으로 균등 배분이 이루어졌다. WFQ의 시스템 수준 JFI는 0.316이었으나, 이는 가중치 기반 의도적 차등의 결과이다. Enterprise의 대기시간이 Free보다 약 12배 짧아 가중치 순서에 대응하는 차등 서비스가 확인되었다.</w:t>
+        <w:t xml:space="preserve">: FCFS, Priority, MLFQ의 JFI는 모두 1.000으로 균등 배분이 이루어졌다. WFQ의 시스템 수준 JFI는 0.316이었으나, 이는 가중치 기반 의도적 차등의 결과이다. Enterprise의 대기시간이 Free보다 약 12배 짧아 가중치 순서에 대응하는 차등 서비스가 확인되었다.</w:t>
       </w:r>
     </w:p>
     <w:p>

</xml_diff>

<commit_message>
Update final submission files and presentation materials
- Updated figures in the final report: system architecture, data flow, module structure, MLFQ vs FCFS, and Ollama tier.
- Revised final report documents in both DOCX and PDF formats.
- Enhanced presentation materials including handouts and slides.
- Updated manifest.yaml with new timestamps and file sizes for all included files.
</commit_message>
<xml_diff>
--- a/06-final-report/final/final-report.docx
+++ b/06-final-report/final/final-report.docx
@@ -4459,7 +4459,7 @@
           <w:sz w:val="20"/>
           <w:szCs w:val="20"/>
         </w:rPr>
-        <w:t xml:space="preserve">실험은 세 가지로 나누어 진행하였다. 기본 실험, MLFQ 선점형 실험, 실서버 실험이다. 실험별 주요 설정은 표 5에 정리하였다. 앞의 두 실험은 시간 기반 시뮬레이션이고, 실서버 실험은 Ollama로 실제 LLM을 호출해 진행하였다. 기본 실험은 짧은 요청을 차례로 보내서 4개 알고리즘을 같은 조건에서 비교하였고, MLFQ 선점형 실험은 처리 시간이 다양한 요청을 한꺼번에 몰아 보내서 MLFQ의 강등과 선점 효과를 따로 확인하였다. 시뮬레이션은 각 요청에 처리 시간을 미리 정해 두고, 스케줄러가 정한 순서대로 한 건씩 처리하는 방식이다. 네트워크 지연이나 LLM 응답 시간의 변동이 없어서 알고리즘 자체의 특성만 비교할 수 있다.</w:t>
+        <w:t xml:space="preserve">실험은 세 가지로 나누어 진행하였다. 기본 실험, MLFQ 선점형 실험, 실서버 실험이다. 실험별 주요 설정은 표 5에 정리하였다. 앞의 두 실험은 시간 기반 시뮬레이션이고, 실서버 실험은 Ollama로 실제 LLM을 호출해 진행하였다. 기본 실험은 짧은 요청을 차례로 보내서 4개 알고리즘을 같은 조건에서 비교하였고, MLFQ 선점형 실험은 처리 시간이 다양한 요청을 한꺼번에 몰아 보내는 버스트(Burst, 짧은 시간에 여러 요청이 동시에 몰리는 상황) 도착으로 MLFQ의 강등과 선점 효과를 따로 확인하였다. 시뮬레이션은 각 요청에 처리 시간을 미리 정해 두고, 스케줄러가 정한 순서대로 한 건씩 처리하는 방식이다. 네트워크 지연이나 LLM 응답 시간의 변동이 없어서 알고리즘 자체의 특성만 비교할 수 있다.</w:t>
       </w:r>
     </w:p>
     <w:p>
@@ -5306,7 +5306,7 @@
                 <w:sz w:val="18"/>
                 <w:szCs w:val="18"/>
               </w:rPr>
-              <w:t xml:space="preserve">버스트 (20건 동시 × 25회)</w:t>
+              <w:t xml:space="preserve">버스트 (20건 동시 × 25회, 2초 간격)</w:t>
             </w:r>
           </w:p>
         </w:tc>
@@ -5336,124 +5336,6 @@
                 <w:szCs w:val="18"/>
               </w:rPr>
               <w:t xml:space="preserve">버스트 (20건 동시)</w:t>
-            </w:r>
-          </w:p>
-        </w:tc>
-      </w:tr>
-      <w:tr>
-        <w:tc>
-          <w:tcPr>
-            <w:tcW w:type="dxa" w:w="1983"/>
-            <w:tcBorders>
-              <w:top w:val="single" w:color="AAAAAA" w:sz="1"/>
-              <w:left w:val="single" w:color="AAAAAA" w:sz="1"/>
-              <w:bottom w:val="single" w:color="AAAAAA" w:sz="1"/>
-              <w:right w:val="single" w:color="AAAAAA" w:sz="1"/>
-            </w:tcBorders>
-            <w:vAlign w:val="center"/>
-          </w:tcPr>
-          <w:p>
-            <w:pPr>
-              <w:spacing w:after="40" w:before="40"/>
-              <w:jc w:val="left"/>
-            </w:pPr>
-            <w:r>
-              <w:rPr>
-                <w:rFonts w:ascii="맑은 고딕" w:cs="맑은 고딕" w:eastAsia="맑은 고딕" w:hAnsi="맑은 고딕"/>
-                <w:b w:val="false"/>
-                <w:bCs w:val="false"/>
-                <w:color w:val="000000"/>
-                <w:sz w:val="18"/>
-                <w:szCs w:val="18"/>
-              </w:rPr>
-              <w:t xml:space="preserve">MLFQ 모드</w:t>
-            </w:r>
-          </w:p>
-        </w:tc>
-        <w:tc>
-          <w:tcPr>
-            <w:tcW w:type="dxa" w:w="1983"/>
-            <w:tcBorders>
-              <w:top w:val="single" w:color="AAAAAA" w:sz="1"/>
-              <w:left w:val="single" w:color="AAAAAA" w:sz="1"/>
-              <w:bottom w:val="single" w:color="AAAAAA" w:sz="1"/>
-              <w:right w:val="single" w:color="AAAAAA" w:sz="1"/>
-            </w:tcBorders>
-            <w:vAlign w:val="center"/>
-          </w:tcPr>
-          <w:p>
-            <w:pPr>
-              <w:spacing w:after="40" w:before="40"/>
-              <w:jc w:val="left"/>
-            </w:pPr>
-            <w:r>
-              <w:rPr>
-                <w:rFonts w:ascii="맑은 고딕" w:cs="맑은 고딕" w:eastAsia="맑은 고딕" w:hAnsi="맑은 고딕"/>
-                <w:b w:val="false"/>
-                <w:bCs w:val="false"/>
-                <w:color w:val="000000"/>
-                <w:sz w:val="18"/>
-                <w:szCs w:val="18"/>
-              </w:rPr>
-              <w:t xml:space="preserve">선점형 (강등 미발생)</w:t>
-            </w:r>
-          </w:p>
-        </w:tc>
-        <w:tc>
-          <w:tcPr>
-            <w:tcW w:type="dxa" w:w="1983"/>
-            <w:tcBorders>
-              <w:top w:val="single" w:color="AAAAAA" w:sz="1"/>
-              <w:left w:val="single" w:color="AAAAAA" w:sz="1"/>
-              <w:bottom w:val="single" w:color="AAAAAA" w:sz="1"/>
-              <w:right w:val="single" w:color="AAAAAA" w:sz="1"/>
-            </w:tcBorders>
-            <w:vAlign w:val="center"/>
-          </w:tcPr>
-          <w:p>
-            <w:pPr>
-              <w:spacing w:after="40" w:before="40"/>
-              <w:jc w:val="left"/>
-            </w:pPr>
-            <w:r>
-              <w:rPr>
-                <w:rFonts w:ascii="맑은 고딕" w:cs="맑은 고딕" w:eastAsia="맑은 고딕" w:hAnsi="맑은 고딕"/>
-                <w:b w:val="false"/>
-                <w:bCs w:val="false"/>
-                <w:color w:val="000000"/>
-                <w:sz w:val="18"/>
-                <w:szCs w:val="18"/>
-              </w:rPr>
-              <w:t xml:space="preserve">선점형 (500ms 간격)</w:t>
-            </w:r>
-          </w:p>
-        </w:tc>
-        <w:tc>
-          <w:tcPr>
-            <w:tcW w:type="dxa" w:w="1983"/>
-            <w:tcBorders>
-              <w:top w:val="single" w:color="AAAAAA" w:sz="1"/>
-              <w:left w:val="single" w:color="AAAAAA" w:sz="1"/>
-              <w:bottom w:val="single" w:color="AAAAAA" w:sz="1"/>
-              <w:right w:val="single" w:color="AAAAAA" w:sz="1"/>
-            </w:tcBorders>
-            <w:vAlign w:val="center"/>
-          </w:tcPr>
-          <w:p>
-            <w:pPr>
-              <w:spacing w:after="40" w:before="40"/>
-              <w:jc w:val="left"/>
-            </w:pPr>
-            <w:r>
-              <w:rPr>
-                <w:rFonts w:ascii="맑은 고딕" w:cs="맑은 고딕" w:eastAsia="맑은 고딕" w:hAnsi="맑은 고딕"/>
-                <w:b w:val="false"/>
-                <w:bCs w:val="false"/>
-                <w:color w:val="000000"/>
-                <w:sz w:val="18"/>
-                <w:szCs w:val="18"/>
-              </w:rPr>
-              <w:t xml:space="preserve">비선점형</w:t>
             </w:r>
           </w:p>
         </w:tc>
@@ -6241,7 +6123,7 @@
           <w:sz w:val="20"/>
           <w:szCs w:val="20"/>
         </w:rPr>
-        <w:t xml:space="preserve">Short는 최상위 큐에서 완료되고 Medium과 Long은 시간 할당량 초과로 하위 큐로 강등되도록 설계하였다. 버스트(Burst, 짧은 시간에 여러 요청이 동시에 몰리는 상황) 도착 패턴은 대기열에 요청이 쌓인 상태에서 스케줄러가 순서를 정하도록 유도한다. 이를 위해 20건씩 동시에 큐에 넣었다. 모든 실험에서 요청은 1건씩 순차 처리된다. JFI 계산 방식의 차이는 5.5절에서 다루며, 대규모 환경은 향후 연구 과제로 남긴다 (7.2절).</w:t>
+        <w:t xml:space="preserve">Short는 최상위 큐에서 완료되고 Medium과 Long은 시간 할당량 초과로 하위 큐로 강등되도록 설계하였다. 버스트 도착 패턴은 대기열에 요청이 쌓인 상태에서 스케줄러가 순서를 정하도록 유도한다. 이를 위해 20건씩 동시에 큐에 넣었다. 모든 실험에서 요청은 1건씩 순차 처리된다. JFI 계산 방식의 차이는 5.5절에서 다루며, 대규모 환경은 향후 연구 과제로 남긴다 (7.2절).</w:t>
       </w:r>
     </w:p>
     <w:p>

</xml_diff>

<commit_message>
Add session summary report and update final submission files
- Created a new session summary report for session ID 3ccde45d-7e27-4bc2-9360-76e161699d88.
- Updated multiple presentation figures and final report documents in both DOCX and PDF formats.
- Modified the manifest.yaml to reflect new file sizes and modification times for the final submission.
- Updated handout and presentation PDF files in the final submission directory.
</commit_message>
<xml_diff>
--- a/06-final-report/final/final-report.docx
+++ b/06-final-report/final/final-report.docx
@@ -12327,7 +12327,7 @@
           <w:sz w:val="20"/>
           <w:szCs w:val="20"/>
         </w:rPr>
-        <w:t xml:space="preserve">: 긴급도를 직접 지정할 수 있는 환경에 적합한 것으로 보인다. 다만 에이징 효과가 나타나려면 처리 시간이 어느 정도 길어야 한다.</w:t>
+        <w:t xml:space="preserve">: 긴급도를 직접 지정할 수 있는 환경에 적합한 것으로 보인다. 다만 5.2절에서 본 것처럼 처리 시간이 짧으면 에이징이 작동할 기회가 없으므로, 처리 시간이 어느 정도 긴 환경에 더 잘 맞는다.</w:t>
       </w:r>
     </w:p>
     <w:p>
@@ -12417,7 +12417,35 @@
           <w:sz w:val="20"/>
           <w:szCs w:val="20"/>
         </w:rPr>
-        <w:t xml:space="preserve">이 프로젝트는 두 가지 면에서 의의를 찾을 수 있다. 우선 CPU 스케줄링(FCFS, Priority, MLFQ)과 네트워크 자원 배분(WFQ) 알고리즘을 LLM API 환경에 적용해 운영체제 이론을 실제 문제에 응용해 본 점이다. 또한 vLLM과 TGI 같은 기존 LLM 서빙 도구가 전체 처리량 최적화에 집중하느라 사용자별 공정성이나 우선순위 관리를 제공하지 않는다는 점을 확인하고, 이 부분에 스케줄링 이론을 적용해 알고리즘별 효과를 비교했다는 점도 의미가 있다. 특히 WFQ의 가중치 비례 차등 서비스는 유료 LLM 서비스의 구독 등급 관리에 쓸 수 있는 가능성을 보여준다. 다만 세 실험을 합산해도 총 3,020건 규모이므로, 대규모 운영 환경에서도 같은 결과가 나올지는 추가 확인이 필요하다.</w:t>
+        <w:t xml:space="preserve">이 프로젝트는 두 가지 면에서 의의를 찾을 수 있다. 우선 CPU 스케줄링(FCFS, Priority, MLFQ)과 네트워크 자원 배분(WFQ) 알고리즘을 LLM API 환경에 적용해 운영체제 이론을 실제 문제에 응용해 본 점이다. 또한 vLLM과 TGI 같은 기존 LLM 서빙 도구가 전체 처리량 최적화에 집중하느라 사용자별 공정성이나 우선순위 관리를 제공하지 않는다는 점을 확인하고, 이 부분에 스케줄링 이론을 적용해 알고리즘별 효과를 비교했다는 점도 의미가 있다.</w:t>
+      </w:r>
+    </w:p>
+    <w:p>
+      <w:pPr>
+        <w:spacing w:after="120" w:line="240"/>
+      </w:pPr>
+      <w:r>
+        <w:rPr>
+          <w:rFonts w:ascii="맑은 고딕" w:cs="맑은 고딕" w:eastAsia="맑은 고딕" w:hAnsi="맑은 고딕"/>
+          <w:color w:val="000000"/>
+          <w:sz w:val="20"/>
+          <w:szCs w:val="20"/>
+        </w:rPr>
+        <w:t xml:space="preserve">특히 WFQ의 가중치 비례 차등 서비스는 유료 LLM 서비스의 구독 등급 관리에 쓸 수 있는 가능성을 보여준다.</w:t>
+      </w:r>
+    </w:p>
+    <w:p>
+      <w:pPr>
+        <w:spacing w:after="120" w:line="240"/>
+      </w:pPr>
+      <w:r>
+        <w:rPr>
+          <w:rFonts w:ascii="맑은 고딕" w:cs="맑은 고딕" w:eastAsia="맑은 고딕" w:hAnsi="맑은 고딕"/>
+          <w:color w:val="000000"/>
+          <w:sz w:val="20"/>
+          <w:szCs w:val="20"/>
+        </w:rPr>
+        <w:t xml:space="preserve">다만 세 실험을 합산해도 총 3,020건 규모이므로, 대규모 운영 환경에서도 같은 결과가 나올지는 추가 확인이 필요하다.</w:t>
       </w:r>
     </w:p>
     <w:p>

</xml_diff>